<commit_message>
Apple App Store availability in the six countries verified from Apple's localizations list, pasted by Frank; widget, document and ledger updated
Co-Authored-By: Claude Fable 5.1 <noreply@anthropic.com>
Claude-Session: https://claude.ai/code/session_01FdLL4Wp3bi12KNX6zHRo7N
</commit_message>
<xml_diff>
--- a/EZvoxa Market Model and Business Plan.docx
+++ b/EZvoxa Market Model and Business Plan.docx
@@ -90,7 +90,7 @@
           <w:sz w:val="22"/>
           <w:szCs w:val="22"/>
         </w:rPr>
-        <w:t xml:space="preserve">Google Play sells paid apps, in-app purchases and subscriptions in all six (Google’s supported locations page, 15 December 2025 version, pasted by Frank). Apple’s App Store country list is still to be read from Apple’s page.</w:t>
+        <w:t xml:space="preserve">On sale in all six from day one on both stores. Google Play: paid apps, in-app purchases and subscriptions in all six countries (Google's supported locations page, 15 Dec 2025 version, pasted by Frank 8 Sep 2026). Apple: all six are App Store countries or regions with English as the default store language (App Store Connect reference, App Store localizations, pasted by Frank 8 Sep 2026). The same Apple list shows English (U.K.) as the default store language in India, Nigeria, the Philippines, South Africa, Singapore and most of Africa and the Caribbean, which is the uncounted upside.</w:t>
       </w:r>
     </w:p>
     <w:p>
@@ -10063,24 +10063,6 @@
           <w:szCs w:val="22"/>
         </w:rPr>
         <w:t xml:space="preserve">Frank’s conversion levels. The three here are placeholders he can change on the widget; the counted market is the fixed part.</w:t>
-      </w:r>
-    </w:p>
-    <w:p>
-      <w:pPr>
-        <w:pStyle w:val="ListParagraph"/>
-        <w:numPr>
-          <w:ilvl w:val="0"/>
-          <w:numId w:val="3"/>
-        </w:numPr>
-        <w:spacing w:after="100"/>
-      </w:pPr>
-      <w:r>
-        <w:rPr>
-          <w:rFonts w:ascii="Calibri" w:cs="Calibri" w:eastAsia="Calibri" w:hAnsi="Calibri"/>
-          <w:sz w:val="22"/>
-          <w:szCs w:val="22"/>
-        </w:rPr>
-        <w:t xml:space="preserve">Apple’s App Store country list, read from Apple’s page.</w:t>
       </w:r>
     </w:p>
     <w:p>

</xml_diff>

<commit_message>
Market model: UK, Australia and Ireland aged 13 and over from their statistics offices' own age tables, Canada at its published 15-and-over share; only New Zealand keeps the placeholder
Co-Authored-By: Claude Fable 5.1 <noreply@anthropic.com>
Claude-Session: https://claude.ai/code/session_01FdLL4Wp3bi12KNX6zHRo7N
</commit_message>
<xml_diff>
--- a/EZvoxa Market Model and Business Plan.docx
+++ b/EZvoxa Market Model and Business Plan.docx
@@ -485,7 +485,7 @@
                 <w:sz w:val="18"/>
                 <w:szCs w:val="18"/>
               </w:rPr>
-              <w:t xml:space="preserve">58,889,190</w:t>
+              <w:t xml:space="preserve">59,222,071</w:t>
             </w:r>
           </w:p>
         </w:tc>
@@ -511,7 +511,7 @@
                 <w:sz w:val="18"/>
                 <w:szCs w:val="18"/>
               </w:rPr>
-              <w:t xml:space="preserve">139,108</w:t>
+              <w:t xml:space="preserve">139,894</w:t>
             </w:r>
           </w:p>
         </w:tc>
@@ -537,7 +537,7 @@
                 <w:sz w:val="18"/>
                 <w:szCs w:val="18"/>
               </w:rPr>
-              <w:t xml:space="preserve">407,718</w:t>
+              <w:t xml:space="preserve">410,022</w:t>
             </w:r>
           </w:p>
         </w:tc>
@@ -563,7 +563,7 @@
                 <w:sz w:val="18"/>
                 <w:szCs w:val="18"/>
               </w:rPr>
-              <w:t xml:space="preserve">546,826</w:t>
+              <w:t xml:space="preserve">549,917</w:t>
             </w:r>
           </w:p>
         </w:tc>
@@ -749,7 +749,7 @@
                 <w:sz w:val="18"/>
                 <w:szCs w:val="18"/>
               </w:rPr>
-              <w:t xml:space="preserve">23,630,870</w:t>
+              <w:t xml:space="preserve">23,482,317</w:t>
             </w:r>
           </w:p>
         </w:tc>
@@ -775,7 +775,7 @@
                 <w:sz w:val="18"/>
                 <w:szCs w:val="18"/>
               </w:rPr>
-              <w:t xml:space="preserve">55,821</w:t>
+              <w:t xml:space="preserve">55,470</w:t>
             </w:r>
           </w:p>
         </w:tc>
@@ -801,7 +801,7 @@
                 <w:sz w:val="18"/>
                 <w:szCs w:val="18"/>
               </w:rPr>
-              <w:t xml:space="preserve">163,608</w:t>
+              <w:t xml:space="preserve">162,579</w:t>
             </w:r>
           </w:p>
         </w:tc>
@@ -827,7 +827,7 @@
                 <w:sz w:val="18"/>
                 <w:szCs w:val="18"/>
               </w:rPr>
-              <w:t xml:space="preserve">219,429</w:t>
+              <w:t xml:space="preserve">218,049</w:t>
             </w:r>
           </w:p>
         </w:tc>
@@ -1013,7 +1013,7 @@
                 <w:sz w:val="18"/>
                 <w:szCs w:val="18"/>
               </w:rPr>
-              <w:t xml:space="preserve">4,639,810</w:t>
+              <w:t xml:space="preserve">4,684,040</w:t>
             </w:r>
           </w:p>
         </w:tc>
@@ -1039,7 +1039,7 @@
                 <w:sz w:val="18"/>
                 <w:szCs w:val="18"/>
               </w:rPr>
-              <w:t xml:space="preserve">10,960</w:t>
+              <w:t xml:space="preserve">11,065</w:t>
             </w:r>
           </w:p>
         </w:tc>
@@ -1065,7 +1065,7 @@
                 <w:sz w:val="18"/>
                 <w:szCs w:val="18"/>
               </w:rPr>
-              <w:t xml:space="preserve">32,124</w:t>
+              <w:t xml:space="preserve">32,430</w:t>
             </w:r>
           </w:p>
         </w:tc>
@@ -1091,7 +1091,7 @@
                 <w:sz w:val="18"/>
                 <w:szCs w:val="18"/>
               </w:rPr>
-              <w:t xml:space="preserve">43,084</w:t>
+              <w:t xml:space="preserve">43,494</w:t>
             </w:r>
           </w:p>
         </w:tc>
@@ -1145,7 +1145,7 @@
                 <w:sz w:val="18"/>
                 <w:szCs w:val="18"/>
               </w:rPr>
-              <w:t xml:space="preserve">415,962,071</w:t>
+              <w:t xml:space="preserve">416,190,629</w:t>
             </w:r>
           </w:p>
         </w:tc>
@@ -1171,7 +1171,7 @@
                 <w:sz w:val="18"/>
                 <w:szCs w:val="18"/>
               </w:rPr>
-              <w:t xml:space="preserve">1,142,745</w:t>
+              <w:t xml:space="preserve">1,143,285</w:t>
             </w:r>
           </w:p>
         </w:tc>
@@ -1197,7 +1197,7 @@
                 <w:sz w:val="18"/>
                 <w:szCs w:val="18"/>
               </w:rPr>
-              <w:t xml:space="preserve">2,879,903</w:t>
+              <w:t xml:space="preserve">2,881,485</w:t>
             </w:r>
           </w:p>
         </w:tc>
@@ -1223,7 +1223,7 @@
                 <w:sz w:val="18"/>
                 <w:szCs w:val="18"/>
               </w:rPr>
-              <w:t xml:space="preserve">4,022,648</w:t>
+              <w:t xml:space="preserve">4,024,770</w:t>
             </w:r>
           </w:p>
         </w:tc>
@@ -1287,7 +1287,7 @@
           <w:sz w:val="22"/>
           <w:szCs w:val="22"/>
         </w:rPr>
-        <w:t xml:space="preserve">Verified from the entity’s own page. ONS mid-2024 estimate, 69,281,400. Read 8 Sep 2026.</w:t>
+        <w:t xml:space="preserve">Verified from the entity’s own page. ONS mid-2024 estimates file (mye24tablesuk.xlsx, MYE2 Persons by single year of age): all ages 69,281,437; 13 and over 59,222,071 (85.5%). Read 8 Sep 2026.</w:t>
       </w:r>
     </w:p>
     <w:p>
@@ -1305,7 +1305,7 @@
           <w:sz w:val="22"/>
           <w:szCs w:val="22"/>
         </w:rPr>
-        <w:t xml:space="preserve">Verified from the entity’s own page. Statistics Canada, 41,651,653 on 1 July 2025; 0 to 14 is 15.0% of the population. Read 8 Sep 2026.</w:t>
+        <w:t xml:space="preserve">Verified from the entity’s own page. Statistics Canada, The Daily, 24 Sep 2025: population 41,651,653 on 1 July 2025; 0 to 14 is 15.0%. The figure used is 15 and over, 85.0%; 13 and 14 year olds are not added because the single-age table renders only in a browser, so the count is slightly low.</w:t>
       </w:r>
     </w:p>
     <w:p>
@@ -1323,7 +1323,7 @@
           <w:sz w:val="22"/>
           <w:szCs w:val="22"/>
         </w:rPr>
-        <w:t xml:space="preserve">Verified from the entity’s own page. Australian Bureau of Statistics, 27,801,023 at 31 December 2025. Read 8 Sep 2026.</w:t>
+        <w:t xml:space="preserve">Verified from the entity’s own page. Australian Bureau of Statistics, National, state and territory population, table 59, population by single year of age, June 2025: all ages 27,611,026; 13 and over 23,482,317 (85.1%). Read 8 Sep 2026. The December 2025 headline total is 27,801,023.</w:t>
       </w:r>
     </w:p>
     <w:p>
@@ -1341,7 +1341,7 @@
           <w:sz w:val="22"/>
           <w:szCs w:val="22"/>
         </w:rPr>
-        <w:t xml:space="preserve">Verified from the entity’s own page. Stats NZ, 5,324,700 at 30 June 2025. Read 8 Sep 2026.</w:t>
+        <w:t xml:space="preserve">Verified from the entity’s own page. Stats NZ, 5,324,700 at 30 June 2025. Read 8 Sep 2026. The age split is not in hand: the release's tables render only in a browser, so the 85% placeholder share applies to New Zealand alone.</w:t>
       </w:r>
     </w:p>
     <w:p>
@@ -1359,7 +1359,7 @@
           <w:sz w:val="22"/>
           <w:szCs w:val="22"/>
         </w:rPr>
-        <w:t xml:space="preserve">Verified from the entity’s own page. Central Statistics Office, 5,458,600 in April 2025. Read 8 Sep 2026.</w:t>
+        <w:t xml:space="preserve">Verified from the entity’s own page. Central Statistics Office data service, table PEA01, April 2026 estimate: all ages 5,525,600; 15 and over 4,533,200; 10 to 14 377,100. 13 and over taken as 15 and over plus two fifths of 10 to 14, 4,684,040 (84.8%). Read 8 Sep 2026.</w:t>
       </w:r>
     </w:p>
     <w:p>
@@ -1377,7 +1377,7 @@
           <w:sz w:val="22"/>
           <w:szCs w:val="22"/>
         </w:rPr>
-        <w:t xml:space="preserve">Assumption, Frank’s to set. Share of the population aged 13 and over in the five countries outside the US. Canada's own figure is 85.0% aged 15 and over (Statistics Canada); the same share is applied to the UK, Australia, New Zealand and Ireland until their age tables are read. The US uses its exact count.</w:t>
+        <w:t xml:space="preserve">Assumption, Frank’s to set. Share aged 13 and over where a country's own age table is not in hand. After 8 Sep this applies only to New Zealand. The four countries with their own tables came out at 85.5% (UK), 85.0% (Canada, 15 and over), 85.1% (Australia) and 84.8% (Ireland), so the placeholder is in line.</w:t>
       </w:r>
     </w:p>
     <w:p>
@@ -3780,7 +3780,7 @@
         <w:rPr>
           <w:rFonts w:ascii="Calibri" w:cs="Calibri" w:eastAsia="Calibri" w:hAnsi="Calibri"/>
         </w:rPr>
-        <w:t xml:space="preserve">All three models combined: five-year net $12,306,440</w:t>
+        <w:t xml:space="preserve">All three models combined: five-year net $12,312,357</w:t>
       </w:r>
     </w:p>
     <w:tbl>
@@ -4044,111 +4044,111 @@
                 <w:sz w:val="14"/>
                 <w:szCs w:val="14"/>
               </w:rPr>
-              <w:t xml:space="preserve">4,023 buyers, 1,006 subs, 252 seats</w:t>
-            </w:r>
-          </w:p>
-        </w:tc>
-        <w:tc>
-          <w:tcPr>
-            <w:tcW w:type="dxa" w:w="1500"/>
-            <w:tcMar>
-              <w:top w:type="dxa" w:w="50"/>
-              <w:left w:type="dxa" w:w="70"/>
-              <w:bottom w:type="dxa" w:w="50"/>
-              <w:right w:type="dxa" w:w="70"/>
-            </w:tcMar>
-          </w:tcPr>
-          <w:p>
-            <w:pPr>
-              <w:jc w:val="right"/>
-            </w:pPr>
-            <w:r>
-              <w:rPr>
-                <w:rFonts w:ascii="Calibri" w:cs="Calibri" w:eastAsia="Calibri" w:hAnsi="Calibri"/>
-                <w:b w:val="false"/>
-                <w:bCs w:val="false"/>
-                <w:sz w:val="14"/>
-                <w:szCs w:val="14"/>
-              </w:rPr>
-              <w:t xml:space="preserve">$494,057</w:t>
-            </w:r>
-          </w:p>
-        </w:tc>
-        <w:tc>
-          <w:tcPr>
-            <w:tcW w:type="dxa" w:w="1500"/>
-            <w:tcMar>
-              <w:top w:type="dxa" w:w="50"/>
-              <w:left w:type="dxa" w:w="70"/>
-              <w:bottom w:type="dxa" w:w="50"/>
-              <w:right w:type="dxa" w:w="70"/>
-            </w:tcMar>
-          </w:tcPr>
-          <w:p>
-            <w:pPr>
-              <w:jc w:val="right"/>
-            </w:pPr>
-            <w:r>
-              <w:rPr>
-                <w:rFonts w:ascii="Calibri" w:cs="Calibri" w:eastAsia="Calibri" w:hAnsi="Calibri"/>
-                <w:b w:val="false"/>
-                <w:bCs w:val="false"/>
-                <w:sz w:val="14"/>
-                <w:szCs w:val="14"/>
-              </w:rPr>
-              <w:t xml:space="preserve">($201,262)</w:t>
-            </w:r>
-          </w:p>
-        </w:tc>
-        <w:tc>
-          <w:tcPr>
-            <w:tcW w:type="dxa" w:w="1500"/>
-            <w:tcMar>
-              <w:top w:type="dxa" w:w="50"/>
-              <w:left w:type="dxa" w:w="70"/>
-              <w:bottom w:type="dxa" w:w="50"/>
-              <w:right w:type="dxa" w:w="70"/>
-            </w:tcMar>
-          </w:tcPr>
-          <w:p>
-            <w:pPr>
-              <w:jc w:val="right"/>
-            </w:pPr>
-            <w:r>
-              <w:rPr>
-                <w:rFonts w:ascii="Calibri" w:cs="Calibri" w:eastAsia="Calibri" w:hAnsi="Calibri"/>
-                <w:b w:val="false"/>
-                <w:bCs w:val="false"/>
-                <w:sz w:val="14"/>
-                <w:szCs w:val="14"/>
-              </w:rPr>
-              <w:t xml:space="preserve">$345,292</w:t>
-            </w:r>
-          </w:p>
-        </w:tc>
-        <w:tc>
-          <w:tcPr>
-            <w:tcW w:type="dxa" w:w="1500"/>
-            <w:tcMar>
-              <w:top w:type="dxa" w:w="50"/>
-              <w:left w:type="dxa" w:w="70"/>
-              <w:bottom w:type="dxa" w:w="50"/>
-              <w:right w:type="dxa" w:w="70"/>
-            </w:tcMar>
-          </w:tcPr>
-          <w:p>
-            <w:pPr>
-              <w:jc w:val="right"/>
-            </w:pPr>
-            <w:r>
-              <w:rPr>
-                <w:rFonts w:ascii="Calibri" w:cs="Calibri" w:eastAsia="Calibri" w:hAnsi="Calibri"/>
-                <w:b w:val="false"/>
-                <w:bCs w:val="false"/>
-                <w:sz w:val="14"/>
-                <w:szCs w:val="14"/>
-              </w:rPr>
-              <w:t xml:space="preserve">$292,795</w:t>
+              <w:t xml:space="preserve">4,025 buyers, 1,006 subs, 252 seats</w:t>
+            </w:r>
+          </w:p>
+        </w:tc>
+        <w:tc>
+          <w:tcPr>
+            <w:tcW w:type="dxa" w:w="1500"/>
+            <w:tcMar>
+              <w:top w:type="dxa" w:w="50"/>
+              <w:left w:type="dxa" w:w="70"/>
+              <w:bottom w:type="dxa" w:w="50"/>
+              <w:right w:type="dxa" w:w="70"/>
+            </w:tcMar>
+          </w:tcPr>
+          <w:p>
+            <w:pPr>
+              <w:jc w:val="right"/>
+            </w:pPr>
+            <w:r>
+              <w:rPr>
+                <w:rFonts w:ascii="Calibri" w:cs="Calibri" w:eastAsia="Calibri" w:hAnsi="Calibri"/>
+                <w:b w:val="false"/>
+                <w:bCs w:val="false"/>
+                <w:sz w:val="14"/>
+                <w:szCs w:val="14"/>
+              </w:rPr>
+              <w:t xml:space="preserve">$494,257</w:t>
+            </w:r>
+          </w:p>
+        </w:tc>
+        <w:tc>
+          <w:tcPr>
+            <w:tcW w:type="dxa" w:w="1500"/>
+            <w:tcMar>
+              <w:top w:type="dxa" w:w="50"/>
+              <w:left w:type="dxa" w:w="70"/>
+              <w:bottom w:type="dxa" w:w="50"/>
+              <w:right w:type="dxa" w:w="70"/>
+            </w:tcMar>
+          </w:tcPr>
+          <w:p>
+            <w:pPr>
+              <w:jc w:val="right"/>
+            </w:pPr>
+            <w:r>
+              <w:rPr>
+                <w:rFonts w:ascii="Calibri" w:cs="Calibri" w:eastAsia="Calibri" w:hAnsi="Calibri"/>
+                <w:b w:val="false"/>
+                <w:bCs w:val="false"/>
+                <w:sz w:val="14"/>
+                <w:szCs w:val="14"/>
+              </w:rPr>
+              <w:t xml:space="preserve">($201,326)</w:t>
+            </w:r>
+          </w:p>
+        </w:tc>
+        <w:tc>
+          <w:tcPr>
+            <w:tcW w:type="dxa" w:w="1500"/>
+            <w:tcMar>
+              <w:top w:type="dxa" w:w="50"/>
+              <w:left w:type="dxa" w:w="70"/>
+              <w:bottom w:type="dxa" w:w="50"/>
+              <w:right w:type="dxa" w:w="70"/>
+            </w:tcMar>
+          </w:tcPr>
+          <w:p>
+            <w:pPr>
+              <w:jc w:val="right"/>
+            </w:pPr>
+            <w:r>
+              <w:rPr>
+                <w:rFonts w:ascii="Calibri" w:cs="Calibri" w:eastAsia="Calibri" w:hAnsi="Calibri"/>
+                <w:b w:val="false"/>
+                <w:bCs w:val="false"/>
+                <w:sz w:val="14"/>
+                <w:szCs w:val="14"/>
+              </w:rPr>
+              <w:t xml:space="preserve">$345,428</w:t>
+            </w:r>
+          </w:p>
+        </w:tc>
+        <w:tc>
+          <w:tcPr>
+            <w:tcW w:type="dxa" w:w="1500"/>
+            <w:tcMar>
+              <w:top w:type="dxa" w:w="50"/>
+              <w:left w:type="dxa" w:w="70"/>
+              <w:bottom w:type="dxa" w:w="50"/>
+              <w:right w:type="dxa" w:w="70"/>
+            </w:tcMar>
+          </w:tcPr>
+          <w:p>
+            <w:pPr>
+              <w:jc w:val="right"/>
+            </w:pPr>
+            <w:r>
+              <w:rPr>
+                <w:rFonts w:ascii="Calibri" w:cs="Calibri" w:eastAsia="Calibri" w:hAnsi="Calibri"/>
+                <w:b w:val="false"/>
+                <w:bCs w:val="false"/>
+                <w:sz w:val="14"/>
+                <w:szCs w:val="14"/>
+              </w:rPr>
+              <w:t xml:space="preserve">$292,931</w:t>
             </w:r>
           </w:p>
         </w:tc>
@@ -4174,7 +4174,7 @@
                 <w:sz w:val="14"/>
                 <w:szCs w:val="14"/>
               </w:rPr>
-              <w:t xml:space="preserve">$292,795</w:t>
+              <w:t xml:space="preserve">$292,931</w:t>
             </w:r>
           </w:p>
         </w:tc>
@@ -4228,111 +4228,111 @@
                 <w:sz w:val="14"/>
                 <w:szCs w:val="14"/>
               </w:rPr>
-              <w:t xml:space="preserve">10,057 buyers, 3,520 subs, 955 seats</w:t>
-            </w:r>
-          </w:p>
-        </w:tc>
-        <w:tc>
-          <w:tcPr>
-            <w:tcW w:type="dxa" w:w="1500"/>
-            <w:tcMar>
-              <w:top w:type="dxa" w:w="50"/>
-              <w:left w:type="dxa" w:w="70"/>
-              <w:bottom w:type="dxa" w:w="50"/>
-              <w:right w:type="dxa" w:w="70"/>
-            </w:tcMar>
-          </w:tcPr>
-          <w:p>
-            <w:pPr>
-              <w:jc w:val="right"/>
-            </w:pPr>
-            <w:r>
-              <w:rPr>
-                <w:rFonts w:ascii="Calibri" w:cs="Calibri" w:eastAsia="Calibri" w:hAnsi="Calibri"/>
-                <w:b w:val="false"/>
-                <w:bCs w:val="false"/>
-                <w:sz w:val="14"/>
-                <w:szCs w:val="14"/>
-              </w:rPr>
-              <w:t xml:space="preserve">$1,396,253</w:t>
-            </w:r>
-          </w:p>
-        </w:tc>
-        <w:tc>
-          <w:tcPr>
-            <w:tcW w:type="dxa" w:w="1500"/>
-            <w:tcMar>
-              <w:top w:type="dxa" w:w="50"/>
-              <w:left w:type="dxa" w:w="70"/>
-              <w:bottom w:type="dxa" w:w="50"/>
-              <w:right w:type="dxa" w:w="70"/>
-            </w:tcMar>
-          </w:tcPr>
-          <w:p>
-            <w:pPr>
-              <w:jc w:val="right"/>
-            </w:pPr>
-            <w:r>
-              <w:rPr>
-                <w:rFonts w:ascii="Calibri" w:cs="Calibri" w:eastAsia="Calibri" w:hAnsi="Calibri"/>
-                <w:b w:val="false"/>
-                <w:bCs w:val="false"/>
-                <w:sz w:val="14"/>
-                <w:szCs w:val="14"/>
-              </w:rPr>
-              <w:t xml:space="preserve">($489,926)</w:t>
-            </w:r>
-          </w:p>
-        </w:tc>
-        <w:tc>
-          <w:tcPr>
-            <w:tcW w:type="dxa" w:w="1500"/>
-            <w:tcMar>
-              <w:top w:type="dxa" w:w="50"/>
-              <w:left w:type="dxa" w:w="70"/>
-              <w:bottom w:type="dxa" w:w="50"/>
-              <w:right w:type="dxa" w:w="70"/>
-            </w:tcMar>
-          </w:tcPr>
-          <w:p>
-            <w:pPr>
-              <w:jc w:val="right"/>
-            </w:pPr>
-            <w:r>
-              <w:rPr>
-                <w:rFonts w:ascii="Calibri" w:cs="Calibri" w:eastAsia="Calibri" w:hAnsi="Calibri"/>
-                <w:b w:val="false"/>
-                <w:bCs w:val="false"/>
-                <w:sz w:val="14"/>
-                <w:szCs w:val="14"/>
-              </w:rPr>
-              <w:t xml:space="preserve">$988,080</w:t>
-            </w:r>
-          </w:p>
-        </w:tc>
-        <w:tc>
-          <w:tcPr>
-            <w:tcW w:type="dxa" w:w="1500"/>
-            <w:tcMar>
-              <w:top w:type="dxa" w:w="50"/>
-              <w:left w:type="dxa" w:w="70"/>
-              <w:bottom w:type="dxa" w:w="50"/>
-              <w:right w:type="dxa" w:w="70"/>
-            </w:tcMar>
-          </w:tcPr>
-          <w:p>
-            <w:pPr>
-              <w:jc w:val="right"/>
-            </w:pPr>
-            <w:r>
-              <w:rPr>
-                <w:rFonts w:ascii="Calibri" w:cs="Calibri" w:eastAsia="Calibri" w:hAnsi="Calibri"/>
-                <w:b w:val="false"/>
-                <w:bCs w:val="false"/>
-                <w:sz w:val="14"/>
-                <w:szCs w:val="14"/>
-              </w:rPr>
-              <w:t xml:space="preserve">$906,328</w:t>
+              <w:t xml:space="preserve">10,062 buyers, 3,522 subs, 955 seats</w:t>
+            </w:r>
+          </w:p>
+        </w:tc>
+        <w:tc>
+          <w:tcPr>
+            <w:tcW w:type="dxa" w:w="1500"/>
+            <w:tcMar>
+              <w:top w:type="dxa" w:w="50"/>
+              <w:left w:type="dxa" w:w="70"/>
+              <w:bottom w:type="dxa" w:w="50"/>
+              <w:right w:type="dxa" w:w="70"/>
+            </w:tcMar>
+          </w:tcPr>
+          <w:p>
+            <w:pPr>
+              <w:jc w:val="right"/>
+            </w:pPr>
+            <w:r>
+              <w:rPr>
+                <w:rFonts w:ascii="Calibri" w:cs="Calibri" w:eastAsia="Calibri" w:hAnsi="Calibri"/>
+                <w:b w:val="false"/>
+                <w:bCs w:val="false"/>
+                <w:sz w:val="14"/>
+                <w:szCs w:val="14"/>
+              </w:rPr>
+              <w:t xml:space="preserve">$1,396,873</w:t>
+            </w:r>
+          </w:p>
+        </w:tc>
+        <w:tc>
+          <w:tcPr>
+            <w:tcW w:type="dxa" w:w="1500"/>
+            <w:tcMar>
+              <w:top w:type="dxa" w:w="50"/>
+              <w:left w:type="dxa" w:w="70"/>
+              <w:bottom w:type="dxa" w:w="50"/>
+              <w:right w:type="dxa" w:w="70"/>
+            </w:tcMar>
+          </w:tcPr>
+          <w:p>
+            <w:pPr>
+              <w:jc w:val="right"/>
+            </w:pPr>
+            <w:r>
+              <w:rPr>
+                <w:rFonts w:ascii="Calibri" w:cs="Calibri" w:eastAsia="Calibri" w:hAnsi="Calibri"/>
+                <w:b w:val="false"/>
+                <w:bCs w:val="false"/>
+                <w:sz w:val="14"/>
+                <w:szCs w:val="14"/>
+              </w:rPr>
+              <w:t xml:space="preserve">($490,116)</w:t>
+            </w:r>
+          </w:p>
+        </w:tc>
+        <w:tc>
+          <w:tcPr>
+            <w:tcW w:type="dxa" w:w="1500"/>
+            <w:tcMar>
+              <w:top w:type="dxa" w:w="50"/>
+              <w:left w:type="dxa" w:w="70"/>
+              <w:bottom w:type="dxa" w:w="50"/>
+              <w:right w:type="dxa" w:w="70"/>
+            </w:tcMar>
+          </w:tcPr>
+          <w:p>
+            <w:pPr>
+              <w:jc w:val="right"/>
+            </w:pPr>
+            <w:r>
+              <w:rPr>
+                <w:rFonts w:ascii="Calibri" w:cs="Calibri" w:eastAsia="Calibri" w:hAnsi="Calibri"/>
+                <w:b w:val="false"/>
+                <w:bCs w:val="false"/>
+                <w:sz w:val="14"/>
+                <w:szCs w:val="14"/>
+              </w:rPr>
+              <w:t xml:space="preserve">$988,510</w:t>
+            </w:r>
+          </w:p>
+        </w:tc>
+        <w:tc>
+          <w:tcPr>
+            <w:tcW w:type="dxa" w:w="1500"/>
+            <w:tcMar>
+              <w:top w:type="dxa" w:w="50"/>
+              <w:left w:type="dxa" w:w="70"/>
+              <w:bottom w:type="dxa" w:w="50"/>
+              <w:right w:type="dxa" w:w="70"/>
+            </w:tcMar>
+          </w:tcPr>
+          <w:p>
+            <w:pPr>
+              <w:jc w:val="right"/>
+            </w:pPr>
+            <w:r>
+              <w:rPr>
+                <w:rFonts w:ascii="Calibri" w:cs="Calibri" w:eastAsia="Calibri" w:hAnsi="Calibri"/>
+                <w:b w:val="false"/>
+                <w:bCs w:val="false"/>
+                <w:sz w:val="14"/>
+                <w:szCs w:val="14"/>
+              </w:rPr>
+              <w:t xml:space="preserve">$906,757</w:t>
             </w:r>
           </w:p>
         </w:tc>
@@ -4358,7 +4358,7 @@
                 <w:sz w:val="14"/>
                 <w:szCs w:val="14"/>
               </w:rPr>
-              <w:t xml:space="preserve">$1,199,123</w:t>
+              <w:t xml:space="preserve">$1,199,688</w:t>
             </w:r>
           </w:p>
         </w:tc>
@@ -4412,111 +4412,111 @@
                 <w:sz w:val="14"/>
                 <w:szCs w:val="14"/>
               </w:rPr>
-              <w:t xml:space="preserve">20,113 buyers, 8,548 subs, 2,289 seats</w:t>
-            </w:r>
-          </w:p>
-        </w:tc>
-        <w:tc>
-          <w:tcPr>
-            <w:tcW w:type="dxa" w:w="1500"/>
-            <w:tcMar>
-              <w:top w:type="dxa" w:w="50"/>
-              <w:left w:type="dxa" w:w="70"/>
-              <w:bottom w:type="dxa" w:w="50"/>
-              <w:right w:type="dxa" w:w="70"/>
-            </w:tcMar>
-          </w:tcPr>
-          <w:p>
-            <w:pPr>
-              <w:jc w:val="right"/>
-            </w:pPr>
-            <w:r>
-              <w:rPr>
-                <w:rFonts w:ascii="Calibri" w:cs="Calibri" w:eastAsia="Calibri" w:hAnsi="Calibri"/>
-                <w:b w:val="false"/>
-                <w:bCs w:val="false"/>
-                <w:sz w:val="14"/>
-                <w:szCs w:val="14"/>
-              </w:rPr>
-              <w:t xml:space="preserve">$3,020,557</w:t>
-            </w:r>
-          </w:p>
-        </w:tc>
-        <w:tc>
-          <w:tcPr>
-            <w:tcW w:type="dxa" w:w="1500"/>
-            <w:tcMar>
-              <w:top w:type="dxa" w:w="50"/>
-              <w:left w:type="dxa" w:w="70"/>
-              <w:bottom w:type="dxa" w:w="50"/>
-              <w:right w:type="dxa" w:w="70"/>
-            </w:tcMar>
-          </w:tcPr>
-          <w:p>
-            <w:pPr>
-              <w:jc w:val="right"/>
-            </w:pPr>
-            <w:r>
-              <w:rPr>
-                <w:rFonts w:ascii="Calibri" w:cs="Calibri" w:eastAsia="Calibri" w:hAnsi="Calibri"/>
-                <w:b w:val="false"/>
-                <w:bCs w:val="false"/>
-                <w:sz w:val="14"/>
-                <w:szCs w:val="14"/>
-              </w:rPr>
-              <w:t xml:space="preserve">($981,638)</w:t>
-            </w:r>
-          </w:p>
-        </w:tc>
-        <w:tc>
-          <w:tcPr>
-            <w:tcW w:type="dxa" w:w="1500"/>
-            <w:tcMar>
-              <w:top w:type="dxa" w:w="50"/>
-              <w:left w:type="dxa" w:w="70"/>
-              <w:bottom w:type="dxa" w:w="50"/>
-              <w:right w:type="dxa" w:w="70"/>
-            </w:tcMar>
-          </w:tcPr>
-          <w:p>
-            <w:pPr>
-              <w:jc w:val="right"/>
-            </w:pPr>
-            <w:r>
-              <w:rPr>
-                <w:rFonts w:ascii="Calibri" w:cs="Calibri" w:eastAsia="Calibri" w:hAnsi="Calibri"/>
-                <w:b w:val="false"/>
-                <w:bCs w:val="false"/>
-                <w:sz w:val="14"/>
-                <w:szCs w:val="14"/>
-              </w:rPr>
-              <w:t xml:space="preserve">$2,151,872</w:t>
-            </w:r>
-          </w:p>
-        </w:tc>
-        <w:tc>
-          <w:tcPr>
-            <w:tcW w:type="dxa" w:w="1500"/>
-            <w:tcMar>
-              <w:top w:type="dxa" w:w="50"/>
-              <w:left w:type="dxa" w:w="70"/>
-              <w:bottom w:type="dxa" w:w="50"/>
-              <w:right w:type="dxa" w:w="70"/>
-            </w:tcMar>
-          </w:tcPr>
-          <w:p>
-            <w:pPr>
-              <w:jc w:val="right"/>
-            </w:pPr>
-            <w:r>
-              <w:rPr>
-                <w:rFonts w:ascii="Calibri" w:cs="Calibri" w:eastAsia="Calibri" w:hAnsi="Calibri"/>
-                <w:b w:val="false"/>
-                <w:bCs w:val="false"/>
-                <w:sz w:val="14"/>
-                <w:szCs w:val="14"/>
-              </w:rPr>
-              <w:t xml:space="preserve">$2,038,919</w:t>
+              <w:t xml:space="preserve">20,124 buyers, 8,553 subs, 2,289 seats</w:t>
+            </w:r>
+          </w:p>
+        </w:tc>
+        <w:tc>
+          <w:tcPr>
+            <w:tcW w:type="dxa" w:w="1500"/>
+            <w:tcMar>
+              <w:top w:type="dxa" w:w="50"/>
+              <w:left w:type="dxa" w:w="70"/>
+              <w:bottom w:type="dxa" w:w="50"/>
+              <w:right w:type="dxa" w:w="70"/>
+            </w:tcMar>
+          </w:tcPr>
+          <w:p>
+            <w:pPr>
+              <w:jc w:val="right"/>
+            </w:pPr>
+            <w:r>
+              <w:rPr>
+                <w:rFonts w:ascii="Calibri" w:cs="Calibri" w:eastAsia="Calibri" w:hAnsi="Calibri"/>
+                <w:b w:val="false"/>
+                <w:bCs w:val="false"/>
+                <w:sz w:val="14"/>
+                <w:szCs w:val="14"/>
+              </w:rPr>
+              <w:t xml:space="preserve">$3,022,076</w:t>
+            </w:r>
+          </w:p>
+        </w:tc>
+        <w:tc>
+          <w:tcPr>
+            <w:tcW w:type="dxa" w:w="1500"/>
+            <w:tcMar>
+              <w:top w:type="dxa" w:w="50"/>
+              <w:left w:type="dxa" w:w="70"/>
+              <w:bottom w:type="dxa" w:w="50"/>
+              <w:right w:type="dxa" w:w="70"/>
+            </w:tcMar>
+          </w:tcPr>
+          <w:p>
+            <w:pPr>
+              <w:jc w:val="right"/>
+            </w:pPr>
+            <w:r>
+              <w:rPr>
+                <w:rFonts w:ascii="Calibri" w:cs="Calibri" w:eastAsia="Calibri" w:hAnsi="Calibri"/>
+                <w:b w:val="false"/>
+                <w:bCs w:val="false"/>
+                <w:sz w:val="14"/>
+                <w:szCs w:val="14"/>
+              </w:rPr>
+              <w:t xml:space="preserve">($982,096)</w:t>
+            </w:r>
+          </w:p>
+        </w:tc>
+        <w:tc>
+          <w:tcPr>
+            <w:tcW w:type="dxa" w:w="1500"/>
+            <w:tcMar>
+              <w:top w:type="dxa" w:w="50"/>
+              <w:left w:type="dxa" w:w="70"/>
+              <w:bottom w:type="dxa" w:w="50"/>
+              <w:right w:type="dxa" w:w="70"/>
+            </w:tcMar>
+          </w:tcPr>
+          <w:p>
+            <w:pPr>
+              <w:jc w:val="right"/>
+            </w:pPr>
+            <w:r>
+              <w:rPr>
+                <w:rFonts w:ascii="Calibri" w:cs="Calibri" w:eastAsia="Calibri" w:hAnsi="Calibri"/>
+                <w:b w:val="false"/>
+                <w:bCs w:val="false"/>
+                <w:sz w:val="14"/>
+                <w:szCs w:val="14"/>
+              </w:rPr>
+              <w:t xml:space="preserve">$2,152,933</w:t>
+            </w:r>
+          </w:p>
+        </w:tc>
+        <w:tc>
+          <w:tcPr>
+            <w:tcW w:type="dxa" w:w="1500"/>
+            <w:tcMar>
+              <w:top w:type="dxa" w:w="50"/>
+              <w:left w:type="dxa" w:w="70"/>
+              <w:bottom w:type="dxa" w:w="50"/>
+              <w:right w:type="dxa" w:w="70"/>
+            </w:tcMar>
+          </w:tcPr>
+          <w:p>
+            <w:pPr>
+              <w:jc w:val="right"/>
+            </w:pPr>
+            <w:r>
+              <w:rPr>
+                <w:rFonts w:ascii="Calibri" w:cs="Calibri" w:eastAsia="Calibri" w:hAnsi="Calibri"/>
+                <w:b w:val="false"/>
+                <w:bCs w:val="false"/>
+                <w:sz w:val="14"/>
+                <w:szCs w:val="14"/>
+              </w:rPr>
+              <w:t xml:space="preserve">$2,039,981</w:t>
             </w:r>
           </w:p>
         </w:tc>
@@ -4542,7 +4542,7 @@
                 <w:sz w:val="14"/>
                 <w:szCs w:val="14"/>
               </w:rPr>
-              <w:t xml:space="preserve">$3,238,042</w:t>
+              <w:t xml:space="preserve">$3,239,669</w:t>
             </w:r>
           </w:p>
         </w:tc>
@@ -4596,111 +4596,111 @@
                 <w:sz w:val="14"/>
                 <w:szCs w:val="14"/>
               </w:rPr>
-              <w:t xml:space="preserve">32,181 buyers, 16,594 subs, 4,074 seats</w:t>
-            </w:r>
-          </w:p>
-        </w:tc>
-        <w:tc>
-          <w:tcPr>
-            <w:tcW w:type="dxa" w:w="1500"/>
-            <w:tcMar>
-              <w:top w:type="dxa" w:w="50"/>
-              <w:left w:type="dxa" w:w="70"/>
-              <w:bottom w:type="dxa" w:w="50"/>
-              <w:right w:type="dxa" w:w="70"/>
-            </w:tcMar>
-          </w:tcPr>
-          <w:p>
-            <w:pPr>
-              <w:jc w:val="right"/>
-            </w:pPr>
-            <w:r>
-              <w:rPr>
-                <w:rFonts w:ascii="Calibri" w:cs="Calibri" w:eastAsia="Calibri" w:hAnsi="Calibri"/>
-                <w:b w:val="false"/>
-                <w:bCs w:val="false"/>
-                <w:sz w:val="14"/>
-                <w:szCs w:val="14"/>
-              </w:rPr>
-              <w:t xml:space="preserve">$5,233,999</w:t>
-            </w:r>
-          </w:p>
-        </w:tc>
-        <w:tc>
-          <w:tcPr>
-            <w:tcW w:type="dxa" w:w="1500"/>
-            <w:tcMar>
-              <w:top w:type="dxa" w:w="50"/>
-              <w:left w:type="dxa" w:w="70"/>
-              <w:bottom w:type="dxa" w:w="50"/>
-              <w:right w:type="dxa" w:w="70"/>
-            </w:tcMar>
-          </w:tcPr>
-          <w:p>
-            <w:pPr>
-              <w:jc w:val="right"/>
-            </w:pPr>
-            <w:r>
-              <w:rPr>
-                <w:rFonts w:ascii="Calibri" w:cs="Calibri" w:eastAsia="Calibri" w:hAnsi="Calibri"/>
-                <w:b w:val="false"/>
-                <w:bCs w:val="false"/>
-                <w:sz w:val="14"/>
-                <w:szCs w:val="14"/>
-              </w:rPr>
-              <w:t xml:space="preserve">($1,624,420)</w:t>
-            </w:r>
-          </w:p>
-        </w:tc>
-        <w:tc>
-          <w:tcPr>
-            <w:tcW w:type="dxa" w:w="1500"/>
-            <w:tcMar>
-              <w:top w:type="dxa" w:w="50"/>
-              <w:left w:type="dxa" w:w="70"/>
-              <w:bottom w:type="dxa" w:w="50"/>
-              <w:right w:type="dxa" w:w="70"/>
-            </w:tcMar>
-          </w:tcPr>
-          <w:p>
-            <w:pPr>
-              <w:jc w:val="right"/>
-            </w:pPr>
-            <w:r>
-              <w:rPr>
-                <w:rFonts w:ascii="Calibri" w:cs="Calibri" w:eastAsia="Calibri" w:hAnsi="Calibri"/>
-                <w:b w:val="false"/>
-                <w:bCs w:val="false"/>
-                <w:sz w:val="14"/>
-                <w:szCs w:val="14"/>
-              </w:rPr>
-              <w:t xml:space="preserve">$3,748,832</w:t>
-            </w:r>
-          </w:p>
-        </w:tc>
-        <w:tc>
-          <w:tcPr>
-            <w:tcW w:type="dxa" w:w="1500"/>
-            <w:tcMar>
-              <w:top w:type="dxa" w:w="50"/>
-              <w:left w:type="dxa" w:w="70"/>
-              <w:bottom w:type="dxa" w:w="50"/>
-              <w:right w:type="dxa" w:w="70"/>
-            </w:tcMar>
-          </w:tcPr>
-          <w:p>
-            <w:pPr>
-              <w:jc w:val="right"/>
-            </w:pPr>
-            <w:r>
-              <w:rPr>
-                <w:rFonts w:ascii="Calibri" w:cs="Calibri" w:eastAsia="Calibri" w:hAnsi="Calibri"/>
-                <w:b w:val="false"/>
-                <w:bCs w:val="false"/>
-                <w:sz w:val="14"/>
-                <w:szCs w:val="14"/>
-              </w:rPr>
-              <w:t xml:space="preserve">$3,609,579</w:t>
+              <w:t xml:space="preserve">32,198 buyers, 16,602 subs, 4,074 seats</w:t>
+            </w:r>
+          </w:p>
+        </w:tc>
+        <w:tc>
+          <w:tcPr>
+            <w:tcW w:type="dxa" w:w="1500"/>
+            <w:tcMar>
+              <w:top w:type="dxa" w:w="50"/>
+              <w:left w:type="dxa" w:w="70"/>
+              <w:bottom w:type="dxa" w:w="50"/>
+              <w:right w:type="dxa" w:w="70"/>
+            </w:tcMar>
+          </w:tcPr>
+          <w:p>
+            <w:pPr>
+              <w:jc w:val="right"/>
+            </w:pPr>
+            <w:r>
+              <w:rPr>
+                <w:rFonts w:ascii="Calibri" w:cs="Calibri" w:eastAsia="Calibri" w:hAnsi="Calibri"/>
+                <w:b w:val="false"/>
+                <w:bCs w:val="false"/>
+                <w:sz w:val="14"/>
+                <w:szCs w:val="14"/>
+              </w:rPr>
+              <w:t xml:space="preserve">$5,236,478</w:t>
+            </w:r>
+          </w:p>
+        </w:tc>
+        <w:tc>
+          <w:tcPr>
+            <w:tcW w:type="dxa" w:w="1500"/>
+            <w:tcMar>
+              <w:top w:type="dxa" w:w="50"/>
+              <w:left w:type="dxa" w:w="70"/>
+              <w:bottom w:type="dxa" w:w="50"/>
+              <w:right w:type="dxa" w:w="70"/>
+            </w:tcMar>
+          </w:tcPr>
+          <w:p>
+            <w:pPr>
+              <w:jc w:val="right"/>
+            </w:pPr>
+            <w:r>
+              <w:rPr>
+                <w:rFonts w:ascii="Calibri" w:cs="Calibri" w:eastAsia="Calibri" w:hAnsi="Calibri"/>
+                <w:b w:val="false"/>
+                <w:bCs w:val="false"/>
+                <w:sz w:val="14"/>
+                <w:szCs w:val="14"/>
+              </w:rPr>
+              <w:t xml:space="preserve">($1,625,160)</w:t>
+            </w:r>
+          </w:p>
+        </w:tc>
+        <w:tc>
+          <w:tcPr>
+            <w:tcW w:type="dxa" w:w="1500"/>
+            <w:tcMar>
+              <w:top w:type="dxa" w:w="50"/>
+              <w:left w:type="dxa" w:w="70"/>
+              <w:bottom w:type="dxa" w:w="50"/>
+              <w:right w:type="dxa" w:w="70"/>
+            </w:tcMar>
+          </w:tcPr>
+          <w:p>
+            <w:pPr>
+              <w:jc w:val="right"/>
+            </w:pPr>
+            <w:r>
+              <w:rPr>
+                <w:rFonts w:ascii="Calibri" w:cs="Calibri" w:eastAsia="Calibri" w:hAnsi="Calibri"/>
+                <w:b w:val="false"/>
+                <w:bCs w:val="false"/>
+                <w:sz w:val="14"/>
+                <w:szCs w:val="14"/>
+              </w:rPr>
+              <w:t xml:space="preserve">$3,750,571</w:t>
+            </w:r>
+          </w:p>
+        </w:tc>
+        <w:tc>
+          <w:tcPr>
+            <w:tcW w:type="dxa" w:w="1500"/>
+            <w:tcMar>
+              <w:top w:type="dxa" w:w="50"/>
+              <w:left w:type="dxa" w:w="70"/>
+              <w:bottom w:type="dxa" w:w="50"/>
+              <w:right w:type="dxa" w:w="70"/>
+            </w:tcMar>
+          </w:tcPr>
+          <w:p>
+            <w:pPr>
+              <w:jc w:val="right"/>
+            </w:pPr>
+            <w:r>
+              <w:rPr>
+                <w:rFonts w:ascii="Calibri" w:cs="Calibri" w:eastAsia="Calibri" w:hAnsi="Calibri"/>
+                <w:b w:val="false"/>
+                <w:bCs w:val="false"/>
+                <w:sz w:val="14"/>
+                <w:szCs w:val="14"/>
+              </w:rPr>
+              <w:t xml:space="preserve">$3,611,318</w:t>
             </w:r>
           </w:p>
         </w:tc>
@@ -4726,7 +4726,7 @@
                 <w:sz w:val="14"/>
                 <w:szCs w:val="14"/>
               </w:rPr>
-              <w:t xml:space="preserve">$6,847,621</w:t>
+              <w:t xml:space="preserve">$6,850,987</w:t>
             </w:r>
           </w:p>
         </w:tc>
@@ -4780,111 +4780,111 @@
                 <w:sz w:val="14"/>
                 <w:szCs w:val="14"/>
               </w:rPr>
-              <w:t xml:space="preserve">44,249 buyers, 27,656 subs, 5,858 seats</w:t>
-            </w:r>
-          </w:p>
-        </w:tc>
-        <w:tc>
-          <w:tcPr>
-            <w:tcW w:type="dxa" w:w="1500"/>
-            <w:tcMar>
-              <w:top w:type="dxa" w:w="50"/>
-              <w:left w:type="dxa" w:w="70"/>
-              <w:bottom w:type="dxa" w:w="50"/>
-              <w:right w:type="dxa" w:w="70"/>
-            </w:tcMar>
-          </w:tcPr>
-          <w:p>
-            <w:pPr>
-              <w:jc w:val="right"/>
-            </w:pPr>
-            <w:r>
-              <w:rPr>
-                <w:rFonts w:ascii="Calibri" w:cs="Calibri" w:eastAsia="Calibri" w:hAnsi="Calibri"/>
-                <w:b w:val="false"/>
-                <w:bCs w:val="false"/>
-                <w:sz w:val="14"/>
-                <w:szCs w:val="14"/>
-              </w:rPr>
-              <w:t xml:space="preserve">$7,808,994</w:t>
-            </w:r>
-          </w:p>
-        </w:tc>
-        <w:tc>
-          <w:tcPr>
-            <w:tcW w:type="dxa" w:w="1500"/>
-            <w:tcMar>
-              <w:top w:type="dxa" w:w="50"/>
-              <w:left w:type="dxa" w:w="70"/>
-              <w:bottom w:type="dxa" w:w="50"/>
-              <w:right w:type="dxa" w:w="70"/>
-            </w:tcMar>
-          </w:tcPr>
-          <w:p>
-            <w:pPr>
-              <w:jc w:val="right"/>
-            </w:pPr>
-            <w:r>
-              <w:rPr>
-                <w:rFonts w:ascii="Calibri" w:cs="Calibri" w:eastAsia="Calibri" w:hAnsi="Calibri"/>
-                <w:b w:val="false"/>
-                <w:bCs w:val="false"/>
-                <w:sz w:val="14"/>
-                <w:szCs w:val="14"/>
-              </w:rPr>
-              <w:t xml:space="preserve">($2,350,175)</w:t>
-            </w:r>
-          </w:p>
-        </w:tc>
-        <w:tc>
-          <w:tcPr>
-            <w:tcW w:type="dxa" w:w="1500"/>
-            <w:tcMar>
-              <w:top w:type="dxa" w:w="50"/>
-              <w:left w:type="dxa" w:w="70"/>
-              <w:bottom w:type="dxa" w:w="50"/>
-              <w:right w:type="dxa" w:w="70"/>
-            </w:tcMar>
-          </w:tcPr>
-          <w:p>
-            <w:pPr>
-              <w:jc w:val="right"/>
-            </w:pPr>
-            <w:r>
-              <w:rPr>
-                <w:rFonts w:ascii="Calibri" w:cs="Calibri" w:eastAsia="Calibri" w:hAnsi="Calibri"/>
-                <w:b w:val="false"/>
-                <w:bCs w:val="false"/>
-                <w:sz w:val="14"/>
-                <w:szCs w:val="14"/>
-              </w:rPr>
-              <w:t xml:space="preserve">$5,616,801</w:t>
-            </w:r>
-          </w:p>
-        </w:tc>
-        <w:tc>
-          <w:tcPr>
-            <w:tcW w:type="dxa" w:w="1500"/>
-            <w:tcMar>
-              <w:top w:type="dxa" w:w="50"/>
-              <w:left w:type="dxa" w:w="70"/>
-              <w:bottom w:type="dxa" w:w="50"/>
-              <w:right w:type="dxa" w:w="70"/>
-            </w:tcMar>
-          </w:tcPr>
-          <w:p>
-            <w:pPr>
-              <w:jc w:val="right"/>
-            </w:pPr>
-            <w:r>
-              <w:rPr>
-                <w:rFonts w:ascii="Calibri" w:cs="Calibri" w:eastAsia="Calibri" w:hAnsi="Calibri"/>
-                <w:b w:val="false"/>
-                <w:bCs w:val="false"/>
-                <w:sz w:val="14"/>
-                <w:szCs w:val="14"/>
-              </w:rPr>
-              <w:t xml:space="preserve">$5,458,819</w:t>
+              <w:t xml:space="preserve">44,272 buyers, 27,670 subs, 5,858 seats</w:t>
+            </w:r>
+          </w:p>
+        </w:tc>
+        <w:tc>
+          <w:tcPr>
+            <w:tcW w:type="dxa" w:w="1500"/>
+            <w:tcMar>
+              <w:top w:type="dxa" w:w="50"/>
+              <w:left w:type="dxa" w:w="70"/>
+              <w:bottom w:type="dxa" w:w="50"/>
+              <w:right w:type="dxa" w:w="70"/>
+            </w:tcMar>
+          </w:tcPr>
+          <w:p>
+            <w:pPr>
+              <w:jc w:val="right"/>
+            </w:pPr>
+            <w:r>
+              <w:rPr>
+                <w:rFonts w:ascii="Calibri" w:cs="Calibri" w:eastAsia="Calibri" w:hAnsi="Calibri"/>
+                <w:b w:val="false"/>
+                <w:bCs w:val="false"/>
+                <w:sz w:val="14"/>
+                <w:szCs w:val="14"/>
+              </w:rPr>
+              <w:t xml:space="preserve">$7,812,612</w:t>
+            </w:r>
+          </w:p>
+        </w:tc>
+        <w:tc>
+          <w:tcPr>
+            <w:tcW w:type="dxa" w:w="1500"/>
+            <w:tcMar>
+              <w:top w:type="dxa" w:w="50"/>
+              <w:left w:type="dxa" w:w="70"/>
+              <w:bottom w:type="dxa" w:w="50"/>
+              <w:right w:type="dxa" w:w="70"/>
+            </w:tcMar>
+          </w:tcPr>
+          <w:p>
+            <w:pPr>
+              <w:jc w:val="right"/>
+            </w:pPr>
+            <w:r>
+              <w:rPr>
+                <w:rFonts w:ascii="Calibri" w:cs="Calibri" w:eastAsia="Calibri" w:hAnsi="Calibri"/>
+                <w:b w:val="false"/>
+                <w:bCs w:val="false"/>
+                <w:sz w:val="14"/>
+                <w:szCs w:val="14"/>
+              </w:rPr>
+              <w:t xml:space="preserve">($2,351,242)</w:t>
+            </w:r>
+          </w:p>
+        </w:tc>
+        <w:tc>
+          <w:tcPr>
+            <w:tcW w:type="dxa" w:w="1500"/>
+            <w:tcMar>
+              <w:top w:type="dxa" w:w="50"/>
+              <w:left w:type="dxa" w:w="70"/>
+              <w:bottom w:type="dxa" w:w="50"/>
+              <w:right w:type="dxa" w:w="70"/>
+            </w:tcMar>
+          </w:tcPr>
+          <w:p>
+            <w:pPr>
+              <w:jc w:val="right"/>
+            </w:pPr>
+            <w:r>
+              <w:rPr>
+                <w:rFonts w:ascii="Calibri" w:cs="Calibri" w:eastAsia="Calibri" w:hAnsi="Calibri"/>
+                <w:b w:val="false"/>
+                <w:bCs w:val="false"/>
+                <w:sz w:val="14"/>
+                <w:szCs w:val="14"/>
+              </w:rPr>
+              <w:t xml:space="preserve">$5,619,352</w:t>
+            </w:r>
+          </w:p>
+        </w:tc>
+        <w:tc>
+          <w:tcPr>
+            <w:tcW w:type="dxa" w:w="1500"/>
+            <w:tcMar>
+              <w:top w:type="dxa" w:w="50"/>
+              <w:left w:type="dxa" w:w="70"/>
+              <w:bottom w:type="dxa" w:w="50"/>
+              <w:right w:type="dxa" w:w="70"/>
+            </w:tcMar>
+          </w:tcPr>
+          <w:p>
+            <w:pPr>
+              <w:jc w:val="right"/>
+            </w:pPr>
+            <w:r>
+              <w:rPr>
+                <w:rFonts w:ascii="Calibri" w:cs="Calibri" w:eastAsia="Calibri" w:hAnsi="Calibri"/>
+                <w:b w:val="false"/>
+                <w:bCs w:val="false"/>
+                <w:sz w:val="14"/>
+                <w:szCs w:val="14"/>
+              </w:rPr>
+              <w:t xml:space="preserve">$5,461,370</w:t>
             </w:r>
           </w:p>
         </w:tc>
@@ -4910,7 +4910,7 @@
                 <w:sz w:val="14"/>
                 <w:szCs w:val="14"/>
               </w:rPr>
-              <w:t xml:space="preserve">$12,306,440</w:t>
+              <w:t xml:space="preserve">$12,312,357</w:t>
             </w:r>
           </w:p>
         </w:tc>
@@ -4990,85 +4990,85 @@
                 <w:sz w:val="14"/>
                 <w:szCs w:val="14"/>
               </w:rPr>
-              <w:t xml:space="preserve">$17,953,860</w:t>
-            </w:r>
-          </w:p>
-        </w:tc>
-        <w:tc>
-          <w:tcPr>
-            <w:tcW w:type="dxa" w:w="1500"/>
-            <w:tcMar>
-              <w:top w:type="dxa" w:w="50"/>
-              <w:left w:type="dxa" w:w="70"/>
-              <w:bottom w:type="dxa" w:w="50"/>
-              <w:right w:type="dxa" w:w="70"/>
-            </w:tcMar>
-          </w:tcPr>
-          <w:p>
-            <w:pPr>
-              <w:jc w:val="right"/>
-            </w:pPr>
-            <w:r>
-              <w:rPr>
-                <w:rFonts w:ascii="Calibri" w:cs="Calibri" w:eastAsia="Calibri" w:hAnsi="Calibri"/>
-                <w:b w:val="false"/>
-                <w:bCs w:val="false"/>
-                <w:sz w:val="14"/>
-                <w:szCs w:val="14"/>
-              </w:rPr>
-              <w:t xml:space="preserve">($5,647,421)</w:t>
-            </w:r>
-          </w:p>
-        </w:tc>
-        <w:tc>
-          <w:tcPr>
-            <w:tcW w:type="dxa" w:w="1500"/>
-            <w:tcMar>
-              <w:top w:type="dxa" w:w="50"/>
-              <w:left w:type="dxa" w:w="70"/>
-              <w:bottom w:type="dxa" w:w="50"/>
-              <w:right w:type="dxa" w:w="70"/>
-            </w:tcMar>
-          </w:tcPr>
-          <w:p>
-            <w:pPr>
-              <w:jc w:val="right"/>
-            </w:pPr>
-            <w:r>
-              <w:rPr>
-                <w:rFonts w:ascii="Calibri" w:cs="Calibri" w:eastAsia="Calibri" w:hAnsi="Calibri"/>
-                <w:b w:val="false"/>
-                <w:bCs w:val="false"/>
-                <w:sz w:val="14"/>
-                <w:szCs w:val="14"/>
-              </w:rPr>
-              <w:t xml:space="preserve">$12,850,877</w:t>
-            </w:r>
-          </w:p>
-        </w:tc>
-        <w:tc>
-          <w:tcPr>
-            <w:tcW w:type="dxa" w:w="1500"/>
-            <w:tcMar>
-              <w:top w:type="dxa" w:w="50"/>
-              <w:left w:type="dxa" w:w="70"/>
-              <w:bottom w:type="dxa" w:w="50"/>
-              <w:right w:type="dxa" w:w="70"/>
-            </w:tcMar>
-          </w:tcPr>
-          <w:p>
-            <w:pPr>
-              <w:jc w:val="right"/>
-            </w:pPr>
-            <w:r>
-              <w:rPr>
-                <w:rFonts w:ascii="Calibri" w:cs="Calibri" w:eastAsia="Calibri" w:hAnsi="Calibri"/>
-                <w:b w:val="false"/>
-                <w:bCs w:val="false"/>
-                <w:sz w:val="14"/>
-                <w:szCs w:val="14"/>
-              </w:rPr>
-              <w:t xml:space="preserve">$12,306,440</w:t>
+              <w:t xml:space="preserve">$17,962,296</w:t>
+            </w:r>
+          </w:p>
+        </w:tc>
+        <w:tc>
+          <w:tcPr>
+            <w:tcW w:type="dxa" w:w="1500"/>
+            <w:tcMar>
+              <w:top w:type="dxa" w:w="50"/>
+              <w:left w:type="dxa" w:w="70"/>
+              <w:bottom w:type="dxa" w:w="50"/>
+              <w:right w:type="dxa" w:w="70"/>
+            </w:tcMar>
+          </w:tcPr>
+          <w:p>
+            <w:pPr>
+              <w:jc w:val="right"/>
+            </w:pPr>
+            <w:r>
+              <w:rPr>
+                <w:rFonts w:ascii="Calibri" w:cs="Calibri" w:eastAsia="Calibri" w:hAnsi="Calibri"/>
+                <w:b w:val="false"/>
+                <w:bCs w:val="false"/>
+                <w:sz w:val="14"/>
+                <w:szCs w:val="14"/>
+              </w:rPr>
+              <w:t xml:space="preserve">($5,649,940)</w:t>
+            </w:r>
+          </w:p>
+        </w:tc>
+        <w:tc>
+          <w:tcPr>
+            <w:tcW w:type="dxa" w:w="1500"/>
+            <w:tcMar>
+              <w:top w:type="dxa" w:w="50"/>
+              <w:left w:type="dxa" w:w="70"/>
+              <w:bottom w:type="dxa" w:w="50"/>
+              <w:right w:type="dxa" w:w="70"/>
+            </w:tcMar>
+          </w:tcPr>
+          <w:p>
+            <w:pPr>
+              <w:jc w:val="right"/>
+            </w:pPr>
+            <w:r>
+              <w:rPr>
+                <w:rFonts w:ascii="Calibri" w:cs="Calibri" w:eastAsia="Calibri" w:hAnsi="Calibri"/>
+                <w:b w:val="false"/>
+                <w:bCs w:val="false"/>
+                <w:sz w:val="14"/>
+                <w:szCs w:val="14"/>
+              </w:rPr>
+              <w:t xml:space="preserve">$12,856,794</w:t>
+            </w:r>
+          </w:p>
+        </w:tc>
+        <w:tc>
+          <w:tcPr>
+            <w:tcW w:type="dxa" w:w="1500"/>
+            <w:tcMar>
+              <w:top w:type="dxa" w:w="50"/>
+              <w:left w:type="dxa" w:w="70"/>
+              <w:bottom w:type="dxa" w:w="50"/>
+              <w:right w:type="dxa" w:w="70"/>
+            </w:tcMar>
+          </w:tcPr>
+          <w:p>
+            <w:pPr>
+              <w:jc w:val="right"/>
+            </w:pPr>
+            <w:r>
+              <w:rPr>
+                <w:rFonts w:ascii="Calibri" w:cs="Calibri" w:eastAsia="Calibri" w:hAnsi="Calibri"/>
+                <w:b w:val="false"/>
+                <w:bCs w:val="false"/>
+                <w:sz w:val="14"/>
+                <w:szCs w:val="14"/>
+              </w:rPr>
+              <w:t xml:space="preserve">$12,312,357</w:t>
             </w:r>
           </w:p>
         </w:tc>
@@ -5094,7 +5094,7 @@
                 <w:sz w:val="14"/>
                 <w:szCs w:val="14"/>
               </w:rPr>
-              <w:t xml:space="preserve">$12,306,440</w:t>
+              <w:t xml:space="preserve">$12,312,357</w:t>
             </w:r>
           </w:p>
         </w:tc>
@@ -5122,7 +5122,7 @@
         <w:rPr>
           <w:rFonts w:ascii="Calibri" w:cs="Calibri" w:eastAsia="Calibri" w:hAnsi="Calibri"/>
         </w:rPr>
-        <w:t xml:space="preserve">Consumer model: five-year net $10,929,225, 110,623 buyers, 2.8% of the counted market after five years</w:t>
+        <w:t xml:space="preserve">Consumer model: five-year net $10,935,118, 110,681 buyers, 2.7% of the counted market after five years</w:t>
       </w:r>
     </w:p>
     <w:tbl>
@@ -5386,111 +5386,111 @@
                 <w:sz w:val="14"/>
                 <w:szCs w:val="14"/>
               </w:rPr>
-              <w:t xml:space="preserve">4,023 buyers (0.10% of market), 1,006 subs at year end</w:t>
-            </w:r>
-          </w:p>
-        </w:tc>
-        <w:tc>
-          <w:tcPr>
-            <w:tcW w:type="dxa" w:w="1500"/>
-            <w:tcMar>
-              <w:top w:type="dxa" w:w="50"/>
-              <w:left w:type="dxa" w:w="70"/>
-              <w:bottom w:type="dxa" w:w="50"/>
-              <w:right w:type="dxa" w:w="70"/>
-            </w:tcMar>
-          </w:tcPr>
-          <w:p>
-            <w:pPr>
-              <w:jc w:val="right"/>
-            </w:pPr>
-            <w:r>
-              <w:rPr>
-                <w:rFonts w:ascii="Calibri" w:cs="Calibri" w:eastAsia="Calibri" w:hAnsi="Calibri"/>
-                <w:b w:val="false"/>
-                <w:bCs w:val="false"/>
-                <w:sz w:val="14"/>
-                <w:szCs w:val="14"/>
-              </w:rPr>
-              <w:t xml:space="preserve">$462,560</w:t>
-            </w:r>
-          </w:p>
-        </w:tc>
-        <w:tc>
-          <w:tcPr>
-            <w:tcW w:type="dxa" w:w="1500"/>
-            <w:tcMar>
-              <w:top w:type="dxa" w:w="50"/>
-              <w:left w:type="dxa" w:w="70"/>
-              <w:bottom w:type="dxa" w:w="50"/>
-              <w:right w:type="dxa" w:w="70"/>
-            </w:tcMar>
-          </w:tcPr>
-          <w:p>
-            <w:pPr>
-              <w:jc w:val="right"/>
-            </w:pPr>
-            <w:r>
-              <w:rPr>
-                <w:rFonts w:ascii="Calibri" w:cs="Calibri" w:eastAsia="Calibri" w:hAnsi="Calibri"/>
-                <w:b w:val="false"/>
-                <w:bCs w:val="false"/>
-                <w:sz w:val="14"/>
-                <w:szCs w:val="14"/>
-              </w:rPr>
-              <w:t xml:space="preserve">($193,191)</w:t>
-            </w:r>
-          </w:p>
-        </w:tc>
-        <w:tc>
-          <w:tcPr>
-            <w:tcW w:type="dxa" w:w="1500"/>
-            <w:tcMar>
-              <w:top w:type="dxa" w:w="50"/>
-              <w:left w:type="dxa" w:w="70"/>
-              <w:bottom w:type="dxa" w:w="50"/>
-              <w:right w:type="dxa" w:w="70"/>
-            </w:tcMar>
-          </w:tcPr>
-          <w:p>
-            <w:pPr>
-              <w:jc w:val="right"/>
-            </w:pPr>
-            <w:r>
-              <w:rPr>
-                <w:rFonts w:ascii="Calibri" w:cs="Calibri" w:eastAsia="Calibri" w:hAnsi="Calibri"/>
-                <w:b w:val="false"/>
-                <w:bCs w:val="false"/>
-                <w:sz w:val="14"/>
-                <w:szCs w:val="14"/>
-              </w:rPr>
-              <w:t xml:space="preserve">$318,519</w:t>
-            </w:r>
-          </w:p>
-        </w:tc>
-        <w:tc>
-          <w:tcPr>
-            <w:tcW w:type="dxa" w:w="1500"/>
-            <w:tcMar>
-              <w:top w:type="dxa" w:w="50"/>
-              <w:left w:type="dxa" w:w="70"/>
-              <w:bottom w:type="dxa" w:w="50"/>
-              <w:right w:type="dxa" w:w="70"/>
-            </w:tcMar>
-          </w:tcPr>
-          <w:p>
-            <w:pPr>
-              <w:jc w:val="right"/>
-            </w:pPr>
-            <w:r>
-              <w:rPr>
-                <w:rFonts w:ascii="Calibri" w:cs="Calibri" w:eastAsia="Calibri" w:hAnsi="Calibri"/>
-                <w:b w:val="false"/>
-                <w:bCs w:val="false"/>
-                <w:sz w:val="14"/>
-                <w:szCs w:val="14"/>
-              </w:rPr>
-              <w:t xml:space="preserve">$269,369</w:t>
+              <w:t xml:space="preserve">4,025 buyers (0.10% of market), 1,006 subs at year end</w:t>
+            </w:r>
+          </w:p>
+        </w:tc>
+        <w:tc>
+          <w:tcPr>
+            <w:tcW w:type="dxa" w:w="1500"/>
+            <w:tcMar>
+              <w:top w:type="dxa" w:w="50"/>
+              <w:left w:type="dxa" w:w="70"/>
+              <w:bottom w:type="dxa" w:w="50"/>
+              <w:right w:type="dxa" w:w="70"/>
+            </w:tcMar>
+          </w:tcPr>
+          <w:p>
+            <w:pPr>
+              <w:jc w:val="right"/>
+            </w:pPr>
+            <w:r>
+              <w:rPr>
+                <w:rFonts w:ascii="Calibri" w:cs="Calibri" w:eastAsia="Calibri" w:hAnsi="Calibri"/>
+                <w:b w:val="false"/>
+                <w:bCs w:val="false"/>
+                <w:sz w:val="14"/>
+                <w:szCs w:val="14"/>
+              </w:rPr>
+              <w:t xml:space="preserve">$462,760</w:t>
+            </w:r>
+          </w:p>
+        </w:tc>
+        <w:tc>
+          <w:tcPr>
+            <w:tcW w:type="dxa" w:w="1500"/>
+            <w:tcMar>
+              <w:top w:type="dxa" w:w="50"/>
+              <w:left w:type="dxa" w:w="70"/>
+              <w:bottom w:type="dxa" w:w="50"/>
+              <w:right w:type="dxa" w:w="70"/>
+            </w:tcMar>
+          </w:tcPr>
+          <w:p>
+            <w:pPr>
+              <w:jc w:val="right"/>
+            </w:pPr>
+            <w:r>
+              <w:rPr>
+                <w:rFonts w:ascii="Calibri" w:cs="Calibri" w:eastAsia="Calibri" w:hAnsi="Calibri"/>
+                <w:b w:val="false"/>
+                <w:bCs w:val="false"/>
+                <w:sz w:val="14"/>
+                <w:szCs w:val="14"/>
+              </w:rPr>
+              <w:t xml:space="preserve">($193,256)</w:t>
+            </w:r>
+          </w:p>
+        </w:tc>
+        <w:tc>
+          <w:tcPr>
+            <w:tcW w:type="dxa" w:w="1500"/>
+            <w:tcMar>
+              <w:top w:type="dxa" w:w="50"/>
+              <w:left w:type="dxa" w:w="70"/>
+              <w:bottom w:type="dxa" w:w="50"/>
+              <w:right w:type="dxa" w:w="70"/>
+            </w:tcMar>
+          </w:tcPr>
+          <w:p>
+            <w:pPr>
+              <w:jc w:val="right"/>
+            </w:pPr>
+            <w:r>
+              <w:rPr>
+                <w:rFonts w:ascii="Calibri" w:cs="Calibri" w:eastAsia="Calibri" w:hAnsi="Calibri"/>
+                <w:b w:val="false"/>
+                <w:bCs w:val="false"/>
+                <w:sz w:val="14"/>
+                <w:szCs w:val="14"/>
+              </w:rPr>
+              <w:t xml:space="preserve">$318,655</w:t>
+            </w:r>
+          </w:p>
+        </w:tc>
+        <w:tc>
+          <w:tcPr>
+            <w:tcW w:type="dxa" w:w="1500"/>
+            <w:tcMar>
+              <w:top w:type="dxa" w:w="50"/>
+              <w:left w:type="dxa" w:w="70"/>
+              <w:bottom w:type="dxa" w:w="50"/>
+              <w:right w:type="dxa" w:w="70"/>
+            </w:tcMar>
+          </w:tcPr>
+          <w:p>
+            <w:pPr>
+              <w:jc w:val="right"/>
+            </w:pPr>
+            <w:r>
+              <w:rPr>
+                <w:rFonts w:ascii="Calibri" w:cs="Calibri" w:eastAsia="Calibri" w:hAnsi="Calibri"/>
+                <w:b w:val="false"/>
+                <w:bCs w:val="false"/>
+                <w:sz w:val="14"/>
+                <w:szCs w:val="14"/>
+              </w:rPr>
+              <w:t xml:space="preserve">$269,503</w:t>
             </w:r>
           </w:p>
         </w:tc>
@@ -5516,7 +5516,7 @@
                 <w:sz w:val="14"/>
                 <w:szCs w:val="14"/>
               </w:rPr>
-              <w:t xml:space="preserve">$269,369</w:t>
+              <w:t xml:space="preserve">$269,503</w:t>
             </w:r>
           </w:p>
         </w:tc>
@@ -5570,111 +5570,111 @@
                 <w:sz w:val="14"/>
                 <w:szCs w:val="14"/>
               </w:rPr>
-              <w:t xml:space="preserve">10,057 buyers (0.25% of market), 3,520 subs at year end</w:t>
-            </w:r>
-          </w:p>
-        </w:tc>
-        <w:tc>
-          <w:tcPr>
-            <w:tcW w:type="dxa" w:w="1500"/>
-            <w:tcMar>
-              <w:top w:type="dxa" w:w="50"/>
-              <w:left w:type="dxa" w:w="70"/>
-              <w:bottom w:type="dxa" w:w="50"/>
-              <w:right w:type="dxa" w:w="70"/>
-            </w:tcMar>
-          </w:tcPr>
-          <w:p>
-            <w:pPr>
-              <w:jc w:val="right"/>
-            </w:pPr>
-            <w:r>
-              <w:rPr>
-                <w:rFonts w:ascii="Calibri" w:cs="Calibri" w:eastAsia="Calibri" w:hAnsi="Calibri"/>
-                <w:b w:val="false"/>
-                <w:bCs w:val="false"/>
-                <w:sz w:val="14"/>
-                <w:szCs w:val="14"/>
-              </w:rPr>
-              <w:t xml:space="preserve">$1,276,887</w:t>
-            </w:r>
-          </w:p>
-        </w:tc>
-        <w:tc>
-          <w:tcPr>
-            <w:tcW w:type="dxa" w:w="1500"/>
-            <w:tcMar>
-              <w:top w:type="dxa" w:w="50"/>
-              <w:left w:type="dxa" w:w="70"/>
-              <w:bottom w:type="dxa" w:w="50"/>
-              <w:right w:type="dxa" w:w="70"/>
-            </w:tcMar>
-          </w:tcPr>
-          <w:p>
-            <w:pPr>
-              <w:jc w:val="right"/>
-            </w:pPr>
-            <w:r>
-              <w:rPr>
-                <w:rFonts w:ascii="Calibri" w:cs="Calibri" w:eastAsia="Calibri" w:hAnsi="Calibri"/>
-                <w:b w:val="false"/>
-                <w:bCs w:val="false"/>
-                <w:sz w:val="14"/>
-                <w:szCs w:val="14"/>
-              </w:rPr>
-              <w:t xml:space="preserve">($465,031)</w:t>
-            </w:r>
-          </w:p>
-        </w:tc>
-        <w:tc>
-          <w:tcPr>
-            <w:tcW w:type="dxa" w:w="1500"/>
-            <w:tcMar>
-              <w:top w:type="dxa" w:w="50"/>
-              <w:left w:type="dxa" w:w="70"/>
-              <w:bottom w:type="dxa" w:w="50"/>
-              <w:right w:type="dxa" w:w="70"/>
-            </w:tcMar>
-          </w:tcPr>
-          <w:p>
-            <w:pPr>
-              <w:jc w:val="right"/>
-            </w:pPr>
-            <w:r>
-              <w:rPr>
-                <w:rFonts w:ascii="Calibri" w:cs="Calibri" w:eastAsia="Calibri" w:hAnsi="Calibri"/>
-                <w:b w:val="false"/>
-                <w:bCs w:val="false"/>
-                <w:sz w:val="14"/>
-                <w:szCs w:val="14"/>
-              </w:rPr>
-              <w:t xml:space="preserve">$886,621</w:t>
-            </w:r>
-          </w:p>
-        </w:tc>
-        <w:tc>
-          <w:tcPr>
-            <w:tcW w:type="dxa" w:w="1500"/>
-            <w:tcMar>
-              <w:top w:type="dxa" w:w="50"/>
-              <w:left w:type="dxa" w:w="70"/>
-              <w:bottom w:type="dxa" w:w="50"/>
-              <w:right w:type="dxa" w:w="70"/>
-            </w:tcMar>
-          </w:tcPr>
-          <w:p>
-            <w:pPr>
-              <w:jc w:val="right"/>
-            </w:pPr>
-            <w:r>
-              <w:rPr>
-                <w:rFonts w:ascii="Calibri" w:cs="Calibri" w:eastAsia="Calibri" w:hAnsi="Calibri"/>
-                <w:b w:val="false"/>
-                <w:bCs w:val="false"/>
-                <w:sz w:val="14"/>
-                <w:szCs w:val="14"/>
-              </w:rPr>
-              <w:t xml:space="preserve">$811,856</w:t>
+              <w:t xml:space="preserve">10,062 buyers (0.25% of market), 3,522 subs at year end</w:t>
+            </w:r>
+          </w:p>
+        </w:tc>
+        <w:tc>
+          <w:tcPr>
+            <w:tcW w:type="dxa" w:w="1500"/>
+            <w:tcMar>
+              <w:top w:type="dxa" w:w="50"/>
+              <w:left w:type="dxa" w:w="70"/>
+              <w:bottom w:type="dxa" w:w="50"/>
+              <w:right w:type="dxa" w:w="70"/>
+            </w:tcMar>
+          </w:tcPr>
+          <w:p>
+            <w:pPr>
+              <w:jc w:val="right"/>
+            </w:pPr>
+            <w:r>
+              <w:rPr>
+                <w:rFonts w:ascii="Calibri" w:cs="Calibri" w:eastAsia="Calibri" w:hAnsi="Calibri"/>
+                <w:b w:val="false"/>
+                <w:bCs w:val="false"/>
+                <w:sz w:val="14"/>
+                <w:szCs w:val="14"/>
+              </w:rPr>
+              <w:t xml:space="preserve">$1,277,507</w:t>
+            </w:r>
+          </w:p>
+        </w:tc>
+        <w:tc>
+          <w:tcPr>
+            <w:tcW w:type="dxa" w:w="1500"/>
+            <w:tcMar>
+              <w:top w:type="dxa" w:w="50"/>
+              <w:left w:type="dxa" w:w="70"/>
+              <w:bottom w:type="dxa" w:w="50"/>
+              <w:right w:type="dxa" w:w="70"/>
+            </w:tcMar>
+          </w:tcPr>
+          <w:p>
+            <w:pPr>
+              <w:jc w:val="right"/>
+            </w:pPr>
+            <w:r>
+              <w:rPr>
+                <w:rFonts w:ascii="Calibri" w:cs="Calibri" w:eastAsia="Calibri" w:hAnsi="Calibri"/>
+                <w:b w:val="false"/>
+                <w:bCs w:val="false"/>
+                <w:sz w:val="14"/>
+                <w:szCs w:val="14"/>
+              </w:rPr>
+              <w:t xml:space="preserve">($465,225)</w:t>
+            </w:r>
+          </w:p>
+        </w:tc>
+        <w:tc>
+          <w:tcPr>
+            <w:tcW w:type="dxa" w:w="1500"/>
+            <w:tcMar>
+              <w:top w:type="dxa" w:w="50"/>
+              <w:left w:type="dxa" w:w="70"/>
+              <w:bottom w:type="dxa" w:w="50"/>
+              <w:right w:type="dxa" w:w="70"/>
+            </w:tcMar>
+          </w:tcPr>
+          <w:p>
+            <w:pPr>
+              <w:jc w:val="right"/>
+            </w:pPr>
+            <w:r>
+              <w:rPr>
+                <w:rFonts w:ascii="Calibri" w:cs="Calibri" w:eastAsia="Calibri" w:hAnsi="Calibri"/>
+                <w:b w:val="false"/>
+                <w:bCs w:val="false"/>
+                <w:sz w:val="14"/>
+                <w:szCs w:val="14"/>
+              </w:rPr>
+              <w:t xml:space="preserve">$887,049</w:t>
+            </w:r>
+          </w:p>
+        </w:tc>
+        <w:tc>
+          <w:tcPr>
+            <w:tcW w:type="dxa" w:w="1500"/>
+            <w:tcMar>
+              <w:top w:type="dxa" w:w="50"/>
+              <w:left w:type="dxa" w:w="70"/>
+              <w:bottom w:type="dxa" w:w="50"/>
+              <w:right w:type="dxa" w:w="70"/>
+            </w:tcMar>
+          </w:tcPr>
+          <w:p>
+            <w:pPr>
+              <w:jc w:val="right"/>
+            </w:pPr>
+            <w:r>
+              <w:rPr>
+                <w:rFonts w:ascii="Calibri" w:cs="Calibri" w:eastAsia="Calibri" w:hAnsi="Calibri"/>
+                <w:b w:val="false"/>
+                <w:bCs w:val="false"/>
+                <w:sz w:val="14"/>
+                <w:szCs w:val="14"/>
+              </w:rPr>
+              <w:t xml:space="preserve">$812,283</w:t>
             </w:r>
           </w:p>
         </w:tc>
@@ -5700,7 +5700,7 @@
                 <w:sz w:val="14"/>
                 <w:szCs w:val="14"/>
               </w:rPr>
-              <w:t xml:space="preserve">$1,081,225</w:t>
+              <w:t xml:space="preserve">$1,081,786</w:t>
             </w:r>
           </w:p>
         </w:tc>
@@ -5754,111 +5754,111 @@
                 <w:sz w:val="14"/>
                 <w:szCs w:val="14"/>
               </w:rPr>
-              <w:t xml:space="preserve">20,113 buyers (0.50% of market), 8,548 subs at year end</w:t>
-            </w:r>
-          </w:p>
-        </w:tc>
-        <w:tc>
-          <w:tcPr>
-            <w:tcW w:type="dxa" w:w="1500"/>
-            <w:tcMar>
-              <w:top w:type="dxa" w:w="50"/>
-              <w:left w:type="dxa" w:w="70"/>
-              <w:bottom w:type="dxa" w:w="50"/>
-              <w:right w:type="dxa" w:w="70"/>
-            </w:tcMar>
-          </w:tcPr>
-          <w:p>
-            <w:pPr>
-              <w:jc w:val="right"/>
-            </w:pPr>
-            <w:r>
-              <w:rPr>
-                <w:rFonts w:ascii="Calibri" w:cs="Calibri" w:eastAsia="Calibri" w:hAnsi="Calibri"/>
-                <w:b w:val="false"/>
-                <w:bCs w:val="false"/>
-                <w:sz w:val="14"/>
-                <w:szCs w:val="14"/>
-              </w:rPr>
-              <w:t xml:space="preserve">$2,734,455</w:t>
-            </w:r>
-          </w:p>
-        </w:tc>
-        <w:tc>
-          <w:tcPr>
-            <w:tcW w:type="dxa" w:w="1500"/>
-            <w:tcMar>
-              <w:top w:type="dxa" w:w="50"/>
-              <w:left w:type="dxa" w:w="70"/>
-              <w:bottom w:type="dxa" w:w="50"/>
-              <w:right w:type="dxa" w:w="70"/>
-            </w:tcMar>
-          </w:tcPr>
-          <w:p>
-            <w:pPr>
-              <w:jc w:val="right"/>
-            </w:pPr>
-            <w:r>
-              <w:rPr>
-                <w:rFonts w:ascii="Calibri" w:cs="Calibri" w:eastAsia="Calibri" w:hAnsi="Calibri"/>
-                <w:b w:val="false"/>
-                <w:bCs w:val="false"/>
-                <w:sz w:val="14"/>
-                <w:szCs w:val="14"/>
-              </w:rPr>
-              <w:t xml:space="preserve">($928,023)</w:t>
-            </w:r>
-          </w:p>
-        </w:tc>
-        <w:tc>
-          <w:tcPr>
-            <w:tcW w:type="dxa" w:w="1500"/>
-            <w:tcMar>
-              <w:top w:type="dxa" w:w="50"/>
-              <w:left w:type="dxa" w:w="70"/>
-              <w:bottom w:type="dxa" w:w="50"/>
-              <w:right w:type="dxa" w:w="70"/>
-            </w:tcMar>
-          </w:tcPr>
-          <w:p>
-            <w:pPr>
-              <w:jc w:val="right"/>
-            </w:pPr>
-            <w:r>
-              <w:rPr>
-                <w:rFonts w:ascii="Calibri" w:cs="Calibri" w:eastAsia="Calibri" w:hAnsi="Calibri"/>
-                <w:b w:val="false"/>
-                <w:bCs w:val="false"/>
-                <w:sz w:val="14"/>
-                <w:szCs w:val="14"/>
-              </w:rPr>
-              <w:t xml:space="preserve">$1,908,685</w:t>
-            </w:r>
-          </w:p>
-        </w:tc>
-        <w:tc>
-          <w:tcPr>
-            <w:tcW w:type="dxa" w:w="1500"/>
-            <w:tcMar>
-              <w:top w:type="dxa" w:w="50"/>
-              <w:left w:type="dxa" w:w="70"/>
-              <w:bottom w:type="dxa" w:w="50"/>
-              <w:right w:type="dxa" w:w="70"/>
-            </w:tcMar>
-          </w:tcPr>
-          <w:p>
-            <w:pPr>
-              <w:jc w:val="right"/>
-            </w:pPr>
-            <w:r>
-              <w:rPr>
-                <w:rFonts w:ascii="Calibri" w:cs="Calibri" w:eastAsia="Calibri" w:hAnsi="Calibri"/>
-                <w:b w:val="false"/>
-                <w:bCs w:val="false"/>
-                <w:sz w:val="14"/>
-                <w:szCs w:val="14"/>
-              </w:rPr>
-              <w:t xml:space="preserve">$1,806,431</w:t>
+              <w:t xml:space="preserve">20,124 buyers (0.50% of market), 8,553 subs at year end</w:t>
+            </w:r>
+          </w:p>
+        </w:tc>
+        <w:tc>
+          <w:tcPr>
+            <w:tcW w:type="dxa" w:w="1500"/>
+            <w:tcMar>
+              <w:top w:type="dxa" w:w="50"/>
+              <w:left w:type="dxa" w:w="70"/>
+              <w:bottom w:type="dxa" w:w="50"/>
+              <w:right w:type="dxa" w:w="70"/>
+            </w:tcMar>
+          </w:tcPr>
+          <w:p>
+            <w:pPr>
+              <w:jc w:val="right"/>
+            </w:pPr>
+            <w:r>
+              <w:rPr>
+                <w:rFonts w:ascii="Calibri" w:cs="Calibri" w:eastAsia="Calibri" w:hAnsi="Calibri"/>
+                <w:b w:val="false"/>
+                <w:bCs w:val="false"/>
+                <w:sz w:val="14"/>
+                <w:szCs w:val="14"/>
+              </w:rPr>
+              <w:t xml:space="preserve">$2,735,975</w:t>
+            </w:r>
+          </w:p>
+        </w:tc>
+        <w:tc>
+          <w:tcPr>
+            <w:tcW w:type="dxa" w:w="1500"/>
+            <w:tcMar>
+              <w:top w:type="dxa" w:w="50"/>
+              <w:left w:type="dxa" w:w="70"/>
+              <w:bottom w:type="dxa" w:w="50"/>
+              <w:right w:type="dxa" w:w="70"/>
+            </w:tcMar>
+          </w:tcPr>
+          <w:p>
+            <w:pPr>
+              <w:jc w:val="right"/>
+            </w:pPr>
+            <w:r>
+              <w:rPr>
+                <w:rFonts w:ascii="Calibri" w:cs="Calibri" w:eastAsia="Calibri" w:hAnsi="Calibri"/>
+                <w:b w:val="false"/>
+                <w:bCs w:val="false"/>
+                <w:sz w:val="14"/>
+                <w:szCs w:val="14"/>
+              </w:rPr>
+              <w:t xml:space="preserve">($928,487)</w:t>
+            </w:r>
+          </w:p>
+        </w:tc>
+        <w:tc>
+          <w:tcPr>
+            <w:tcW w:type="dxa" w:w="1500"/>
+            <w:tcMar>
+              <w:top w:type="dxa" w:w="50"/>
+              <w:left w:type="dxa" w:w="70"/>
+              <w:bottom w:type="dxa" w:w="50"/>
+              <w:right w:type="dxa" w:w="70"/>
+            </w:tcMar>
+          </w:tcPr>
+          <w:p>
+            <w:pPr>
+              <w:jc w:val="right"/>
+            </w:pPr>
+            <w:r>
+              <w:rPr>
+                <w:rFonts w:ascii="Calibri" w:cs="Calibri" w:eastAsia="Calibri" w:hAnsi="Calibri"/>
+                <w:b w:val="false"/>
+                <w:bCs w:val="false"/>
+                <w:sz w:val="14"/>
+                <w:szCs w:val="14"/>
+              </w:rPr>
+              <w:t xml:space="preserve">$1,909,747</w:t>
+            </w:r>
+          </w:p>
+        </w:tc>
+        <w:tc>
+          <w:tcPr>
+            <w:tcW w:type="dxa" w:w="1500"/>
+            <w:tcMar>
+              <w:top w:type="dxa" w:w="50"/>
+              <w:left w:type="dxa" w:w="70"/>
+              <w:bottom w:type="dxa" w:w="50"/>
+              <w:right w:type="dxa" w:w="70"/>
+            </w:tcMar>
+          </w:tcPr>
+          <w:p>
+            <w:pPr>
+              <w:jc w:val="right"/>
+            </w:pPr>
+            <w:r>
+              <w:rPr>
+                <w:rFonts w:ascii="Calibri" w:cs="Calibri" w:eastAsia="Calibri" w:hAnsi="Calibri"/>
+                <w:b w:val="false"/>
+                <w:bCs w:val="false"/>
+                <w:sz w:val="14"/>
+                <w:szCs w:val="14"/>
+              </w:rPr>
+              <w:t xml:space="preserve">$1,807,488</w:t>
             </w:r>
           </w:p>
         </w:tc>
@@ -5884,7 +5884,7 @@
                 <w:sz w:val="14"/>
                 <w:szCs w:val="14"/>
               </w:rPr>
-              <w:t xml:space="preserve">$2,887,656</w:t>
+              <w:t xml:space="preserve">$2,889,274</w:t>
             </w:r>
           </w:p>
         </w:tc>
@@ -5938,111 +5938,111 @@
                 <w:sz w:val="14"/>
                 <w:szCs w:val="14"/>
               </w:rPr>
-              <w:t xml:space="preserve">32,181 buyers (0.80% of market), 16,594 subs at year end</w:t>
-            </w:r>
-          </w:p>
-        </w:tc>
-        <w:tc>
-          <w:tcPr>
-            <w:tcW w:type="dxa" w:w="1500"/>
-            <w:tcMar>
-              <w:top w:type="dxa" w:w="50"/>
-              <w:left w:type="dxa" w:w="70"/>
-              <w:bottom w:type="dxa" w:w="50"/>
-              <w:right w:type="dxa" w:w="70"/>
-            </w:tcMar>
-          </w:tcPr>
-          <w:p>
-            <w:pPr>
-              <w:jc w:val="right"/>
-            </w:pPr>
-            <w:r>
-              <w:rPr>
-                <w:rFonts w:ascii="Calibri" w:cs="Calibri" w:eastAsia="Calibri" w:hAnsi="Calibri"/>
-                <w:b w:val="false"/>
-                <w:bCs w:val="false"/>
-                <w:sz w:val="14"/>
-                <w:szCs w:val="14"/>
-              </w:rPr>
-              <w:t xml:space="preserve">$4,724,789</w:t>
-            </w:r>
-          </w:p>
-        </w:tc>
-        <w:tc>
-          <w:tcPr>
-            <w:tcW w:type="dxa" w:w="1500"/>
-            <w:tcMar>
-              <w:top w:type="dxa" w:w="50"/>
-              <w:left w:type="dxa" w:w="70"/>
-              <w:bottom w:type="dxa" w:w="50"/>
-              <w:right w:type="dxa" w:w="70"/>
-            </w:tcMar>
-          </w:tcPr>
-          <w:p>
-            <w:pPr>
-              <w:jc w:val="right"/>
-            </w:pPr>
-            <w:r>
-              <w:rPr>
-                <w:rFonts w:ascii="Calibri" w:cs="Calibri" w:eastAsia="Calibri" w:hAnsi="Calibri"/>
-                <w:b w:val="false"/>
-                <w:bCs w:val="false"/>
-                <w:sz w:val="14"/>
-                <w:szCs w:val="14"/>
-              </w:rPr>
-              <w:t xml:space="preserve">($1,534,491)</w:t>
-            </w:r>
-          </w:p>
-        </w:tc>
-        <w:tc>
-          <w:tcPr>
-            <w:tcW w:type="dxa" w:w="1500"/>
-            <w:tcMar>
-              <w:top w:type="dxa" w:w="50"/>
-              <w:left w:type="dxa" w:w="70"/>
-              <w:bottom w:type="dxa" w:w="50"/>
-              <w:right w:type="dxa" w:w="70"/>
-            </w:tcMar>
-          </w:tcPr>
-          <w:p>
-            <w:pPr>
-              <w:jc w:val="right"/>
-            </w:pPr>
-            <w:r>
-              <w:rPr>
-                <w:rFonts w:ascii="Calibri" w:cs="Calibri" w:eastAsia="Calibri" w:hAnsi="Calibri"/>
-                <w:b w:val="false"/>
-                <w:bCs w:val="false"/>
-                <w:sz w:val="14"/>
-                <w:szCs w:val="14"/>
-              </w:rPr>
-              <w:t xml:space="preserve">$3,316,004</w:t>
-            </w:r>
-          </w:p>
-        </w:tc>
-        <w:tc>
-          <w:tcPr>
-            <w:tcW w:type="dxa" w:w="1500"/>
-            <w:tcMar>
-              <w:top w:type="dxa" w:w="50"/>
-              <w:left w:type="dxa" w:w="70"/>
-              <w:bottom w:type="dxa" w:w="50"/>
-              <w:right w:type="dxa" w:w="70"/>
-            </w:tcMar>
-          </w:tcPr>
-          <w:p>
-            <w:pPr>
-              <w:jc w:val="right"/>
-            </w:pPr>
-            <w:r>
-              <w:rPr>
-                <w:rFonts w:ascii="Calibri" w:cs="Calibri" w:eastAsia="Calibri" w:hAnsi="Calibri"/>
-                <w:b w:val="false"/>
-                <w:bCs w:val="false"/>
-                <w:sz w:val="14"/>
-                <w:szCs w:val="14"/>
-              </w:rPr>
-              <w:t xml:space="preserve">$3,190,299</w:t>
+              <w:t xml:space="preserve">32,198 buyers (0.80% of market), 16,602 subs at year end</w:t>
+            </w:r>
+          </w:p>
+        </w:tc>
+        <w:tc>
+          <w:tcPr>
+            <w:tcW w:type="dxa" w:w="1500"/>
+            <w:tcMar>
+              <w:top w:type="dxa" w:w="50"/>
+              <w:left w:type="dxa" w:w="70"/>
+              <w:bottom w:type="dxa" w:w="50"/>
+              <w:right w:type="dxa" w:w="70"/>
+            </w:tcMar>
+          </w:tcPr>
+          <w:p>
+            <w:pPr>
+              <w:jc w:val="right"/>
+            </w:pPr>
+            <w:r>
+              <w:rPr>
+                <w:rFonts w:ascii="Calibri" w:cs="Calibri" w:eastAsia="Calibri" w:hAnsi="Calibri"/>
+                <w:b w:val="false"/>
+                <w:bCs w:val="false"/>
+                <w:sz w:val="14"/>
+                <w:szCs w:val="14"/>
+              </w:rPr>
+              <w:t xml:space="preserve">$4,727,269</w:t>
+            </w:r>
+          </w:p>
+        </w:tc>
+        <w:tc>
+          <w:tcPr>
+            <w:tcW w:type="dxa" w:w="1500"/>
+            <w:tcMar>
+              <w:top w:type="dxa" w:w="50"/>
+              <w:left w:type="dxa" w:w="70"/>
+              <w:bottom w:type="dxa" w:w="50"/>
+              <w:right w:type="dxa" w:w="70"/>
+            </w:tcMar>
+          </w:tcPr>
+          <w:p>
+            <w:pPr>
+              <w:jc w:val="right"/>
+            </w:pPr>
+            <w:r>
+              <w:rPr>
+                <w:rFonts w:ascii="Calibri" w:cs="Calibri" w:eastAsia="Calibri" w:hAnsi="Calibri"/>
+                <w:b w:val="false"/>
+                <w:bCs w:val="false"/>
+                <w:sz w:val="14"/>
+                <w:szCs w:val="14"/>
+              </w:rPr>
+              <w:t xml:space="preserve">($1,535,238)</w:t>
+            </w:r>
+          </w:p>
+        </w:tc>
+        <w:tc>
+          <w:tcPr>
+            <w:tcW w:type="dxa" w:w="1500"/>
+            <w:tcMar>
+              <w:top w:type="dxa" w:w="50"/>
+              <w:left w:type="dxa" w:w="70"/>
+              <w:bottom w:type="dxa" w:w="50"/>
+              <w:right w:type="dxa" w:w="70"/>
+            </w:tcMar>
+          </w:tcPr>
+          <w:p>
+            <w:pPr>
+              <w:jc w:val="right"/>
+            </w:pPr>
+            <w:r>
+              <w:rPr>
+                <w:rFonts w:ascii="Calibri" w:cs="Calibri" w:eastAsia="Calibri" w:hAnsi="Calibri"/>
+                <w:b w:val="false"/>
+                <w:bCs w:val="false"/>
+                <w:sz w:val="14"/>
+                <w:szCs w:val="14"/>
+              </w:rPr>
+              <w:t xml:space="preserve">$3,317,742</w:t>
+            </w:r>
+          </w:p>
+        </w:tc>
+        <w:tc>
+          <w:tcPr>
+            <w:tcW w:type="dxa" w:w="1500"/>
+            <w:tcMar>
+              <w:top w:type="dxa" w:w="50"/>
+              <w:left w:type="dxa" w:w="70"/>
+              <w:bottom w:type="dxa" w:w="50"/>
+              <w:right w:type="dxa" w:w="70"/>
+            </w:tcMar>
+          </w:tcPr>
+          <w:p>
+            <w:pPr>
+              <w:jc w:val="right"/>
+            </w:pPr>
+            <w:r>
+              <w:rPr>
+                <w:rFonts w:ascii="Calibri" w:cs="Calibri" w:eastAsia="Calibri" w:hAnsi="Calibri"/>
+                <w:b w:val="false"/>
+                <w:bCs w:val="false"/>
+                <w:sz w:val="14"/>
+                <w:szCs w:val="14"/>
+              </w:rPr>
+              <w:t xml:space="preserve">$3,192,031</w:t>
             </w:r>
           </w:p>
         </w:tc>
@@ -6068,7 +6068,7 @@
                 <w:sz w:val="14"/>
                 <w:szCs w:val="14"/>
               </w:rPr>
-              <w:t xml:space="preserve">$6,077,955</w:t>
+              <w:t xml:space="preserve">$6,081,305</w:t>
             </w:r>
           </w:p>
         </w:tc>
@@ -6122,111 +6122,111 @@
                 <w:sz w:val="14"/>
                 <w:szCs w:val="14"/>
               </w:rPr>
-              <w:t xml:space="preserve">44,249 buyers (1.10% of market), 27,656 subs at year end</w:t>
-            </w:r>
-          </w:p>
-        </w:tc>
-        <w:tc>
-          <w:tcPr>
-            <w:tcW w:type="dxa" w:w="1500"/>
-            <w:tcMar>
-              <w:top w:type="dxa" w:w="50"/>
-              <w:left w:type="dxa" w:w="70"/>
-              <w:bottom w:type="dxa" w:w="50"/>
-              <w:right w:type="dxa" w:w="70"/>
-            </w:tcMar>
-          </w:tcPr>
-          <w:p>
-            <w:pPr>
-              <w:jc w:val="right"/>
-            </w:pPr>
-            <w:r>
-              <w:rPr>
-                <w:rFonts w:ascii="Calibri" w:cs="Calibri" w:eastAsia="Calibri" w:hAnsi="Calibri"/>
-                <w:b w:val="false"/>
-                <w:bCs w:val="false"/>
-                <w:sz w:val="14"/>
-                <w:szCs w:val="14"/>
-              </w:rPr>
-              <w:t xml:space="preserve">$7,076,803</w:t>
-            </w:r>
-          </w:p>
-        </w:tc>
-        <w:tc>
-          <w:tcPr>
-            <w:tcW w:type="dxa" w:w="1500"/>
-            <w:tcMar>
-              <w:top w:type="dxa" w:w="50"/>
-              <w:left w:type="dxa" w:w="70"/>
-              <w:bottom w:type="dxa" w:w="50"/>
-              <w:right w:type="dxa" w:w="70"/>
-            </w:tcMar>
-          </w:tcPr>
-          <w:p>
-            <w:pPr>
-              <w:jc w:val="right"/>
-            </w:pPr>
-            <w:r>
-              <w:rPr>
-                <w:rFonts w:ascii="Calibri" w:cs="Calibri" w:eastAsia="Calibri" w:hAnsi="Calibri"/>
-                <w:b w:val="false"/>
-                <w:bCs w:val="false"/>
-                <w:sz w:val="14"/>
-                <w:szCs w:val="14"/>
-              </w:rPr>
-              <w:t xml:space="preserve">($2,225,533)</w:t>
-            </w:r>
-          </w:p>
-        </w:tc>
-        <w:tc>
-          <w:tcPr>
-            <w:tcW w:type="dxa" w:w="1500"/>
-            <w:tcMar>
-              <w:top w:type="dxa" w:w="50"/>
-              <w:left w:type="dxa" w:w="70"/>
-              <w:bottom w:type="dxa" w:w="50"/>
-              <w:right w:type="dxa" w:w="70"/>
-            </w:tcMar>
-          </w:tcPr>
-          <w:p>
-            <w:pPr>
-              <w:jc w:val="right"/>
-            </w:pPr>
-            <w:r>
-              <w:rPr>
-                <w:rFonts w:ascii="Calibri" w:cs="Calibri" w:eastAsia="Calibri" w:hAnsi="Calibri"/>
-                <w:b w:val="false"/>
-                <w:bCs w:val="false"/>
-                <w:sz w:val="14"/>
-                <w:szCs w:val="14"/>
-              </w:rPr>
-              <w:t xml:space="preserve">$4,994,438</w:t>
-            </w:r>
-          </w:p>
-        </w:tc>
-        <w:tc>
-          <w:tcPr>
-            <w:tcW w:type="dxa" w:w="1500"/>
-            <w:tcMar>
-              <w:top w:type="dxa" w:w="50"/>
-              <w:left w:type="dxa" w:w="70"/>
-              <w:bottom w:type="dxa" w:w="50"/>
-              <w:right w:type="dxa" w:w="70"/>
-            </w:tcMar>
-          </w:tcPr>
-          <w:p>
-            <w:pPr>
-              <w:jc w:val="right"/>
-            </w:pPr>
-            <w:r>
-              <w:rPr>
-                <w:rFonts w:ascii="Calibri" w:cs="Calibri" w:eastAsia="Calibri" w:hAnsi="Calibri"/>
-                <w:b w:val="false"/>
-                <w:bCs w:val="false"/>
-                <w:sz w:val="14"/>
-                <w:szCs w:val="14"/>
-              </w:rPr>
-              <w:t xml:space="preserve">$4,851,270</w:t>
+              <w:t xml:space="preserve">44,272 buyers (1.10% of market), 27,670 subs at year end</w:t>
+            </w:r>
+          </w:p>
+        </w:tc>
+        <w:tc>
+          <w:tcPr>
+            <w:tcW w:type="dxa" w:w="1500"/>
+            <w:tcMar>
+              <w:top w:type="dxa" w:w="50"/>
+              <w:left w:type="dxa" w:w="70"/>
+              <w:bottom w:type="dxa" w:w="50"/>
+              <w:right w:type="dxa" w:w="70"/>
+            </w:tcMar>
+          </w:tcPr>
+          <w:p>
+            <w:pPr>
+              <w:jc w:val="right"/>
+            </w:pPr>
+            <w:r>
+              <w:rPr>
+                <w:rFonts w:ascii="Calibri" w:cs="Calibri" w:eastAsia="Calibri" w:hAnsi="Calibri"/>
+                <w:b w:val="false"/>
+                <w:bCs w:val="false"/>
+                <w:sz w:val="14"/>
+                <w:szCs w:val="14"/>
+              </w:rPr>
+              <w:t xml:space="preserve">$7,080,421</w:t>
+            </w:r>
+          </w:p>
+        </w:tc>
+        <w:tc>
+          <w:tcPr>
+            <w:tcW w:type="dxa" w:w="1500"/>
+            <w:tcMar>
+              <w:top w:type="dxa" w:w="50"/>
+              <w:left w:type="dxa" w:w="70"/>
+              <w:bottom w:type="dxa" w:w="50"/>
+              <w:right w:type="dxa" w:w="70"/>
+            </w:tcMar>
+          </w:tcPr>
+          <w:p>
+            <w:pPr>
+              <w:jc w:val="right"/>
+            </w:pPr>
+            <w:r>
+              <w:rPr>
+                <w:rFonts w:ascii="Calibri" w:cs="Calibri" w:eastAsia="Calibri" w:hAnsi="Calibri"/>
+                <w:b w:val="false"/>
+                <w:bCs w:val="false"/>
+                <w:sz w:val="14"/>
+                <w:szCs w:val="14"/>
+              </w:rPr>
+              <w:t xml:space="preserve">($2,226,607)</w:t>
+            </w:r>
+          </w:p>
+        </w:tc>
+        <w:tc>
+          <w:tcPr>
+            <w:tcW w:type="dxa" w:w="1500"/>
+            <w:tcMar>
+              <w:top w:type="dxa" w:w="50"/>
+              <w:left w:type="dxa" w:w="70"/>
+              <w:bottom w:type="dxa" w:w="50"/>
+              <w:right w:type="dxa" w:w="70"/>
+            </w:tcMar>
+          </w:tcPr>
+          <w:p>
+            <w:pPr>
+              <w:jc w:val="right"/>
+            </w:pPr>
+            <w:r>
+              <w:rPr>
+                <w:rFonts w:ascii="Calibri" w:cs="Calibri" w:eastAsia="Calibri" w:hAnsi="Calibri"/>
+                <w:b w:val="false"/>
+                <w:bCs w:val="false"/>
+                <w:sz w:val="14"/>
+                <w:szCs w:val="14"/>
+              </w:rPr>
+              <w:t xml:space="preserve">$4,996,990</w:t>
+            </w:r>
+          </w:p>
+        </w:tc>
+        <w:tc>
+          <w:tcPr>
+            <w:tcW w:type="dxa" w:w="1500"/>
+            <w:tcMar>
+              <w:top w:type="dxa" w:w="50"/>
+              <w:left w:type="dxa" w:w="70"/>
+              <w:bottom w:type="dxa" w:w="50"/>
+              <w:right w:type="dxa" w:w="70"/>
+            </w:tcMar>
+          </w:tcPr>
+          <w:p>
+            <w:pPr>
+              <w:jc w:val="right"/>
+            </w:pPr>
+            <w:r>
+              <w:rPr>
+                <w:rFonts w:ascii="Calibri" w:cs="Calibri" w:eastAsia="Calibri" w:hAnsi="Calibri"/>
+                <w:b w:val="false"/>
+                <w:bCs w:val="false"/>
+                <w:sz w:val="14"/>
+                <w:szCs w:val="14"/>
+              </w:rPr>
+              <w:t xml:space="preserve">$4,853,813</w:t>
             </w:r>
           </w:p>
         </w:tc>
@@ -6252,7 +6252,7 @@
                 <w:sz w:val="14"/>
                 <w:szCs w:val="14"/>
               </w:rPr>
-              <w:t xml:space="preserve">$10,929,225</w:t>
+              <w:t xml:space="preserve">$10,935,118</w:t>
             </w:r>
           </w:p>
         </w:tc>
@@ -6332,85 +6332,85 @@
                 <w:sz w:val="14"/>
                 <w:szCs w:val="14"/>
               </w:rPr>
-              <w:t xml:space="preserve">$16,275,494</w:t>
-            </w:r>
-          </w:p>
-        </w:tc>
-        <w:tc>
-          <w:tcPr>
-            <w:tcW w:type="dxa" w:w="1500"/>
-            <w:tcMar>
-              <w:top w:type="dxa" w:w="50"/>
-              <w:left w:type="dxa" w:w="70"/>
-              <w:bottom w:type="dxa" w:w="50"/>
-              <w:right w:type="dxa" w:w="70"/>
-            </w:tcMar>
-          </w:tcPr>
-          <w:p>
-            <w:pPr>
-              <w:jc w:val="right"/>
-            </w:pPr>
-            <w:r>
-              <w:rPr>
-                <w:rFonts w:ascii="Calibri" w:cs="Calibri" w:eastAsia="Calibri" w:hAnsi="Calibri"/>
-                <w:b w:val="false"/>
-                <w:bCs w:val="false"/>
-                <w:sz w:val="14"/>
-                <w:szCs w:val="14"/>
-              </w:rPr>
-              <w:t xml:space="preserve">($5,346,269)</w:t>
-            </w:r>
-          </w:p>
-        </w:tc>
-        <w:tc>
-          <w:tcPr>
-            <w:tcW w:type="dxa" w:w="1500"/>
-            <w:tcMar>
-              <w:top w:type="dxa" w:w="50"/>
-              <w:left w:type="dxa" w:w="70"/>
-              <w:bottom w:type="dxa" w:w="50"/>
-              <w:right w:type="dxa" w:w="70"/>
-            </w:tcMar>
-          </w:tcPr>
-          <w:p>
-            <w:pPr>
-              <w:jc w:val="right"/>
-            </w:pPr>
-            <w:r>
-              <w:rPr>
-                <w:rFonts w:ascii="Calibri" w:cs="Calibri" w:eastAsia="Calibri" w:hAnsi="Calibri"/>
-                <w:b w:val="false"/>
-                <w:bCs w:val="false"/>
-                <w:sz w:val="14"/>
-                <w:szCs w:val="14"/>
-              </w:rPr>
-              <w:t xml:space="preserve">$11,424,267</w:t>
-            </w:r>
-          </w:p>
-        </w:tc>
-        <w:tc>
-          <w:tcPr>
-            <w:tcW w:type="dxa" w:w="1500"/>
-            <w:tcMar>
-              <w:top w:type="dxa" w:w="50"/>
-              <w:left w:type="dxa" w:w="70"/>
-              <w:bottom w:type="dxa" w:w="50"/>
-              <w:right w:type="dxa" w:w="70"/>
-            </w:tcMar>
-          </w:tcPr>
-          <w:p>
-            <w:pPr>
-              <w:jc w:val="right"/>
-            </w:pPr>
-            <w:r>
-              <w:rPr>
-                <w:rFonts w:ascii="Calibri" w:cs="Calibri" w:eastAsia="Calibri" w:hAnsi="Calibri"/>
-                <w:b w:val="false"/>
-                <w:bCs w:val="false"/>
-                <w:sz w:val="14"/>
-                <w:szCs w:val="14"/>
-              </w:rPr>
-              <w:t xml:space="preserve">$10,929,225</w:t>
+              <w:t xml:space="preserve">$16,283,932</w:t>
+            </w:r>
+          </w:p>
+        </w:tc>
+        <w:tc>
+          <w:tcPr>
+            <w:tcW w:type="dxa" w:w="1500"/>
+            <w:tcMar>
+              <w:top w:type="dxa" w:w="50"/>
+              <w:left w:type="dxa" w:w="70"/>
+              <w:bottom w:type="dxa" w:w="50"/>
+              <w:right w:type="dxa" w:w="70"/>
+            </w:tcMar>
+          </w:tcPr>
+          <w:p>
+            <w:pPr>
+              <w:jc w:val="right"/>
+            </w:pPr>
+            <w:r>
+              <w:rPr>
+                <w:rFonts w:ascii="Calibri" w:cs="Calibri" w:eastAsia="Calibri" w:hAnsi="Calibri"/>
+                <w:b w:val="false"/>
+                <w:bCs w:val="false"/>
+                <w:sz w:val="14"/>
+                <w:szCs w:val="14"/>
+              </w:rPr>
+              <w:t xml:space="preserve">($5,348,813)</w:t>
+            </w:r>
+          </w:p>
+        </w:tc>
+        <w:tc>
+          <w:tcPr>
+            <w:tcW w:type="dxa" w:w="1500"/>
+            <w:tcMar>
+              <w:top w:type="dxa" w:w="50"/>
+              <w:left w:type="dxa" w:w="70"/>
+              <w:bottom w:type="dxa" w:w="50"/>
+              <w:right w:type="dxa" w:w="70"/>
+            </w:tcMar>
+          </w:tcPr>
+          <w:p>
+            <w:pPr>
+              <w:jc w:val="right"/>
+            </w:pPr>
+            <w:r>
+              <w:rPr>
+                <w:rFonts w:ascii="Calibri" w:cs="Calibri" w:eastAsia="Calibri" w:hAnsi="Calibri"/>
+                <w:b w:val="false"/>
+                <w:bCs w:val="false"/>
+                <w:sz w:val="14"/>
+                <w:szCs w:val="14"/>
+              </w:rPr>
+              <w:t xml:space="preserve">$11,430,183</w:t>
+            </w:r>
+          </w:p>
+        </w:tc>
+        <w:tc>
+          <w:tcPr>
+            <w:tcW w:type="dxa" w:w="1500"/>
+            <w:tcMar>
+              <w:top w:type="dxa" w:w="50"/>
+              <w:left w:type="dxa" w:w="70"/>
+              <w:bottom w:type="dxa" w:w="50"/>
+              <w:right w:type="dxa" w:w="70"/>
+            </w:tcMar>
+          </w:tcPr>
+          <w:p>
+            <w:pPr>
+              <w:jc w:val="right"/>
+            </w:pPr>
+            <w:r>
+              <w:rPr>
+                <w:rFonts w:ascii="Calibri" w:cs="Calibri" w:eastAsia="Calibri" w:hAnsi="Calibri"/>
+                <w:b w:val="false"/>
+                <w:bCs w:val="false"/>
+                <w:sz w:val="14"/>
+                <w:szCs w:val="14"/>
+              </w:rPr>
+              <w:t xml:space="preserve">$10,935,118</w:t>
             </w:r>
           </w:p>
         </w:tc>
@@ -6436,7 +6436,7 @@
                 <w:sz w:val="14"/>
                 <w:szCs w:val="14"/>
               </w:rPr>
-              <w:t xml:space="preserve">$10,929,225</w:t>
+              <w:t xml:space="preserve">$10,935,118</w:t>
             </w:r>
           </w:p>
         </w:tc>
@@ -6464,7 +6464,7 @@
         <w:rPr>
           <w:rFonts w:ascii="Calibri" w:cs="Calibri" w:eastAsia="Calibri" w:hAnsi="Calibri"/>
         </w:rPr>
-        <w:t xml:space="preserve">School district model: five-year net $1,164,811</w:t>
+        <w:t xml:space="preserve">School district model: five-year net $1,164,830</w:t>
       </w:r>
     </w:p>
     <w:tbl>
@@ -6780,7 +6780,7 @@
                 <w:sz w:val="14"/>
                 <w:szCs w:val="14"/>
               </w:rPr>
-              <w:t xml:space="preserve">($6,150)</w:t>
+              <w:t xml:space="preserve">($6,149)</w:t>
             </w:r>
           </w:p>
         </w:tc>
@@ -6832,7 +6832,7 @@
                 <w:sz w:val="14"/>
                 <w:szCs w:val="14"/>
               </w:rPr>
-              <w:t xml:space="preserve">$17,848</w:t>
+              <w:t xml:space="preserve">$17,849</w:t>
             </w:r>
           </w:p>
         </w:tc>
@@ -6858,7 +6858,7 @@
                 <w:sz w:val="14"/>
                 <w:szCs w:val="14"/>
               </w:rPr>
-              <w:t xml:space="preserve">$17,848</w:t>
+              <w:t xml:space="preserve">$17,849</w:t>
             </w:r>
           </w:p>
         </w:tc>
@@ -6964,7 +6964,7 @@
                 <w:sz w:val="14"/>
                 <w:szCs w:val="14"/>
               </w:rPr>
-              <w:t xml:space="preserve">($20,071)</w:t>
+              <w:t xml:space="preserve">($20,069)</w:t>
             </w:r>
           </w:p>
         </w:tc>
@@ -7016,7 +7016,7 @@
                 <w:sz w:val="14"/>
                 <w:szCs w:val="14"/>
               </w:rPr>
-              <w:t xml:space="preserve">$76,171</w:t>
+              <w:t xml:space="preserve">$76,173</w:t>
             </w:r>
           </w:p>
         </w:tc>
@@ -7042,7 +7042,7 @@
                 <w:sz w:val="14"/>
                 <w:szCs w:val="14"/>
               </w:rPr>
-              <w:t xml:space="preserve">$94,019</w:t>
+              <w:t xml:space="preserve">$94,022</w:t>
             </w:r>
           </w:p>
         </w:tc>
@@ -7148,7 +7148,7 @@
                 <w:sz w:val="14"/>
                 <w:szCs w:val="14"/>
               </w:rPr>
-              <w:t xml:space="preserve">($45,065)</w:t>
+              <w:t xml:space="preserve">($45,060)</w:t>
             </w:r>
           </w:p>
         </w:tc>
@@ -7200,7 +7200,7 @@
                 <w:sz w:val="14"/>
                 <w:szCs w:val="14"/>
               </w:rPr>
-              <w:t xml:space="preserve">$195,416</w:t>
+              <w:t xml:space="preserve">$195,420</w:t>
             </w:r>
           </w:p>
         </w:tc>
@@ -7226,7 +7226,7 @@
                 <w:sz w:val="14"/>
                 <w:szCs w:val="14"/>
               </w:rPr>
-              <w:t xml:space="preserve">$289,435</w:t>
+              <w:t xml:space="preserve">$289,442</w:t>
             </w:r>
           </w:p>
         </w:tc>
@@ -7332,7 +7332,7 @@
                 <w:sz w:val="14"/>
                 <w:szCs w:val="14"/>
               </w:rPr>
-              <w:t xml:space="preserve">($76,464)</w:t>
+              <w:t xml:space="preserve">($76,459)</w:t>
             </w:r>
           </w:p>
         </w:tc>
@@ -7384,7 +7384,7 @@
                 <w:sz w:val="14"/>
                 <w:szCs w:val="14"/>
               </w:rPr>
-              <w:t xml:space="preserve">$356,501</w:t>
+              <w:t xml:space="preserve">$356,507</w:t>
             </w:r>
           </w:p>
         </w:tc>
@@ -7410,7 +7410,7 @@
                 <w:sz w:val="14"/>
                 <w:szCs w:val="14"/>
               </w:rPr>
-              <w:t xml:space="preserve">$645,936</w:t>
+              <w:t xml:space="preserve">$645,949</w:t>
             </w:r>
           </w:p>
         </w:tc>
@@ -7516,7 +7516,7 @@
                 <w:sz w:val="14"/>
                 <w:szCs w:val="14"/>
               </w:rPr>
-              <w:t xml:space="preserve">($106,450)</w:t>
+              <w:t xml:space="preserve">($106,444)</w:t>
             </w:r>
           </w:p>
         </w:tc>
@@ -7568,7 +7568,7 @@
                 <w:sz w:val="14"/>
                 <w:szCs w:val="14"/>
               </w:rPr>
-              <w:t xml:space="preserve">$518,875</w:t>
+              <w:t xml:space="preserve">$518,881</w:t>
             </w:r>
           </w:p>
         </w:tc>
@@ -7594,7 +7594,7 @@
                 <w:sz w:val="14"/>
                 <w:szCs w:val="14"/>
               </w:rPr>
-              <w:t xml:space="preserve">$1,164,811</w:t>
+              <w:t xml:space="preserve">$1,164,830</w:t>
             </w:r>
           </w:p>
         </w:tc>
@@ -7700,7 +7700,7 @@
                 <w:sz w:val="14"/>
                 <w:szCs w:val="14"/>
               </w:rPr>
-              <w:t xml:space="preserve">($254,200)</w:t>
+              <w:t xml:space="preserve">($254,181)</w:t>
             </w:r>
           </w:p>
         </w:tc>
@@ -7752,7 +7752,7 @@
                 <w:sz w:val="14"/>
                 <w:szCs w:val="14"/>
               </w:rPr>
-              <w:t xml:space="preserve">$1,164,811</w:t>
+              <w:t xml:space="preserve">$1,164,830</w:t>
             </w:r>
           </w:p>
         </w:tc>
@@ -7778,7 +7778,7 @@
                 <w:sz w:val="14"/>
                 <w:szCs w:val="14"/>
               </w:rPr>
-              <w:t xml:space="preserve">$1,164,811</w:t>
+              <w:t xml:space="preserve">$1,164,830</w:t>
             </w:r>
           </w:p>
         </w:tc>
@@ -7806,7 +7806,7 @@
         <w:rPr>
           <w:rFonts w:ascii="Calibri" w:cs="Calibri" w:eastAsia="Calibri" w:hAnsi="Calibri"/>
         </w:rPr>
-        <w:t xml:space="preserve">Clinical model: five-year net $212,404</w:t>
+        <w:t xml:space="preserve">Clinical model: five-year net $212,407</w:t>
       </w:r>
     </w:p>
     <w:tbl>
@@ -8122,7 +8122,7 @@
                 <w:sz w:val="14"/>
                 <w:szCs w:val="14"/>
               </w:rPr>
-              <w:t xml:space="preserve">($1,922)</w:t>
+              <w:t xml:space="preserve">($1,921)</w:t>
             </w:r>
           </w:p>
         </w:tc>
@@ -8490,7 +8490,7 @@
                 <w:sz w:val="14"/>
                 <w:szCs w:val="14"/>
               </w:rPr>
-              <w:t xml:space="preserve">($8,549)</w:t>
+              <w:t xml:space="preserve">($8,548)</w:t>
             </w:r>
           </w:p>
         </w:tc>
@@ -8542,7 +8542,7 @@
                 <w:sz w:val="14"/>
                 <w:szCs w:val="14"/>
               </w:rPr>
-              <w:t xml:space="preserve">$37,072</w:t>
+              <w:t xml:space="preserve">$37,073</w:t>
             </w:r>
           </w:p>
         </w:tc>
@@ -8568,7 +8568,7 @@
                 <w:sz w:val="14"/>
                 <w:szCs w:val="14"/>
               </w:rPr>
-              <w:t xml:space="preserve">$60,951</w:t>
+              <w:t xml:space="preserve">$60,952</w:t>
             </w:r>
           </w:p>
         </w:tc>
@@ -8674,7 +8674,7 @@
                 <w:sz w:val="14"/>
                 <w:szCs w:val="14"/>
               </w:rPr>
-              <w:t xml:space="preserve">($13,465)</w:t>
+              <w:t xml:space="preserve">($13,464)</w:t>
             </w:r>
           </w:p>
         </w:tc>
@@ -8726,7 +8726,7 @@
                 <w:sz w:val="14"/>
                 <w:szCs w:val="14"/>
               </w:rPr>
-              <w:t xml:space="preserve">$62,779</w:t>
+              <w:t xml:space="preserve">$62,780</w:t>
             </w:r>
           </w:p>
         </w:tc>
@@ -8752,7 +8752,7 @@
                 <w:sz w:val="14"/>
                 <w:szCs w:val="14"/>
               </w:rPr>
-              <w:t xml:space="preserve">$123,730</w:t>
+              <w:t xml:space="preserve">$123,732</w:t>
             </w:r>
           </w:p>
         </w:tc>
@@ -8858,7 +8858,7 @@
                 <w:sz w:val="14"/>
                 <w:szCs w:val="14"/>
               </w:rPr>
-              <w:t xml:space="preserve">($18,192)</w:t>
+              <w:t xml:space="preserve">($18,191)</w:t>
             </w:r>
           </w:p>
         </w:tc>
@@ -8910,7 +8910,7 @@
                 <w:sz w:val="14"/>
                 <w:szCs w:val="14"/>
               </w:rPr>
-              <w:t xml:space="preserve">$88,674</w:t>
+              <w:t xml:space="preserve">$88,675</w:t>
             </w:r>
           </w:p>
         </w:tc>
@@ -8936,7 +8936,7 @@
                 <w:sz w:val="14"/>
                 <w:szCs w:val="14"/>
               </w:rPr>
-              <w:t xml:space="preserve">$212,404</w:t>
+              <w:t xml:space="preserve">$212,407</w:t>
             </w:r>
           </w:p>
         </w:tc>
@@ -9042,7 +9042,7 @@
                 <w:sz w:val="14"/>
                 <w:szCs w:val="14"/>
               </w:rPr>
-              <w:t xml:space="preserve">($46,950)</w:t>
+              <w:t xml:space="preserve">($46,946)</w:t>
             </w:r>
           </w:p>
         </w:tc>
@@ -9094,7 +9094,7 @@
                 <w:sz w:val="14"/>
                 <w:szCs w:val="14"/>
               </w:rPr>
-              <w:t xml:space="preserve">$212,404</w:t>
+              <w:t xml:space="preserve">$212,407</w:t>
             </w:r>
           </w:p>
         </w:tc>
@@ -9120,7 +9120,7 @@
                 <w:sz w:val="14"/>
                 <w:szCs w:val="14"/>
               </w:rPr>
-              <w:t xml:space="preserve">$212,404</w:t>
+              <w:t xml:space="preserve">$212,407</w:t>
             </w:r>
           </w:p>
         </w:tc>
@@ -9440,7 +9440,7 @@
                 <w:sz w:val="16"/>
                 <w:szCs w:val="16"/>
               </w:rPr>
-              <w:t xml:space="preserve">55,312</w:t>
+              <w:t xml:space="preserve">55,340</w:t>
             </w:r>
           </w:p>
         </w:tc>
@@ -9492,7 +9492,7 @@
                 <w:sz w:val="16"/>
                 <w:szCs w:val="16"/>
               </w:rPr>
-              <w:t xml:space="preserve">8,297</w:t>
+              <w:t xml:space="preserve">8,301</w:t>
             </w:r>
           </w:p>
         </w:tc>
@@ -9570,7 +9570,7 @@
                 <w:sz w:val="16"/>
                 <w:szCs w:val="16"/>
               </w:rPr>
-              <w:t xml:space="preserve">$7,934,459</w:t>
+              <w:t xml:space="preserve">$7,938,097</w:t>
             </w:r>
           </w:p>
         </w:tc>
@@ -9596,7 +9596,7 @@
                 <w:sz w:val="16"/>
                 <w:szCs w:val="16"/>
               </w:rPr>
-              <w:t xml:space="preserve">$5,099,593</w:t>
+              <w:t xml:space="preserve">$5,102,124</w:t>
             </w:r>
           </w:p>
         </w:tc>
@@ -9650,7 +9650,7 @@
                 <w:sz w:val="16"/>
                 <w:szCs w:val="16"/>
               </w:rPr>
-              <w:t xml:space="preserve">110,623</w:t>
+              <w:t xml:space="preserve">110,681</w:t>
             </w:r>
           </w:p>
         </w:tc>
@@ -9676,7 +9676,7 @@
                 <w:sz w:val="16"/>
                 <w:szCs w:val="16"/>
               </w:rPr>
-              <w:t xml:space="preserve">2.8%</w:t>
+              <w:t xml:space="preserve">2.7%</w:t>
             </w:r>
           </w:p>
         </w:tc>
@@ -9702,7 +9702,7 @@
                 <w:sz w:val="16"/>
                 <w:szCs w:val="16"/>
               </w:rPr>
-              <w:t xml:space="preserve">27,656</w:t>
+              <w:t xml:space="preserve">27,670</w:t>
             </w:r>
           </w:p>
         </w:tc>
@@ -9780,7 +9780,7 @@
                 <w:sz w:val="16"/>
                 <w:szCs w:val="16"/>
               </w:rPr>
-              <w:t xml:space="preserve">$17,953,860</w:t>
+              <w:t xml:space="preserve">$17,962,296</w:t>
             </w:r>
           </w:p>
         </w:tc>
@@ -9806,7 +9806,7 @@
                 <w:sz w:val="16"/>
                 <w:szCs w:val="16"/>
               </w:rPr>
-              <w:t xml:space="preserve">$12,306,440</w:t>
+              <w:t xml:space="preserve">$12,312,357</w:t>
             </w:r>
           </w:p>
         </w:tc>
@@ -9860,7 +9860,7 @@
                 <w:sz w:val="16"/>
                 <w:szCs w:val="16"/>
               </w:rPr>
-              <w:t xml:space="preserve">221,244</w:t>
+              <w:t xml:space="preserve">221,363</w:t>
             </w:r>
           </w:p>
         </w:tc>
@@ -9912,7 +9912,7 @@
                 <w:sz w:val="16"/>
                 <w:szCs w:val="16"/>
               </w:rPr>
-              <w:t xml:space="preserve">77,435</w:t>
+              <w:t xml:space="preserve">77,477</w:t>
             </w:r>
           </w:p>
         </w:tc>
@@ -9990,7 +9990,7 @@
                 <w:sz w:val="16"/>
                 <w:szCs w:val="16"/>
               </w:rPr>
-              <w:t xml:space="preserve">$40,078,576</w:t>
+              <w:t xml:space="preserve">$40,098,626</w:t>
             </w:r>
           </w:p>
         </w:tc>
@@ -10016,7 +10016,7 @@
                 <w:sz w:val="16"/>
                 <w:szCs w:val="16"/>
               </w:rPr>
-              <w:t xml:space="preserve">$28,283,856</w:t>
+              <w:t xml:space="preserve">$28,298,051</w:t>
             </w:r>
           </w:p>
         </w:tc>

</xml_diff>

<commit_message>
Market model: England's school seats from the department's own age file (49,463 autism EHC pupils aged 13 and over), replacing two estimates; US 13 to 21 share flagged with England's real ratio
Co-Authored-By: Claude Fable 5.1 <noreply@anthropic.com>
Claude-Session: https://claude.ai/code/session_01FdLL4Wp3bi12KNX6zHRo7N
</commit_message>
<xml_diff>
--- a/EZvoxa Market Model and Business Plan.docx
+++ b/EZvoxa Market Model and Business Plan.docx
@@ -1905,7 +1905,7 @@
                 <w:sz w:val="16"/>
                 <w:szCs w:val="16"/>
               </w:rPr>
-              <w:t xml:space="preserve">Share of the 6 to 21 group who are 13 to 21: nine of sixteen ages, as if every age were equal in number. NCES does not publish the autism count by age in the table read.</w:t>
+              <w:t xml:space="preserve">Share of the US 6 to 21 IDEA autism group who are 13 to 21: nine of sixteen ages, as if every age were equal in number. NCES does not publish the autism count by age in the tables read, and OSEP's autism fast-facts page blocked the request. Caution: England's own file shows only 29.9% of its autism EHC pupils aged 13 and over across ages 2 to 19, so the US share may be lower than this placeholder.</w:t>
             </w:r>
           </w:p>
         </w:tc>
@@ -2145,7 +2145,7 @@
                 <w:sz w:val="16"/>
                 <w:szCs w:val="16"/>
               </w:rPr>
-              <w:t xml:space="preserve">England pupils with an EHC plan</w:t>
+              <w:t xml:space="preserve">England pupils with an EHC plan, all needs</w:t>
             </w:r>
           </w:p>
         </w:tc>
@@ -2171,7 +2171,7 @@
                 <w:sz w:val="16"/>
                 <w:szCs w:val="16"/>
               </w:rPr>
-              <w:t xml:space="preserve">538,547, autism 33.5%</w:t>
+              <w:t xml:space="preserve">538,547</w:t>
             </w:r>
           </w:p>
         </w:tc>
@@ -2223,7 +2223,7 @@
                 <w:sz w:val="16"/>
                 <w:szCs w:val="16"/>
               </w:rPr>
-              <w:t xml:space="preserve">Department for Education, special educational needs in England, 2025/26: 538,547 pupils with an EHC plan; 33.5% with autism as the primary need.</w:t>
+              <w:t xml:space="preserve">Department for Education headline, 2025/26: 538,547 pupils with an EHC plan (6.0%), autism the most common primary need (33.5%). Shown for scale; the count used is the autism-by-age line.</w:t>
             </w:r>
           </w:p>
         </w:tc>
@@ -2251,7 +2251,7 @@
                 <w:sz w:val="16"/>
                 <w:szCs w:val="16"/>
               </w:rPr>
-              <w:t xml:space="preserve">England share aged 13 and over</w:t>
+              <w:t xml:space="preserve">England autism EHC pupils aged 13 and over</w:t>
             </w:r>
           </w:p>
         </w:tc>
@@ -2277,7 +2277,7 @@
                 <w:sz w:val="16"/>
                 <w:szCs w:val="16"/>
               </w:rPr>
-              <w:t xml:space="preserve">50%</w:t>
+              <w:t xml:space="preserve">49,463</w:t>
             </w:r>
           </w:p>
         </w:tc>
@@ -2303,7 +2303,7 @@
                 <w:sz w:val="16"/>
                 <w:szCs w:val="16"/>
               </w:rPr>
-              <w:t xml:space="preserve">Assumption, Frank’s to set</w:t>
+              <w:t xml:space="preserve">Verified from the entity’s own page</w:t>
             </w:r>
           </w:p>
         </w:tc>
@@ -2329,7 +2329,7 @@
                 <w:sz w:val="16"/>
                 <w:szCs w:val="16"/>
               </w:rPr>
-              <w:t xml:space="preserve">Share of England's EHC pupils aged 13 and over. The release does not give it in the page read; half is a placeholder.</w:t>
+              <w:t xml:space="preserve">Department for Education, special educational needs in England 2025/26, data file sen_age_sex_api.csv (national, all school types, EHC plan, primary need autistic spectrum disorder): 165,399 pupils, of whom 49,463 are aged 13 and over (29.9%). Across all needs, 153,839 of 493,764 EHC pupils in that file are 13 and over (31.2%). Read 8 Sep 2026.</w:t>
             </w:r>
           </w:p>
         </w:tc>
@@ -2383,7 +2383,7 @@
                 <w:sz w:val="16"/>
                 <w:szCs w:val="16"/>
               </w:rPr>
-              <w:t xml:space="preserve">27,062</w:t>
+              <w:t xml:space="preserve">14,839</w:t>
             </w:r>
           </w:p>
         </w:tc>
@@ -2435,7 +2435,7 @@
                 <w:sz w:val="16"/>
                 <w:szCs w:val="16"/>
               </w:rPr>
-              <w:t xml:space="preserve">Department for Education, special educational needs in England, 2025/26: 538,547 pupils with an EHC plan; 33.5% with autism as the primary need.</w:t>
+              <w:t xml:space="preserve">Department for Education, special educational needs in England 2025/26, data file sen_age_sex_api.csv (national, all school types, EHC plan, primary need autistic spectrum disorder): 165,399 pupils, of whom 49,463 are aged 13 and over (29.9%). Across all needs, 153,839 of 493,764 EHC pupils in that file are 13 and over (31.2%). Read 8 Sep 2026.</w:t>
             </w:r>
           </w:p>
         </w:tc>
@@ -2676,7 +2676,7 @@
           <w:sz w:val="22"/>
           <w:szCs w:val="22"/>
         </w:rPr>
-        <w:t xml:space="preserve">Counted school market: 192,437 seats, US and England. Special education outside those two is not yet read.</w:t>
+        <w:t xml:space="preserve">Counted school market: 180,214 seats, US and England. Special education outside those two is not yet read.</w:t>
       </w:r>
     </w:p>
     <w:p>
@@ -3780,7 +3780,7 @@
         <w:rPr>
           <w:rFonts w:ascii="Calibri" w:cs="Calibri" w:eastAsia="Calibri" w:hAnsi="Calibri"/>
         </w:rPr>
-        <w:t xml:space="preserve">All three models combined: five-year net $12,312,357</w:t>
+        <w:t xml:space="preserve">All three models combined: five-year net $12,235,865</w:t>
       </w:r>
     </w:p>
     <w:tbl>
@@ -4044,111 +4044,111 @@
                 <w:sz w:val="14"/>
                 <w:szCs w:val="14"/>
               </w:rPr>
-              <w:t xml:space="preserve">4,025 buyers, 1,006 subs, 252 seats</w:t>
-            </w:r>
-          </w:p>
-        </w:tc>
-        <w:tc>
-          <w:tcPr>
-            <w:tcW w:type="dxa" w:w="1500"/>
-            <w:tcMar>
-              <w:top w:type="dxa" w:w="50"/>
-              <w:left w:type="dxa" w:w="70"/>
-              <w:bottom w:type="dxa" w:w="50"/>
-              <w:right w:type="dxa" w:w="70"/>
-            </w:tcMar>
-          </w:tcPr>
-          <w:p>
-            <w:pPr>
-              <w:jc w:val="right"/>
-            </w:pPr>
-            <w:r>
-              <w:rPr>
-                <w:rFonts w:ascii="Calibri" w:cs="Calibri" w:eastAsia="Calibri" w:hAnsi="Calibri"/>
-                <w:b w:val="false"/>
-                <w:bCs w:val="false"/>
-                <w:sz w:val="14"/>
-                <w:szCs w:val="14"/>
-              </w:rPr>
-              <w:t xml:space="preserve">$494,257</w:t>
-            </w:r>
-          </w:p>
-        </w:tc>
-        <w:tc>
-          <w:tcPr>
-            <w:tcW w:type="dxa" w:w="1500"/>
-            <w:tcMar>
-              <w:top w:type="dxa" w:w="50"/>
-              <w:left w:type="dxa" w:w="70"/>
-              <w:bottom w:type="dxa" w:w="50"/>
-              <w:right w:type="dxa" w:w="70"/>
-            </w:tcMar>
-          </w:tcPr>
-          <w:p>
-            <w:pPr>
-              <w:jc w:val="right"/>
-            </w:pPr>
-            <w:r>
-              <w:rPr>
-                <w:rFonts w:ascii="Calibri" w:cs="Calibri" w:eastAsia="Calibri" w:hAnsi="Calibri"/>
-                <w:b w:val="false"/>
-                <w:bCs w:val="false"/>
-                <w:sz w:val="14"/>
-                <w:szCs w:val="14"/>
-              </w:rPr>
-              <w:t xml:space="preserve">($201,326)</w:t>
-            </w:r>
-          </w:p>
-        </w:tc>
-        <w:tc>
-          <w:tcPr>
-            <w:tcW w:type="dxa" w:w="1500"/>
-            <w:tcMar>
-              <w:top w:type="dxa" w:w="50"/>
-              <w:left w:type="dxa" w:w="70"/>
-              <w:bottom w:type="dxa" w:w="50"/>
-              <w:right w:type="dxa" w:w="70"/>
-            </w:tcMar>
-          </w:tcPr>
-          <w:p>
-            <w:pPr>
-              <w:jc w:val="right"/>
-            </w:pPr>
-            <w:r>
-              <w:rPr>
-                <w:rFonts w:ascii="Calibri" w:cs="Calibri" w:eastAsia="Calibri" w:hAnsi="Calibri"/>
-                <w:b w:val="false"/>
-                <w:bCs w:val="false"/>
-                <w:sz w:val="14"/>
-                <w:szCs w:val="14"/>
-              </w:rPr>
-              <w:t xml:space="preserve">$345,428</w:t>
-            </w:r>
-          </w:p>
-        </w:tc>
-        <w:tc>
-          <w:tcPr>
-            <w:tcW w:type="dxa" w:w="1500"/>
-            <w:tcMar>
-              <w:top w:type="dxa" w:w="50"/>
-              <w:left w:type="dxa" w:w="70"/>
-              <w:bottom w:type="dxa" w:w="50"/>
-              <w:right w:type="dxa" w:w="70"/>
-            </w:tcMar>
-          </w:tcPr>
-          <w:p>
-            <w:pPr>
-              <w:jc w:val="right"/>
-            </w:pPr>
-            <w:r>
-              <w:rPr>
-                <w:rFonts w:ascii="Calibri" w:cs="Calibri" w:eastAsia="Calibri" w:hAnsi="Calibri"/>
-                <w:b w:val="false"/>
-                <w:bCs w:val="false"/>
-                <w:sz w:val="14"/>
-                <w:szCs w:val="14"/>
-              </w:rPr>
-              <w:t xml:space="preserve">$292,931</w:t>
+              <w:t xml:space="preserve">4,025 buyers, 1,006 subs, 240 seats</w:t>
+            </w:r>
+          </w:p>
+        </w:tc>
+        <w:tc>
+          <w:tcPr>
+            <w:tcW w:type="dxa" w:w="1500"/>
+            <w:tcMar>
+              <w:top w:type="dxa" w:w="50"/>
+              <w:left w:type="dxa" w:w="70"/>
+              <w:bottom w:type="dxa" w:w="50"/>
+              <w:right w:type="dxa" w:w="70"/>
+            </w:tcMar>
+          </w:tcPr>
+          <w:p>
+            <w:pPr>
+              <w:jc w:val="right"/>
+            </w:pPr>
+            <w:r>
+              <w:rPr>
+                <w:rFonts w:ascii="Calibri" w:cs="Calibri" w:eastAsia="Calibri" w:hAnsi="Calibri"/>
+                <w:b w:val="false"/>
+                <w:bCs w:val="false"/>
+                <w:sz w:val="14"/>
+                <w:szCs w:val="14"/>
+              </w:rPr>
+              <w:t xml:space="preserve">$492,757</w:t>
+            </w:r>
+          </w:p>
+        </w:tc>
+        <w:tc>
+          <w:tcPr>
+            <w:tcW w:type="dxa" w:w="1500"/>
+            <w:tcMar>
+              <w:top w:type="dxa" w:w="50"/>
+              <w:left w:type="dxa" w:w="70"/>
+              <w:bottom w:type="dxa" w:w="50"/>
+              <w:right w:type="dxa" w:w="70"/>
+            </w:tcMar>
+          </w:tcPr>
+          <w:p>
+            <w:pPr>
+              <w:jc w:val="right"/>
+            </w:pPr>
+            <w:r>
+              <w:rPr>
+                <w:rFonts w:ascii="Calibri" w:cs="Calibri" w:eastAsia="Calibri" w:hAnsi="Calibri"/>
+                <w:b w:val="false"/>
+                <w:bCs w:val="false"/>
+                <w:sz w:val="14"/>
+                <w:szCs w:val="14"/>
+              </w:rPr>
+              <w:t xml:space="preserve">($201,101)</w:t>
+            </w:r>
+          </w:p>
+        </w:tc>
+        <w:tc>
+          <w:tcPr>
+            <w:tcW w:type="dxa" w:w="1500"/>
+            <w:tcMar>
+              <w:top w:type="dxa" w:w="50"/>
+              <w:left w:type="dxa" w:w="70"/>
+              <w:bottom w:type="dxa" w:w="50"/>
+              <w:right w:type="dxa" w:w="70"/>
+            </w:tcMar>
+          </w:tcPr>
+          <w:p>
+            <w:pPr>
+              <w:jc w:val="right"/>
+            </w:pPr>
+            <w:r>
+              <w:rPr>
+                <w:rFonts w:ascii="Calibri" w:cs="Calibri" w:eastAsia="Calibri" w:hAnsi="Calibri"/>
+                <w:b w:val="false"/>
+                <w:bCs w:val="false"/>
+                <w:sz w:val="14"/>
+                <w:szCs w:val="14"/>
+              </w:rPr>
+              <w:t xml:space="preserve">$344,153</w:t>
+            </w:r>
+          </w:p>
+        </w:tc>
+        <w:tc>
+          <w:tcPr>
+            <w:tcW w:type="dxa" w:w="1500"/>
+            <w:tcMar>
+              <w:top w:type="dxa" w:w="50"/>
+              <w:left w:type="dxa" w:w="70"/>
+              <w:bottom w:type="dxa" w:w="50"/>
+              <w:right w:type="dxa" w:w="70"/>
+            </w:tcMar>
+          </w:tcPr>
+          <w:p>
+            <w:pPr>
+              <w:jc w:val="right"/>
+            </w:pPr>
+            <w:r>
+              <w:rPr>
+                <w:rFonts w:ascii="Calibri" w:cs="Calibri" w:eastAsia="Calibri" w:hAnsi="Calibri"/>
+                <w:b w:val="false"/>
+                <w:bCs w:val="false"/>
+                <w:sz w:val="14"/>
+                <w:szCs w:val="14"/>
+              </w:rPr>
+              <w:t xml:space="preserve">$291,656</w:t>
             </w:r>
           </w:p>
         </w:tc>
@@ -4174,7 +4174,7 @@
                 <w:sz w:val="14"/>
                 <w:szCs w:val="14"/>
               </w:rPr>
-              <w:t xml:space="preserve">$292,931</w:t>
+              <w:t xml:space="preserve">$291,656</w:t>
             </w:r>
           </w:p>
         </w:tc>
@@ -4228,111 +4228,111 @@
                 <w:sz w:val="14"/>
                 <w:szCs w:val="14"/>
               </w:rPr>
-              <w:t xml:space="preserve">10,062 buyers, 3,522 subs, 955 seats</w:t>
-            </w:r>
-          </w:p>
-        </w:tc>
-        <w:tc>
-          <w:tcPr>
-            <w:tcW w:type="dxa" w:w="1500"/>
-            <w:tcMar>
-              <w:top w:type="dxa" w:w="50"/>
-              <w:left w:type="dxa" w:w="70"/>
-              <w:bottom w:type="dxa" w:w="50"/>
-              <w:right w:type="dxa" w:w="70"/>
-            </w:tcMar>
-          </w:tcPr>
-          <w:p>
-            <w:pPr>
-              <w:jc w:val="right"/>
-            </w:pPr>
-            <w:r>
-              <w:rPr>
-                <w:rFonts w:ascii="Calibri" w:cs="Calibri" w:eastAsia="Calibri" w:hAnsi="Calibri"/>
-                <w:b w:val="false"/>
-                <w:bCs w:val="false"/>
-                <w:sz w:val="14"/>
-                <w:szCs w:val="14"/>
-              </w:rPr>
-              <w:t xml:space="preserve">$1,396,873</w:t>
-            </w:r>
-          </w:p>
-        </w:tc>
-        <w:tc>
-          <w:tcPr>
-            <w:tcW w:type="dxa" w:w="1500"/>
-            <w:tcMar>
-              <w:top w:type="dxa" w:w="50"/>
-              <w:left w:type="dxa" w:w="70"/>
-              <w:bottom w:type="dxa" w:w="50"/>
-              <w:right w:type="dxa" w:w="70"/>
-            </w:tcMar>
-          </w:tcPr>
-          <w:p>
-            <w:pPr>
-              <w:jc w:val="right"/>
-            </w:pPr>
-            <w:r>
-              <w:rPr>
-                <w:rFonts w:ascii="Calibri" w:cs="Calibri" w:eastAsia="Calibri" w:hAnsi="Calibri"/>
-                <w:b w:val="false"/>
-                <w:bCs w:val="false"/>
-                <w:sz w:val="14"/>
-                <w:szCs w:val="14"/>
-              </w:rPr>
-              <w:t xml:space="preserve">($490,116)</w:t>
-            </w:r>
-          </w:p>
-        </w:tc>
-        <w:tc>
-          <w:tcPr>
-            <w:tcW w:type="dxa" w:w="1500"/>
-            <w:tcMar>
-              <w:top w:type="dxa" w:w="50"/>
-              <w:left w:type="dxa" w:w="70"/>
-              <w:bottom w:type="dxa" w:w="50"/>
-              <w:right w:type="dxa" w:w="70"/>
-            </w:tcMar>
-          </w:tcPr>
-          <w:p>
-            <w:pPr>
-              <w:jc w:val="right"/>
-            </w:pPr>
-            <w:r>
-              <w:rPr>
-                <w:rFonts w:ascii="Calibri" w:cs="Calibri" w:eastAsia="Calibri" w:hAnsi="Calibri"/>
-                <w:b w:val="false"/>
-                <w:bCs w:val="false"/>
-                <w:sz w:val="14"/>
-                <w:szCs w:val="14"/>
-              </w:rPr>
-              <w:t xml:space="preserve">$988,510</w:t>
-            </w:r>
-          </w:p>
-        </w:tc>
-        <w:tc>
-          <w:tcPr>
-            <w:tcW w:type="dxa" w:w="1500"/>
-            <w:tcMar>
-              <w:top w:type="dxa" w:w="50"/>
-              <w:left w:type="dxa" w:w="70"/>
-              <w:bottom w:type="dxa" w:w="50"/>
-              <w:right w:type="dxa" w:w="70"/>
-            </w:tcMar>
-          </w:tcPr>
-          <w:p>
-            <w:pPr>
-              <w:jc w:val="right"/>
-            </w:pPr>
-            <w:r>
-              <w:rPr>
-                <w:rFonts w:ascii="Calibri" w:cs="Calibri" w:eastAsia="Calibri" w:hAnsi="Calibri"/>
-                <w:b w:val="false"/>
-                <w:bCs w:val="false"/>
-                <w:sz w:val="14"/>
-                <w:szCs w:val="14"/>
-              </w:rPr>
-              <w:t xml:space="preserve">$906,757</w:t>
+              <w:t xml:space="preserve">10,062 buyers, 3,522 subs, 906 seats</w:t>
+            </w:r>
+          </w:p>
+        </w:tc>
+        <w:tc>
+          <w:tcPr>
+            <w:tcW w:type="dxa" w:w="1500"/>
+            <w:tcMar>
+              <w:top w:type="dxa" w:w="50"/>
+              <w:left w:type="dxa" w:w="70"/>
+              <w:bottom w:type="dxa" w:w="50"/>
+              <w:right w:type="dxa" w:w="70"/>
+            </w:tcMar>
+          </w:tcPr>
+          <w:p>
+            <w:pPr>
+              <w:jc w:val="right"/>
+            </w:pPr>
+            <w:r>
+              <w:rPr>
+                <w:rFonts w:ascii="Calibri" w:cs="Calibri" w:eastAsia="Calibri" w:hAnsi="Calibri"/>
+                <w:b w:val="false"/>
+                <w:bCs w:val="false"/>
+                <w:sz w:val="14"/>
+                <w:szCs w:val="14"/>
+              </w:rPr>
+              <w:t xml:space="preserve">$1,390,749</w:t>
+            </w:r>
+          </w:p>
+        </w:tc>
+        <w:tc>
+          <w:tcPr>
+            <w:tcW w:type="dxa" w:w="1500"/>
+            <w:tcMar>
+              <w:top w:type="dxa" w:w="50"/>
+              <w:left w:type="dxa" w:w="70"/>
+              <w:bottom w:type="dxa" w:w="50"/>
+              <w:right w:type="dxa" w:w="70"/>
+            </w:tcMar>
+          </w:tcPr>
+          <w:p>
+            <w:pPr>
+              <w:jc w:val="right"/>
+            </w:pPr>
+            <w:r>
+              <w:rPr>
+                <w:rFonts w:ascii="Calibri" w:cs="Calibri" w:eastAsia="Calibri" w:hAnsi="Calibri"/>
+                <w:b w:val="false"/>
+                <w:bCs w:val="false"/>
+                <w:sz w:val="14"/>
+                <w:szCs w:val="14"/>
+              </w:rPr>
+              <w:t xml:space="preserve">($489,197)</w:t>
+            </w:r>
+          </w:p>
+        </w:tc>
+        <w:tc>
+          <w:tcPr>
+            <w:tcW w:type="dxa" w:w="1500"/>
+            <w:tcMar>
+              <w:top w:type="dxa" w:w="50"/>
+              <w:left w:type="dxa" w:w="70"/>
+              <w:bottom w:type="dxa" w:w="50"/>
+              <w:right w:type="dxa" w:w="70"/>
+            </w:tcMar>
+          </w:tcPr>
+          <w:p>
+            <w:pPr>
+              <w:jc w:val="right"/>
+            </w:pPr>
+            <w:r>
+              <w:rPr>
+                <w:rFonts w:ascii="Calibri" w:cs="Calibri" w:eastAsia="Calibri" w:hAnsi="Calibri"/>
+                <w:b w:val="false"/>
+                <w:bCs w:val="false"/>
+                <w:sz w:val="14"/>
+                <w:szCs w:val="14"/>
+              </w:rPr>
+              <w:t xml:space="preserve">$983,305</w:t>
+            </w:r>
+          </w:p>
+        </w:tc>
+        <w:tc>
+          <w:tcPr>
+            <w:tcW w:type="dxa" w:w="1500"/>
+            <w:tcMar>
+              <w:top w:type="dxa" w:w="50"/>
+              <w:left w:type="dxa" w:w="70"/>
+              <w:bottom w:type="dxa" w:w="50"/>
+              <w:right w:type="dxa" w:w="70"/>
+            </w:tcMar>
+          </w:tcPr>
+          <w:p>
+            <w:pPr>
+              <w:jc w:val="right"/>
+            </w:pPr>
+            <w:r>
+              <w:rPr>
+                <w:rFonts w:ascii="Calibri" w:cs="Calibri" w:eastAsia="Calibri" w:hAnsi="Calibri"/>
+                <w:b w:val="false"/>
+                <w:bCs w:val="false"/>
+                <w:sz w:val="14"/>
+                <w:szCs w:val="14"/>
+              </w:rPr>
+              <w:t xml:space="preserve">$901,552</w:t>
             </w:r>
           </w:p>
         </w:tc>
@@ -4358,7 +4358,7 @@
                 <w:sz w:val="14"/>
                 <w:szCs w:val="14"/>
               </w:rPr>
-              <w:t xml:space="preserve">$1,199,688</w:t>
+              <w:t xml:space="preserve">$1,193,208</w:t>
             </w:r>
           </w:p>
         </w:tc>
@@ -4412,111 +4412,111 @@
                 <w:sz w:val="14"/>
                 <w:szCs w:val="14"/>
               </w:rPr>
-              <w:t xml:space="preserve">20,124 buyers, 8,553 subs, 2,289 seats</w:t>
-            </w:r>
-          </w:p>
-        </w:tc>
-        <w:tc>
-          <w:tcPr>
-            <w:tcW w:type="dxa" w:w="1500"/>
-            <w:tcMar>
-              <w:top w:type="dxa" w:w="50"/>
-              <w:left w:type="dxa" w:w="70"/>
-              <w:bottom w:type="dxa" w:w="50"/>
-              <w:right w:type="dxa" w:w="70"/>
-            </w:tcMar>
-          </w:tcPr>
-          <w:p>
-            <w:pPr>
-              <w:jc w:val="right"/>
-            </w:pPr>
-            <w:r>
-              <w:rPr>
-                <w:rFonts w:ascii="Calibri" w:cs="Calibri" w:eastAsia="Calibri" w:hAnsi="Calibri"/>
-                <w:b w:val="false"/>
-                <w:bCs w:val="false"/>
-                <w:sz w:val="14"/>
-                <w:szCs w:val="14"/>
-              </w:rPr>
-              <w:t xml:space="preserve">$3,022,076</w:t>
-            </w:r>
-          </w:p>
-        </w:tc>
-        <w:tc>
-          <w:tcPr>
-            <w:tcW w:type="dxa" w:w="1500"/>
-            <w:tcMar>
-              <w:top w:type="dxa" w:w="50"/>
-              <w:left w:type="dxa" w:w="70"/>
-              <w:bottom w:type="dxa" w:w="50"/>
-              <w:right w:type="dxa" w:w="70"/>
-            </w:tcMar>
-          </w:tcPr>
-          <w:p>
-            <w:pPr>
-              <w:jc w:val="right"/>
-            </w:pPr>
-            <w:r>
-              <w:rPr>
-                <w:rFonts w:ascii="Calibri" w:cs="Calibri" w:eastAsia="Calibri" w:hAnsi="Calibri"/>
-                <w:b w:val="false"/>
-                <w:bCs w:val="false"/>
-                <w:sz w:val="14"/>
-                <w:szCs w:val="14"/>
-              </w:rPr>
-              <w:t xml:space="preserve">($982,096)</w:t>
-            </w:r>
-          </w:p>
-        </w:tc>
-        <w:tc>
-          <w:tcPr>
-            <w:tcW w:type="dxa" w:w="1500"/>
-            <w:tcMar>
-              <w:top w:type="dxa" w:w="50"/>
-              <w:left w:type="dxa" w:w="70"/>
-              <w:bottom w:type="dxa" w:w="50"/>
-              <w:right w:type="dxa" w:w="70"/>
-            </w:tcMar>
-          </w:tcPr>
-          <w:p>
-            <w:pPr>
-              <w:jc w:val="right"/>
-            </w:pPr>
-            <w:r>
-              <w:rPr>
-                <w:rFonts w:ascii="Calibri" w:cs="Calibri" w:eastAsia="Calibri" w:hAnsi="Calibri"/>
-                <w:b w:val="false"/>
-                <w:bCs w:val="false"/>
-                <w:sz w:val="14"/>
-                <w:szCs w:val="14"/>
-              </w:rPr>
-              <w:t xml:space="preserve">$2,152,933</w:t>
-            </w:r>
-          </w:p>
-        </w:tc>
-        <w:tc>
-          <w:tcPr>
-            <w:tcW w:type="dxa" w:w="1500"/>
-            <w:tcMar>
-              <w:top w:type="dxa" w:w="50"/>
-              <w:left w:type="dxa" w:w="70"/>
-              <w:bottom w:type="dxa" w:w="50"/>
-              <w:right w:type="dxa" w:w="70"/>
-            </w:tcMar>
-          </w:tcPr>
-          <w:p>
-            <w:pPr>
-              <w:jc w:val="right"/>
-            </w:pPr>
-            <w:r>
-              <w:rPr>
-                <w:rFonts w:ascii="Calibri" w:cs="Calibri" w:eastAsia="Calibri" w:hAnsi="Calibri"/>
-                <w:b w:val="false"/>
-                <w:bCs w:val="false"/>
-                <w:sz w:val="14"/>
-                <w:szCs w:val="14"/>
-              </w:rPr>
-              <w:t xml:space="preserve">$2,039,981</w:t>
+              <w:t xml:space="preserve">20,124 buyers, 8,553 subs, 2,167 seats</w:t>
+            </w:r>
+          </w:p>
+        </w:tc>
+        <w:tc>
+          <w:tcPr>
+            <w:tcW w:type="dxa" w:w="1500"/>
+            <w:tcMar>
+              <w:top w:type="dxa" w:w="50"/>
+              <w:left w:type="dxa" w:w="70"/>
+              <w:bottom w:type="dxa" w:w="50"/>
+              <w:right w:type="dxa" w:w="70"/>
+            </w:tcMar>
+          </w:tcPr>
+          <w:p>
+            <w:pPr>
+              <w:jc w:val="right"/>
+            </w:pPr>
+            <w:r>
+              <w:rPr>
+                <w:rFonts w:ascii="Calibri" w:cs="Calibri" w:eastAsia="Calibri" w:hAnsi="Calibri"/>
+                <w:b w:val="false"/>
+                <w:bCs w:val="false"/>
+                <w:sz w:val="14"/>
+                <w:szCs w:val="14"/>
+              </w:rPr>
+              <w:t xml:space="preserve">$3,006,828</w:t>
+            </w:r>
+          </w:p>
+        </w:tc>
+        <w:tc>
+          <w:tcPr>
+            <w:tcW w:type="dxa" w:w="1500"/>
+            <w:tcMar>
+              <w:top w:type="dxa" w:w="50"/>
+              <w:left w:type="dxa" w:w="70"/>
+              <w:bottom w:type="dxa" w:w="50"/>
+              <w:right w:type="dxa" w:w="70"/>
+            </w:tcMar>
+          </w:tcPr>
+          <w:p>
+            <w:pPr>
+              <w:jc w:val="right"/>
+            </w:pPr>
+            <w:r>
+              <w:rPr>
+                <w:rFonts w:ascii="Calibri" w:cs="Calibri" w:eastAsia="Calibri" w:hAnsi="Calibri"/>
+                <w:b w:val="false"/>
+                <w:bCs w:val="false"/>
+                <w:sz w:val="14"/>
+                <w:szCs w:val="14"/>
+              </w:rPr>
+              <w:t xml:space="preserve">($979,808)</w:t>
+            </w:r>
+          </w:p>
+        </w:tc>
+        <w:tc>
+          <w:tcPr>
+            <w:tcW w:type="dxa" w:w="1500"/>
+            <w:tcMar>
+              <w:top w:type="dxa" w:w="50"/>
+              <w:left w:type="dxa" w:w="70"/>
+              <w:bottom w:type="dxa" w:w="50"/>
+              <w:right w:type="dxa" w:w="70"/>
+            </w:tcMar>
+          </w:tcPr>
+          <w:p>
+            <w:pPr>
+              <w:jc w:val="right"/>
+            </w:pPr>
+            <w:r>
+              <w:rPr>
+                <w:rFonts w:ascii="Calibri" w:cs="Calibri" w:eastAsia="Calibri" w:hAnsi="Calibri"/>
+                <w:b w:val="false"/>
+                <w:bCs w:val="false"/>
+                <w:sz w:val="14"/>
+                <w:szCs w:val="14"/>
+              </w:rPr>
+              <w:t xml:space="preserve">$2,139,973</w:t>
+            </w:r>
+          </w:p>
+        </w:tc>
+        <w:tc>
+          <w:tcPr>
+            <w:tcW w:type="dxa" w:w="1500"/>
+            <w:tcMar>
+              <w:top w:type="dxa" w:w="50"/>
+              <w:left w:type="dxa" w:w="70"/>
+              <w:bottom w:type="dxa" w:w="50"/>
+              <w:right w:type="dxa" w:w="70"/>
+            </w:tcMar>
+          </w:tcPr>
+          <w:p>
+            <w:pPr>
+              <w:jc w:val="right"/>
+            </w:pPr>
+            <w:r>
+              <w:rPr>
+                <w:rFonts w:ascii="Calibri" w:cs="Calibri" w:eastAsia="Calibri" w:hAnsi="Calibri"/>
+                <w:b w:val="false"/>
+                <w:bCs w:val="false"/>
+                <w:sz w:val="14"/>
+                <w:szCs w:val="14"/>
+              </w:rPr>
+              <w:t xml:space="preserve">$2,027,020</w:t>
             </w:r>
           </w:p>
         </w:tc>
@@ -4542,7 +4542,7 @@
                 <w:sz w:val="14"/>
                 <w:szCs w:val="14"/>
               </w:rPr>
-              <w:t xml:space="preserve">$3,239,669</w:t>
+              <w:t xml:space="preserve">$3,220,228</w:t>
             </w:r>
           </w:p>
         </w:tc>
@@ -4596,111 +4596,111 @@
                 <w:sz w:val="14"/>
                 <w:szCs w:val="14"/>
               </w:rPr>
-              <w:t xml:space="preserve">32,198 buyers, 16,602 subs, 4,074 seats</w:t>
-            </w:r>
-          </w:p>
-        </w:tc>
-        <w:tc>
-          <w:tcPr>
-            <w:tcW w:type="dxa" w:w="1500"/>
-            <w:tcMar>
-              <w:top w:type="dxa" w:w="50"/>
-              <w:left w:type="dxa" w:w="70"/>
-              <w:bottom w:type="dxa" w:w="50"/>
-              <w:right w:type="dxa" w:w="70"/>
-            </w:tcMar>
-          </w:tcPr>
-          <w:p>
-            <w:pPr>
-              <w:jc w:val="right"/>
-            </w:pPr>
-            <w:r>
-              <w:rPr>
-                <w:rFonts w:ascii="Calibri" w:cs="Calibri" w:eastAsia="Calibri" w:hAnsi="Calibri"/>
-                <w:b w:val="false"/>
-                <w:bCs w:val="false"/>
-                <w:sz w:val="14"/>
-                <w:szCs w:val="14"/>
-              </w:rPr>
-              <w:t xml:space="preserve">$5,236,478</w:t>
-            </w:r>
-          </w:p>
-        </w:tc>
-        <w:tc>
-          <w:tcPr>
-            <w:tcW w:type="dxa" w:w="1500"/>
-            <w:tcMar>
-              <w:top w:type="dxa" w:w="50"/>
-              <w:left w:type="dxa" w:w="70"/>
-              <w:bottom w:type="dxa" w:w="50"/>
-              <w:right w:type="dxa" w:w="70"/>
-            </w:tcMar>
-          </w:tcPr>
-          <w:p>
-            <w:pPr>
-              <w:jc w:val="right"/>
-            </w:pPr>
-            <w:r>
-              <w:rPr>
-                <w:rFonts w:ascii="Calibri" w:cs="Calibri" w:eastAsia="Calibri" w:hAnsi="Calibri"/>
-                <w:b w:val="false"/>
-                <w:bCs w:val="false"/>
-                <w:sz w:val="14"/>
-                <w:szCs w:val="14"/>
-              </w:rPr>
-              <w:t xml:space="preserve">($1,625,160)</w:t>
-            </w:r>
-          </w:p>
-        </w:tc>
-        <w:tc>
-          <w:tcPr>
-            <w:tcW w:type="dxa" w:w="1500"/>
-            <w:tcMar>
-              <w:top w:type="dxa" w:w="50"/>
-              <w:left w:type="dxa" w:w="70"/>
-              <w:bottom w:type="dxa" w:w="50"/>
-              <w:right w:type="dxa" w:w="70"/>
-            </w:tcMar>
-          </w:tcPr>
-          <w:p>
-            <w:pPr>
-              <w:jc w:val="right"/>
-            </w:pPr>
-            <w:r>
-              <w:rPr>
-                <w:rFonts w:ascii="Calibri" w:cs="Calibri" w:eastAsia="Calibri" w:hAnsi="Calibri"/>
-                <w:b w:val="false"/>
-                <w:bCs w:val="false"/>
-                <w:sz w:val="14"/>
-                <w:szCs w:val="14"/>
-              </w:rPr>
-              <w:t xml:space="preserve">$3,750,571</w:t>
-            </w:r>
-          </w:p>
-        </w:tc>
-        <w:tc>
-          <w:tcPr>
-            <w:tcW w:type="dxa" w:w="1500"/>
-            <w:tcMar>
-              <w:top w:type="dxa" w:w="50"/>
-              <w:left w:type="dxa" w:w="70"/>
-              <w:bottom w:type="dxa" w:w="50"/>
-              <w:right w:type="dxa" w:w="70"/>
-            </w:tcMar>
-          </w:tcPr>
-          <w:p>
-            <w:pPr>
-              <w:jc w:val="right"/>
-            </w:pPr>
-            <w:r>
-              <w:rPr>
-                <w:rFonts w:ascii="Calibri" w:cs="Calibri" w:eastAsia="Calibri" w:hAnsi="Calibri"/>
-                <w:b w:val="false"/>
-                <w:bCs w:val="false"/>
-                <w:sz w:val="14"/>
-                <w:szCs w:val="14"/>
-              </w:rPr>
-              <w:t xml:space="preserve">$3,611,318</w:t>
+              <w:t xml:space="preserve">32,198 buyers, 16,602 subs, 3,854 seats</w:t>
+            </w:r>
+          </w:p>
+        </w:tc>
+        <w:tc>
+          <w:tcPr>
+            <w:tcW w:type="dxa" w:w="1500"/>
+            <w:tcMar>
+              <w:top w:type="dxa" w:w="50"/>
+              <w:left w:type="dxa" w:w="70"/>
+              <w:bottom w:type="dxa" w:w="50"/>
+              <w:right w:type="dxa" w:w="70"/>
+            </w:tcMar>
+          </w:tcPr>
+          <w:p>
+            <w:pPr>
+              <w:jc w:val="right"/>
+            </w:pPr>
+            <w:r>
+              <w:rPr>
+                <w:rFonts w:ascii="Calibri" w:cs="Calibri" w:eastAsia="Calibri" w:hAnsi="Calibri"/>
+                <w:b w:val="false"/>
+                <w:bCs w:val="false"/>
+                <w:sz w:val="14"/>
+                <w:szCs w:val="14"/>
+              </w:rPr>
+              <w:t xml:space="preserve">$5,208,980</w:t>
+            </w:r>
+          </w:p>
+        </w:tc>
+        <w:tc>
+          <w:tcPr>
+            <w:tcW w:type="dxa" w:w="1500"/>
+            <w:tcMar>
+              <w:top w:type="dxa" w:w="50"/>
+              <w:left w:type="dxa" w:w="70"/>
+              <w:bottom w:type="dxa" w:w="50"/>
+              <w:right w:type="dxa" w:w="70"/>
+            </w:tcMar>
+          </w:tcPr>
+          <w:p>
+            <w:pPr>
+              <w:jc w:val="right"/>
+            </w:pPr>
+            <w:r>
+              <w:rPr>
+                <w:rFonts w:ascii="Calibri" w:cs="Calibri" w:eastAsia="Calibri" w:hAnsi="Calibri"/>
+                <w:b w:val="false"/>
+                <w:bCs w:val="false"/>
+                <w:sz w:val="14"/>
+                <w:szCs w:val="14"/>
+              </w:rPr>
+              <w:t xml:space="preserve">($1,621,036)</w:t>
+            </w:r>
+          </w:p>
+        </w:tc>
+        <w:tc>
+          <w:tcPr>
+            <w:tcW w:type="dxa" w:w="1500"/>
+            <w:tcMar>
+              <w:top w:type="dxa" w:w="50"/>
+              <w:left w:type="dxa" w:w="70"/>
+              <w:bottom w:type="dxa" w:w="50"/>
+              <w:right w:type="dxa" w:w="70"/>
+            </w:tcMar>
+          </w:tcPr>
+          <w:p>
+            <w:pPr>
+              <w:jc w:val="right"/>
+            </w:pPr>
+            <w:r>
+              <w:rPr>
+                <w:rFonts w:ascii="Calibri" w:cs="Calibri" w:eastAsia="Calibri" w:hAnsi="Calibri"/>
+                <w:b w:val="false"/>
+                <w:bCs w:val="false"/>
+                <w:sz w:val="14"/>
+                <w:szCs w:val="14"/>
+              </w:rPr>
+              <w:t xml:space="preserve">$3,727,197</w:t>
+            </w:r>
+          </w:p>
+        </w:tc>
+        <w:tc>
+          <w:tcPr>
+            <w:tcW w:type="dxa" w:w="1500"/>
+            <w:tcMar>
+              <w:top w:type="dxa" w:w="50"/>
+              <w:left w:type="dxa" w:w="70"/>
+              <w:bottom w:type="dxa" w:w="50"/>
+              <w:right w:type="dxa" w:w="70"/>
+            </w:tcMar>
+          </w:tcPr>
+          <w:p>
+            <w:pPr>
+              <w:jc w:val="right"/>
+            </w:pPr>
+            <w:r>
+              <w:rPr>
+                <w:rFonts w:ascii="Calibri" w:cs="Calibri" w:eastAsia="Calibri" w:hAnsi="Calibri"/>
+                <w:b w:val="false"/>
+                <w:bCs w:val="false"/>
+                <w:sz w:val="14"/>
+                <w:szCs w:val="14"/>
+              </w:rPr>
+              <w:t xml:space="preserve">$3,587,945</w:t>
             </w:r>
           </w:p>
         </w:tc>
@@ -4726,7 +4726,7 @@
                 <w:sz w:val="14"/>
                 <w:szCs w:val="14"/>
               </w:rPr>
-              <w:t xml:space="preserve">$6,850,987</w:t>
+              <w:t xml:space="preserve">$6,808,173</w:t>
             </w:r>
           </w:p>
         </w:tc>
@@ -4780,111 +4780,111 @@
                 <w:sz w:val="14"/>
                 <w:szCs w:val="14"/>
               </w:rPr>
-              <w:t xml:space="preserve">44,272 buyers, 27,670 subs, 5,858 seats</w:t>
-            </w:r>
-          </w:p>
-        </w:tc>
-        <w:tc>
-          <w:tcPr>
-            <w:tcW w:type="dxa" w:w="1500"/>
-            <w:tcMar>
-              <w:top w:type="dxa" w:w="50"/>
-              <w:left w:type="dxa" w:w="70"/>
-              <w:bottom w:type="dxa" w:w="50"/>
-              <w:right w:type="dxa" w:w="70"/>
-            </w:tcMar>
-          </w:tcPr>
-          <w:p>
-            <w:pPr>
-              <w:jc w:val="right"/>
-            </w:pPr>
-            <w:r>
-              <w:rPr>
-                <w:rFonts w:ascii="Calibri" w:cs="Calibri" w:eastAsia="Calibri" w:hAnsi="Calibri"/>
-                <w:b w:val="false"/>
-                <w:bCs w:val="false"/>
-                <w:sz w:val="14"/>
-                <w:szCs w:val="14"/>
-              </w:rPr>
-              <w:t xml:space="preserve">$7,812,612</w:t>
-            </w:r>
-          </w:p>
-        </w:tc>
-        <w:tc>
-          <w:tcPr>
-            <w:tcW w:type="dxa" w:w="1500"/>
-            <w:tcMar>
-              <w:top w:type="dxa" w:w="50"/>
-              <w:left w:type="dxa" w:w="70"/>
-              <w:bottom w:type="dxa" w:w="50"/>
-              <w:right w:type="dxa" w:w="70"/>
-            </w:tcMar>
-          </w:tcPr>
-          <w:p>
-            <w:pPr>
-              <w:jc w:val="right"/>
-            </w:pPr>
-            <w:r>
-              <w:rPr>
-                <w:rFonts w:ascii="Calibri" w:cs="Calibri" w:eastAsia="Calibri" w:hAnsi="Calibri"/>
-                <w:b w:val="false"/>
-                <w:bCs w:val="false"/>
-                <w:sz w:val="14"/>
-                <w:szCs w:val="14"/>
-              </w:rPr>
-              <w:t xml:space="preserve">($2,351,242)</w:t>
-            </w:r>
-          </w:p>
-        </w:tc>
-        <w:tc>
-          <w:tcPr>
-            <w:tcW w:type="dxa" w:w="1500"/>
-            <w:tcMar>
-              <w:top w:type="dxa" w:w="50"/>
-              <w:left w:type="dxa" w:w="70"/>
-              <w:bottom w:type="dxa" w:w="50"/>
-              <w:right w:type="dxa" w:w="70"/>
-            </w:tcMar>
-          </w:tcPr>
-          <w:p>
-            <w:pPr>
-              <w:jc w:val="right"/>
-            </w:pPr>
-            <w:r>
-              <w:rPr>
-                <w:rFonts w:ascii="Calibri" w:cs="Calibri" w:eastAsia="Calibri" w:hAnsi="Calibri"/>
-                <w:b w:val="false"/>
-                <w:bCs w:val="false"/>
-                <w:sz w:val="14"/>
-                <w:szCs w:val="14"/>
-              </w:rPr>
-              <w:t xml:space="preserve">$5,619,352</w:t>
-            </w:r>
-          </w:p>
-        </w:tc>
-        <w:tc>
-          <w:tcPr>
-            <w:tcW w:type="dxa" w:w="1500"/>
-            <w:tcMar>
-              <w:top w:type="dxa" w:w="50"/>
-              <w:left w:type="dxa" w:w="70"/>
-              <w:bottom w:type="dxa" w:w="50"/>
-              <w:right w:type="dxa" w:w="70"/>
-            </w:tcMar>
-          </w:tcPr>
-          <w:p>
-            <w:pPr>
-              <w:jc w:val="right"/>
-            </w:pPr>
-            <w:r>
-              <w:rPr>
-                <w:rFonts w:ascii="Calibri" w:cs="Calibri" w:eastAsia="Calibri" w:hAnsi="Calibri"/>
-                <w:b w:val="false"/>
-                <w:bCs w:val="false"/>
-                <w:sz w:val="14"/>
-                <w:szCs w:val="14"/>
-              </w:rPr>
-              <w:t xml:space="preserve">$5,461,370</w:t>
+              <w:t xml:space="preserve">44,272 buyers, 27,670 subs, 5,541 seats</w:t>
+            </w:r>
+          </w:p>
+        </w:tc>
+        <w:tc>
+          <w:tcPr>
+            <w:tcW w:type="dxa" w:w="1500"/>
+            <w:tcMar>
+              <w:top w:type="dxa" w:w="50"/>
+              <w:left w:type="dxa" w:w="70"/>
+              <w:bottom w:type="dxa" w:w="50"/>
+              <w:right w:type="dxa" w:w="70"/>
+            </w:tcMar>
+          </w:tcPr>
+          <w:p>
+            <w:pPr>
+              <w:jc w:val="right"/>
+            </w:pPr>
+            <w:r>
+              <w:rPr>
+                <w:rFonts w:ascii="Calibri" w:cs="Calibri" w:eastAsia="Calibri" w:hAnsi="Calibri"/>
+                <w:b w:val="false"/>
+                <w:bCs w:val="false"/>
+                <w:sz w:val="14"/>
+                <w:szCs w:val="14"/>
+              </w:rPr>
+              <w:t xml:space="preserve">$7,772,991</w:t>
+            </w:r>
+          </w:p>
+        </w:tc>
+        <w:tc>
+          <w:tcPr>
+            <w:tcW w:type="dxa" w:w="1500"/>
+            <w:tcMar>
+              <w:top w:type="dxa" w:w="50"/>
+              <w:left w:type="dxa" w:w="70"/>
+              <w:bottom w:type="dxa" w:w="50"/>
+              <w:right w:type="dxa" w:w="70"/>
+            </w:tcMar>
+          </w:tcPr>
+          <w:p>
+            <w:pPr>
+              <w:jc w:val="right"/>
+            </w:pPr>
+            <w:r>
+              <w:rPr>
+                <w:rFonts w:ascii="Calibri" w:cs="Calibri" w:eastAsia="Calibri" w:hAnsi="Calibri"/>
+                <w:b w:val="false"/>
+                <w:bCs w:val="false"/>
+                <w:sz w:val="14"/>
+                <w:szCs w:val="14"/>
+              </w:rPr>
+              <w:t xml:space="preserve">($2,345,299)</w:t>
+            </w:r>
+          </w:p>
+        </w:tc>
+        <w:tc>
+          <w:tcPr>
+            <w:tcW w:type="dxa" w:w="1500"/>
+            <w:tcMar>
+              <w:top w:type="dxa" w:w="50"/>
+              <w:left w:type="dxa" w:w="70"/>
+              <w:bottom w:type="dxa" w:w="50"/>
+              <w:right w:type="dxa" w:w="70"/>
+            </w:tcMar>
+          </w:tcPr>
+          <w:p>
+            <w:pPr>
+              <w:jc w:val="right"/>
+            </w:pPr>
+            <w:r>
+              <w:rPr>
+                <w:rFonts w:ascii="Calibri" w:cs="Calibri" w:eastAsia="Calibri" w:hAnsi="Calibri"/>
+                <w:b w:val="false"/>
+                <w:bCs w:val="false"/>
+                <w:sz w:val="14"/>
+                <w:szCs w:val="14"/>
+              </w:rPr>
+              <w:t xml:space="preserve">$5,585,674</w:t>
+            </w:r>
+          </w:p>
+        </w:tc>
+        <w:tc>
+          <w:tcPr>
+            <w:tcW w:type="dxa" w:w="1500"/>
+            <w:tcMar>
+              <w:top w:type="dxa" w:w="50"/>
+              <w:left w:type="dxa" w:w="70"/>
+              <w:bottom w:type="dxa" w:w="50"/>
+              <w:right w:type="dxa" w:w="70"/>
+            </w:tcMar>
+          </w:tcPr>
+          <w:p>
+            <w:pPr>
+              <w:jc w:val="right"/>
+            </w:pPr>
+            <w:r>
+              <w:rPr>
+                <w:rFonts w:ascii="Calibri" w:cs="Calibri" w:eastAsia="Calibri" w:hAnsi="Calibri"/>
+                <w:b w:val="false"/>
+                <w:bCs w:val="false"/>
+                <w:sz w:val="14"/>
+                <w:szCs w:val="14"/>
+              </w:rPr>
+              <w:t xml:space="preserve">$5,427,692</w:t>
             </w:r>
           </w:p>
         </w:tc>
@@ -4910,7 +4910,7 @@
                 <w:sz w:val="14"/>
                 <w:szCs w:val="14"/>
               </w:rPr>
-              <w:t xml:space="preserve">$12,312,357</w:t>
+              <w:t xml:space="preserve">$12,235,865</w:t>
             </w:r>
           </w:p>
         </w:tc>
@@ -4990,85 +4990,85 @@
                 <w:sz w:val="14"/>
                 <w:szCs w:val="14"/>
               </w:rPr>
-              <w:t xml:space="preserve">$17,962,296</w:t>
-            </w:r>
-          </w:p>
-        </w:tc>
-        <w:tc>
-          <w:tcPr>
-            <w:tcW w:type="dxa" w:w="1500"/>
-            <w:tcMar>
-              <w:top w:type="dxa" w:w="50"/>
-              <w:left w:type="dxa" w:w="70"/>
-              <w:bottom w:type="dxa" w:w="50"/>
-              <w:right w:type="dxa" w:w="70"/>
-            </w:tcMar>
-          </w:tcPr>
-          <w:p>
-            <w:pPr>
-              <w:jc w:val="right"/>
-            </w:pPr>
-            <w:r>
-              <w:rPr>
-                <w:rFonts w:ascii="Calibri" w:cs="Calibri" w:eastAsia="Calibri" w:hAnsi="Calibri"/>
-                <w:b w:val="false"/>
-                <w:bCs w:val="false"/>
-                <w:sz w:val="14"/>
-                <w:szCs w:val="14"/>
-              </w:rPr>
-              <w:t xml:space="preserve">($5,649,940)</w:t>
-            </w:r>
-          </w:p>
-        </w:tc>
-        <w:tc>
-          <w:tcPr>
-            <w:tcW w:type="dxa" w:w="1500"/>
-            <w:tcMar>
-              <w:top w:type="dxa" w:w="50"/>
-              <w:left w:type="dxa" w:w="70"/>
-              <w:bottom w:type="dxa" w:w="50"/>
-              <w:right w:type="dxa" w:w="70"/>
-            </w:tcMar>
-          </w:tcPr>
-          <w:p>
-            <w:pPr>
-              <w:jc w:val="right"/>
-            </w:pPr>
-            <w:r>
-              <w:rPr>
-                <w:rFonts w:ascii="Calibri" w:cs="Calibri" w:eastAsia="Calibri" w:hAnsi="Calibri"/>
-                <w:b w:val="false"/>
-                <w:bCs w:val="false"/>
-                <w:sz w:val="14"/>
-                <w:szCs w:val="14"/>
-              </w:rPr>
-              <w:t xml:space="preserve">$12,856,794</w:t>
-            </w:r>
-          </w:p>
-        </w:tc>
-        <w:tc>
-          <w:tcPr>
-            <w:tcW w:type="dxa" w:w="1500"/>
-            <w:tcMar>
-              <w:top w:type="dxa" w:w="50"/>
-              <w:left w:type="dxa" w:w="70"/>
-              <w:bottom w:type="dxa" w:w="50"/>
-              <w:right w:type="dxa" w:w="70"/>
-            </w:tcMar>
-          </w:tcPr>
-          <w:p>
-            <w:pPr>
-              <w:jc w:val="right"/>
-            </w:pPr>
-            <w:r>
-              <w:rPr>
-                <w:rFonts w:ascii="Calibri" w:cs="Calibri" w:eastAsia="Calibri" w:hAnsi="Calibri"/>
-                <w:b w:val="false"/>
-                <w:bCs w:val="false"/>
-                <w:sz w:val="14"/>
-                <w:szCs w:val="14"/>
-              </w:rPr>
-              <w:t xml:space="preserve">$12,312,357</w:t>
+              <w:t xml:space="preserve">$17,872,305</w:t>
+            </w:r>
+          </w:p>
+        </w:tc>
+        <w:tc>
+          <w:tcPr>
+            <w:tcW w:type="dxa" w:w="1500"/>
+            <w:tcMar>
+              <w:top w:type="dxa" w:w="50"/>
+              <w:left w:type="dxa" w:w="70"/>
+              <w:bottom w:type="dxa" w:w="50"/>
+              <w:right w:type="dxa" w:w="70"/>
+            </w:tcMar>
+          </w:tcPr>
+          <w:p>
+            <w:pPr>
+              <w:jc w:val="right"/>
+            </w:pPr>
+            <w:r>
+              <w:rPr>
+                <w:rFonts w:ascii="Calibri" w:cs="Calibri" w:eastAsia="Calibri" w:hAnsi="Calibri"/>
+                <w:b w:val="false"/>
+                <w:bCs w:val="false"/>
+                <w:sz w:val="14"/>
+                <w:szCs w:val="14"/>
+              </w:rPr>
+              <w:t xml:space="preserve">($5,636,441)</w:t>
+            </w:r>
+          </w:p>
+        </w:tc>
+        <w:tc>
+          <w:tcPr>
+            <w:tcW w:type="dxa" w:w="1500"/>
+            <w:tcMar>
+              <w:top w:type="dxa" w:w="50"/>
+              <w:left w:type="dxa" w:w="70"/>
+              <w:bottom w:type="dxa" w:w="50"/>
+              <w:right w:type="dxa" w:w="70"/>
+            </w:tcMar>
+          </w:tcPr>
+          <w:p>
+            <w:pPr>
+              <w:jc w:val="right"/>
+            </w:pPr>
+            <w:r>
+              <w:rPr>
+                <w:rFonts w:ascii="Calibri" w:cs="Calibri" w:eastAsia="Calibri" w:hAnsi="Calibri"/>
+                <w:b w:val="false"/>
+                <w:bCs w:val="false"/>
+                <w:sz w:val="14"/>
+                <w:szCs w:val="14"/>
+              </w:rPr>
+              <w:t xml:space="preserve">$12,780,302</w:t>
+            </w:r>
+          </w:p>
+        </w:tc>
+        <w:tc>
+          <w:tcPr>
+            <w:tcW w:type="dxa" w:w="1500"/>
+            <w:tcMar>
+              <w:top w:type="dxa" w:w="50"/>
+              <w:left w:type="dxa" w:w="70"/>
+              <w:bottom w:type="dxa" w:w="50"/>
+              <w:right w:type="dxa" w:w="70"/>
+            </w:tcMar>
+          </w:tcPr>
+          <w:p>
+            <w:pPr>
+              <w:jc w:val="right"/>
+            </w:pPr>
+            <w:r>
+              <w:rPr>
+                <w:rFonts w:ascii="Calibri" w:cs="Calibri" w:eastAsia="Calibri" w:hAnsi="Calibri"/>
+                <w:b w:val="false"/>
+                <w:bCs w:val="false"/>
+                <w:sz w:val="14"/>
+                <w:szCs w:val="14"/>
+              </w:rPr>
+              <w:t xml:space="preserve">$12,235,865</w:t>
             </w:r>
           </w:p>
         </w:tc>
@@ -5094,7 +5094,7 @@
                 <w:sz w:val="14"/>
                 <w:szCs w:val="14"/>
               </w:rPr>
-              <w:t xml:space="preserve">$12,312,357</w:t>
+              <w:t xml:space="preserve">$12,235,865</w:t>
             </w:r>
           </w:p>
         </w:tc>
@@ -5122,7 +5122,7 @@
         <w:rPr>
           <w:rFonts w:ascii="Calibri" w:cs="Calibri" w:eastAsia="Calibri" w:hAnsi="Calibri"/>
         </w:rPr>
-        <w:t xml:space="preserve">Consumer model: five-year net $10,935,118, 110,681 buyers, 2.7% of the counted market after five years</w:t>
+        <w:t xml:space="preserve">Consumer model: five-year net $10,932,727, 110,681 buyers, 2.7% of the counted market after five years</w:t>
       </w:r>
     </w:p>
     <w:tbl>
@@ -5438,7 +5438,7 @@
                 <w:sz w:val="14"/>
                 <w:szCs w:val="14"/>
               </w:rPr>
-              <w:t xml:space="preserve">($193,256)</w:t>
+              <w:t xml:space="preserve">($193,406)</w:t>
             </w:r>
           </w:p>
         </w:tc>
@@ -5490,7 +5490,7 @@
                 <w:sz w:val="14"/>
                 <w:szCs w:val="14"/>
               </w:rPr>
-              <w:t xml:space="preserve">$269,503</w:t>
+              <w:t xml:space="preserve">$269,354</w:t>
             </w:r>
           </w:p>
         </w:tc>
@@ -5516,7 +5516,7 @@
                 <w:sz w:val="14"/>
                 <w:szCs w:val="14"/>
               </w:rPr>
-              <w:t xml:space="preserve">$269,503</w:t>
+              <w:t xml:space="preserve">$269,354</w:t>
             </w:r>
           </w:p>
         </w:tc>
@@ -5622,7 +5622,7 @@
                 <w:sz w:val="14"/>
                 <w:szCs w:val="14"/>
               </w:rPr>
-              <w:t xml:space="preserve">($465,225)</w:t>
+              <w:t xml:space="preserve">($465,554)</w:t>
             </w:r>
           </w:p>
         </w:tc>
@@ -5674,7 +5674,7 @@
                 <w:sz w:val="14"/>
                 <w:szCs w:val="14"/>
               </w:rPr>
-              <w:t xml:space="preserve">$812,283</w:t>
+              <w:t xml:space="preserve">$811,953</w:t>
             </w:r>
           </w:p>
         </w:tc>
@@ -5700,7 +5700,7 @@
                 <w:sz w:val="14"/>
                 <w:szCs w:val="14"/>
               </w:rPr>
-              <w:t xml:space="preserve">$1,081,786</w:t>
+              <w:t xml:space="preserve">$1,081,307</w:t>
             </w:r>
           </w:p>
         </w:tc>
@@ -5806,7 +5806,7 @@
                 <w:sz w:val="14"/>
                 <w:szCs w:val="14"/>
               </w:rPr>
-              <w:t xml:space="preserve">($928,487)</w:t>
+              <w:t xml:space="preserve">($929,005)</w:t>
             </w:r>
           </w:p>
         </w:tc>
@@ -5858,7 +5858,7 @@
                 <w:sz w:val="14"/>
                 <w:szCs w:val="14"/>
               </w:rPr>
-              <w:t xml:space="preserve">$1,807,488</w:t>
+              <w:t xml:space="preserve">$1,806,969</w:t>
             </w:r>
           </w:p>
         </w:tc>
@@ -5884,7 +5884,7 @@
                 <w:sz w:val="14"/>
                 <w:szCs w:val="14"/>
               </w:rPr>
-              <w:t xml:space="preserve">$2,889,274</w:t>
+              <w:t xml:space="preserve">$2,888,276</w:t>
             </w:r>
           </w:p>
         </w:tc>
@@ -5990,7 +5990,7 @@
                 <w:sz w:val="14"/>
                 <w:szCs w:val="14"/>
               </w:rPr>
-              <w:t xml:space="preserve">($1,535,238)</w:t>
+              <w:t xml:space="preserve">($1,535,901)</w:t>
             </w:r>
           </w:p>
         </w:tc>
@@ -6042,7 +6042,7 @@
                 <w:sz w:val="14"/>
                 <w:szCs w:val="14"/>
               </w:rPr>
-              <w:t xml:space="preserve">$3,192,031</w:t>
+              <w:t xml:space="preserve">$3,191,367</w:t>
             </w:r>
           </w:p>
         </w:tc>
@@ -6068,7 +6068,7 @@
                 <w:sz w:val="14"/>
                 <w:szCs w:val="14"/>
               </w:rPr>
-              <w:t xml:space="preserve">$6,081,305</w:t>
+              <w:t xml:space="preserve">$6,079,643</w:t>
             </w:r>
           </w:p>
         </w:tc>
@@ -6174,7 +6174,7 @@
                 <w:sz w:val="14"/>
                 <w:szCs w:val="14"/>
               </w:rPr>
-              <w:t xml:space="preserve">($2,226,607)</w:t>
+              <w:t xml:space="preserve">($2,227,337)</w:t>
             </w:r>
           </w:p>
         </w:tc>
@@ -6226,7 +6226,7 @@
                 <w:sz w:val="14"/>
                 <w:szCs w:val="14"/>
               </w:rPr>
-              <w:t xml:space="preserve">$4,853,813</w:t>
+              <w:t xml:space="preserve">$4,853,084</w:t>
             </w:r>
           </w:p>
         </w:tc>
@@ -6252,7 +6252,7 @@
                 <w:sz w:val="14"/>
                 <w:szCs w:val="14"/>
               </w:rPr>
-              <w:t xml:space="preserve">$10,935,118</w:t>
+              <w:t xml:space="preserve">$10,932,727</w:t>
             </w:r>
           </w:p>
         </w:tc>
@@ -6358,7 +6358,7 @@
                 <w:sz w:val="14"/>
                 <w:szCs w:val="14"/>
               </w:rPr>
-              <w:t xml:space="preserve">($5,348,813)</w:t>
+              <w:t xml:space="preserve">($5,351,203)</w:t>
             </w:r>
           </w:p>
         </w:tc>
@@ -6410,7 +6410,7 @@
                 <w:sz w:val="14"/>
                 <w:szCs w:val="14"/>
               </w:rPr>
-              <w:t xml:space="preserve">$10,935,118</w:t>
+              <w:t xml:space="preserve">$10,932,727</w:t>
             </w:r>
           </w:p>
         </w:tc>
@@ -6436,7 +6436,7 @@
                 <w:sz w:val="14"/>
                 <w:szCs w:val="14"/>
               </w:rPr>
-              <w:t xml:space="preserve">$10,935,118</w:t>
+              <w:t xml:space="preserve">$10,932,727</w:t>
             </w:r>
           </w:p>
         </w:tc>
@@ -6464,7 +6464,7 @@
         <w:rPr>
           <w:rFonts w:ascii="Calibri" w:cs="Calibri" w:eastAsia="Calibri" w:hAnsi="Calibri"/>
         </w:rPr>
-        <w:t xml:space="preserve">School district model: five-year net $1,164,830</w:t>
+        <w:t xml:space="preserve">School district model: five-year net $1,090,768</w:t>
       </w:r>
     </w:p>
     <w:tbl>
@@ -6728,111 +6728,111 @@
                 <w:sz w:val="14"/>
                 <w:szCs w:val="14"/>
               </w:rPr>
-              <w:t xml:space="preserve">192 seats (0.10% of market), 5 districts</w:t>
-            </w:r>
-          </w:p>
-        </w:tc>
-        <w:tc>
-          <w:tcPr>
-            <w:tcW w:type="dxa" w:w="1500"/>
-            <w:tcMar>
-              <w:top w:type="dxa" w:w="50"/>
-              <w:left w:type="dxa" w:w="70"/>
-              <w:bottom w:type="dxa" w:w="50"/>
-              <w:right w:type="dxa" w:w="70"/>
-            </w:tcMar>
-          </w:tcPr>
-          <w:p>
-            <w:pPr>
-              <w:jc w:val="right"/>
-            </w:pPr>
-            <w:r>
-              <w:rPr>
-                <w:rFonts w:ascii="Calibri" w:cs="Calibri" w:eastAsia="Calibri" w:hAnsi="Calibri"/>
-                <w:b w:val="false"/>
-                <w:bCs w:val="false"/>
-                <w:sz w:val="14"/>
-                <w:szCs w:val="14"/>
-              </w:rPr>
-              <w:t xml:space="preserve">$23,998</w:t>
-            </w:r>
-          </w:p>
-        </w:tc>
-        <w:tc>
-          <w:tcPr>
-            <w:tcW w:type="dxa" w:w="1500"/>
-            <w:tcMar>
-              <w:top w:type="dxa" w:w="50"/>
-              <w:left w:type="dxa" w:w="70"/>
-              <w:bottom w:type="dxa" w:w="50"/>
-              <w:right w:type="dxa" w:w="70"/>
-            </w:tcMar>
-          </w:tcPr>
-          <w:p>
-            <w:pPr>
-              <w:jc w:val="right"/>
-            </w:pPr>
-            <w:r>
-              <w:rPr>
-                <w:rFonts w:ascii="Calibri" w:cs="Calibri" w:eastAsia="Calibri" w:hAnsi="Calibri"/>
-                <w:b w:val="false"/>
-                <w:bCs w:val="false"/>
-                <w:sz w:val="14"/>
-                <w:szCs w:val="14"/>
-              </w:rPr>
-              <w:t xml:space="preserve">($6,149)</w:t>
-            </w:r>
-          </w:p>
-        </w:tc>
-        <w:tc>
-          <w:tcPr>
-            <w:tcW w:type="dxa" w:w="1500"/>
-            <w:tcMar>
-              <w:top w:type="dxa" w:w="50"/>
-              <w:left w:type="dxa" w:w="70"/>
-              <w:bottom w:type="dxa" w:w="50"/>
-              <w:right w:type="dxa" w:w="70"/>
-            </w:tcMar>
-          </w:tcPr>
-          <w:p>
-            <w:pPr>
-              <w:jc w:val="right"/>
-            </w:pPr>
-            <w:r>
-              <w:rPr>
-                <w:rFonts w:ascii="Calibri" w:cs="Calibri" w:eastAsia="Calibri" w:hAnsi="Calibri"/>
-                <w:b w:val="false"/>
-                <w:bCs w:val="false"/>
-                <w:sz w:val="14"/>
-                <w:szCs w:val="14"/>
-              </w:rPr>
-              <w:t xml:space="preserve">$20,398</w:t>
-            </w:r>
-          </w:p>
-        </w:tc>
-        <w:tc>
-          <w:tcPr>
-            <w:tcW w:type="dxa" w:w="1500"/>
-            <w:tcMar>
-              <w:top w:type="dxa" w:w="50"/>
-              <w:left w:type="dxa" w:w="70"/>
-              <w:bottom w:type="dxa" w:w="50"/>
-              <w:right w:type="dxa" w:w="70"/>
-            </w:tcMar>
-          </w:tcPr>
-          <w:p>
-            <w:pPr>
-              <w:jc w:val="right"/>
-            </w:pPr>
-            <w:r>
-              <w:rPr>
-                <w:rFonts w:ascii="Calibri" w:cs="Calibri" w:eastAsia="Calibri" w:hAnsi="Calibri"/>
-                <w:b w:val="false"/>
-                <w:bCs w:val="false"/>
-                <w:sz w:val="14"/>
-                <w:szCs w:val="14"/>
-              </w:rPr>
-              <w:t xml:space="preserve">$17,849</w:t>
+              <w:t xml:space="preserve">180 seats (0.10% of market), 5 districts</w:t>
+            </w:r>
+          </w:p>
+        </w:tc>
+        <w:tc>
+          <w:tcPr>
+            <w:tcW w:type="dxa" w:w="1500"/>
+            <w:tcMar>
+              <w:top w:type="dxa" w:w="50"/>
+              <w:left w:type="dxa" w:w="70"/>
+              <w:bottom w:type="dxa" w:w="50"/>
+              <w:right w:type="dxa" w:w="70"/>
+            </w:tcMar>
+          </w:tcPr>
+          <w:p>
+            <w:pPr>
+              <w:jc w:val="right"/>
+            </w:pPr>
+            <w:r>
+              <w:rPr>
+                <w:rFonts w:ascii="Calibri" w:cs="Calibri" w:eastAsia="Calibri" w:hAnsi="Calibri"/>
+                <w:b w:val="false"/>
+                <w:bCs w:val="false"/>
+                <w:sz w:val="14"/>
+                <w:szCs w:val="14"/>
+              </w:rPr>
+              <w:t xml:space="preserve">$22,498</w:t>
+            </w:r>
+          </w:p>
+        </w:tc>
+        <w:tc>
+          <w:tcPr>
+            <w:tcW w:type="dxa" w:w="1500"/>
+            <w:tcMar>
+              <w:top w:type="dxa" w:w="50"/>
+              <w:left w:type="dxa" w:w="70"/>
+              <w:bottom w:type="dxa" w:w="50"/>
+              <w:right w:type="dxa" w:w="70"/>
+            </w:tcMar>
+          </w:tcPr>
+          <w:p>
+            <w:pPr>
+              <w:jc w:val="right"/>
+            </w:pPr>
+            <w:r>
+              <w:rPr>
+                <w:rFonts w:ascii="Calibri" w:cs="Calibri" w:eastAsia="Calibri" w:hAnsi="Calibri"/>
+                <w:b w:val="false"/>
+                <w:bCs w:val="false"/>
+                <w:sz w:val="14"/>
+                <w:szCs w:val="14"/>
+              </w:rPr>
+              <w:t xml:space="preserve">($5,772)</w:t>
+            </w:r>
+          </w:p>
+        </w:tc>
+        <w:tc>
+          <w:tcPr>
+            <w:tcW w:type="dxa" w:w="1500"/>
+            <w:tcMar>
+              <w:top w:type="dxa" w:w="50"/>
+              <w:left w:type="dxa" w:w="70"/>
+              <w:bottom w:type="dxa" w:w="50"/>
+              <w:right w:type="dxa" w:w="70"/>
+            </w:tcMar>
+          </w:tcPr>
+          <w:p>
+            <w:pPr>
+              <w:jc w:val="right"/>
+            </w:pPr>
+            <w:r>
+              <w:rPr>
+                <w:rFonts w:ascii="Calibri" w:cs="Calibri" w:eastAsia="Calibri" w:hAnsi="Calibri"/>
+                <w:b w:val="false"/>
+                <w:bCs w:val="false"/>
+                <w:sz w:val="14"/>
+                <w:szCs w:val="14"/>
+              </w:rPr>
+              <w:t xml:space="preserve">$19,123</w:t>
+            </w:r>
+          </w:p>
+        </w:tc>
+        <w:tc>
+          <w:tcPr>
+            <w:tcW w:type="dxa" w:w="1500"/>
+            <w:tcMar>
+              <w:top w:type="dxa" w:w="50"/>
+              <w:left w:type="dxa" w:w="70"/>
+              <w:bottom w:type="dxa" w:w="50"/>
+              <w:right w:type="dxa" w:w="70"/>
+            </w:tcMar>
+          </w:tcPr>
+          <w:p>
+            <w:pPr>
+              <w:jc w:val="right"/>
+            </w:pPr>
+            <w:r>
+              <w:rPr>
+                <w:rFonts w:ascii="Calibri" w:cs="Calibri" w:eastAsia="Calibri" w:hAnsi="Calibri"/>
+                <w:b w:val="false"/>
+                <w:bCs w:val="false"/>
+                <w:sz w:val="14"/>
+                <w:szCs w:val="14"/>
+              </w:rPr>
+              <w:t xml:space="preserve">$16,727</w:t>
             </w:r>
           </w:p>
         </w:tc>
@@ -6858,7 +6858,7 @@
                 <w:sz w:val="14"/>
                 <w:szCs w:val="14"/>
               </w:rPr>
-              <w:t xml:space="preserve">$17,849</w:t>
+              <w:t xml:space="preserve">$16,727</w:t>
             </w:r>
           </w:p>
         </w:tc>
@@ -6912,111 +6912,111 @@
                 <w:sz w:val="14"/>
                 <w:szCs w:val="14"/>
               </w:rPr>
-              <w:t xml:space="preserve">770 seats (0.40% of market), 19 districts</w:t>
-            </w:r>
-          </w:p>
-        </w:tc>
-        <w:tc>
-          <w:tcPr>
-            <w:tcW w:type="dxa" w:w="1500"/>
-            <w:tcMar>
-              <w:top w:type="dxa" w:w="50"/>
-              <w:left w:type="dxa" w:w="70"/>
-              <w:bottom w:type="dxa" w:w="50"/>
-              <w:right w:type="dxa" w:w="70"/>
-            </w:tcMar>
-          </w:tcPr>
-          <w:p>
-            <w:pPr>
-              <w:jc w:val="right"/>
-            </w:pPr>
-            <w:r>
-              <w:rPr>
-                <w:rFonts w:ascii="Calibri" w:cs="Calibri" w:eastAsia="Calibri" w:hAnsi="Calibri"/>
-                <w:b w:val="false"/>
-                <w:bCs w:val="false"/>
-                <w:sz w:val="14"/>
-                <w:szCs w:val="14"/>
-              </w:rPr>
-              <w:t xml:space="preserve">$96,242</w:t>
-            </w:r>
-          </w:p>
-        </w:tc>
-        <w:tc>
-          <w:tcPr>
-            <w:tcW w:type="dxa" w:w="1500"/>
-            <w:tcMar>
-              <w:top w:type="dxa" w:w="50"/>
-              <w:left w:type="dxa" w:w="70"/>
-              <w:bottom w:type="dxa" w:w="50"/>
-              <w:right w:type="dxa" w:w="70"/>
-            </w:tcMar>
-          </w:tcPr>
-          <w:p>
-            <w:pPr>
-              <w:jc w:val="right"/>
-            </w:pPr>
-            <w:r>
-              <w:rPr>
-                <w:rFonts w:ascii="Calibri" w:cs="Calibri" w:eastAsia="Calibri" w:hAnsi="Calibri"/>
-                <w:b w:val="false"/>
-                <w:bCs w:val="false"/>
-                <w:sz w:val="14"/>
-                <w:szCs w:val="14"/>
-              </w:rPr>
-              <w:t xml:space="preserve">($20,069)</w:t>
-            </w:r>
-          </w:p>
-        </w:tc>
-        <w:tc>
-          <w:tcPr>
-            <w:tcW w:type="dxa" w:w="1500"/>
-            <w:tcMar>
-              <w:top w:type="dxa" w:w="50"/>
-              <w:left w:type="dxa" w:w="70"/>
-              <w:bottom w:type="dxa" w:w="50"/>
-              <w:right w:type="dxa" w:w="70"/>
-            </w:tcMar>
-          </w:tcPr>
-          <w:p>
-            <w:pPr>
-              <w:jc w:val="right"/>
-            </w:pPr>
-            <w:r>
-              <w:rPr>
-                <w:rFonts w:ascii="Calibri" w:cs="Calibri" w:eastAsia="Calibri" w:hAnsi="Calibri"/>
-                <w:b w:val="false"/>
-                <w:bCs w:val="false"/>
-                <w:sz w:val="14"/>
-                <w:szCs w:val="14"/>
-              </w:rPr>
-              <w:t xml:space="preserve">$81,806</w:t>
-            </w:r>
-          </w:p>
-        </w:tc>
-        <w:tc>
-          <w:tcPr>
-            <w:tcW w:type="dxa" w:w="1500"/>
-            <w:tcMar>
-              <w:top w:type="dxa" w:w="50"/>
-              <w:left w:type="dxa" w:w="70"/>
-              <w:bottom w:type="dxa" w:w="50"/>
-              <w:right w:type="dxa" w:w="70"/>
-            </w:tcMar>
-          </w:tcPr>
-          <w:p>
-            <w:pPr>
-              <w:jc w:val="right"/>
-            </w:pPr>
-            <w:r>
-              <w:rPr>
-                <w:rFonts w:ascii="Calibri" w:cs="Calibri" w:eastAsia="Calibri" w:hAnsi="Calibri"/>
-                <w:b w:val="false"/>
-                <w:bCs w:val="false"/>
-                <w:sz w:val="14"/>
-                <w:szCs w:val="14"/>
-              </w:rPr>
-              <w:t xml:space="preserve">$76,173</w:t>
+              <w:t xml:space="preserve">721 seats (0.40% of market), 18 districts</w:t>
+            </w:r>
+          </w:p>
+        </w:tc>
+        <w:tc>
+          <w:tcPr>
+            <w:tcW w:type="dxa" w:w="1500"/>
+            <w:tcMar>
+              <w:top w:type="dxa" w:w="50"/>
+              <w:left w:type="dxa" w:w="70"/>
+              <w:bottom w:type="dxa" w:w="50"/>
+              <w:right w:type="dxa" w:w="70"/>
+            </w:tcMar>
+          </w:tcPr>
+          <w:p>
+            <w:pPr>
+              <w:jc w:val="right"/>
+            </w:pPr>
+            <w:r>
+              <w:rPr>
+                <w:rFonts w:ascii="Calibri" w:cs="Calibri" w:eastAsia="Calibri" w:hAnsi="Calibri"/>
+                <w:b w:val="false"/>
+                <w:bCs w:val="false"/>
+                <w:sz w:val="14"/>
+                <w:szCs w:val="14"/>
+              </w:rPr>
+              <w:t xml:space="preserve">$90,118</w:t>
+            </w:r>
+          </w:p>
+        </w:tc>
+        <w:tc>
+          <w:tcPr>
+            <w:tcW w:type="dxa" w:w="1500"/>
+            <w:tcMar>
+              <w:top w:type="dxa" w:w="50"/>
+              <w:left w:type="dxa" w:w="70"/>
+              <w:bottom w:type="dxa" w:w="50"/>
+              <w:right w:type="dxa" w:w="70"/>
+            </w:tcMar>
+          </w:tcPr>
+          <w:p>
+            <w:pPr>
+              <w:jc w:val="right"/>
+            </w:pPr>
+            <w:r>
+              <w:rPr>
+                <w:rFonts w:ascii="Calibri" w:cs="Calibri" w:eastAsia="Calibri" w:hAnsi="Calibri"/>
+                <w:b w:val="false"/>
+                <w:bCs w:val="false"/>
+                <w:sz w:val="14"/>
+                <w:szCs w:val="14"/>
+              </w:rPr>
+              <w:t xml:space="preserve">($18,815)</w:t>
+            </w:r>
+          </w:p>
+        </w:tc>
+        <w:tc>
+          <w:tcPr>
+            <w:tcW w:type="dxa" w:w="1500"/>
+            <w:tcMar>
+              <w:top w:type="dxa" w:w="50"/>
+              <w:left w:type="dxa" w:w="70"/>
+              <w:bottom w:type="dxa" w:w="50"/>
+              <w:right w:type="dxa" w:w="70"/>
+            </w:tcMar>
+          </w:tcPr>
+          <w:p>
+            <w:pPr>
+              <w:jc w:val="right"/>
+            </w:pPr>
+            <w:r>
+              <w:rPr>
+                <w:rFonts w:ascii="Calibri" w:cs="Calibri" w:eastAsia="Calibri" w:hAnsi="Calibri"/>
+                <w:b w:val="false"/>
+                <w:bCs w:val="false"/>
+                <w:sz w:val="14"/>
+                <w:szCs w:val="14"/>
+              </w:rPr>
+              <w:t xml:space="preserve">$76,600</w:t>
+            </w:r>
+          </w:p>
+        </w:tc>
+        <w:tc>
+          <w:tcPr>
+            <w:tcW w:type="dxa" w:w="1500"/>
+            <w:tcMar>
+              <w:top w:type="dxa" w:w="50"/>
+              <w:left w:type="dxa" w:w="70"/>
+              <w:bottom w:type="dxa" w:w="50"/>
+              <w:right w:type="dxa" w:w="70"/>
+            </w:tcMar>
+          </w:tcPr>
+          <w:p>
+            <w:pPr>
+              <w:jc w:val="right"/>
+            </w:pPr>
+            <w:r>
+              <w:rPr>
+                <w:rFonts w:ascii="Calibri" w:cs="Calibri" w:eastAsia="Calibri" w:hAnsi="Calibri"/>
+                <w:b w:val="false"/>
+                <w:bCs w:val="false"/>
+                <w:sz w:val="14"/>
+                <w:szCs w:val="14"/>
+              </w:rPr>
+              <w:t xml:space="preserve">$71,303</w:t>
             </w:r>
           </w:p>
         </w:tc>
@@ -7042,7 +7042,7 @@
                 <w:sz w:val="14"/>
                 <w:szCs w:val="14"/>
               </w:rPr>
-              <w:t xml:space="preserve">$94,022</w:t>
+              <w:t xml:space="preserve">$88,030</w:t>
             </w:r>
           </w:p>
         </w:tc>
@@ -7096,111 +7096,111 @@
                 <w:sz w:val="14"/>
                 <w:szCs w:val="14"/>
               </w:rPr>
-              <w:t xml:space="preserve">1,924 seats (1.00% of market), 48 districts</w:t>
-            </w:r>
-          </w:p>
-        </w:tc>
-        <w:tc>
-          <w:tcPr>
-            <w:tcW w:type="dxa" w:w="1500"/>
-            <w:tcMar>
-              <w:top w:type="dxa" w:w="50"/>
-              <w:left w:type="dxa" w:w="70"/>
-              <w:bottom w:type="dxa" w:w="50"/>
-              <w:right w:type="dxa" w:w="70"/>
-            </w:tcMar>
-          </w:tcPr>
-          <w:p>
-            <w:pPr>
-              <w:jc w:val="right"/>
-            </w:pPr>
-            <w:r>
-              <w:rPr>
-                <w:rFonts w:ascii="Calibri" w:cs="Calibri" w:eastAsia="Calibri" w:hAnsi="Calibri"/>
-                <w:b w:val="false"/>
-                <w:bCs w:val="false"/>
-                <w:sz w:val="14"/>
-                <w:szCs w:val="14"/>
-              </w:rPr>
-              <w:t xml:space="preserve">$240,481</w:t>
-            </w:r>
-          </w:p>
-        </w:tc>
-        <w:tc>
-          <w:tcPr>
-            <w:tcW w:type="dxa" w:w="1500"/>
-            <w:tcMar>
-              <w:top w:type="dxa" w:w="50"/>
-              <w:left w:type="dxa" w:w="70"/>
-              <w:bottom w:type="dxa" w:w="50"/>
-              <w:right w:type="dxa" w:w="70"/>
-            </w:tcMar>
-          </w:tcPr>
-          <w:p>
-            <w:pPr>
-              <w:jc w:val="right"/>
-            </w:pPr>
-            <w:r>
-              <w:rPr>
-                <w:rFonts w:ascii="Calibri" w:cs="Calibri" w:eastAsia="Calibri" w:hAnsi="Calibri"/>
-                <w:b w:val="false"/>
-                <w:bCs w:val="false"/>
-                <w:sz w:val="14"/>
-                <w:szCs w:val="14"/>
-              </w:rPr>
-              <w:t xml:space="preserve">($45,060)</w:t>
-            </w:r>
-          </w:p>
-        </w:tc>
-        <w:tc>
-          <w:tcPr>
-            <w:tcW w:type="dxa" w:w="1500"/>
-            <w:tcMar>
-              <w:top w:type="dxa" w:w="50"/>
-              <w:left w:type="dxa" w:w="70"/>
-              <w:bottom w:type="dxa" w:w="50"/>
-              <w:right w:type="dxa" w:w="70"/>
-            </w:tcMar>
-          </w:tcPr>
-          <w:p>
-            <w:pPr>
-              <w:jc w:val="right"/>
-            </w:pPr>
-            <w:r>
-              <w:rPr>
-                <w:rFonts w:ascii="Calibri" w:cs="Calibri" w:eastAsia="Calibri" w:hAnsi="Calibri"/>
-                <w:b w:val="false"/>
-                <w:bCs w:val="false"/>
-                <w:sz w:val="14"/>
-                <w:szCs w:val="14"/>
-              </w:rPr>
-              <w:t xml:space="preserve">$204,409</w:t>
-            </w:r>
-          </w:p>
-        </w:tc>
-        <w:tc>
-          <w:tcPr>
-            <w:tcW w:type="dxa" w:w="1500"/>
-            <w:tcMar>
-              <w:top w:type="dxa" w:w="50"/>
-              <w:left w:type="dxa" w:w="70"/>
-              <w:bottom w:type="dxa" w:w="50"/>
-              <w:right w:type="dxa" w:w="70"/>
-            </w:tcMar>
-          </w:tcPr>
-          <w:p>
-            <w:pPr>
-              <w:jc w:val="right"/>
-            </w:pPr>
-            <w:r>
-              <w:rPr>
-                <w:rFonts w:ascii="Calibri" w:cs="Calibri" w:eastAsia="Calibri" w:hAnsi="Calibri"/>
-                <w:b w:val="false"/>
-                <w:bCs w:val="false"/>
-                <w:sz w:val="14"/>
-                <w:szCs w:val="14"/>
-              </w:rPr>
-              <w:t xml:space="preserve">$195,420</w:t>
+              <w:t xml:space="preserve">1,802 seats (1.00% of market), 45 districts</w:t>
+            </w:r>
+          </w:p>
+        </w:tc>
+        <w:tc>
+          <w:tcPr>
+            <w:tcW w:type="dxa" w:w="1500"/>
+            <w:tcMar>
+              <w:top w:type="dxa" w:w="50"/>
+              <w:left w:type="dxa" w:w="70"/>
+              <w:bottom w:type="dxa" w:w="50"/>
+              <w:right w:type="dxa" w:w="70"/>
+            </w:tcMar>
+          </w:tcPr>
+          <w:p>
+            <w:pPr>
+              <w:jc w:val="right"/>
+            </w:pPr>
+            <w:r>
+              <w:rPr>
+                <w:rFonts w:ascii="Calibri" w:cs="Calibri" w:eastAsia="Calibri" w:hAnsi="Calibri"/>
+                <w:b w:val="false"/>
+                <w:bCs w:val="false"/>
+                <w:sz w:val="14"/>
+                <w:szCs w:val="14"/>
+              </w:rPr>
+              <w:t xml:space="preserve">$225,232</w:t>
+            </w:r>
+          </w:p>
+        </w:tc>
+        <w:tc>
+          <w:tcPr>
+            <w:tcW w:type="dxa" w:w="1500"/>
+            <w:tcMar>
+              <w:top w:type="dxa" w:w="50"/>
+              <w:left w:type="dxa" w:w="70"/>
+              <w:bottom w:type="dxa" w:w="50"/>
+              <w:right w:type="dxa" w:w="70"/>
+            </w:tcMar>
+          </w:tcPr>
+          <w:p>
+            <w:pPr>
+              <w:jc w:val="right"/>
+            </w:pPr>
+            <w:r>
+              <w:rPr>
+                <w:rFonts w:ascii="Calibri" w:cs="Calibri" w:eastAsia="Calibri" w:hAnsi="Calibri"/>
+                <w:b w:val="false"/>
+                <w:bCs w:val="false"/>
+                <w:sz w:val="14"/>
+                <w:szCs w:val="14"/>
+              </w:rPr>
+              <w:t xml:space="preserve">($42,246)</w:t>
+            </w:r>
+          </w:p>
+        </w:tc>
+        <w:tc>
+          <w:tcPr>
+            <w:tcW w:type="dxa" w:w="1500"/>
+            <w:tcMar>
+              <w:top w:type="dxa" w:w="50"/>
+              <w:left w:type="dxa" w:w="70"/>
+              <w:bottom w:type="dxa" w:w="50"/>
+              <w:right w:type="dxa" w:w="70"/>
+            </w:tcMar>
+          </w:tcPr>
+          <w:p>
+            <w:pPr>
+              <w:jc w:val="right"/>
+            </w:pPr>
+            <w:r>
+              <w:rPr>
+                <w:rFonts w:ascii="Calibri" w:cs="Calibri" w:eastAsia="Calibri" w:hAnsi="Calibri"/>
+                <w:b w:val="false"/>
+                <w:bCs w:val="false"/>
+                <w:sz w:val="14"/>
+                <w:szCs w:val="14"/>
+              </w:rPr>
+              <w:t xml:space="preserve">$191,447</w:t>
+            </w:r>
+          </w:p>
+        </w:tc>
+        <w:tc>
+          <w:tcPr>
+            <w:tcW w:type="dxa" w:w="1500"/>
+            <w:tcMar>
+              <w:top w:type="dxa" w:w="50"/>
+              <w:left w:type="dxa" w:w="70"/>
+              <w:bottom w:type="dxa" w:w="50"/>
+              <w:right w:type="dxa" w:w="70"/>
+            </w:tcMar>
+          </w:tcPr>
+          <w:p>
+            <w:pPr>
+              <w:jc w:val="right"/>
+            </w:pPr>
+            <w:r>
+              <w:rPr>
+                <w:rFonts w:ascii="Calibri" w:cs="Calibri" w:eastAsia="Calibri" w:hAnsi="Calibri"/>
+                <w:b w:val="false"/>
+                <w:bCs w:val="false"/>
+                <w:sz w:val="14"/>
+                <w:szCs w:val="14"/>
+              </w:rPr>
+              <w:t xml:space="preserve">$182,986</w:t>
             </w:r>
           </w:p>
         </w:tc>
@@ -7226,7 +7226,7 @@
                 <w:sz w:val="14"/>
                 <w:szCs w:val="14"/>
               </w:rPr>
-              <w:t xml:space="preserve">$289,442</w:t>
+              <w:t xml:space="preserve">$271,016</w:t>
             </w:r>
           </w:p>
         </w:tc>
@@ -7280,111 +7280,111 @@
                 <w:sz w:val="14"/>
                 <w:szCs w:val="14"/>
               </w:rPr>
-              <w:t xml:space="preserve">3,464 seats (1.80% of market), 87 districts</w:t>
-            </w:r>
-          </w:p>
-        </w:tc>
-        <w:tc>
-          <w:tcPr>
-            <w:tcW w:type="dxa" w:w="1500"/>
-            <w:tcMar>
-              <w:top w:type="dxa" w:w="50"/>
-              <w:left w:type="dxa" w:w="70"/>
-              <w:bottom w:type="dxa" w:w="50"/>
-              <w:right w:type="dxa" w:w="70"/>
-            </w:tcMar>
-          </w:tcPr>
-          <w:p>
-            <w:pPr>
-              <w:jc w:val="right"/>
-            </w:pPr>
-            <w:r>
-              <w:rPr>
-                <w:rFonts w:ascii="Calibri" w:cs="Calibri" w:eastAsia="Calibri" w:hAnsi="Calibri"/>
-                <w:b w:val="false"/>
-                <w:bCs w:val="false"/>
-                <w:sz w:val="14"/>
-                <w:szCs w:val="14"/>
-              </w:rPr>
-              <w:t xml:space="preserve">$432,965</w:t>
-            </w:r>
-          </w:p>
-        </w:tc>
-        <w:tc>
-          <w:tcPr>
-            <w:tcW w:type="dxa" w:w="1500"/>
-            <w:tcMar>
-              <w:top w:type="dxa" w:w="50"/>
-              <w:left w:type="dxa" w:w="70"/>
-              <w:bottom w:type="dxa" w:w="50"/>
-              <w:right w:type="dxa" w:w="70"/>
-            </w:tcMar>
-          </w:tcPr>
-          <w:p>
-            <w:pPr>
-              <w:jc w:val="right"/>
-            </w:pPr>
-            <w:r>
-              <w:rPr>
-                <w:rFonts w:ascii="Calibri" w:cs="Calibri" w:eastAsia="Calibri" w:hAnsi="Calibri"/>
-                <w:b w:val="false"/>
-                <w:bCs w:val="false"/>
-                <w:sz w:val="14"/>
-                <w:szCs w:val="14"/>
-              </w:rPr>
-              <w:t xml:space="preserve">($76,459)</w:t>
-            </w:r>
-          </w:p>
-        </w:tc>
-        <w:tc>
-          <w:tcPr>
-            <w:tcW w:type="dxa" w:w="1500"/>
-            <w:tcMar>
-              <w:top w:type="dxa" w:w="50"/>
-              <w:left w:type="dxa" w:w="70"/>
-              <w:bottom w:type="dxa" w:w="50"/>
-              <w:right w:type="dxa" w:w="70"/>
-            </w:tcMar>
-          </w:tcPr>
-          <w:p>
-            <w:pPr>
-              <w:jc w:val="right"/>
-            </w:pPr>
-            <w:r>
-              <w:rPr>
-                <w:rFonts w:ascii="Calibri" w:cs="Calibri" w:eastAsia="Calibri" w:hAnsi="Calibri"/>
-                <w:b w:val="false"/>
-                <w:bCs w:val="false"/>
-                <w:sz w:val="14"/>
-                <w:szCs w:val="14"/>
-              </w:rPr>
-              <w:t xml:space="preserve">$368,021</w:t>
-            </w:r>
-          </w:p>
-        </w:tc>
-        <w:tc>
-          <w:tcPr>
-            <w:tcW w:type="dxa" w:w="1500"/>
-            <w:tcMar>
-              <w:top w:type="dxa" w:w="50"/>
-              <w:left w:type="dxa" w:w="70"/>
-              <w:bottom w:type="dxa" w:w="50"/>
-              <w:right w:type="dxa" w:w="70"/>
-            </w:tcMar>
-          </w:tcPr>
-          <w:p>
-            <w:pPr>
-              <w:jc w:val="right"/>
-            </w:pPr>
-            <w:r>
-              <w:rPr>
-                <w:rFonts w:ascii="Calibri" w:cs="Calibri" w:eastAsia="Calibri" w:hAnsi="Calibri"/>
-                <w:b w:val="false"/>
-                <w:bCs w:val="false"/>
-                <w:sz w:val="14"/>
-                <w:szCs w:val="14"/>
-              </w:rPr>
-              <w:t xml:space="preserve">$356,507</w:t>
+              <w:t xml:space="preserve">3,244 seats (1.80% of market), 81 districts</w:t>
+            </w:r>
+          </w:p>
+        </w:tc>
+        <w:tc>
+          <w:tcPr>
+            <w:tcW w:type="dxa" w:w="1500"/>
+            <w:tcMar>
+              <w:top w:type="dxa" w:w="50"/>
+              <w:left w:type="dxa" w:w="70"/>
+              <w:bottom w:type="dxa" w:w="50"/>
+              <w:right w:type="dxa" w:w="70"/>
+            </w:tcMar>
+          </w:tcPr>
+          <w:p>
+            <w:pPr>
+              <w:jc w:val="right"/>
+            </w:pPr>
+            <w:r>
+              <w:rPr>
+                <w:rFonts w:ascii="Calibri" w:cs="Calibri" w:eastAsia="Calibri" w:hAnsi="Calibri"/>
+                <w:b w:val="false"/>
+                <w:bCs w:val="false"/>
+                <w:sz w:val="14"/>
+                <w:szCs w:val="14"/>
+              </w:rPr>
+              <w:t xml:space="preserve">$405,468</w:t>
+            </w:r>
+          </w:p>
+        </w:tc>
+        <w:tc>
+          <w:tcPr>
+            <w:tcW w:type="dxa" w:w="1500"/>
+            <w:tcMar>
+              <w:top w:type="dxa" w:w="50"/>
+              <w:left w:type="dxa" w:w="70"/>
+              <w:bottom w:type="dxa" w:w="50"/>
+              <w:right w:type="dxa" w:w="70"/>
+            </w:tcMar>
+          </w:tcPr>
+          <w:p>
+            <w:pPr>
+              <w:jc w:val="right"/>
+            </w:pPr>
+            <w:r>
+              <w:rPr>
+                <w:rFonts w:ascii="Calibri" w:cs="Calibri" w:eastAsia="Calibri" w:hAnsi="Calibri"/>
+                <w:b w:val="false"/>
+                <w:bCs w:val="false"/>
+                <w:sz w:val="14"/>
+                <w:szCs w:val="14"/>
+              </w:rPr>
+              <w:t xml:space="preserve">($71,660)</w:t>
+            </w:r>
+          </w:p>
+        </w:tc>
+        <w:tc>
+          <w:tcPr>
+            <w:tcW w:type="dxa" w:w="1500"/>
+            <w:tcMar>
+              <w:top w:type="dxa" w:w="50"/>
+              <w:left w:type="dxa" w:w="70"/>
+              <w:bottom w:type="dxa" w:w="50"/>
+              <w:right w:type="dxa" w:w="70"/>
+            </w:tcMar>
+          </w:tcPr>
+          <w:p>
+            <w:pPr>
+              <w:jc w:val="right"/>
+            </w:pPr>
+            <w:r>
+              <w:rPr>
+                <w:rFonts w:ascii="Calibri" w:cs="Calibri" w:eastAsia="Calibri" w:hAnsi="Calibri"/>
+                <w:b w:val="false"/>
+                <w:bCs w:val="false"/>
+                <w:sz w:val="14"/>
+                <w:szCs w:val="14"/>
+              </w:rPr>
+              <w:t xml:space="preserve">$344,647</w:t>
+            </w:r>
+          </w:p>
+        </w:tc>
+        <w:tc>
+          <w:tcPr>
+            <w:tcW w:type="dxa" w:w="1500"/>
+            <w:tcMar>
+              <w:top w:type="dxa" w:w="50"/>
+              <w:left w:type="dxa" w:w="70"/>
+              <w:bottom w:type="dxa" w:w="50"/>
+              <w:right w:type="dxa" w:w="70"/>
+            </w:tcMar>
+          </w:tcPr>
+          <w:p>
+            <w:pPr>
+              <w:jc w:val="right"/>
+            </w:pPr>
+            <w:r>
+              <w:rPr>
+                <w:rFonts w:ascii="Calibri" w:cs="Calibri" w:eastAsia="Calibri" w:hAnsi="Calibri"/>
+                <w:b w:val="false"/>
+                <w:bCs w:val="false"/>
+                <w:sz w:val="14"/>
+                <w:szCs w:val="14"/>
+              </w:rPr>
+              <w:t xml:space="preserve">$333,808</w:t>
             </w:r>
           </w:p>
         </w:tc>
@@ -7410,7 +7410,7 @@
                 <w:sz w:val="14"/>
                 <w:szCs w:val="14"/>
               </w:rPr>
-              <w:t xml:space="preserve">$645,949</w:t>
+              <w:t xml:space="preserve">$604,824</w:t>
             </w:r>
           </w:p>
         </w:tc>
@@ -7464,111 +7464,111 @@
                 <w:sz w:val="14"/>
                 <w:szCs w:val="14"/>
               </w:rPr>
-              <w:t xml:space="preserve">5,003 seats (2.60% of market), 125 districts</w:t>
-            </w:r>
-          </w:p>
-        </w:tc>
-        <w:tc>
-          <w:tcPr>
-            <w:tcW w:type="dxa" w:w="1500"/>
-            <w:tcMar>
-              <w:top w:type="dxa" w:w="50"/>
-              <w:left w:type="dxa" w:w="70"/>
-              <w:bottom w:type="dxa" w:w="50"/>
-              <w:right w:type="dxa" w:w="70"/>
-            </w:tcMar>
-          </w:tcPr>
-          <w:p>
-            <w:pPr>
-              <w:jc w:val="right"/>
-            </w:pPr>
-            <w:r>
-              <w:rPr>
-                <w:rFonts w:ascii="Calibri" w:cs="Calibri" w:eastAsia="Calibri" w:hAnsi="Calibri"/>
-                <w:b w:val="false"/>
-                <w:bCs w:val="false"/>
-                <w:sz w:val="14"/>
-                <w:szCs w:val="14"/>
-              </w:rPr>
-              <w:t xml:space="preserve">$625,325</w:t>
-            </w:r>
-          </w:p>
-        </w:tc>
-        <w:tc>
-          <w:tcPr>
-            <w:tcW w:type="dxa" w:w="1500"/>
-            <w:tcMar>
-              <w:top w:type="dxa" w:w="50"/>
-              <w:left w:type="dxa" w:w="70"/>
-              <w:bottom w:type="dxa" w:w="50"/>
-              <w:right w:type="dxa" w:w="70"/>
-            </w:tcMar>
-          </w:tcPr>
-          <w:p>
-            <w:pPr>
-              <w:jc w:val="right"/>
-            </w:pPr>
-            <w:r>
-              <w:rPr>
-                <w:rFonts w:ascii="Calibri" w:cs="Calibri" w:eastAsia="Calibri" w:hAnsi="Calibri"/>
-                <w:b w:val="false"/>
-                <w:bCs w:val="false"/>
-                <w:sz w:val="14"/>
-                <w:szCs w:val="14"/>
-              </w:rPr>
-              <w:t xml:space="preserve">($106,444)</w:t>
-            </w:r>
-          </w:p>
-        </w:tc>
-        <w:tc>
-          <w:tcPr>
-            <w:tcW w:type="dxa" w:w="1500"/>
-            <w:tcMar>
-              <w:top w:type="dxa" w:w="50"/>
-              <w:left w:type="dxa" w:w="70"/>
-              <w:bottom w:type="dxa" w:w="50"/>
-              <w:right w:type="dxa" w:w="70"/>
-            </w:tcMar>
-          </w:tcPr>
-          <w:p>
-            <w:pPr>
-              <w:jc w:val="right"/>
-            </w:pPr>
-            <w:r>
-              <w:rPr>
-                <w:rFonts w:ascii="Calibri" w:cs="Calibri" w:eastAsia="Calibri" w:hAnsi="Calibri"/>
-                <w:b w:val="false"/>
-                <w:bCs w:val="false"/>
-                <w:sz w:val="14"/>
-                <w:szCs w:val="14"/>
-              </w:rPr>
-              <w:t xml:space="preserve">$531,526</w:t>
-            </w:r>
-          </w:p>
-        </w:tc>
-        <w:tc>
-          <w:tcPr>
-            <w:tcW w:type="dxa" w:w="1500"/>
-            <w:tcMar>
-              <w:top w:type="dxa" w:w="50"/>
-              <w:left w:type="dxa" w:w="70"/>
-              <w:bottom w:type="dxa" w:w="50"/>
-              <w:right w:type="dxa" w:w="70"/>
-            </w:tcMar>
-          </w:tcPr>
-          <w:p>
-            <w:pPr>
-              <w:jc w:val="right"/>
-            </w:pPr>
-            <w:r>
-              <w:rPr>
-                <w:rFonts w:ascii="Calibri" w:cs="Calibri" w:eastAsia="Calibri" w:hAnsi="Calibri"/>
-                <w:b w:val="false"/>
-                <w:bCs w:val="false"/>
-                <w:sz w:val="14"/>
-                <w:szCs w:val="14"/>
-              </w:rPr>
-              <w:t xml:space="preserve">$518,881</w:t>
+              <w:t xml:space="preserve">4,686 seats (2.60% of market), 117 districts</w:t>
+            </w:r>
+          </w:p>
+        </w:tc>
+        <w:tc>
+          <w:tcPr>
+            <w:tcW w:type="dxa" w:w="1500"/>
+            <w:tcMar>
+              <w:top w:type="dxa" w:w="50"/>
+              <w:left w:type="dxa" w:w="70"/>
+              <w:bottom w:type="dxa" w:w="50"/>
+              <w:right w:type="dxa" w:w="70"/>
+            </w:tcMar>
+          </w:tcPr>
+          <w:p>
+            <w:pPr>
+              <w:jc w:val="right"/>
+            </w:pPr>
+            <w:r>
+              <w:rPr>
+                <w:rFonts w:ascii="Calibri" w:cs="Calibri" w:eastAsia="Calibri" w:hAnsi="Calibri"/>
+                <w:b w:val="false"/>
+                <w:bCs w:val="false"/>
+                <w:sz w:val="14"/>
+                <w:szCs w:val="14"/>
+              </w:rPr>
+              <w:t xml:space="preserve">$585,703</w:t>
+            </w:r>
+          </w:p>
+        </w:tc>
+        <w:tc>
+          <w:tcPr>
+            <w:tcW w:type="dxa" w:w="1500"/>
+            <w:tcMar>
+              <w:top w:type="dxa" w:w="50"/>
+              <w:left w:type="dxa" w:w="70"/>
+              <w:bottom w:type="dxa" w:w="50"/>
+              <w:right w:type="dxa" w:w="70"/>
+            </w:tcMar>
+          </w:tcPr>
+          <w:p>
+            <w:pPr>
+              <w:jc w:val="right"/>
+            </w:pPr>
+            <w:r>
+              <w:rPr>
+                <w:rFonts w:ascii="Calibri" w:cs="Calibri" w:eastAsia="Calibri" w:hAnsi="Calibri"/>
+                <w:b w:val="false"/>
+                <w:bCs w:val="false"/>
+                <w:sz w:val="14"/>
+                <w:szCs w:val="14"/>
+              </w:rPr>
+              <w:t xml:space="preserve">($99,760)</w:t>
+            </w:r>
+          </w:p>
+        </w:tc>
+        <w:tc>
+          <w:tcPr>
+            <w:tcW w:type="dxa" w:w="1500"/>
+            <w:tcMar>
+              <w:top w:type="dxa" w:w="50"/>
+              <w:left w:type="dxa" w:w="70"/>
+              <w:bottom w:type="dxa" w:w="50"/>
+              <w:right w:type="dxa" w:w="70"/>
+            </w:tcMar>
+          </w:tcPr>
+          <w:p>
+            <w:pPr>
+              <w:jc w:val="right"/>
+            </w:pPr>
+            <w:r>
+              <w:rPr>
+                <w:rFonts w:ascii="Calibri" w:cs="Calibri" w:eastAsia="Calibri" w:hAnsi="Calibri"/>
+                <w:b w:val="false"/>
+                <w:bCs w:val="false"/>
+                <w:sz w:val="14"/>
+                <w:szCs w:val="14"/>
+              </w:rPr>
+              <w:t xml:space="preserve">$497,848</w:t>
+            </w:r>
+          </w:p>
+        </w:tc>
+        <w:tc>
+          <w:tcPr>
+            <w:tcW w:type="dxa" w:w="1500"/>
+            <w:tcMar>
+              <w:top w:type="dxa" w:w="50"/>
+              <w:left w:type="dxa" w:w="70"/>
+              <w:bottom w:type="dxa" w:w="50"/>
+              <w:right w:type="dxa" w:w="70"/>
+            </w:tcMar>
+          </w:tcPr>
+          <w:p>
+            <w:pPr>
+              <w:jc w:val="right"/>
+            </w:pPr>
+            <w:r>
+              <w:rPr>
+                <w:rFonts w:ascii="Calibri" w:cs="Calibri" w:eastAsia="Calibri" w:hAnsi="Calibri"/>
+                <w:b w:val="false"/>
+                <w:bCs w:val="false"/>
+                <w:sz w:val="14"/>
+                <w:szCs w:val="14"/>
+              </w:rPr>
+              <w:t xml:space="preserve">$485,944</w:t>
             </w:r>
           </w:p>
         </w:tc>
@@ -7594,7 +7594,7 @@
                 <w:sz w:val="14"/>
                 <w:szCs w:val="14"/>
               </w:rPr>
-              <w:t xml:space="preserve">$1,164,830</w:t>
+              <w:t xml:space="preserve">$1,090,768</w:t>
             </w:r>
           </w:p>
         </w:tc>
@@ -7674,85 +7674,85 @@
                 <w:sz w:val="14"/>
                 <w:szCs w:val="14"/>
               </w:rPr>
-              <w:t xml:space="preserve">$1,419,011</w:t>
-            </w:r>
-          </w:p>
-        </w:tc>
-        <w:tc>
-          <w:tcPr>
-            <w:tcW w:type="dxa" w:w="1500"/>
-            <w:tcMar>
-              <w:top w:type="dxa" w:w="50"/>
-              <w:left w:type="dxa" w:w="70"/>
-              <w:bottom w:type="dxa" w:w="50"/>
-              <w:right w:type="dxa" w:w="70"/>
-            </w:tcMar>
-          </w:tcPr>
-          <w:p>
-            <w:pPr>
-              <w:jc w:val="right"/>
-            </w:pPr>
-            <w:r>
-              <w:rPr>
-                <w:rFonts w:ascii="Calibri" w:cs="Calibri" w:eastAsia="Calibri" w:hAnsi="Calibri"/>
-                <w:b w:val="false"/>
-                <w:bCs w:val="false"/>
-                <w:sz w:val="14"/>
-                <w:szCs w:val="14"/>
-              </w:rPr>
-              <w:t xml:space="preserve">($254,181)</w:t>
-            </w:r>
-          </w:p>
-        </w:tc>
-        <w:tc>
-          <w:tcPr>
-            <w:tcW w:type="dxa" w:w="1500"/>
-            <w:tcMar>
-              <w:top w:type="dxa" w:w="50"/>
-              <w:left w:type="dxa" w:w="70"/>
-              <w:bottom w:type="dxa" w:w="50"/>
-              <w:right w:type="dxa" w:w="70"/>
-            </w:tcMar>
-          </w:tcPr>
-          <w:p>
-            <w:pPr>
-              <w:jc w:val="right"/>
-            </w:pPr>
-            <w:r>
-              <w:rPr>
-                <w:rFonts w:ascii="Calibri" w:cs="Calibri" w:eastAsia="Calibri" w:hAnsi="Calibri"/>
-                <w:b w:val="false"/>
-                <w:bCs w:val="false"/>
-                <w:sz w:val="14"/>
-                <w:szCs w:val="14"/>
-              </w:rPr>
-              <w:t xml:space="preserve">$1,206,160</w:t>
-            </w:r>
-          </w:p>
-        </w:tc>
-        <w:tc>
-          <w:tcPr>
-            <w:tcW w:type="dxa" w:w="1500"/>
-            <w:tcMar>
-              <w:top w:type="dxa" w:w="50"/>
-              <w:left w:type="dxa" w:w="70"/>
-              <w:bottom w:type="dxa" w:w="50"/>
-              <w:right w:type="dxa" w:w="70"/>
-            </w:tcMar>
-          </w:tcPr>
-          <w:p>
-            <w:pPr>
-              <w:jc w:val="right"/>
-            </w:pPr>
-            <w:r>
-              <w:rPr>
-                <w:rFonts w:ascii="Calibri" w:cs="Calibri" w:eastAsia="Calibri" w:hAnsi="Calibri"/>
-                <w:b w:val="false"/>
-                <w:bCs w:val="false"/>
-                <w:sz w:val="14"/>
-                <w:szCs w:val="14"/>
-              </w:rPr>
-              <w:t xml:space="preserve">$1,164,830</w:t>
+              <w:t xml:space="preserve">$1,329,019</w:t>
+            </w:r>
+          </w:p>
+        </w:tc>
+        <w:tc>
+          <w:tcPr>
+            <w:tcW w:type="dxa" w:w="1500"/>
+            <w:tcMar>
+              <w:top w:type="dxa" w:w="50"/>
+              <w:left w:type="dxa" w:w="70"/>
+              <w:bottom w:type="dxa" w:w="50"/>
+              <w:right w:type="dxa" w:w="70"/>
+            </w:tcMar>
+          </w:tcPr>
+          <w:p>
+            <w:pPr>
+              <w:jc w:val="right"/>
+            </w:pPr>
+            <w:r>
+              <w:rPr>
+                <w:rFonts w:ascii="Calibri" w:cs="Calibri" w:eastAsia="Calibri" w:hAnsi="Calibri"/>
+                <w:b w:val="false"/>
+                <w:bCs w:val="false"/>
+                <w:sz w:val="14"/>
+                <w:szCs w:val="14"/>
+              </w:rPr>
+              <w:t xml:space="preserve">($238,253)</w:t>
+            </w:r>
+          </w:p>
+        </w:tc>
+        <w:tc>
+          <w:tcPr>
+            <w:tcW w:type="dxa" w:w="1500"/>
+            <w:tcMar>
+              <w:top w:type="dxa" w:w="50"/>
+              <w:left w:type="dxa" w:w="70"/>
+              <w:bottom w:type="dxa" w:w="50"/>
+              <w:right w:type="dxa" w:w="70"/>
+            </w:tcMar>
+          </w:tcPr>
+          <w:p>
+            <w:pPr>
+              <w:jc w:val="right"/>
+            </w:pPr>
+            <w:r>
+              <w:rPr>
+                <w:rFonts w:ascii="Calibri" w:cs="Calibri" w:eastAsia="Calibri" w:hAnsi="Calibri"/>
+                <w:b w:val="false"/>
+                <w:bCs w:val="false"/>
+                <w:sz w:val="14"/>
+                <w:szCs w:val="14"/>
+              </w:rPr>
+              <w:t xml:space="preserve">$1,129,665</w:t>
+            </w:r>
+          </w:p>
+        </w:tc>
+        <w:tc>
+          <w:tcPr>
+            <w:tcW w:type="dxa" w:w="1500"/>
+            <w:tcMar>
+              <w:top w:type="dxa" w:w="50"/>
+              <w:left w:type="dxa" w:w="70"/>
+              <w:bottom w:type="dxa" w:w="50"/>
+              <w:right w:type="dxa" w:w="70"/>
+            </w:tcMar>
+          </w:tcPr>
+          <w:p>
+            <w:pPr>
+              <w:jc w:val="right"/>
+            </w:pPr>
+            <w:r>
+              <w:rPr>
+                <w:rFonts w:ascii="Calibri" w:cs="Calibri" w:eastAsia="Calibri" w:hAnsi="Calibri"/>
+                <w:b w:val="false"/>
+                <w:bCs w:val="false"/>
+                <w:sz w:val="14"/>
+                <w:szCs w:val="14"/>
+              </w:rPr>
+              <w:t xml:space="preserve">$1,090,768</w:t>
             </w:r>
           </w:p>
         </w:tc>
@@ -7778,7 +7778,7 @@
                 <w:sz w:val="14"/>
                 <w:szCs w:val="14"/>
               </w:rPr>
-              <w:t xml:space="preserve">$1,164,830</w:t>
+              <w:t xml:space="preserve">$1,090,768</w:t>
             </w:r>
           </w:p>
         </w:tc>
@@ -7806,7 +7806,7 @@
         <w:rPr>
           <w:rFonts w:ascii="Calibri" w:cs="Calibri" w:eastAsia="Calibri" w:hAnsi="Calibri"/>
         </w:rPr>
-        <w:t xml:space="preserve">Clinical model: five-year net $212,407</w:t>
+        <w:t xml:space="preserve">Clinical model: five-year net $212,368</w:t>
       </w:r>
     </w:p>
     <w:tbl>
@@ -8122,7 +8122,7 @@
                 <w:sz w:val="14"/>
                 <w:szCs w:val="14"/>
               </w:rPr>
-              <w:t xml:space="preserve">($1,921)</w:t>
+              <w:t xml:space="preserve">($1,924)</w:t>
             </w:r>
           </w:p>
         </w:tc>
@@ -8174,7 +8174,7 @@
                 <w:sz w:val="14"/>
                 <w:szCs w:val="14"/>
               </w:rPr>
-              <w:t xml:space="preserve">$5,578</w:t>
+              <w:t xml:space="preserve">$5,576</w:t>
             </w:r>
           </w:p>
         </w:tc>
@@ -8200,7 +8200,7 @@
                 <w:sz w:val="14"/>
                 <w:szCs w:val="14"/>
               </w:rPr>
-              <w:t xml:space="preserve">$5,578</w:t>
+              <w:t xml:space="preserve">$5,576</w:t>
             </w:r>
           </w:p>
         </w:tc>
@@ -8306,7 +8306,7 @@
                 <w:sz w:val="14"/>
                 <w:szCs w:val="14"/>
               </w:rPr>
-              <w:t xml:space="preserve">($4,822)</w:t>
+              <w:t xml:space="preserve">($4,828)</w:t>
             </w:r>
           </w:p>
         </w:tc>
@@ -8358,7 +8358,7 @@
                 <w:sz w:val="14"/>
                 <w:szCs w:val="14"/>
               </w:rPr>
-              <w:t xml:space="preserve">$18,301</w:t>
+              <w:t xml:space="preserve">$18,295</w:t>
             </w:r>
           </w:p>
         </w:tc>
@@ -8384,7 +8384,7 @@
                 <w:sz w:val="14"/>
                 <w:szCs w:val="14"/>
               </w:rPr>
-              <w:t xml:space="preserve">$23,879</w:t>
+              <w:t xml:space="preserve">$23,871</w:t>
             </w:r>
           </w:p>
         </w:tc>
@@ -8490,7 +8490,7 @@
                 <w:sz w:val="14"/>
                 <w:szCs w:val="14"/>
               </w:rPr>
-              <w:t xml:space="preserve">($8,548)</w:t>
+              <w:t xml:space="preserve">($8,557)</w:t>
             </w:r>
           </w:p>
         </w:tc>
@@ -8542,7 +8542,7 @@
                 <w:sz w:val="14"/>
                 <w:szCs w:val="14"/>
               </w:rPr>
-              <w:t xml:space="preserve">$37,073</w:t>
+              <w:t xml:space="preserve">$37,064</w:t>
             </w:r>
           </w:p>
         </w:tc>
@@ -8568,7 +8568,7 @@
                 <w:sz w:val="14"/>
                 <w:szCs w:val="14"/>
               </w:rPr>
-              <w:t xml:space="preserve">$60,952</w:t>
+              <w:t xml:space="preserve">$60,935</w:t>
             </w:r>
           </w:p>
         </w:tc>
@@ -8674,7 +8674,7 @@
                 <w:sz w:val="14"/>
                 <w:szCs w:val="14"/>
               </w:rPr>
-              <w:t xml:space="preserve">($13,464)</w:t>
+              <w:t xml:space="preserve">($13,475)</w:t>
             </w:r>
           </w:p>
         </w:tc>
@@ -8726,7 +8726,7 @@
                 <w:sz w:val="14"/>
                 <w:szCs w:val="14"/>
               </w:rPr>
-              <w:t xml:space="preserve">$62,780</w:t>
+              <w:t xml:space="preserve">$62,769</w:t>
             </w:r>
           </w:p>
         </w:tc>
@@ -8752,7 +8752,7 @@
                 <w:sz w:val="14"/>
                 <w:szCs w:val="14"/>
               </w:rPr>
-              <w:t xml:space="preserve">$123,732</w:t>
+              <w:t xml:space="preserve">$123,704</w:t>
             </w:r>
           </w:p>
         </w:tc>
@@ -8858,7 +8858,7 @@
                 <w:sz w:val="14"/>
                 <w:szCs w:val="14"/>
               </w:rPr>
-              <w:t xml:space="preserve">($18,191)</w:t>
+              <w:t xml:space="preserve">($18,202)</w:t>
             </w:r>
           </w:p>
         </w:tc>
@@ -8910,7 +8910,7 @@
                 <w:sz w:val="14"/>
                 <w:szCs w:val="14"/>
               </w:rPr>
-              <w:t xml:space="preserve">$88,675</w:t>
+              <w:t xml:space="preserve">$88,664</w:t>
             </w:r>
           </w:p>
         </w:tc>
@@ -8936,7 +8936,7 @@
                 <w:sz w:val="14"/>
                 <w:szCs w:val="14"/>
               </w:rPr>
-              <w:t xml:space="preserve">$212,407</w:t>
+              <w:t xml:space="preserve">$212,368</w:t>
             </w:r>
           </w:p>
         </w:tc>
@@ -9042,7 +9042,7 @@
                 <w:sz w:val="14"/>
                 <w:szCs w:val="14"/>
               </w:rPr>
-              <w:t xml:space="preserve">($46,946)</w:t>
+              <w:t xml:space="preserve">($46,986)</w:t>
             </w:r>
           </w:p>
         </w:tc>
@@ -9094,7 +9094,7 @@
                 <w:sz w:val="14"/>
                 <w:szCs w:val="14"/>
               </w:rPr>
-              <w:t xml:space="preserve">$212,407</w:t>
+              <w:t xml:space="preserve">$212,368</w:t>
             </w:r>
           </w:p>
         </w:tc>
@@ -9120,7 +9120,7 @@
                 <w:sz w:val="14"/>
                 <w:szCs w:val="14"/>
               </w:rPr>
-              <w:t xml:space="preserve">$212,407</w:t>
+              <w:t xml:space="preserve">$212,368</w:t>
             </w:r>
           </w:p>
         </w:tc>
@@ -9518,7 +9518,7 @@
                 <w:sz w:val="16"/>
                 <w:szCs w:val="16"/>
               </w:rPr>
-              <w:t xml:space="preserve">5,677</w:t>
+              <w:t xml:space="preserve">5,316</w:t>
             </w:r>
           </w:p>
         </w:tc>
@@ -9570,7 +9570,7 @@
                 <w:sz w:val="16"/>
                 <w:szCs w:val="16"/>
               </w:rPr>
-              <w:t xml:space="preserve">$7,938,097</w:t>
+              <w:t xml:space="preserve">$7,892,977</w:t>
             </w:r>
           </w:p>
         </w:tc>
@@ -9596,7 +9596,7 @@
                 <w:sz w:val="16"/>
                 <w:szCs w:val="16"/>
               </w:rPr>
-              <w:t xml:space="preserve">$5,102,124</w:t>
+              <w:t xml:space="preserve">$5,063,771</w:t>
             </w:r>
           </w:p>
         </w:tc>
@@ -9728,7 +9728,7 @@
                 <w:sz w:val="16"/>
                 <w:szCs w:val="16"/>
               </w:rPr>
-              <w:t xml:space="preserve">11,353</w:t>
+              <w:t xml:space="preserve">10,633</w:t>
             </w:r>
           </w:p>
         </w:tc>
@@ -9780,7 +9780,7 @@
                 <w:sz w:val="16"/>
                 <w:szCs w:val="16"/>
               </w:rPr>
-              <w:t xml:space="preserve">$17,962,296</w:t>
+              <w:t xml:space="preserve">$17,872,305</w:t>
             </w:r>
           </w:p>
         </w:tc>
@@ -9806,7 +9806,7 @@
                 <w:sz w:val="16"/>
                 <w:szCs w:val="16"/>
               </w:rPr>
-              <w:t xml:space="preserve">$12,312,357</w:t>
+              <w:t xml:space="preserve">$12,235,865</w:t>
             </w:r>
           </w:p>
         </w:tc>
@@ -9938,7 +9938,7 @@
                 <w:sz w:val="16"/>
                 <w:szCs w:val="16"/>
               </w:rPr>
-              <w:t xml:space="preserve">22,708</w:t>
+              <w:t xml:space="preserve">21,265</w:t>
             </w:r>
           </w:p>
         </w:tc>
@@ -9990,7 +9990,7 @@
                 <w:sz w:val="16"/>
                 <w:szCs w:val="16"/>
               </w:rPr>
-              <w:t xml:space="preserve">$40,098,626</w:t>
+              <w:t xml:space="preserve">$39,918,266</w:t>
             </w:r>
           </w:p>
         </w:tc>
@@ -10016,7 +10016,7 @@
                 <w:sz w:val="16"/>
                 <w:szCs w:val="16"/>
               </w:rPr>
-              <w:t xml:space="preserve">$28,298,051</w:t>
+              <w:t xml:space="preserve">$28,144,744</w:t>
             </w:r>
           </w:p>
         </w:tc>

</xml_diff>

<commit_message>
Market model: US school seats from the federal 2024-25 child count file (386,380 autism students aged 13 through 21), replacing the last placeholder in the school count; Frank's rule recorded: if you have the document, use the document
Co-Authored-By: Claude Fable 5.1 <noreply@anthropic.com>
Claude-Session: https://claude.ai/code/session_01FdLL4Wp3bi12KNX6zHRo7N
</commit_message>
<xml_diff>
--- a/EZvoxa Market Model and Business Plan.docx
+++ b/EZvoxa Market Model and Business Plan.docx
@@ -1615,7 +1615,7 @@
                 <w:sz w:val="16"/>
                 <w:szCs w:val="16"/>
               </w:rPr>
-              <w:t xml:space="preserve">US students 6 to 21 under IDEA</w:t>
+              <w:t xml:space="preserve">US students under the autism category, ages 3 to 21 (2022-23)</w:t>
             </w:r>
           </w:p>
         </w:tc>
@@ -1641,7 +1641,7 @@
                 <w:sz w:val="16"/>
                 <w:szCs w:val="16"/>
               </w:rPr>
-              <w:t xml:space="preserve">6,998,778</w:t>
+              <w:t xml:space="preserve">980,000</w:t>
             </w:r>
           </w:p>
         </w:tc>
@@ -1693,7 +1693,7 @@
                 <w:sz w:val="16"/>
                 <w:szCs w:val="16"/>
               </w:rPr>
-              <w:t xml:space="preserve">NCES Digest tables 204.30 and 204.70, 2022-23: 7,525,941 children 3 to 21 served under IDEA, of whom 527,163 are 3 to 5.</w:t>
+              <w:t xml:space="preserve">NCES Digest table 204.30, 2022-23: 980,000 served under the autism category ages 3 to 21 (13.0%). Shown for scale; the count used is the 2024-25 federal file's 13 through 21 line.</w:t>
             </w:r>
           </w:p>
         </w:tc>
@@ -1721,7 +1721,7 @@
                 <w:sz w:val="16"/>
                 <w:szCs w:val="16"/>
               </w:rPr>
-              <w:t xml:space="preserve">US students under the autism category</w:t>
+              <w:t xml:space="preserve">US autism students aged 13 through 21 (2024-25)</w:t>
             </w:r>
           </w:p>
         </w:tc>
@@ -1747,7 +1747,7 @@
                 <w:sz w:val="16"/>
                 <w:szCs w:val="16"/>
               </w:rPr>
-              <w:t xml:space="preserve">980,000</w:t>
+              <w:t xml:space="preserve">386,380 of 1,111,435 aged 5 through 21</w:t>
             </w:r>
           </w:p>
         </w:tc>
@@ -1799,7 +1799,7 @@
                 <w:sz w:val="16"/>
                 <w:szCs w:val="16"/>
               </w:rPr>
-              <w:t xml:space="preserve">NCES Digest table 204.30, 2022-23: 980,000 served under the autism category (13.0%).</w:t>
+              <w:t xml:space="preserve">US Department of Education, Office of Special Education Programs, IDEA Section 618 Part B Child Count and Educational Environments 2024-25 (bchildcountandedenvironment2024-25.csv, data.ed.gov), national total row 'US, Outlying Areas, and Freely Associated States', environment 'Total, School Age', disability Autism: ages 13 through 21 sum to 386,380 (ages 13 to 17: 142,976, 134,732, 129,100, 123,068, 112,074; 18 to 21: 59,415, 30,860, 24,236, 16,290); ages 5 through 21 sum to 1,111,435, so 13 through 21 is 34.8%. Read 8 Sep 2026.</w:t>
             </w:r>
           </w:p>
         </w:tc>
@@ -1827,7 +1827,7 @@
                 <w:sz w:val="16"/>
                 <w:szCs w:val="16"/>
               </w:rPr>
-              <w:t xml:space="preserve">Share who are 13 to 21</w:t>
+              <w:t xml:space="preserve">Minimally verbal share</w:t>
             </w:r>
           </w:p>
         </w:tc>
@@ -1853,7 +1853,7 @@
                 <w:sz w:val="16"/>
                 <w:szCs w:val="16"/>
               </w:rPr>
-              <w:t xml:space="preserve">56.3%</w:t>
+              <w:t xml:space="preserve">30%</w:t>
             </w:r>
           </w:p>
         </w:tc>
@@ -1879,7 +1879,7 @@
                 <w:sz w:val="16"/>
                 <w:szCs w:val="16"/>
               </w:rPr>
-              <w:t xml:space="preserve">Assumption, Frank’s to set</w:t>
+              <w:t xml:space="preserve">Verified from the entity’s own page</w:t>
             </w:r>
           </w:p>
         </w:tc>
@@ -1905,7 +1905,7 @@
                 <w:sz w:val="16"/>
                 <w:szCs w:val="16"/>
               </w:rPr>
-              <w:t xml:space="preserve">Share of the US 6 to 21 IDEA autism group who are 13 to 21: nine of sixteen ages, as if every age were equal in number. NCES does not publish the autism count by age in the tables read, and OSEP's autism fast-facts page blocked the request. Caution: England's own file shows only 29.9% of its autism EHC pupils aged 13 and over across ages 2 to 19, so the US share may be lower than this placeholder.</w:t>
+              <w:t xml:space="preserve">Tager-Flusberg and Kasari 2013, NIH-hosted (PMC3869868): about 30% of children with autism remain minimally verbal even after years of intervention. Applied to adults as well, which is an assumption; the study is about school-aged children.</w:t>
             </w:r>
           </w:p>
         </w:tc>
@@ -1933,7 +1933,7 @@
                 <w:sz w:val="16"/>
                 <w:szCs w:val="16"/>
               </w:rPr>
-              <w:t xml:space="preserve">Minimally verbal share</w:t>
+              <w:t xml:space="preserve">US counted school seats</w:t>
             </w:r>
           </w:p>
         </w:tc>
@@ -1959,7 +1959,7 @@
                 <w:sz w:val="16"/>
                 <w:szCs w:val="16"/>
               </w:rPr>
-              <w:t xml:space="preserve">30%</w:t>
+              <w:t xml:space="preserve">115,914</w:t>
             </w:r>
           </w:p>
         </w:tc>
@@ -2011,113 +2011,7 @@
                 <w:sz w:val="16"/>
                 <w:szCs w:val="16"/>
               </w:rPr>
-              <w:t xml:space="preserve">Tager-Flusberg and Kasari 2013, NIH-hosted (PMC3869868): about 30% of children with autism remain minimally verbal even after years of intervention. Applied to adults as well, which is an assumption; the study is about school-aged children.</w:t>
-            </w:r>
-          </w:p>
-        </w:tc>
-      </w:tr>
-      <w:tr>
-        <w:tc>
-          <w:tcPr>
-            <w:tcW w:type="dxa" w:w="2800"/>
-            <w:tcMar>
-              <w:top w:type="dxa" w:w="50"/>
-              <w:left w:type="dxa" w:w="70"/>
-              <w:bottom w:type="dxa" w:w="50"/>
-              <w:right w:type="dxa" w:w="70"/>
-            </w:tcMar>
-          </w:tcPr>
-          <w:p>
-            <w:pPr>
-              <w:jc w:val="left"/>
-            </w:pPr>
-            <w:r>
-              <w:rPr>
-                <w:rFonts w:ascii="Calibri" w:cs="Calibri" w:eastAsia="Calibri" w:hAnsi="Calibri"/>
-                <w:b w:val="false"/>
-                <w:bCs w:val="false"/>
-                <w:sz w:val="16"/>
-                <w:szCs w:val="16"/>
-              </w:rPr>
-              <w:t xml:space="preserve">US counted school seats</w:t>
-            </w:r>
-          </w:p>
-        </w:tc>
-        <w:tc>
-          <w:tcPr>
-            <w:tcW w:type="dxa" w:w="1600"/>
-            <w:tcMar>
-              <w:top w:type="dxa" w:w="50"/>
-              <w:left w:type="dxa" w:w="70"/>
-              <w:bottom w:type="dxa" w:w="50"/>
-              <w:right w:type="dxa" w:w="70"/>
-            </w:tcMar>
-          </w:tcPr>
-          <w:p>
-            <w:pPr>
-              <w:jc w:val="right"/>
-            </w:pPr>
-            <w:r>
-              <w:rPr>
-                <w:rFonts w:ascii="Calibri" w:cs="Calibri" w:eastAsia="Calibri" w:hAnsi="Calibri"/>
-                <w:b w:val="false"/>
-                <w:bCs w:val="false"/>
-                <w:sz w:val="16"/>
-                <w:szCs w:val="16"/>
-              </w:rPr>
-              <w:t xml:space="preserve">165,375</w:t>
-            </w:r>
-          </w:p>
-        </w:tc>
-        <w:tc>
-          <w:tcPr>
-            <w:tcW w:type="dxa" w:w="2400"/>
-            <w:tcMar>
-              <w:top w:type="dxa" w:w="50"/>
-              <w:left w:type="dxa" w:w="70"/>
-              <w:bottom w:type="dxa" w:w="50"/>
-              <w:right w:type="dxa" w:w="70"/>
-            </w:tcMar>
-          </w:tcPr>
-          <w:p>
-            <w:pPr>
-              <w:jc w:val="left"/>
-            </w:pPr>
-            <w:r>
-              <w:rPr>
-                <w:rFonts w:ascii="Calibri" w:cs="Calibri" w:eastAsia="Calibri" w:hAnsi="Calibri"/>
-                <w:b w:val="false"/>
-                <w:bCs w:val="false"/>
-                <w:sz w:val="16"/>
-                <w:szCs w:val="16"/>
-              </w:rPr>
-              <w:t xml:space="preserve">Verified from the entity’s own page</w:t>
-            </w:r>
-          </w:p>
-        </w:tc>
-        <w:tc>
-          <w:tcPr>
-            <w:tcW w:type="dxa" w:w="7000"/>
-            <w:tcMar>
-              <w:top w:type="dxa" w:w="50"/>
-              <w:left w:type="dxa" w:w="70"/>
-              <w:bottom w:type="dxa" w:w="50"/>
-              <w:right w:type="dxa" w:w="70"/>
-            </w:tcMar>
-          </w:tcPr>
-          <w:p>
-            <w:pPr>
-              <w:jc w:val="left"/>
-            </w:pPr>
-            <w:r>
-              <w:rPr>
-                <w:rFonts w:ascii="Calibri" w:cs="Calibri" w:eastAsia="Calibri" w:hAnsi="Calibri"/>
-                <w:b w:val="false"/>
-                <w:bCs w:val="false"/>
-                <w:sz w:val="16"/>
-                <w:szCs w:val="16"/>
-              </w:rPr>
-              <w:t xml:space="preserve">NCES Digest table 204.30, 2022-23: 980,000 served under the autism category (13.0%).</w:t>
+              <w:t xml:space="preserve">US Department of Education, Office of Special Education Programs, IDEA Section 618 Part B Child Count and Educational Environments 2024-25 (bchildcountandedenvironment2024-25.csv, data.ed.gov), national total row 'US, Outlying Areas, and Freely Associated States', environment 'Total, School Age', disability Autism: ages 13 through 21 sum to 386,380 (ages 13 to 17: 142,976, 134,732, 129,100, 123,068, 112,074; 18 to 21: 59,415, 30,860, 24,236, 16,290); ages 5 through 21 sum to 1,111,435, so 13 through 21 is 34.8%. Read 8 Sep 2026.</w:t>
             </w:r>
           </w:p>
         </w:tc>
@@ -2676,7 +2570,7 @@
           <w:sz w:val="22"/>
           <w:szCs w:val="22"/>
         </w:rPr>
-        <w:t xml:space="preserve">Counted school market: 180,214 seats, US and England. Special education outside those two is not yet read.</w:t>
+        <w:t xml:space="preserve">Counted school market: 130,753 seats, US and England. Special education outside those two is not yet read.</w:t>
       </w:r>
     </w:p>
     <w:p>
@@ -3780,7 +3674,7 @@
         <w:rPr>
           <w:rFonts w:ascii="Calibri" w:cs="Calibri" w:eastAsia="Calibri" w:hAnsi="Calibri"/>
         </w:rPr>
-        <w:t xml:space="preserve">All three models combined: five-year net $12,235,865</w:t>
+        <w:t xml:space="preserve">All three models combined: five-year net $11,925,957</w:t>
       </w:r>
     </w:p>
     <w:tbl>
@@ -4044,111 +3938,111 @@
                 <w:sz w:val="14"/>
                 <w:szCs w:val="14"/>
               </w:rPr>
-              <w:t xml:space="preserve">4,025 buyers, 1,006 subs, 240 seats</w:t>
-            </w:r>
-          </w:p>
-        </w:tc>
-        <w:tc>
-          <w:tcPr>
-            <w:tcW w:type="dxa" w:w="1500"/>
-            <w:tcMar>
-              <w:top w:type="dxa" w:w="50"/>
-              <w:left w:type="dxa" w:w="70"/>
-              <w:bottom w:type="dxa" w:w="50"/>
-              <w:right w:type="dxa" w:w="70"/>
-            </w:tcMar>
-          </w:tcPr>
-          <w:p>
-            <w:pPr>
-              <w:jc w:val="right"/>
-            </w:pPr>
-            <w:r>
-              <w:rPr>
-                <w:rFonts w:ascii="Calibri" w:cs="Calibri" w:eastAsia="Calibri" w:hAnsi="Calibri"/>
-                <w:b w:val="false"/>
-                <w:bCs w:val="false"/>
-                <w:sz w:val="14"/>
-                <w:szCs w:val="14"/>
-              </w:rPr>
-              <w:t xml:space="preserve">$492,757</w:t>
-            </w:r>
-          </w:p>
-        </w:tc>
-        <w:tc>
-          <w:tcPr>
-            <w:tcW w:type="dxa" w:w="1500"/>
-            <w:tcMar>
-              <w:top w:type="dxa" w:w="50"/>
-              <w:left w:type="dxa" w:w="70"/>
-              <w:bottom w:type="dxa" w:w="50"/>
-              <w:right w:type="dxa" w:w="70"/>
-            </w:tcMar>
-          </w:tcPr>
-          <w:p>
-            <w:pPr>
-              <w:jc w:val="right"/>
-            </w:pPr>
-            <w:r>
-              <w:rPr>
-                <w:rFonts w:ascii="Calibri" w:cs="Calibri" w:eastAsia="Calibri" w:hAnsi="Calibri"/>
-                <w:b w:val="false"/>
-                <w:bCs w:val="false"/>
-                <w:sz w:val="14"/>
-                <w:szCs w:val="14"/>
-              </w:rPr>
-              <w:t xml:space="preserve">($201,101)</w:t>
-            </w:r>
-          </w:p>
-        </w:tc>
-        <w:tc>
-          <w:tcPr>
-            <w:tcW w:type="dxa" w:w="1500"/>
-            <w:tcMar>
-              <w:top w:type="dxa" w:w="50"/>
-              <w:left w:type="dxa" w:w="70"/>
-              <w:bottom w:type="dxa" w:w="50"/>
-              <w:right w:type="dxa" w:w="70"/>
-            </w:tcMar>
-          </w:tcPr>
-          <w:p>
-            <w:pPr>
-              <w:jc w:val="right"/>
-            </w:pPr>
-            <w:r>
-              <w:rPr>
-                <w:rFonts w:ascii="Calibri" w:cs="Calibri" w:eastAsia="Calibri" w:hAnsi="Calibri"/>
-                <w:b w:val="false"/>
-                <w:bCs w:val="false"/>
-                <w:sz w:val="14"/>
-                <w:szCs w:val="14"/>
-              </w:rPr>
-              <w:t xml:space="preserve">$344,153</w:t>
-            </w:r>
-          </w:p>
-        </w:tc>
-        <w:tc>
-          <w:tcPr>
-            <w:tcW w:type="dxa" w:w="1500"/>
-            <w:tcMar>
-              <w:top w:type="dxa" w:w="50"/>
-              <w:left w:type="dxa" w:w="70"/>
-              <w:bottom w:type="dxa" w:w="50"/>
-              <w:right w:type="dxa" w:w="70"/>
-            </w:tcMar>
-          </w:tcPr>
-          <w:p>
-            <w:pPr>
-              <w:jc w:val="right"/>
-            </w:pPr>
-            <w:r>
-              <w:rPr>
-                <w:rFonts w:ascii="Calibri" w:cs="Calibri" w:eastAsia="Calibri" w:hAnsi="Calibri"/>
-                <w:b w:val="false"/>
-                <w:bCs w:val="false"/>
-                <w:sz w:val="14"/>
-                <w:szCs w:val="14"/>
-              </w:rPr>
-              <w:t xml:space="preserve">$291,656</w:t>
+              <w:t xml:space="preserve">4,025 buyers, 1,006 subs, 191 seats</w:t>
+            </w:r>
+          </w:p>
+        </w:tc>
+        <w:tc>
+          <w:tcPr>
+            <w:tcW w:type="dxa" w:w="1500"/>
+            <w:tcMar>
+              <w:top w:type="dxa" w:w="50"/>
+              <w:left w:type="dxa" w:w="70"/>
+              <w:bottom w:type="dxa" w:w="50"/>
+              <w:right w:type="dxa" w:w="70"/>
+            </w:tcMar>
+          </w:tcPr>
+          <w:p>
+            <w:pPr>
+              <w:jc w:val="right"/>
+            </w:pPr>
+            <w:r>
+              <w:rPr>
+                <w:rFonts w:ascii="Calibri" w:cs="Calibri" w:eastAsia="Calibri" w:hAnsi="Calibri"/>
+                <w:b w:val="false"/>
+                <w:bCs w:val="false"/>
+                <w:sz w:val="14"/>
+                <w:szCs w:val="14"/>
+              </w:rPr>
+              <w:t xml:space="preserve">$486,632</w:t>
+            </w:r>
+          </w:p>
+        </w:tc>
+        <w:tc>
+          <w:tcPr>
+            <w:tcW w:type="dxa" w:w="1500"/>
+            <w:tcMar>
+              <w:top w:type="dxa" w:w="50"/>
+              <w:left w:type="dxa" w:w="70"/>
+              <w:bottom w:type="dxa" w:w="50"/>
+              <w:right w:type="dxa" w:w="70"/>
+            </w:tcMar>
+          </w:tcPr>
+          <w:p>
+            <w:pPr>
+              <w:jc w:val="right"/>
+            </w:pPr>
+            <w:r>
+              <w:rPr>
+                <w:rFonts w:ascii="Calibri" w:cs="Calibri" w:eastAsia="Calibri" w:hAnsi="Calibri"/>
+                <w:b w:val="false"/>
+                <w:bCs w:val="false"/>
+                <w:sz w:val="14"/>
+                <w:szCs w:val="14"/>
+              </w:rPr>
+              <w:t xml:space="preserve">($200,183)</w:t>
+            </w:r>
+          </w:p>
+        </w:tc>
+        <w:tc>
+          <w:tcPr>
+            <w:tcW w:type="dxa" w:w="1500"/>
+            <w:tcMar>
+              <w:top w:type="dxa" w:w="50"/>
+              <w:left w:type="dxa" w:w="70"/>
+              <w:bottom w:type="dxa" w:w="50"/>
+              <w:right w:type="dxa" w:w="70"/>
+            </w:tcMar>
+          </w:tcPr>
+          <w:p>
+            <w:pPr>
+              <w:jc w:val="right"/>
+            </w:pPr>
+            <w:r>
+              <w:rPr>
+                <w:rFonts w:ascii="Calibri" w:cs="Calibri" w:eastAsia="Calibri" w:hAnsi="Calibri"/>
+                <w:b w:val="false"/>
+                <w:bCs w:val="false"/>
+                <w:sz w:val="14"/>
+                <w:szCs w:val="14"/>
+              </w:rPr>
+              <w:t xml:space="preserve">$338,946</w:t>
+            </w:r>
+          </w:p>
+        </w:tc>
+        <w:tc>
+          <w:tcPr>
+            <w:tcW w:type="dxa" w:w="1500"/>
+            <w:tcMar>
+              <w:top w:type="dxa" w:w="50"/>
+              <w:left w:type="dxa" w:w="70"/>
+              <w:bottom w:type="dxa" w:w="50"/>
+              <w:right w:type="dxa" w:w="70"/>
+            </w:tcMar>
+          </w:tcPr>
+          <w:p>
+            <w:pPr>
+              <w:jc w:val="right"/>
+            </w:pPr>
+            <w:r>
+              <w:rPr>
+                <w:rFonts w:ascii="Calibri" w:cs="Calibri" w:eastAsia="Calibri" w:hAnsi="Calibri"/>
+                <w:b w:val="false"/>
+                <w:bCs w:val="false"/>
+                <w:sz w:val="14"/>
+                <w:szCs w:val="14"/>
+              </w:rPr>
+              <w:t xml:space="preserve">$286,450</w:t>
             </w:r>
           </w:p>
         </w:tc>
@@ -4174,7 +4068,7 @@
                 <w:sz w:val="14"/>
                 <w:szCs w:val="14"/>
               </w:rPr>
-              <w:t xml:space="preserve">$291,656</w:t>
+              <w:t xml:space="preserve">$286,450</w:t>
             </w:r>
           </w:p>
         </w:tc>
@@ -4228,111 +4122,111 @@
                 <w:sz w:val="14"/>
                 <w:szCs w:val="14"/>
               </w:rPr>
-              <w:t xml:space="preserve">10,062 buyers, 3,522 subs, 906 seats</w:t>
-            </w:r>
-          </w:p>
-        </w:tc>
-        <w:tc>
-          <w:tcPr>
-            <w:tcW w:type="dxa" w:w="1500"/>
-            <w:tcMar>
-              <w:top w:type="dxa" w:w="50"/>
-              <w:left w:type="dxa" w:w="70"/>
-              <w:bottom w:type="dxa" w:w="50"/>
-              <w:right w:type="dxa" w:w="70"/>
-            </w:tcMar>
-          </w:tcPr>
-          <w:p>
-            <w:pPr>
-              <w:jc w:val="right"/>
-            </w:pPr>
-            <w:r>
-              <w:rPr>
-                <w:rFonts w:ascii="Calibri" w:cs="Calibri" w:eastAsia="Calibri" w:hAnsi="Calibri"/>
-                <w:b w:val="false"/>
-                <w:bCs w:val="false"/>
-                <w:sz w:val="14"/>
-                <w:szCs w:val="14"/>
-              </w:rPr>
-              <w:t xml:space="preserve">$1,390,749</w:t>
-            </w:r>
-          </w:p>
-        </w:tc>
-        <w:tc>
-          <w:tcPr>
-            <w:tcW w:type="dxa" w:w="1500"/>
-            <w:tcMar>
-              <w:top w:type="dxa" w:w="50"/>
-              <w:left w:type="dxa" w:w="70"/>
-              <w:bottom w:type="dxa" w:w="50"/>
-              <w:right w:type="dxa" w:w="70"/>
-            </w:tcMar>
-          </w:tcPr>
-          <w:p>
-            <w:pPr>
-              <w:jc w:val="right"/>
-            </w:pPr>
-            <w:r>
-              <w:rPr>
-                <w:rFonts w:ascii="Calibri" w:cs="Calibri" w:eastAsia="Calibri" w:hAnsi="Calibri"/>
-                <w:b w:val="false"/>
-                <w:bCs w:val="false"/>
-                <w:sz w:val="14"/>
-                <w:szCs w:val="14"/>
-              </w:rPr>
-              <w:t xml:space="preserve">($489,197)</w:t>
-            </w:r>
-          </w:p>
-        </w:tc>
-        <w:tc>
-          <w:tcPr>
-            <w:tcW w:type="dxa" w:w="1500"/>
-            <w:tcMar>
-              <w:top w:type="dxa" w:w="50"/>
-              <w:left w:type="dxa" w:w="70"/>
-              <w:bottom w:type="dxa" w:w="50"/>
-              <w:right w:type="dxa" w:w="70"/>
-            </w:tcMar>
-          </w:tcPr>
-          <w:p>
-            <w:pPr>
-              <w:jc w:val="right"/>
-            </w:pPr>
-            <w:r>
-              <w:rPr>
-                <w:rFonts w:ascii="Calibri" w:cs="Calibri" w:eastAsia="Calibri" w:hAnsi="Calibri"/>
-                <w:b w:val="false"/>
-                <w:bCs w:val="false"/>
-                <w:sz w:val="14"/>
-                <w:szCs w:val="14"/>
-              </w:rPr>
-              <w:t xml:space="preserve">$983,305</w:t>
-            </w:r>
-          </w:p>
-        </w:tc>
-        <w:tc>
-          <w:tcPr>
-            <w:tcW w:type="dxa" w:w="1500"/>
-            <w:tcMar>
-              <w:top w:type="dxa" w:w="50"/>
-              <w:left w:type="dxa" w:w="70"/>
-              <w:bottom w:type="dxa" w:w="50"/>
-              <w:right w:type="dxa" w:w="70"/>
-            </w:tcMar>
-          </w:tcPr>
-          <w:p>
-            <w:pPr>
-              <w:jc w:val="right"/>
-            </w:pPr>
-            <w:r>
-              <w:rPr>
-                <w:rFonts w:ascii="Calibri" w:cs="Calibri" w:eastAsia="Calibri" w:hAnsi="Calibri"/>
-                <w:b w:val="false"/>
-                <w:bCs w:val="false"/>
-                <w:sz w:val="14"/>
-                <w:szCs w:val="14"/>
-              </w:rPr>
-              <w:t xml:space="preserve">$901,552</w:t>
+              <w:t xml:space="preserve">10,062 buyers, 3,522 subs, 708 seats</w:t>
+            </w:r>
+          </w:p>
+        </w:tc>
+        <w:tc>
+          <w:tcPr>
+            <w:tcW w:type="dxa" w:w="1500"/>
+            <w:tcMar>
+              <w:top w:type="dxa" w:w="50"/>
+              <w:left w:type="dxa" w:w="70"/>
+              <w:bottom w:type="dxa" w:w="50"/>
+              <w:right w:type="dxa" w:w="70"/>
+            </w:tcMar>
+          </w:tcPr>
+          <w:p>
+            <w:pPr>
+              <w:jc w:val="right"/>
+            </w:pPr>
+            <w:r>
+              <w:rPr>
+                <w:rFonts w:ascii="Calibri" w:cs="Calibri" w:eastAsia="Calibri" w:hAnsi="Calibri"/>
+                <w:b w:val="false"/>
+                <w:bCs w:val="false"/>
+                <w:sz w:val="14"/>
+                <w:szCs w:val="14"/>
+              </w:rPr>
+              <w:t xml:space="preserve">$1,366,001</w:t>
+            </w:r>
+          </w:p>
+        </w:tc>
+        <w:tc>
+          <w:tcPr>
+            <w:tcW w:type="dxa" w:w="1500"/>
+            <w:tcMar>
+              <w:top w:type="dxa" w:w="50"/>
+              <w:left w:type="dxa" w:w="70"/>
+              <w:bottom w:type="dxa" w:w="50"/>
+              <w:right w:type="dxa" w:w="70"/>
+            </w:tcMar>
+          </w:tcPr>
+          <w:p>
+            <w:pPr>
+              <w:jc w:val="right"/>
+            </w:pPr>
+            <w:r>
+              <w:rPr>
+                <w:rFonts w:ascii="Calibri" w:cs="Calibri" w:eastAsia="Calibri" w:hAnsi="Calibri"/>
+                <w:b w:val="false"/>
+                <w:bCs w:val="false"/>
+                <w:sz w:val="14"/>
+                <w:szCs w:val="14"/>
+              </w:rPr>
+              <w:t xml:space="preserve">($485,485)</w:t>
+            </w:r>
+          </w:p>
+        </w:tc>
+        <w:tc>
+          <w:tcPr>
+            <w:tcW w:type="dxa" w:w="1500"/>
+            <w:tcMar>
+              <w:top w:type="dxa" w:w="50"/>
+              <w:left w:type="dxa" w:w="70"/>
+              <w:bottom w:type="dxa" w:w="50"/>
+              <w:right w:type="dxa" w:w="70"/>
+            </w:tcMar>
+          </w:tcPr>
+          <w:p>
+            <w:pPr>
+              <w:jc w:val="right"/>
+            </w:pPr>
+            <w:r>
+              <w:rPr>
+                <w:rFonts w:ascii="Calibri" w:cs="Calibri" w:eastAsia="Calibri" w:hAnsi="Calibri"/>
+                <w:b w:val="false"/>
+                <w:bCs w:val="false"/>
+                <w:sz w:val="14"/>
+                <w:szCs w:val="14"/>
+              </w:rPr>
+              <w:t xml:space="preserve">$962,269</w:t>
+            </w:r>
+          </w:p>
+        </w:tc>
+        <w:tc>
+          <w:tcPr>
+            <w:tcW w:type="dxa" w:w="1500"/>
+            <w:tcMar>
+              <w:top w:type="dxa" w:w="50"/>
+              <w:left w:type="dxa" w:w="70"/>
+              <w:bottom w:type="dxa" w:w="50"/>
+              <w:right w:type="dxa" w:w="70"/>
+            </w:tcMar>
+          </w:tcPr>
+          <w:p>
+            <w:pPr>
+              <w:jc w:val="right"/>
+            </w:pPr>
+            <w:r>
+              <w:rPr>
+                <w:rFonts w:ascii="Calibri" w:cs="Calibri" w:eastAsia="Calibri" w:hAnsi="Calibri"/>
+                <w:b w:val="false"/>
+                <w:bCs w:val="false"/>
+                <w:sz w:val="14"/>
+                <w:szCs w:val="14"/>
+              </w:rPr>
+              <w:t xml:space="preserve">$880,516</w:t>
             </w:r>
           </w:p>
         </w:tc>
@@ -4358,7 +4252,7 @@
                 <w:sz w:val="14"/>
                 <w:szCs w:val="14"/>
               </w:rPr>
-              <w:t xml:space="preserve">$1,193,208</w:t>
+              <w:t xml:space="preserve">$1,166,966</w:t>
             </w:r>
           </w:p>
         </w:tc>
@@ -4412,111 +4306,111 @@
                 <w:sz w:val="14"/>
                 <w:szCs w:val="14"/>
               </w:rPr>
-              <w:t xml:space="preserve">20,124 buyers, 8,553 subs, 2,167 seats</w:t>
-            </w:r>
-          </w:p>
-        </w:tc>
-        <w:tc>
-          <w:tcPr>
-            <w:tcW w:type="dxa" w:w="1500"/>
-            <w:tcMar>
-              <w:top w:type="dxa" w:w="50"/>
-              <w:left w:type="dxa" w:w="70"/>
-              <w:bottom w:type="dxa" w:w="50"/>
-              <w:right w:type="dxa" w:w="70"/>
-            </w:tcMar>
-          </w:tcPr>
-          <w:p>
-            <w:pPr>
-              <w:jc w:val="right"/>
-            </w:pPr>
-            <w:r>
-              <w:rPr>
-                <w:rFonts w:ascii="Calibri" w:cs="Calibri" w:eastAsia="Calibri" w:hAnsi="Calibri"/>
-                <w:b w:val="false"/>
-                <w:bCs w:val="false"/>
-                <w:sz w:val="14"/>
-                <w:szCs w:val="14"/>
-              </w:rPr>
-              <w:t xml:space="preserve">$3,006,828</w:t>
-            </w:r>
-          </w:p>
-        </w:tc>
-        <w:tc>
-          <w:tcPr>
-            <w:tcW w:type="dxa" w:w="1500"/>
-            <w:tcMar>
-              <w:top w:type="dxa" w:w="50"/>
-              <w:left w:type="dxa" w:w="70"/>
-              <w:bottom w:type="dxa" w:w="50"/>
-              <w:right w:type="dxa" w:w="70"/>
-            </w:tcMar>
-          </w:tcPr>
-          <w:p>
-            <w:pPr>
-              <w:jc w:val="right"/>
-            </w:pPr>
-            <w:r>
-              <w:rPr>
-                <w:rFonts w:ascii="Calibri" w:cs="Calibri" w:eastAsia="Calibri" w:hAnsi="Calibri"/>
-                <w:b w:val="false"/>
-                <w:bCs w:val="false"/>
-                <w:sz w:val="14"/>
-                <w:szCs w:val="14"/>
-              </w:rPr>
-              <w:t xml:space="preserve">($979,808)</w:t>
-            </w:r>
-          </w:p>
-        </w:tc>
-        <w:tc>
-          <w:tcPr>
-            <w:tcW w:type="dxa" w:w="1500"/>
-            <w:tcMar>
-              <w:top w:type="dxa" w:w="50"/>
-              <w:left w:type="dxa" w:w="70"/>
-              <w:bottom w:type="dxa" w:w="50"/>
-              <w:right w:type="dxa" w:w="70"/>
-            </w:tcMar>
-          </w:tcPr>
-          <w:p>
-            <w:pPr>
-              <w:jc w:val="right"/>
-            </w:pPr>
-            <w:r>
-              <w:rPr>
-                <w:rFonts w:ascii="Calibri" w:cs="Calibri" w:eastAsia="Calibri" w:hAnsi="Calibri"/>
-                <w:b w:val="false"/>
-                <w:bCs w:val="false"/>
-                <w:sz w:val="14"/>
-                <w:szCs w:val="14"/>
-              </w:rPr>
-              <w:t xml:space="preserve">$2,139,973</w:t>
-            </w:r>
-          </w:p>
-        </w:tc>
-        <w:tc>
-          <w:tcPr>
-            <w:tcW w:type="dxa" w:w="1500"/>
-            <w:tcMar>
-              <w:top w:type="dxa" w:w="50"/>
-              <w:left w:type="dxa" w:w="70"/>
-              <w:bottom w:type="dxa" w:w="50"/>
-              <w:right w:type="dxa" w:w="70"/>
-            </w:tcMar>
-          </w:tcPr>
-          <w:p>
-            <w:pPr>
-              <w:jc w:val="right"/>
-            </w:pPr>
-            <w:r>
-              <w:rPr>
-                <w:rFonts w:ascii="Calibri" w:cs="Calibri" w:eastAsia="Calibri" w:hAnsi="Calibri"/>
-                <w:b w:val="false"/>
-                <w:bCs w:val="false"/>
-                <w:sz w:val="14"/>
-                <w:szCs w:val="14"/>
-              </w:rPr>
-              <w:t xml:space="preserve">$2,027,020</w:t>
+              <w:t xml:space="preserve">20,124 buyers, 8,553 subs, 1,673 seats</w:t>
+            </w:r>
+          </w:p>
+        </w:tc>
+        <w:tc>
+          <w:tcPr>
+            <w:tcW w:type="dxa" w:w="1500"/>
+            <w:tcMar>
+              <w:top w:type="dxa" w:w="50"/>
+              <w:left w:type="dxa" w:w="70"/>
+              <w:bottom w:type="dxa" w:w="50"/>
+              <w:right w:type="dxa" w:w="70"/>
+            </w:tcMar>
+          </w:tcPr>
+          <w:p>
+            <w:pPr>
+              <w:jc w:val="right"/>
+            </w:pPr>
+            <w:r>
+              <w:rPr>
+                <w:rFonts w:ascii="Calibri" w:cs="Calibri" w:eastAsia="Calibri" w:hAnsi="Calibri"/>
+                <w:b w:val="false"/>
+                <w:bCs w:val="false"/>
+                <w:sz w:val="14"/>
+                <w:szCs w:val="14"/>
+              </w:rPr>
+              <w:t xml:space="preserve">$2,945,083</w:t>
+            </w:r>
+          </w:p>
+        </w:tc>
+        <w:tc>
+          <w:tcPr>
+            <w:tcW w:type="dxa" w:w="1500"/>
+            <w:tcMar>
+              <w:top w:type="dxa" w:w="50"/>
+              <w:left w:type="dxa" w:w="70"/>
+              <w:bottom w:type="dxa" w:w="50"/>
+              <w:right w:type="dxa" w:w="70"/>
+            </w:tcMar>
+          </w:tcPr>
+          <w:p>
+            <w:pPr>
+              <w:jc w:val="right"/>
+            </w:pPr>
+            <w:r>
+              <w:rPr>
+                <w:rFonts w:ascii="Calibri" w:cs="Calibri" w:eastAsia="Calibri" w:hAnsi="Calibri"/>
+                <w:b w:val="false"/>
+                <w:bCs w:val="false"/>
+                <w:sz w:val="14"/>
+                <w:szCs w:val="14"/>
+              </w:rPr>
+              <w:t xml:space="preserve">($970,546)</w:t>
+            </w:r>
+          </w:p>
+        </w:tc>
+        <w:tc>
+          <w:tcPr>
+            <w:tcW w:type="dxa" w:w="1500"/>
+            <w:tcMar>
+              <w:top w:type="dxa" w:w="50"/>
+              <w:left w:type="dxa" w:w="70"/>
+              <w:bottom w:type="dxa" w:w="50"/>
+              <w:right w:type="dxa" w:w="70"/>
+            </w:tcMar>
+          </w:tcPr>
+          <w:p>
+            <w:pPr>
+              <w:jc w:val="right"/>
+            </w:pPr>
+            <w:r>
+              <w:rPr>
+                <w:rFonts w:ascii="Calibri" w:cs="Calibri" w:eastAsia="Calibri" w:hAnsi="Calibri"/>
+                <w:b w:val="false"/>
+                <w:bCs w:val="false"/>
+                <w:sz w:val="14"/>
+                <w:szCs w:val="14"/>
+              </w:rPr>
+              <w:t xml:space="preserve">$2,087,490</w:t>
+            </w:r>
+          </w:p>
+        </w:tc>
+        <w:tc>
+          <w:tcPr>
+            <w:tcW w:type="dxa" w:w="1500"/>
+            <w:tcMar>
+              <w:top w:type="dxa" w:w="50"/>
+              <w:left w:type="dxa" w:w="70"/>
+              <w:bottom w:type="dxa" w:w="50"/>
+              <w:right w:type="dxa" w:w="70"/>
+            </w:tcMar>
+          </w:tcPr>
+          <w:p>
+            <w:pPr>
+              <w:jc w:val="right"/>
+            </w:pPr>
+            <w:r>
+              <w:rPr>
+                <w:rFonts w:ascii="Calibri" w:cs="Calibri" w:eastAsia="Calibri" w:hAnsi="Calibri"/>
+                <w:b w:val="false"/>
+                <w:bCs w:val="false"/>
+                <w:sz w:val="14"/>
+                <w:szCs w:val="14"/>
+              </w:rPr>
+              <w:t xml:space="preserve">$1,974,536</w:t>
             </w:r>
           </w:p>
         </w:tc>
@@ -4542,7 +4436,7 @@
                 <w:sz w:val="14"/>
                 <w:szCs w:val="14"/>
               </w:rPr>
-              <w:t xml:space="preserve">$3,220,228</w:t>
+              <w:t xml:space="preserve">$3,141,502</w:t>
             </w:r>
           </w:p>
         </w:tc>
@@ -4596,111 +4490,111 @@
                 <w:sz w:val="14"/>
                 <w:szCs w:val="14"/>
               </w:rPr>
-              <w:t xml:space="preserve">32,198 buyers, 16,602 subs, 3,854 seats</w:t>
-            </w:r>
-          </w:p>
-        </w:tc>
-        <w:tc>
-          <w:tcPr>
-            <w:tcW w:type="dxa" w:w="1500"/>
-            <w:tcMar>
-              <w:top w:type="dxa" w:w="50"/>
-              <w:left w:type="dxa" w:w="70"/>
-              <w:bottom w:type="dxa" w:w="50"/>
-              <w:right w:type="dxa" w:w="70"/>
-            </w:tcMar>
-          </w:tcPr>
-          <w:p>
-            <w:pPr>
-              <w:jc w:val="right"/>
-            </w:pPr>
-            <w:r>
-              <w:rPr>
-                <w:rFonts w:ascii="Calibri" w:cs="Calibri" w:eastAsia="Calibri" w:hAnsi="Calibri"/>
-                <w:b w:val="false"/>
-                <w:bCs w:val="false"/>
-                <w:sz w:val="14"/>
-                <w:szCs w:val="14"/>
-              </w:rPr>
-              <w:t xml:space="preserve">$5,208,980</w:t>
-            </w:r>
-          </w:p>
-        </w:tc>
-        <w:tc>
-          <w:tcPr>
-            <w:tcW w:type="dxa" w:w="1500"/>
-            <w:tcMar>
-              <w:top w:type="dxa" w:w="50"/>
-              <w:left w:type="dxa" w:w="70"/>
-              <w:bottom w:type="dxa" w:w="50"/>
-              <w:right w:type="dxa" w:w="70"/>
-            </w:tcMar>
-          </w:tcPr>
-          <w:p>
-            <w:pPr>
-              <w:jc w:val="right"/>
-            </w:pPr>
-            <w:r>
-              <w:rPr>
-                <w:rFonts w:ascii="Calibri" w:cs="Calibri" w:eastAsia="Calibri" w:hAnsi="Calibri"/>
-                <w:b w:val="false"/>
-                <w:bCs w:val="false"/>
-                <w:sz w:val="14"/>
-                <w:szCs w:val="14"/>
-              </w:rPr>
-              <w:t xml:space="preserve">($1,621,036)</w:t>
-            </w:r>
-          </w:p>
-        </w:tc>
-        <w:tc>
-          <w:tcPr>
-            <w:tcW w:type="dxa" w:w="1500"/>
-            <w:tcMar>
-              <w:top w:type="dxa" w:w="50"/>
-              <w:left w:type="dxa" w:w="70"/>
-              <w:bottom w:type="dxa" w:w="50"/>
-              <w:right w:type="dxa" w:w="70"/>
-            </w:tcMar>
-          </w:tcPr>
-          <w:p>
-            <w:pPr>
-              <w:jc w:val="right"/>
-            </w:pPr>
-            <w:r>
-              <w:rPr>
-                <w:rFonts w:ascii="Calibri" w:cs="Calibri" w:eastAsia="Calibri" w:hAnsi="Calibri"/>
-                <w:b w:val="false"/>
-                <w:bCs w:val="false"/>
-                <w:sz w:val="14"/>
-                <w:szCs w:val="14"/>
-              </w:rPr>
-              <w:t xml:space="preserve">$3,727,197</w:t>
-            </w:r>
-          </w:p>
-        </w:tc>
-        <w:tc>
-          <w:tcPr>
-            <w:tcW w:type="dxa" w:w="1500"/>
-            <w:tcMar>
-              <w:top w:type="dxa" w:w="50"/>
-              <w:left w:type="dxa" w:w="70"/>
-              <w:bottom w:type="dxa" w:w="50"/>
-              <w:right w:type="dxa" w:w="70"/>
-            </w:tcMar>
-          </w:tcPr>
-          <w:p>
-            <w:pPr>
-              <w:jc w:val="right"/>
-            </w:pPr>
-            <w:r>
-              <w:rPr>
-                <w:rFonts w:ascii="Calibri" w:cs="Calibri" w:eastAsia="Calibri" w:hAnsi="Calibri"/>
-                <w:b w:val="false"/>
-                <w:bCs w:val="false"/>
-                <w:sz w:val="14"/>
-                <w:szCs w:val="14"/>
-              </w:rPr>
-              <w:t xml:space="preserve">$3,587,945</w:t>
+              <w:t xml:space="preserve">32,198 buyers, 16,602 subs, 2,964 seats</w:t>
+            </w:r>
+          </w:p>
+        </w:tc>
+        <w:tc>
+          <w:tcPr>
+            <w:tcW w:type="dxa" w:w="1500"/>
+            <w:tcMar>
+              <w:top w:type="dxa" w:w="50"/>
+              <w:left w:type="dxa" w:w="70"/>
+              <w:bottom w:type="dxa" w:w="50"/>
+              <w:right w:type="dxa" w:w="70"/>
+            </w:tcMar>
+          </w:tcPr>
+          <w:p>
+            <w:pPr>
+              <w:jc w:val="right"/>
+            </w:pPr>
+            <w:r>
+              <w:rPr>
+                <w:rFonts w:ascii="Calibri" w:cs="Calibri" w:eastAsia="Calibri" w:hAnsi="Calibri"/>
+                <w:b w:val="false"/>
+                <w:bCs w:val="false"/>
+                <w:sz w:val="14"/>
+                <w:szCs w:val="14"/>
+              </w:rPr>
+              <w:t xml:space="preserve">$5,097,739</w:t>
+            </w:r>
+          </w:p>
+        </w:tc>
+        <w:tc>
+          <w:tcPr>
+            <w:tcW w:type="dxa" w:w="1500"/>
+            <w:tcMar>
+              <w:top w:type="dxa" w:w="50"/>
+              <w:left w:type="dxa" w:w="70"/>
+              <w:bottom w:type="dxa" w:w="50"/>
+              <w:right w:type="dxa" w:w="70"/>
+            </w:tcMar>
+          </w:tcPr>
+          <w:p>
+            <w:pPr>
+              <w:jc w:val="right"/>
+            </w:pPr>
+            <w:r>
+              <w:rPr>
+                <w:rFonts w:ascii="Calibri" w:cs="Calibri" w:eastAsia="Calibri" w:hAnsi="Calibri"/>
+                <w:b w:val="false"/>
+                <w:bCs w:val="false"/>
+                <w:sz w:val="14"/>
+                <w:szCs w:val="14"/>
+              </w:rPr>
+              <w:t xml:space="preserve">($1,604,349)</w:t>
+            </w:r>
+          </w:p>
+        </w:tc>
+        <w:tc>
+          <w:tcPr>
+            <w:tcW w:type="dxa" w:w="1500"/>
+            <w:tcMar>
+              <w:top w:type="dxa" w:w="50"/>
+              <w:left w:type="dxa" w:w="70"/>
+              <w:bottom w:type="dxa" w:w="50"/>
+              <w:right w:type="dxa" w:w="70"/>
+            </w:tcMar>
+          </w:tcPr>
+          <w:p>
+            <w:pPr>
+              <w:jc w:val="right"/>
+            </w:pPr>
+            <w:r>
+              <w:rPr>
+                <w:rFonts w:ascii="Calibri" w:cs="Calibri" w:eastAsia="Calibri" w:hAnsi="Calibri"/>
+                <w:b w:val="false"/>
+                <w:bCs w:val="false"/>
+                <w:sz w:val="14"/>
+                <w:szCs w:val="14"/>
+              </w:rPr>
+              <w:t xml:space="preserve">$3,632,643</w:t>
+            </w:r>
+          </w:p>
+        </w:tc>
+        <w:tc>
+          <w:tcPr>
+            <w:tcW w:type="dxa" w:w="1500"/>
+            <w:tcMar>
+              <w:top w:type="dxa" w:w="50"/>
+              <w:left w:type="dxa" w:w="70"/>
+              <w:bottom w:type="dxa" w:w="50"/>
+              <w:right w:type="dxa" w:w="70"/>
+            </w:tcMar>
+          </w:tcPr>
+          <w:p>
+            <w:pPr>
+              <w:jc w:val="right"/>
+            </w:pPr>
+            <w:r>
+              <w:rPr>
+                <w:rFonts w:ascii="Calibri" w:cs="Calibri" w:eastAsia="Calibri" w:hAnsi="Calibri"/>
+                <w:b w:val="false"/>
+                <w:bCs w:val="false"/>
+                <w:sz w:val="14"/>
+                <w:szCs w:val="14"/>
+              </w:rPr>
+              <w:t xml:space="preserve">$3,493,390</w:t>
             </w:r>
           </w:p>
         </w:tc>
@@ -4726,7 +4620,7 @@
                 <w:sz w:val="14"/>
                 <w:szCs w:val="14"/>
               </w:rPr>
-              <w:t xml:space="preserve">$6,808,173</w:t>
+              <w:t xml:space="preserve">$6,634,892</w:t>
             </w:r>
           </w:p>
         </w:tc>
@@ -4780,111 +4674,111 @@
                 <w:sz w:val="14"/>
                 <w:szCs w:val="14"/>
               </w:rPr>
-              <w:t xml:space="preserve">44,272 buyers, 27,670 subs, 5,541 seats</w:t>
-            </w:r>
-          </w:p>
-        </w:tc>
-        <w:tc>
-          <w:tcPr>
-            <w:tcW w:type="dxa" w:w="1500"/>
-            <w:tcMar>
-              <w:top w:type="dxa" w:w="50"/>
-              <w:left w:type="dxa" w:w="70"/>
-              <w:bottom w:type="dxa" w:w="50"/>
-              <w:right w:type="dxa" w:w="70"/>
-            </w:tcMar>
-          </w:tcPr>
-          <w:p>
-            <w:pPr>
-              <w:jc w:val="right"/>
-            </w:pPr>
-            <w:r>
-              <w:rPr>
-                <w:rFonts w:ascii="Calibri" w:cs="Calibri" w:eastAsia="Calibri" w:hAnsi="Calibri"/>
-                <w:b w:val="false"/>
-                <w:bCs w:val="false"/>
-                <w:sz w:val="14"/>
-                <w:szCs w:val="14"/>
-              </w:rPr>
-              <w:t xml:space="preserve">$7,772,991</w:t>
-            </w:r>
-          </w:p>
-        </w:tc>
-        <w:tc>
-          <w:tcPr>
-            <w:tcW w:type="dxa" w:w="1500"/>
-            <w:tcMar>
-              <w:top w:type="dxa" w:w="50"/>
-              <w:left w:type="dxa" w:w="70"/>
-              <w:bottom w:type="dxa" w:w="50"/>
-              <w:right w:type="dxa" w:w="70"/>
-            </w:tcMar>
-          </w:tcPr>
-          <w:p>
-            <w:pPr>
-              <w:jc w:val="right"/>
-            </w:pPr>
-            <w:r>
-              <w:rPr>
-                <w:rFonts w:ascii="Calibri" w:cs="Calibri" w:eastAsia="Calibri" w:hAnsi="Calibri"/>
-                <w:b w:val="false"/>
-                <w:bCs w:val="false"/>
-                <w:sz w:val="14"/>
-                <w:szCs w:val="14"/>
-              </w:rPr>
-              <w:t xml:space="preserve">($2,345,299)</w:t>
-            </w:r>
-          </w:p>
-        </w:tc>
-        <w:tc>
-          <w:tcPr>
-            <w:tcW w:type="dxa" w:w="1500"/>
-            <w:tcMar>
-              <w:top w:type="dxa" w:w="50"/>
-              <w:left w:type="dxa" w:w="70"/>
-              <w:bottom w:type="dxa" w:w="50"/>
-              <w:right w:type="dxa" w:w="70"/>
-            </w:tcMar>
-          </w:tcPr>
-          <w:p>
-            <w:pPr>
-              <w:jc w:val="right"/>
-            </w:pPr>
-            <w:r>
-              <w:rPr>
-                <w:rFonts w:ascii="Calibri" w:cs="Calibri" w:eastAsia="Calibri" w:hAnsi="Calibri"/>
-                <w:b w:val="false"/>
-                <w:bCs w:val="false"/>
-                <w:sz w:val="14"/>
-                <w:szCs w:val="14"/>
-              </w:rPr>
-              <w:t xml:space="preserve">$5,585,674</w:t>
-            </w:r>
-          </w:p>
-        </w:tc>
-        <w:tc>
-          <w:tcPr>
-            <w:tcW w:type="dxa" w:w="1500"/>
-            <w:tcMar>
-              <w:top w:type="dxa" w:w="50"/>
-              <w:left w:type="dxa" w:w="70"/>
-              <w:bottom w:type="dxa" w:w="50"/>
-              <w:right w:type="dxa" w:w="70"/>
-            </w:tcMar>
-          </w:tcPr>
-          <w:p>
-            <w:pPr>
-              <w:jc w:val="right"/>
-            </w:pPr>
-            <w:r>
-              <w:rPr>
-                <w:rFonts w:ascii="Calibri" w:cs="Calibri" w:eastAsia="Calibri" w:hAnsi="Calibri"/>
-                <w:b w:val="false"/>
-                <w:bCs w:val="false"/>
-                <w:sz w:val="14"/>
-                <w:szCs w:val="14"/>
-              </w:rPr>
-              <w:t xml:space="preserve">$5,427,692</w:t>
+              <w:t xml:space="preserve">44,272 buyers, 27,670 subs, 4,255 seats</w:t>
+            </w:r>
+          </w:p>
+        </w:tc>
+        <w:tc>
+          <w:tcPr>
+            <w:tcW w:type="dxa" w:w="1500"/>
+            <w:tcMar>
+              <w:top w:type="dxa" w:w="50"/>
+              <w:left w:type="dxa" w:w="70"/>
+              <w:bottom w:type="dxa" w:w="50"/>
+              <w:right w:type="dxa" w:w="70"/>
+            </w:tcMar>
+          </w:tcPr>
+          <w:p>
+            <w:pPr>
+              <w:jc w:val="right"/>
+            </w:pPr>
+            <w:r>
+              <w:rPr>
+                <w:rFonts w:ascii="Calibri" w:cs="Calibri" w:eastAsia="Calibri" w:hAnsi="Calibri"/>
+                <w:b w:val="false"/>
+                <w:bCs w:val="false"/>
+                <w:sz w:val="14"/>
+                <w:szCs w:val="14"/>
+              </w:rPr>
+              <w:t xml:space="preserve">$7,612,253</w:t>
+            </w:r>
+          </w:p>
+        </w:tc>
+        <w:tc>
+          <w:tcPr>
+            <w:tcW w:type="dxa" w:w="1500"/>
+            <w:tcMar>
+              <w:top w:type="dxa" w:w="50"/>
+              <w:left w:type="dxa" w:w="70"/>
+              <w:bottom w:type="dxa" w:w="50"/>
+              <w:right w:type="dxa" w:w="70"/>
+            </w:tcMar>
+          </w:tcPr>
+          <w:p>
+            <w:pPr>
+              <w:jc w:val="right"/>
+            </w:pPr>
+            <w:r>
+              <w:rPr>
+                <w:rFonts w:ascii="Calibri" w:cs="Calibri" w:eastAsia="Calibri" w:hAnsi="Calibri"/>
+                <w:b w:val="false"/>
+                <w:bCs w:val="false"/>
+                <w:sz w:val="14"/>
+                <w:szCs w:val="14"/>
+              </w:rPr>
+              <w:t xml:space="preserve">($2,321,188)</w:t>
+            </w:r>
+          </w:p>
+        </w:tc>
+        <w:tc>
+          <w:tcPr>
+            <w:tcW w:type="dxa" w:w="1500"/>
+            <w:tcMar>
+              <w:top w:type="dxa" w:w="50"/>
+              <w:left w:type="dxa" w:w="70"/>
+              <w:bottom w:type="dxa" w:w="50"/>
+              <w:right w:type="dxa" w:w="70"/>
+            </w:tcMar>
+          </w:tcPr>
+          <w:p>
+            <w:pPr>
+              <w:jc w:val="right"/>
+            </w:pPr>
+            <w:r>
+              <w:rPr>
+                <w:rFonts w:ascii="Calibri" w:cs="Calibri" w:eastAsia="Calibri" w:hAnsi="Calibri"/>
+                <w:b w:val="false"/>
+                <w:bCs w:val="false"/>
+                <w:sz w:val="14"/>
+                <w:szCs w:val="14"/>
+              </w:rPr>
+              <w:t xml:space="preserve">$5,449,047</w:t>
+            </w:r>
+          </w:p>
+        </w:tc>
+        <w:tc>
+          <w:tcPr>
+            <w:tcW w:type="dxa" w:w="1500"/>
+            <w:tcMar>
+              <w:top w:type="dxa" w:w="50"/>
+              <w:left w:type="dxa" w:w="70"/>
+              <w:bottom w:type="dxa" w:w="50"/>
+              <w:right w:type="dxa" w:w="70"/>
+            </w:tcMar>
+          </w:tcPr>
+          <w:p>
+            <w:pPr>
+              <w:jc w:val="right"/>
+            </w:pPr>
+            <w:r>
+              <w:rPr>
+                <w:rFonts w:ascii="Calibri" w:cs="Calibri" w:eastAsia="Calibri" w:hAnsi="Calibri"/>
+                <w:b w:val="false"/>
+                <w:bCs w:val="false"/>
+                <w:sz w:val="14"/>
+                <w:szCs w:val="14"/>
+              </w:rPr>
+              <w:t xml:space="preserve">$5,291,065</w:t>
             </w:r>
           </w:p>
         </w:tc>
@@ -4910,7 +4804,7 @@
                 <w:sz w:val="14"/>
                 <w:szCs w:val="14"/>
               </w:rPr>
-              <w:t xml:space="preserve">$12,235,865</w:t>
+              <w:t xml:space="preserve">$11,925,957</w:t>
             </w:r>
           </w:p>
         </w:tc>
@@ -4990,85 +4884,85 @@
                 <w:sz w:val="14"/>
                 <w:szCs w:val="14"/>
               </w:rPr>
-              <w:t xml:space="preserve">$17,872,305</w:t>
-            </w:r>
-          </w:p>
-        </w:tc>
-        <w:tc>
-          <w:tcPr>
-            <w:tcW w:type="dxa" w:w="1500"/>
-            <w:tcMar>
-              <w:top w:type="dxa" w:w="50"/>
-              <w:left w:type="dxa" w:w="70"/>
-              <w:bottom w:type="dxa" w:w="50"/>
-              <w:right w:type="dxa" w:w="70"/>
-            </w:tcMar>
-          </w:tcPr>
-          <w:p>
-            <w:pPr>
-              <w:jc w:val="right"/>
-            </w:pPr>
-            <w:r>
-              <w:rPr>
-                <w:rFonts w:ascii="Calibri" w:cs="Calibri" w:eastAsia="Calibri" w:hAnsi="Calibri"/>
-                <w:b w:val="false"/>
-                <w:bCs w:val="false"/>
-                <w:sz w:val="14"/>
-                <w:szCs w:val="14"/>
-              </w:rPr>
-              <w:t xml:space="preserve">($5,636,441)</w:t>
-            </w:r>
-          </w:p>
-        </w:tc>
-        <w:tc>
-          <w:tcPr>
-            <w:tcW w:type="dxa" w:w="1500"/>
-            <w:tcMar>
-              <w:top w:type="dxa" w:w="50"/>
-              <w:left w:type="dxa" w:w="70"/>
-              <w:bottom w:type="dxa" w:w="50"/>
-              <w:right w:type="dxa" w:w="70"/>
-            </w:tcMar>
-          </w:tcPr>
-          <w:p>
-            <w:pPr>
-              <w:jc w:val="right"/>
-            </w:pPr>
-            <w:r>
-              <w:rPr>
-                <w:rFonts w:ascii="Calibri" w:cs="Calibri" w:eastAsia="Calibri" w:hAnsi="Calibri"/>
-                <w:b w:val="false"/>
-                <w:bCs w:val="false"/>
-                <w:sz w:val="14"/>
-                <w:szCs w:val="14"/>
-              </w:rPr>
-              <w:t xml:space="preserve">$12,780,302</w:t>
-            </w:r>
-          </w:p>
-        </w:tc>
-        <w:tc>
-          <w:tcPr>
-            <w:tcW w:type="dxa" w:w="1500"/>
-            <w:tcMar>
-              <w:top w:type="dxa" w:w="50"/>
-              <w:left w:type="dxa" w:w="70"/>
-              <w:bottom w:type="dxa" w:w="50"/>
-              <w:right w:type="dxa" w:w="70"/>
-            </w:tcMar>
-          </w:tcPr>
-          <w:p>
-            <w:pPr>
-              <w:jc w:val="right"/>
-            </w:pPr>
-            <w:r>
-              <w:rPr>
-                <w:rFonts w:ascii="Calibri" w:cs="Calibri" w:eastAsia="Calibri" w:hAnsi="Calibri"/>
-                <w:b w:val="false"/>
-                <w:bCs w:val="false"/>
-                <w:sz w:val="14"/>
-                <w:szCs w:val="14"/>
-              </w:rPr>
-              <w:t xml:space="preserve">$12,235,865</w:t>
+              <w:t xml:space="preserve">$17,507,708</w:t>
+            </w:r>
+          </w:p>
+        </w:tc>
+        <w:tc>
+          <w:tcPr>
+            <w:tcW w:type="dxa" w:w="1500"/>
+            <w:tcMar>
+              <w:top w:type="dxa" w:w="50"/>
+              <w:left w:type="dxa" w:w="70"/>
+              <w:bottom w:type="dxa" w:w="50"/>
+              <w:right w:type="dxa" w:w="70"/>
+            </w:tcMar>
+          </w:tcPr>
+          <w:p>
+            <w:pPr>
+              <w:jc w:val="right"/>
+            </w:pPr>
+            <w:r>
+              <w:rPr>
+                <w:rFonts w:ascii="Calibri" w:cs="Calibri" w:eastAsia="Calibri" w:hAnsi="Calibri"/>
+                <w:b w:val="false"/>
+                <w:bCs w:val="false"/>
+                <w:sz w:val="14"/>
+                <w:szCs w:val="14"/>
+              </w:rPr>
+              <w:t xml:space="preserve">($5,581,751)</w:t>
+            </w:r>
+          </w:p>
+        </w:tc>
+        <w:tc>
+          <w:tcPr>
+            <w:tcW w:type="dxa" w:w="1500"/>
+            <w:tcMar>
+              <w:top w:type="dxa" w:w="50"/>
+              <w:left w:type="dxa" w:w="70"/>
+              <w:bottom w:type="dxa" w:w="50"/>
+              <w:right w:type="dxa" w:w="70"/>
+            </w:tcMar>
+          </w:tcPr>
+          <w:p>
+            <w:pPr>
+              <w:jc w:val="right"/>
+            </w:pPr>
+            <w:r>
+              <w:rPr>
+                <w:rFonts w:ascii="Calibri" w:cs="Calibri" w:eastAsia="Calibri" w:hAnsi="Calibri"/>
+                <w:b w:val="false"/>
+                <w:bCs w:val="false"/>
+                <w:sz w:val="14"/>
+                <w:szCs w:val="14"/>
+              </w:rPr>
+              <w:t xml:space="preserve">$12,470,395</w:t>
+            </w:r>
+          </w:p>
+        </w:tc>
+        <w:tc>
+          <w:tcPr>
+            <w:tcW w:type="dxa" w:w="1500"/>
+            <w:tcMar>
+              <w:top w:type="dxa" w:w="50"/>
+              <w:left w:type="dxa" w:w="70"/>
+              <w:bottom w:type="dxa" w:w="50"/>
+              <w:right w:type="dxa" w:w="70"/>
+            </w:tcMar>
+          </w:tcPr>
+          <w:p>
+            <w:pPr>
+              <w:jc w:val="right"/>
+            </w:pPr>
+            <w:r>
+              <w:rPr>
+                <w:rFonts w:ascii="Calibri" w:cs="Calibri" w:eastAsia="Calibri" w:hAnsi="Calibri"/>
+                <w:b w:val="false"/>
+                <w:bCs w:val="false"/>
+                <w:sz w:val="14"/>
+                <w:szCs w:val="14"/>
+              </w:rPr>
+              <w:t xml:space="preserve">$11,925,957</w:t>
             </w:r>
           </w:p>
         </w:tc>
@@ -5094,7 +4988,7 @@
                 <w:sz w:val="14"/>
                 <w:szCs w:val="14"/>
               </w:rPr>
-              <w:t xml:space="preserve">$12,235,865</w:t>
+              <w:t xml:space="preserve">$11,925,957</w:t>
             </w:r>
           </w:p>
         </w:tc>
@@ -5122,7 +5016,7 @@
         <w:rPr>
           <w:rFonts w:ascii="Calibri" w:cs="Calibri" w:eastAsia="Calibri" w:hAnsi="Calibri"/>
         </w:rPr>
-        <w:t xml:space="preserve">Consumer model: five-year net $10,932,727, 110,681 buyers, 2.7% of the counted market after five years</w:t>
+        <w:t xml:space="preserve">Consumer model: five-year net $10,922,796, 110,681 buyers, 2.7% of the counted market after five years</w:t>
       </w:r>
     </w:p>
     <w:tbl>
@@ -5438,7 +5332,7 @@
                 <w:sz w:val="14"/>
                 <w:szCs w:val="14"/>
               </w:rPr>
-              <w:t xml:space="preserve">($193,406)</w:t>
+              <w:t xml:space="preserve">($194,027)</w:t>
             </w:r>
           </w:p>
         </w:tc>
@@ -5490,7 +5384,7 @@
                 <w:sz w:val="14"/>
                 <w:szCs w:val="14"/>
               </w:rPr>
-              <w:t xml:space="preserve">$269,354</w:t>
+              <w:t xml:space="preserve">$268,733</w:t>
             </w:r>
           </w:p>
         </w:tc>
@@ -5516,7 +5410,7 @@
                 <w:sz w:val="14"/>
                 <w:szCs w:val="14"/>
               </w:rPr>
-              <w:t xml:space="preserve">$269,354</w:t>
+              <w:t xml:space="preserve">$268,733</w:t>
             </w:r>
           </w:p>
         </w:tc>
@@ -5622,7 +5516,7 @@
                 <w:sz w:val="14"/>
                 <w:szCs w:val="14"/>
               </w:rPr>
-              <w:t xml:space="preserve">($465,554)</w:t>
+              <w:t xml:space="preserve">($466,915)</w:t>
             </w:r>
           </w:p>
         </w:tc>
@@ -5674,7 +5568,7 @@
                 <w:sz w:val="14"/>
                 <w:szCs w:val="14"/>
               </w:rPr>
-              <w:t xml:space="preserve">$811,953</w:t>
+              <w:t xml:space="preserve">$810,593</w:t>
             </w:r>
           </w:p>
         </w:tc>
@@ -5700,7 +5594,7 @@
                 <w:sz w:val="14"/>
                 <w:szCs w:val="14"/>
               </w:rPr>
-              <w:t xml:space="preserve">$1,081,307</w:t>
+              <w:t xml:space="preserve">$1,079,326</w:t>
             </w:r>
           </w:p>
         </w:tc>
@@ -5806,7 +5700,7 @@
                 <w:sz w:val="14"/>
                 <w:szCs w:val="14"/>
               </w:rPr>
-              <w:t xml:space="preserve">($929,005)</w:t>
+              <w:t xml:space="preserve">($931,160)</w:t>
             </w:r>
           </w:p>
         </w:tc>
@@ -5858,7 +5752,7 @@
                 <w:sz w:val="14"/>
                 <w:szCs w:val="14"/>
               </w:rPr>
-              <w:t xml:space="preserve">$1,806,969</w:t>
+              <w:t xml:space="preserve">$1,804,815</w:t>
             </w:r>
           </w:p>
         </w:tc>
@@ -5884,7 +5778,7 @@
                 <w:sz w:val="14"/>
                 <w:szCs w:val="14"/>
               </w:rPr>
-              <w:t xml:space="preserve">$2,888,276</w:t>
+              <w:t xml:space="preserve">$2,884,141</w:t>
             </w:r>
           </w:p>
         </w:tc>
@@ -5990,7 +5884,7 @@
                 <w:sz w:val="14"/>
                 <w:szCs w:val="14"/>
               </w:rPr>
-              <w:t xml:space="preserve">($1,535,901)</w:t>
+              <w:t xml:space="preserve">($1,538,659)</w:t>
             </w:r>
           </w:p>
         </w:tc>
@@ -6042,7 +5936,7 @@
                 <w:sz w:val="14"/>
                 <w:szCs w:val="14"/>
               </w:rPr>
-              <w:t xml:space="preserve">$3,191,367</w:t>
+              <w:t xml:space="preserve">$3,188,610</w:t>
             </w:r>
           </w:p>
         </w:tc>
@@ -6068,7 +5962,7 @@
                 <w:sz w:val="14"/>
                 <w:szCs w:val="14"/>
               </w:rPr>
-              <w:t xml:space="preserve">$6,079,643</w:t>
+              <w:t xml:space="preserve">$6,072,751</w:t>
             </w:r>
           </w:p>
         </w:tc>
@@ -6174,7 +6068,7 @@
                 <w:sz w:val="14"/>
                 <w:szCs w:val="14"/>
               </w:rPr>
-              <w:t xml:space="preserve">($2,227,337)</w:t>
+              <w:t xml:space="preserve">($2,230,376)</w:t>
             </w:r>
           </w:p>
         </w:tc>
@@ -6226,7 +6120,7 @@
                 <w:sz w:val="14"/>
                 <w:szCs w:val="14"/>
               </w:rPr>
-              <w:t xml:space="preserve">$4,853,084</w:t>
+              <w:t xml:space="preserve">$4,850,045</w:t>
             </w:r>
           </w:p>
         </w:tc>
@@ -6252,7 +6146,7 @@
                 <w:sz w:val="14"/>
                 <w:szCs w:val="14"/>
               </w:rPr>
-              <w:t xml:space="preserve">$10,932,727</w:t>
+              <w:t xml:space="preserve">$10,922,796</w:t>
             </w:r>
           </w:p>
         </w:tc>
@@ -6358,7 +6252,7 @@
                 <w:sz w:val="14"/>
                 <w:szCs w:val="14"/>
               </w:rPr>
-              <w:t xml:space="preserve">($5,351,203)</w:t>
+              <w:t xml:space="preserve">($5,361,137)</w:t>
             </w:r>
           </w:p>
         </w:tc>
@@ -6410,7 +6304,7 @@
                 <w:sz w:val="14"/>
                 <w:szCs w:val="14"/>
               </w:rPr>
-              <w:t xml:space="preserve">$10,932,727</w:t>
+              <w:t xml:space="preserve">$10,922,796</w:t>
             </w:r>
           </w:p>
         </w:tc>
@@ -6436,7 +6330,7 @@
                 <w:sz w:val="14"/>
                 <w:szCs w:val="14"/>
               </w:rPr>
-              <w:t xml:space="preserve">$10,932,727</w:t>
+              <w:t xml:space="preserve">$10,922,796</w:t>
             </w:r>
           </w:p>
         </w:tc>
@@ -6464,7 +6358,7 @@
         <w:rPr>
           <w:rFonts w:ascii="Calibri" w:cs="Calibri" w:eastAsia="Calibri" w:hAnsi="Calibri"/>
         </w:rPr>
-        <w:t xml:space="preserve">School district model: five-year net $1,090,768</w:t>
+        <w:t xml:space="preserve">School district model: five-year net $790,954</w:t>
       </w:r>
     </w:p>
     <w:tbl>
@@ -6728,111 +6622,111 @@
                 <w:sz w:val="14"/>
                 <w:szCs w:val="14"/>
               </w:rPr>
-              <w:t xml:space="preserve">180 seats (0.10% of market), 5 districts</w:t>
-            </w:r>
-          </w:p>
-        </w:tc>
-        <w:tc>
-          <w:tcPr>
-            <w:tcW w:type="dxa" w:w="1500"/>
-            <w:tcMar>
-              <w:top w:type="dxa" w:w="50"/>
-              <w:left w:type="dxa" w:w="70"/>
-              <w:bottom w:type="dxa" w:w="50"/>
-              <w:right w:type="dxa" w:w="70"/>
-            </w:tcMar>
-          </w:tcPr>
-          <w:p>
-            <w:pPr>
-              <w:jc w:val="right"/>
-            </w:pPr>
-            <w:r>
-              <w:rPr>
-                <w:rFonts w:ascii="Calibri" w:cs="Calibri" w:eastAsia="Calibri" w:hAnsi="Calibri"/>
-                <w:b w:val="false"/>
-                <w:bCs w:val="false"/>
-                <w:sz w:val="14"/>
-                <w:szCs w:val="14"/>
-              </w:rPr>
-              <w:t xml:space="preserve">$22,498</w:t>
-            </w:r>
-          </w:p>
-        </w:tc>
-        <w:tc>
-          <w:tcPr>
-            <w:tcW w:type="dxa" w:w="1500"/>
-            <w:tcMar>
-              <w:top w:type="dxa" w:w="50"/>
-              <w:left w:type="dxa" w:w="70"/>
-              <w:bottom w:type="dxa" w:w="50"/>
-              <w:right w:type="dxa" w:w="70"/>
-            </w:tcMar>
-          </w:tcPr>
-          <w:p>
-            <w:pPr>
-              <w:jc w:val="right"/>
-            </w:pPr>
-            <w:r>
-              <w:rPr>
-                <w:rFonts w:ascii="Calibri" w:cs="Calibri" w:eastAsia="Calibri" w:hAnsi="Calibri"/>
-                <w:b w:val="false"/>
-                <w:bCs w:val="false"/>
-                <w:sz w:val="14"/>
-                <w:szCs w:val="14"/>
-              </w:rPr>
-              <w:t xml:space="preserve">($5,772)</w:t>
-            </w:r>
-          </w:p>
-        </w:tc>
-        <w:tc>
-          <w:tcPr>
-            <w:tcW w:type="dxa" w:w="1500"/>
-            <w:tcMar>
-              <w:top w:type="dxa" w:w="50"/>
-              <w:left w:type="dxa" w:w="70"/>
-              <w:bottom w:type="dxa" w:w="50"/>
-              <w:right w:type="dxa" w:w="70"/>
-            </w:tcMar>
-          </w:tcPr>
-          <w:p>
-            <w:pPr>
-              <w:jc w:val="right"/>
-            </w:pPr>
-            <w:r>
-              <w:rPr>
-                <w:rFonts w:ascii="Calibri" w:cs="Calibri" w:eastAsia="Calibri" w:hAnsi="Calibri"/>
-                <w:b w:val="false"/>
-                <w:bCs w:val="false"/>
-                <w:sz w:val="14"/>
-                <w:szCs w:val="14"/>
-              </w:rPr>
-              <w:t xml:space="preserve">$19,123</w:t>
-            </w:r>
-          </w:p>
-        </w:tc>
-        <w:tc>
-          <w:tcPr>
-            <w:tcW w:type="dxa" w:w="1500"/>
-            <w:tcMar>
-              <w:top w:type="dxa" w:w="50"/>
-              <w:left w:type="dxa" w:w="70"/>
-              <w:bottom w:type="dxa" w:w="50"/>
-              <w:right w:type="dxa" w:w="70"/>
-            </w:tcMar>
-          </w:tcPr>
-          <w:p>
-            <w:pPr>
-              <w:jc w:val="right"/>
-            </w:pPr>
-            <w:r>
-              <w:rPr>
-                <w:rFonts w:ascii="Calibri" w:cs="Calibri" w:eastAsia="Calibri" w:hAnsi="Calibri"/>
-                <w:b w:val="false"/>
-                <w:bCs w:val="false"/>
-                <w:sz w:val="14"/>
-                <w:szCs w:val="14"/>
-              </w:rPr>
-              <w:t xml:space="preserve">$16,727</w:t>
+              <w:t xml:space="preserve">131 seats (0.10% of market), 3 districts</w:t>
+            </w:r>
+          </w:p>
+        </w:tc>
+        <w:tc>
+          <w:tcPr>
+            <w:tcW w:type="dxa" w:w="1500"/>
+            <w:tcMar>
+              <w:top w:type="dxa" w:w="50"/>
+              <w:left w:type="dxa" w:w="70"/>
+              <w:bottom w:type="dxa" w:w="50"/>
+              <w:right w:type="dxa" w:w="70"/>
+            </w:tcMar>
+          </w:tcPr>
+          <w:p>
+            <w:pPr>
+              <w:jc w:val="right"/>
+            </w:pPr>
+            <w:r>
+              <w:rPr>
+                <w:rFonts w:ascii="Calibri" w:cs="Calibri" w:eastAsia="Calibri" w:hAnsi="Calibri"/>
+                <w:b w:val="false"/>
+                <w:bCs w:val="false"/>
+                <w:sz w:val="14"/>
+                <w:szCs w:val="14"/>
+              </w:rPr>
+              <w:t xml:space="preserve">$16,374</w:t>
+            </w:r>
+          </w:p>
+        </w:tc>
+        <w:tc>
+          <w:tcPr>
+            <w:tcW w:type="dxa" w:w="1500"/>
+            <w:tcMar>
+              <w:top w:type="dxa" w:w="50"/>
+              <w:left w:type="dxa" w:w="70"/>
+              <w:bottom w:type="dxa" w:w="50"/>
+              <w:right w:type="dxa" w:w="70"/>
+            </w:tcMar>
+          </w:tcPr>
+          <w:p>
+            <w:pPr>
+              <w:jc w:val="right"/>
+            </w:pPr>
+            <w:r>
+              <w:rPr>
+                <w:rFonts w:ascii="Calibri" w:cs="Calibri" w:eastAsia="Calibri" w:hAnsi="Calibri"/>
+                <w:b w:val="false"/>
+                <w:bCs w:val="false"/>
+                <w:sz w:val="14"/>
+                <w:szCs w:val="14"/>
+              </w:rPr>
+              <w:t xml:space="preserve">($4,222)</w:t>
+            </w:r>
+          </w:p>
+        </w:tc>
+        <w:tc>
+          <w:tcPr>
+            <w:tcW w:type="dxa" w:w="1500"/>
+            <w:tcMar>
+              <w:top w:type="dxa" w:w="50"/>
+              <w:left w:type="dxa" w:w="70"/>
+              <w:bottom w:type="dxa" w:w="50"/>
+              <w:right w:type="dxa" w:w="70"/>
+            </w:tcMar>
+          </w:tcPr>
+          <w:p>
+            <w:pPr>
+              <w:jc w:val="right"/>
+            </w:pPr>
+            <w:r>
+              <w:rPr>
+                <w:rFonts w:ascii="Calibri" w:cs="Calibri" w:eastAsia="Calibri" w:hAnsi="Calibri"/>
+                <w:b w:val="false"/>
+                <w:bCs w:val="false"/>
+                <w:sz w:val="14"/>
+                <w:szCs w:val="14"/>
+              </w:rPr>
+              <w:t xml:space="preserve">$13,918</w:t>
+            </w:r>
+          </w:p>
+        </w:tc>
+        <w:tc>
+          <w:tcPr>
+            <w:tcW w:type="dxa" w:w="1500"/>
+            <w:tcMar>
+              <w:top w:type="dxa" w:w="50"/>
+              <w:left w:type="dxa" w:w="70"/>
+              <w:bottom w:type="dxa" w:w="50"/>
+              <w:right w:type="dxa" w:w="70"/>
+            </w:tcMar>
+          </w:tcPr>
+          <w:p>
+            <w:pPr>
+              <w:jc w:val="right"/>
+            </w:pPr>
+            <w:r>
+              <w:rPr>
+                <w:rFonts w:ascii="Calibri" w:cs="Calibri" w:eastAsia="Calibri" w:hAnsi="Calibri"/>
+                <w:b w:val="false"/>
+                <w:bCs w:val="false"/>
+                <w:sz w:val="14"/>
+                <w:szCs w:val="14"/>
+              </w:rPr>
+              <w:t xml:space="preserve">$12,151</w:t>
             </w:r>
           </w:p>
         </w:tc>
@@ -6858,7 +6752,7 @@
                 <w:sz w:val="14"/>
                 <w:szCs w:val="14"/>
               </w:rPr>
-              <w:t xml:space="preserve">$16,727</w:t>
+              <w:t xml:space="preserve">$12,151</w:t>
             </w:r>
           </w:p>
         </w:tc>
@@ -6912,111 +6806,111 @@
                 <w:sz w:val="14"/>
                 <w:szCs w:val="14"/>
               </w:rPr>
-              <w:t xml:space="preserve">721 seats (0.40% of market), 18 districts</w:t>
-            </w:r>
-          </w:p>
-        </w:tc>
-        <w:tc>
-          <w:tcPr>
-            <w:tcW w:type="dxa" w:w="1500"/>
-            <w:tcMar>
-              <w:top w:type="dxa" w:w="50"/>
-              <w:left w:type="dxa" w:w="70"/>
-              <w:bottom w:type="dxa" w:w="50"/>
-              <w:right w:type="dxa" w:w="70"/>
-            </w:tcMar>
-          </w:tcPr>
-          <w:p>
-            <w:pPr>
-              <w:jc w:val="right"/>
-            </w:pPr>
-            <w:r>
-              <w:rPr>
-                <w:rFonts w:ascii="Calibri" w:cs="Calibri" w:eastAsia="Calibri" w:hAnsi="Calibri"/>
-                <w:b w:val="false"/>
-                <w:bCs w:val="false"/>
-                <w:sz w:val="14"/>
-                <w:szCs w:val="14"/>
-              </w:rPr>
-              <w:t xml:space="preserve">$90,118</w:t>
-            </w:r>
-          </w:p>
-        </w:tc>
-        <w:tc>
-          <w:tcPr>
-            <w:tcW w:type="dxa" w:w="1500"/>
-            <w:tcMar>
-              <w:top w:type="dxa" w:w="50"/>
-              <w:left w:type="dxa" w:w="70"/>
-              <w:bottom w:type="dxa" w:w="50"/>
-              <w:right w:type="dxa" w:w="70"/>
-            </w:tcMar>
-          </w:tcPr>
-          <w:p>
-            <w:pPr>
-              <w:jc w:val="right"/>
-            </w:pPr>
-            <w:r>
-              <w:rPr>
-                <w:rFonts w:ascii="Calibri" w:cs="Calibri" w:eastAsia="Calibri" w:hAnsi="Calibri"/>
-                <w:b w:val="false"/>
-                <w:bCs w:val="false"/>
-                <w:sz w:val="14"/>
-                <w:szCs w:val="14"/>
-              </w:rPr>
-              <w:t xml:space="preserve">($18,815)</w:t>
-            </w:r>
-          </w:p>
-        </w:tc>
-        <w:tc>
-          <w:tcPr>
-            <w:tcW w:type="dxa" w:w="1500"/>
-            <w:tcMar>
-              <w:top w:type="dxa" w:w="50"/>
-              <w:left w:type="dxa" w:w="70"/>
-              <w:bottom w:type="dxa" w:w="50"/>
-              <w:right w:type="dxa" w:w="70"/>
-            </w:tcMar>
-          </w:tcPr>
-          <w:p>
-            <w:pPr>
-              <w:jc w:val="right"/>
-            </w:pPr>
-            <w:r>
-              <w:rPr>
-                <w:rFonts w:ascii="Calibri" w:cs="Calibri" w:eastAsia="Calibri" w:hAnsi="Calibri"/>
-                <w:b w:val="false"/>
-                <w:bCs w:val="false"/>
-                <w:sz w:val="14"/>
-                <w:szCs w:val="14"/>
-              </w:rPr>
-              <w:t xml:space="preserve">$76,600</w:t>
-            </w:r>
-          </w:p>
-        </w:tc>
-        <w:tc>
-          <w:tcPr>
-            <w:tcW w:type="dxa" w:w="1500"/>
-            <w:tcMar>
-              <w:top w:type="dxa" w:w="50"/>
-              <w:left w:type="dxa" w:w="70"/>
-              <w:bottom w:type="dxa" w:w="50"/>
-              <w:right w:type="dxa" w:w="70"/>
-            </w:tcMar>
-          </w:tcPr>
-          <w:p>
-            <w:pPr>
-              <w:jc w:val="right"/>
-            </w:pPr>
-            <w:r>
-              <w:rPr>
-                <w:rFonts w:ascii="Calibri" w:cs="Calibri" w:eastAsia="Calibri" w:hAnsi="Calibri"/>
-                <w:b w:val="false"/>
-                <w:bCs w:val="false"/>
-                <w:sz w:val="14"/>
-                <w:szCs w:val="14"/>
-              </w:rPr>
-              <w:t xml:space="preserve">$71,303</w:t>
+              <w:t xml:space="preserve">523 seats (0.40% of market), 13 districts</w:t>
+            </w:r>
+          </w:p>
+        </w:tc>
+        <w:tc>
+          <w:tcPr>
+            <w:tcW w:type="dxa" w:w="1500"/>
+            <w:tcMar>
+              <w:top w:type="dxa" w:w="50"/>
+              <w:left w:type="dxa" w:w="70"/>
+              <w:bottom w:type="dxa" w:w="50"/>
+              <w:right w:type="dxa" w:w="70"/>
+            </w:tcMar>
+          </w:tcPr>
+          <w:p>
+            <w:pPr>
+              <w:jc w:val="right"/>
+            </w:pPr>
+            <w:r>
+              <w:rPr>
+                <w:rFonts w:ascii="Calibri" w:cs="Calibri" w:eastAsia="Calibri" w:hAnsi="Calibri"/>
+                <w:b w:val="false"/>
+                <w:bCs w:val="false"/>
+                <w:sz w:val="14"/>
+                <w:szCs w:val="14"/>
+              </w:rPr>
+              <w:t xml:space="preserve">$65,370</w:t>
+            </w:r>
+          </w:p>
+        </w:tc>
+        <w:tc>
+          <w:tcPr>
+            <w:tcW w:type="dxa" w:w="1500"/>
+            <w:tcMar>
+              <w:top w:type="dxa" w:w="50"/>
+              <w:left w:type="dxa" w:w="70"/>
+              <w:bottom w:type="dxa" w:w="50"/>
+              <w:right w:type="dxa" w:w="70"/>
+            </w:tcMar>
+          </w:tcPr>
+          <w:p>
+            <w:pPr>
+              <w:jc w:val="right"/>
+            </w:pPr>
+            <w:r>
+              <w:rPr>
+                <w:rFonts w:ascii="Calibri" w:cs="Calibri" w:eastAsia="Calibri" w:hAnsi="Calibri"/>
+                <w:b w:val="false"/>
+                <w:bCs w:val="false"/>
+                <w:sz w:val="14"/>
+                <w:szCs w:val="14"/>
+              </w:rPr>
+              <w:t xml:space="preserve">($13,718)</w:t>
+            </w:r>
+          </w:p>
+        </w:tc>
+        <w:tc>
+          <w:tcPr>
+            <w:tcW w:type="dxa" w:w="1500"/>
+            <w:tcMar>
+              <w:top w:type="dxa" w:w="50"/>
+              <w:left w:type="dxa" w:w="70"/>
+              <w:bottom w:type="dxa" w:w="50"/>
+              <w:right w:type="dxa" w:w="70"/>
+            </w:tcMar>
+          </w:tcPr>
+          <w:p>
+            <w:pPr>
+              <w:jc w:val="right"/>
+            </w:pPr>
+            <w:r>
+              <w:rPr>
+                <w:rFonts w:ascii="Calibri" w:cs="Calibri" w:eastAsia="Calibri" w:hAnsi="Calibri"/>
+                <w:b w:val="false"/>
+                <w:bCs w:val="false"/>
+                <w:sz w:val="14"/>
+                <w:szCs w:val="14"/>
+              </w:rPr>
+              <w:t xml:space="preserve">$55,564</w:t>
+            </w:r>
+          </w:p>
+        </w:tc>
+        <w:tc>
+          <w:tcPr>
+            <w:tcW w:type="dxa" w:w="1500"/>
+            <w:tcMar>
+              <w:top w:type="dxa" w:w="50"/>
+              <w:left w:type="dxa" w:w="70"/>
+              <w:bottom w:type="dxa" w:w="50"/>
+              <w:right w:type="dxa" w:w="70"/>
+            </w:tcMar>
+          </w:tcPr>
+          <w:p>
+            <w:pPr>
+              <w:jc w:val="right"/>
+            </w:pPr>
+            <w:r>
+              <w:rPr>
+                <w:rFonts w:ascii="Calibri" w:cs="Calibri" w:eastAsia="Calibri" w:hAnsi="Calibri"/>
+                <w:b w:val="false"/>
+                <w:bCs w:val="false"/>
+                <w:sz w:val="14"/>
+                <w:szCs w:val="14"/>
+              </w:rPr>
+              <w:t xml:space="preserve">$51,652</w:t>
             </w:r>
           </w:p>
         </w:tc>
@@ -7042,7 +6936,7 @@
                 <w:sz w:val="14"/>
                 <w:szCs w:val="14"/>
               </w:rPr>
-              <w:t xml:space="preserve">$88,030</w:t>
+              <w:t xml:space="preserve">$63,803</w:t>
             </w:r>
           </w:p>
         </w:tc>
@@ -7096,111 +6990,111 @@
                 <w:sz w:val="14"/>
                 <w:szCs w:val="14"/>
               </w:rPr>
-              <w:t xml:space="preserve">1,802 seats (1.00% of market), 45 districts</w:t>
-            </w:r>
-          </w:p>
-        </w:tc>
-        <w:tc>
-          <w:tcPr>
-            <w:tcW w:type="dxa" w:w="1500"/>
-            <w:tcMar>
-              <w:top w:type="dxa" w:w="50"/>
-              <w:left w:type="dxa" w:w="70"/>
-              <w:bottom w:type="dxa" w:w="50"/>
-              <w:right w:type="dxa" w:w="70"/>
-            </w:tcMar>
-          </w:tcPr>
-          <w:p>
-            <w:pPr>
-              <w:jc w:val="right"/>
-            </w:pPr>
-            <w:r>
-              <w:rPr>
-                <w:rFonts w:ascii="Calibri" w:cs="Calibri" w:eastAsia="Calibri" w:hAnsi="Calibri"/>
-                <w:b w:val="false"/>
-                <w:bCs w:val="false"/>
-                <w:sz w:val="14"/>
-                <w:szCs w:val="14"/>
-              </w:rPr>
-              <w:t xml:space="preserve">$225,232</w:t>
-            </w:r>
-          </w:p>
-        </w:tc>
-        <w:tc>
-          <w:tcPr>
-            <w:tcW w:type="dxa" w:w="1500"/>
-            <w:tcMar>
-              <w:top w:type="dxa" w:w="50"/>
-              <w:left w:type="dxa" w:w="70"/>
-              <w:bottom w:type="dxa" w:w="50"/>
-              <w:right w:type="dxa" w:w="70"/>
-            </w:tcMar>
-          </w:tcPr>
-          <w:p>
-            <w:pPr>
-              <w:jc w:val="right"/>
-            </w:pPr>
-            <w:r>
-              <w:rPr>
-                <w:rFonts w:ascii="Calibri" w:cs="Calibri" w:eastAsia="Calibri" w:hAnsi="Calibri"/>
-                <w:b w:val="false"/>
-                <w:bCs w:val="false"/>
-                <w:sz w:val="14"/>
-                <w:szCs w:val="14"/>
-              </w:rPr>
-              <w:t xml:space="preserve">($42,246)</w:t>
-            </w:r>
-          </w:p>
-        </w:tc>
-        <w:tc>
-          <w:tcPr>
-            <w:tcW w:type="dxa" w:w="1500"/>
-            <w:tcMar>
-              <w:top w:type="dxa" w:w="50"/>
-              <w:left w:type="dxa" w:w="70"/>
-              <w:bottom w:type="dxa" w:w="50"/>
-              <w:right w:type="dxa" w:w="70"/>
-            </w:tcMar>
-          </w:tcPr>
-          <w:p>
-            <w:pPr>
-              <w:jc w:val="right"/>
-            </w:pPr>
-            <w:r>
-              <w:rPr>
-                <w:rFonts w:ascii="Calibri" w:cs="Calibri" w:eastAsia="Calibri" w:hAnsi="Calibri"/>
-                <w:b w:val="false"/>
-                <w:bCs w:val="false"/>
-                <w:sz w:val="14"/>
-                <w:szCs w:val="14"/>
-              </w:rPr>
-              <w:t xml:space="preserve">$191,447</w:t>
-            </w:r>
-          </w:p>
-        </w:tc>
-        <w:tc>
-          <w:tcPr>
-            <w:tcW w:type="dxa" w:w="1500"/>
-            <w:tcMar>
-              <w:top w:type="dxa" w:w="50"/>
-              <w:left w:type="dxa" w:w="70"/>
-              <w:bottom w:type="dxa" w:w="50"/>
-              <w:right w:type="dxa" w:w="70"/>
-            </w:tcMar>
-          </w:tcPr>
-          <w:p>
-            <w:pPr>
-              <w:jc w:val="right"/>
-            </w:pPr>
-            <w:r>
-              <w:rPr>
-                <w:rFonts w:ascii="Calibri" w:cs="Calibri" w:eastAsia="Calibri" w:hAnsi="Calibri"/>
-                <w:b w:val="false"/>
-                <w:bCs w:val="false"/>
-                <w:sz w:val="14"/>
-                <w:szCs w:val="14"/>
-              </w:rPr>
-              <w:t xml:space="preserve">$182,986</w:t>
+              <w:t xml:space="preserve">1,308 seats (1.00% of market), 33 districts</w:t>
+            </w:r>
+          </w:p>
+        </w:tc>
+        <w:tc>
+          <w:tcPr>
+            <w:tcW w:type="dxa" w:w="1500"/>
+            <w:tcMar>
+              <w:top w:type="dxa" w:w="50"/>
+              <w:left w:type="dxa" w:w="70"/>
+              <w:bottom w:type="dxa" w:w="50"/>
+              <w:right w:type="dxa" w:w="70"/>
+            </w:tcMar>
+          </w:tcPr>
+          <w:p>
+            <w:pPr>
+              <w:jc w:val="right"/>
+            </w:pPr>
+            <w:r>
+              <w:rPr>
+                <w:rFonts w:ascii="Calibri" w:cs="Calibri" w:eastAsia="Calibri" w:hAnsi="Calibri"/>
+                <w:b w:val="false"/>
+                <w:bCs w:val="false"/>
+                <w:sz w:val="14"/>
+                <w:szCs w:val="14"/>
+              </w:rPr>
+              <w:t xml:space="preserve">$163,487</w:t>
+            </w:r>
+          </w:p>
+        </w:tc>
+        <w:tc>
+          <w:tcPr>
+            <w:tcW w:type="dxa" w:w="1500"/>
+            <w:tcMar>
+              <w:top w:type="dxa" w:w="50"/>
+              <w:left w:type="dxa" w:w="70"/>
+              <w:bottom w:type="dxa" w:w="50"/>
+              <w:right w:type="dxa" w:w="70"/>
+            </w:tcMar>
+          </w:tcPr>
+          <w:p>
+            <w:pPr>
+              <w:jc w:val="right"/>
+            </w:pPr>
+            <w:r>
+              <w:rPr>
+                <w:rFonts w:ascii="Calibri" w:cs="Calibri" w:eastAsia="Calibri" w:hAnsi="Calibri"/>
+                <w:b w:val="false"/>
+                <w:bCs w:val="false"/>
+                <w:sz w:val="14"/>
+                <w:szCs w:val="14"/>
+              </w:rPr>
+              <w:t xml:space="preserve">($30,793)</w:t>
+            </w:r>
+          </w:p>
+        </w:tc>
+        <w:tc>
+          <w:tcPr>
+            <w:tcW w:type="dxa" w:w="1500"/>
+            <w:tcMar>
+              <w:top w:type="dxa" w:w="50"/>
+              <w:left w:type="dxa" w:w="70"/>
+              <w:bottom w:type="dxa" w:w="50"/>
+              <w:right w:type="dxa" w:w="70"/>
+            </w:tcMar>
+          </w:tcPr>
+          <w:p>
+            <w:pPr>
+              <w:jc w:val="right"/>
+            </w:pPr>
+            <w:r>
+              <w:rPr>
+                <w:rFonts w:ascii="Calibri" w:cs="Calibri" w:eastAsia="Calibri" w:hAnsi="Calibri"/>
+                <w:b w:val="false"/>
+                <w:bCs w:val="false"/>
+                <w:sz w:val="14"/>
+                <w:szCs w:val="14"/>
+              </w:rPr>
+              <w:t xml:space="preserve">$138,964</w:t>
+            </w:r>
+          </w:p>
+        </w:tc>
+        <w:tc>
+          <w:tcPr>
+            <w:tcW w:type="dxa" w:w="1500"/>
+            <w:tcMar>
+              <w:top w:type="dxa" w:w="50"/>
+              <w:left w:type="dxa" w:w="70"/>
+              <w:bottom w:type="dxa" w:w="50"/>
+              <w:right w:type="dxa" w:w="70"/>
+            </w:tcMar>
+          </w:tcPr>
+          <w:p>
+            <w:pPr>
+              <w:jc w:val="right"/>
+            </w:pPr>
+            <w:r>
+              <w:rPr>
+                <w:rFonts w:ascii="Calibri" w:cs="Calibri" w:eastAsia="Calibri" w:hAnsi="Calibri"/>
+                <w:b w:val="false"/>
+                <w:bCs w:val="false"/>
+                <w:sz w:val="14"/>
+                <w:szCs w:val="14"/>
+              </w:rPr>
+              <w:t xml:space="preserve">$132,694</w:t>
             </w:r>
           </w:p>
         </w:tc>
@@ -7226,7 +7120,7 @@
                 <w:sz w:val="14"/>
                 <w:szCs w:val="14"/>
               </w:rPr>
-              <w:t xml:space="preserve">$271,016</w:t>
+              <w:t xml:space="preserve">$196,497</w:t>
             </w:r>
           </w:p>
         </w:tc>
@@ -7280,111 +7174,111 @@
                 <w:sz w:val="14"/>
                 <w:szCs w:val="14"/>
               </w:rPr>
-              <w:t xml:space="preserve">3,244 seats (1.80% of market), 81 districts</w:t>
-            </w:r>
-          </w:p>
-        </w:tc>
-        <w:tc>
-          <w:tcPr>
-            <w:tcW w:type="dxa" w:w="1500"/>
-            <w:tcMar>
-              <w:top w:type="dxa" w:w="50"/>
-              <w:left w:type="dxa" w:w="70"/>
-              <w:bottom w:type="dxa" w:w="50"/>
-              <w:right w:type="dxa" w:w="70"/>
-            </w:tcMar>
-          </w:tcPr>
-          <w:p>
-            <w:pPr>
-              <w:jc w:val="right"/>
-            </w:pPr>
-            <w:r>
-              <w:rPr>
-                <w:rFonts w:ascii="Calibri" w:cs="Calibri" w:eastAsia="Calibri" w:hAnsi="Calibri"/>
-                <w:b w:val="false"/>
-                <w:bCs w:val="false"/>
-                <w:sz w:val="14"/>
-                <w:szCs w:val="14"/>
-              </w:rPr>
-              <w:t xml:space="preserve">$405,468</w:t>
-            </w:r>
-          </w:p>
-        </w:tc>
-        <w:tc>
-          <w:tcPr>
-            <w:tcW w:type="dxa" w:w="1500"/>
-            <w:tcMar>
-              <w:top w:type="dxa" w:w="50"/>
-              <w:left w:type="dxa" w:w="70"/>
-              <w:bottom w:type="dxa" w:w="50"/>
-              <w:right w:type="dxa" w:w="70"/>
-            </w:tcMar>
-          </w:tcPr>
-          <w:p>
-            <w:pPr>
-              <w:jc w:val="right"/>
-            </w:pPr>
-            <w:r>
-              <w:rPr>
-                <w:rFonts w:ascii="Calibri" w:cs="Calibri" w:eastAsia="Calibri" w:hAnsi="Calibri"/>
-                <w:b w:val="false"/>
-                <w:bCs w:val="false"/>
-                <w:sz w:val="14"/>
-                <w:szCs w:val="14"/>
-              </w:rPr>
-              <w:t xml:space="preserve">($71,660)</w:t>
-            </w:r>
-          </w:p>
-        </w:tc>
-        <w:tc>
-          <w:tcPr>
-            <w:tcW w:type="dxa" w:w="1500"/>
-            <w:tcMar>
-              <w:top w:type="dxa" w:w="50"/>
-              <w:left w:type="dxa" w:w="70"/>
-              <w:bottom w:type="dxa" w:w="50"/>
-              <w:right w:type="dxa" w:w="70"/>
-            </w:tcMar>
-          </w:tcPr>
-          <w:p>
-            <w:pPr>
-              <w:jc w:val="right"/>
-            </w:pPr>
-            <w:r>
-              <w:rPr>
-                <w:rFonts w:ascii="Calibri" w:cs="Calibri" w:eastAsia="Calibri" w:hAnsi="Calibri"/>
-                <w:b w:val="false"/>
-                <w:bCs w:val="false"/>
-                <w:sz w:val="14"/>
-                <w:szCs w:val="14"/>
-              </w:rPr>
-              <w:t xml:space="preserve">$344,647</w:t>
-            </w:r>
-          </w:p>
-        </w:tc>
-        <w:tc>
-          <w:tcPr>
-            <w:tcW w:type="dxa" w:w="1500"/>
-            <w:tcMar>
-              <w:top w:type="dxa" w:w="50"/>
-              <w:left w:type="dxa" w:w="70"/>
-              <w:bottom w:type="dxa" w:w="50"/>
-              <w:right w:type="dxa" w:w="70"/>
-            </w:tcMar>
-          </w:tcPr>
-          <w:p>
-            <w:pPr>
-              <w:jc w:val="right"/>
-            </w:pPr>
-            <w:r>
-              <w:rPr>
-                <w:rFonts w:ascii="Calibri" w:cs="Calibri" w:eastAsia="Calibri" w:hAnsi="Calibri"/>
-                <w:b w:val="false"/>
-                <w:bCs w:val="false"/>
-                <w:sz w:val="14"/>
-                <w:szCs w:val="14"/>
-              </w:rPr>
-              <w:t xml:space="preserve">$333,808</w:t>
+              <w:t xml:space="preserve">2,354 seats (1.80% of market), 59 districts</w:t>
+            </w:r>
+          </w:p>
+        </w:tc>
+        <w:tc>
+          <w:tcPr>
+            <w:tcW w:type="dxa" w:w="1500"/>
+            <w:tcMar>
+              <w:top w:type="dxa" w:w="50"/>
+              <w:left w:type="dxa" w:w="70"/>
+              <w:bottom w:type="dxa" w:w="50"/>
+              <w:right w:type="dxa" w:w="70"/>
+            </w:tcMar>
+          </w:tcPr>
+          <w:p>
+            <w:pPr>
+              <w:jc w:val="right"/>
+            </w:pPr>
+            <w:r>
+              <w:rPr>
+                <w:rFonts w:ascii="Calibri" w:cs="Calibri" w:eastAsia="Calibri" w:hAnsi="Calibri"/>
+                <w:b w:val="false"/>
+                <w:bCs w:val="false"/>
+                <w:sz w:val="14"/>
+                <w:szCs w:val="14"/>
+              </w:rPr>
+              <w:t xml:space="preserve">$294,226</w:t>
+            </w:r>
+          </w:p>
+        </w:tc>
+        <w:tc>
+          <w:tcPr>
+            <w:tcW w:type="dxa" w:w="1500"/>
+            <w:tcMar>
+              <w:top w:type="dxa" w:w="50"/>
+              <w:left w:type="dxa" w:w="70"/>
+              <w:bottom w:type="dxa" w:w="50"/>
+              <w:right w:type="dxa" w:w="70"/>
+            </w:tcMar>
+          </w:tcPr>
+          <w:p>
+            <w:pPr>
+              <w:jc w:val="right"/>
+            </w:pPr>
+            <w:r>
+              <w:rPr>
+                <w:rFonts w:ascii="Calibri" w:cs="Calibri" w:eastAsia="Calibri" w:hAnsi="Calibri"/>
+                <w:b w:val="false"/>
+                <w:bCs w:val="false"/>
+                <w:sz w:val="14"/>
+                <w:szCs w:val="14"/>
+              </w:rPr>
+              <w:t xml:space="preserve">($52,171)</w:t>
+            </w:r>
+          </w:p>
+        </w:tc>
+        <w:tc>
+          <w:tcPr>
+            <w:tcW w:type="dxa" w:w="1500"/>
+            <w:tcMar>
+              <w:top w:type="dxa" w:w="50"/>
+              <w:left w:type="dxa" w:w="70"/>
+              <w:bottom w:type="dxa" w:w="50"/>
+              <w:right w:type="dxa" w:w="70"/>
+            </w:tcMar>
+          </w:tcPr>
+          <w:p>
+            <w:pPr>
+              <w:jc w:val="right"/>
+            </w:pPr>
+            <w:r>
+              <w:rPr>
+                <w:rFonts w:ascii="Calibri" w:cs="Calibri" w:eastAsia="Calibri" w:hAnsi="Calibri"/>
+                <w:b w:val="false"/>
+                <w:bCs w:val="false"/>
+                <w:sz w:val="14"/>
+                <w:szCs w:val="14"/>
+              </w:rPr>
+              <w:t xml:space="preserve">$250,092</w:t>
+            </w:r>
+          </w:p>
+        </w:tc>
+        <w:tc>
+          <w:tcPr>
+            <w:tcW w:type="dxa" w:w="1500"/>
+            <w:tcMar>
+              <w:top w:type="dxa" w:w="50"/>
+              <w:left w:type="dxa" w:w="70"/>
+              <w:bottom w:type="dxa" w:w="50"/>
+              <w:right w:type="dxa" w:w="70"/>
+            </w:tcMar>
+          </w:tcPr>
+          <w:p>
+            <w:pPr>
+              <w:jc w:val="right"/>
+            </w:pPr>
+            <w:r>
+              <w:rPr>
+                <w:rFonts w:ascii="Calibri" w:cs="Calibri" w:eastAsia="Calibri" w:hAnsi="Calibri"/>
+                <w:b w:val="false"/>
+                <w:bCs w:val="false"/>
+                <w:sz w:val="14"/>
+                <w:szCs w:val="14"/>
+              </w:rPr>
+              <w:t xml:space="preserve">$242,055</w:t>
             </w:r>
           </w:p>
         </w:tc>
@@ -7410,7 +7304,7 @@
                 <w:sz w:val="14"/>
                 <w:szCs w:val="14"/>
               </w:rPr>
-              <w:t xml:space="preserve">$604,824</w:t>
+              <w:t xml:space="preserve">$438,552</w:t>
             </w:r>
           </w:p>
         </w:tc>
@@ -7464,111 +7358,111 @@
                 <w:sz w:val="14"/>
                 <w:szCs w:val="14"/>
               </w:rPr>
-              <w:t xml:space="preserve">4,686 seats (2.60% of market), 117 districts</w:t>
-            </w:r>
-          </w:p>
-        </w:tc>
-        <w:tc>
-          <w:tcPr>
-            <w:tcW w:type="dxa" w:w="1500"/>
-            <w:tcMar>
-              <w:top w:type="dxa" w:w="50"/>
-              <w:left w:type="dxa" w:w="70"/>
-              <w:bottom w:type="dxa" w:w="50"/>
-              <w:right w:type="dxa" w:w="70"/>
-            </w:tcMar>
-          </w:tcPr>
-          <w:p>
-            <w:pPr>
-              <w:jc w:val="right"/>
-            </w:pPr>
-            <w:r>
-              <w:rPr>
-                <w:rFonts w:ascii="Calibri" w:cs="Calibri" w:eastAsia="Calibri" w:hAnsi="Calibri"/>
-                <w:b w:val="false"/>
-                <w:bCs w:val="false"/>
-                <w:sz w:val="14"/>
-                <w:szCs w:val="14"/>
-              </w:rPr>
-              <w:t xml:space="preserve">$585,703</w:t>
-            </w:r>
-          </w:p>
-        </w:tc>
-        <w:tc>
-          <w:tcPr>
-            <w:tcW w:type="dxa" w:w="1500"/>
-            <w:tcMar>
-              <w:top w:type="dxa" w:w="50"/>
-              <w:left w:type="dxa" w:w="70"/>
-              <w:bottom w:type="dxa" w:w="50"/>
-              <w:right w:type="dxa" w:w="70"/>
-            </w:tcMar>
-          </w:tcPr>
-          <w:p>
-            <w:pPr>
-              <w:jc w:val="right"/>
-            </w:pPr>
-            <w:r>
-              <w:rPr>
-                <w:rFonts w:ascii="Calibri" w:cs="Calibri" w:eastAsia="Calibri" w:hAnsi="Calibri"/>
-                <w:b w:val="false"/>
-                <w:bCs w:val="false"/>
-                <w:sz w:val="14"/>
-                <w:szCs w:val="14"/>
-              </w:rPr>
-              <w:t xml:space="preserve">($99,760)</w:t>
-            </w:r>
-          </w:p>
-        </w:tc>
-        <w:tc>
-          <w:tcPr>
-            <w:tcW w:type="dxa" w:w="1500"/>
-            <w:tcMar>
-              <w:top w:type="dxa" w:w="50"/>
-              <w:left w:type="dxa" w:w="70"/>
-              <w:bottom w:type="dxa" w:w="50"/>
-              <w:right w:type="dxa" w:w="70"/>
-            </w:tcMar>
-          </w:tcPr>
-          <w:p>
-            <w:pPr>
-              <w:jc w:val="right"/>
-            </w:pPr>
-            <w:r>
-              <w:rPr>
-                <w:rFonts w:ascii="Calibri" w:cs="Calibri" w:eastAsia="Calibri" w:hAnsi="Calibri"/>
-                <w:b w:val="false"/>
-                <w:bCs w:val="false"/>
-                <w:sz w:val="14"/>
-                <w:szCs w:val="14"/>
-              </w:rPr>
-              <w:t xml:space="preserve">$497,848</w:t>
-            </w:r>
-          </w:p>
-        </w:tc>
-        <w:tc>
-          <w:tcPr>
-            <w:tcW w:type="dxa" w:w="1500"/>
-            <w:tcMar>
-              <w:top w:type="dxa" w:w="50"/>
-              <w:left w:type="dxa" w:w="70"/>
-              <w:bottom w:type="dxa" w:w="50"/>
-              <w:right w:type="dxa" w:w="70"/>
-            </w:tcMar>
-          </w:tcPr>
-          <w:p>
-            <w:pPr>
-              <w:jc w:val="right"/>
-            </w:pPr>
-            <w:r>
-              <w:rPr>
-                <w:rFonts w:ascii="Calibri" w:cs="Calibri" w:eastAsia="Calibri" w:hAnsi="Calibri"/>
-                <w:b w:val="false"/>
-                <w:bCs w:val="false"/>
-                <w:sz w:val="14"/>
-                <w:szCs w:val="14"/>
-              </w:rPr>
-              <w:t xml:space="preserve">$485,944</w:t>
+              <w:t xml:space="preserve">3,400 seats (2.60% of market), 85 districts</w:t>
+            </w:r>
+          </w:p>
+        </w:tc>
+        <w:tc>
+          <w:tcPr>
+            <w:tcW w:type="dxa" w:w="1500"/>
+            <w:tcMar>
+              <w:top w:type="dxa" w:w="50"/>
+              <w:left w:type="dxa" w:w="70"/>
+              <w:bottom w:type="dxa" w:w="50"/>
+              <w:right w:type="dxa" w:w="70"/>
+            </w:tcMar>
+          </w:tcPr>
+          <w:p>
+            <w:pPr>
+              <w:jc w:val="right"/>
+            </w:pPr>
+            <w:r>
+              <w:rPr>
+                <w:rFonts w:ascii="Calibri" w:cs="Calibri" w:eastAsia="Calibri" w:hAnsi="Calibri"/>
+                <w:b w:val="false"/>
+                <w:bCs w:val="false"/>
+                <w:sz w:val="14"/>
+                <w:szCs w:val="14"/>
+              </w:rPr>
+              <w:t xml:space="preserve">$424,966</w:t>
+            </w:r>
+          </w:p>
+        </w:tc>
+        <w:tc>
+          <w:tcPr>
+            <w:tcW w:type="dxa" w:w="1500"/>
+            <w:tcMar>
+              <w:top w:type="dxa" w:w="50"/>
+              <w:left w:type="dxa" w:w="70"/>
+              <w:bottom w:type="dxa" w:w="50"/>
+              <w:right w:type="dxa" w:w="70"/>
+            </w:tcMar>
+          </w:tcPr>
+          <w:p>
+            <w:pPr>
+              <w:jc w:val="right"/>
+            </w:pPr>
+            <w:r>
+              <w:rPr>
+                <w:rFonts w:ascii="Calibri" w:cs="Calibri" w:eastAsia="Calibri" w:hAnsi="Calibri"/>
+                <w:b w:val="false"/>
+                <w:bCs w:val="false"/>
+                <w:sz w:val="14"/>
+                <w:szCs w:val="14"/>
+              </w:rPr>
+              <w:t xml:space="preserve">($72,564)</w:t>
+            </w:r>
+          </w:p>
+        </w:tc>
+        <w:tc>
+          <w:tcPr>
+            <w:tcW w:type="dxa" w:w="1500"/>
+            <w:tcMar>
+              <w:top w:type="dxa" w:w="50"/>
+              <w:left w:type="dxa" w:w="70"/>
+              <w:bottom w:type="dxa" w:w="50"/>
+              <w:right w:type="dxa" w:w="70"/>
+            </w:tcMar>
+          </w:tcPr>
+          <w:p>
+            <w:pPr>
+              <w:jc w:val="right"/>
+            </w:pPr>
+            <w:r>
+              <w:rPr>
+                <w:rFonts w:ascii="Calibri" w:cs="Calibri" w:eastAsia="Calibri" w:hAnsi="Calibri"/>
+                <w:b w:val="false"/>
+                <w:bCs w:val="false"/>
+                <w:sz w:val="14"/>
+                <w:szCs w:val="14"/>
+              </w:rPr>
+              <w:t xml:space="preserve">$361,221</w:t>
+            </w:r>
+          </w:p>
+        </w:tc>
+        <w:tc>
+          <w:tcPr>
+            <w:tcW w:type="dxa" w:w="1500"/>
+            <w:tcMar>
+              <w:top w:type="dxa" w:w="50"/>
+              <w:left w:type="dxa" w:w="70"/>
+              <w:bottom w:type="dxa" w:w="50"/>
+              <w:right w:type="dxa" w:w="70"/>
+            </w:tcMar>
+          </w:tcPr>
+          <w:p>
+            <w:pPr>
+              <w:jc w:val="right"/>
+            </w:pPr>
+            <w:r>
+              <w:rPr>
+                <w:rFonts w:ascii="Calibri" w:cs="Calibri" w:eastAsia="Calibri" w:hAnsi="Calibri"/>
+                <w:b w:val="false"/>
+                <w:bCs w:val="false"/>
+                <w:sz w:val="14"/>
+                <w:szCs w:val="14"/>
+              </w:rPr>
+              <w:t xml:space="preserve">$352,402</w:t>
             </w:r>
           </w:p>
         </w:tc>
@@ -7594,7 +7488,7 @@
                 <w:sz w:val="14"/>
                 <w:szCs w:val="14"/>
               </w:rPr>
-              <w:t xml:space="preserve">$1,090,768</w:t>
+              <w:t xml:space="preserve">$790,954</w:t>
             </w:r>
           </w:p>
         </w:tc>
@@ -7674,85 +7568,85 @@
                 <w:sz w:val="14"/>
                 <w:szCs w:val="14"/>
               </w:rPr>
-              <w:t xml:space="preserve">$1,329,019</w:t>
-            </w:r>
-          </w:p>
-        </w:tc>
-        <w:tc>
-          <w:tcPr>
-            <w:tcW w:type="dxa" w:w="1500"/>
-            <w:tcMar>
-              <w:top w:type="dxa" w:w="50"/>
-              <w:left w:type="dxa" w:w="70"/>
-              <w:bottom w:type="dxa" w:w="50"/>
-              <w:right w:type="dxa" w:w="70"/>
-            </w:tcMar>
-          </w:tcPr>
-          <w:p>
-            <w:pPr>
-              <w:jc w:val="right"/>
-            </w:pPr>
-            <w:r>
-              <w:rPr>
-                <w:rFonts w:ascii="Calibri" w:cs="Calibri" w:eastAsia="Calibri" w:hAnsi="Calibri"/>
-                <w:b w:val="false"/>
-                <w:bCs w:val="false"/>
-                <w:sz w:val="14"/>
-                <w:szCs w:val="14"/>
-              </w:rPr>
-              <w:t xml:space="preserve">($238,253)</w:t>
-            </w:r>
-          </w:p>
-        </w:tc>
-        <w:tc>
-          <w:tcPr>
-            <w:tcW w:type="dxa" w:w="1500"/>
-            <w:tcMar>
-              <w:top w:type="dxa" w:w="50"/>
-              <w:left w:type="dxa" w:w="70"/>
-              <w:bottom w:type="dxa" w:w="50"/>
-              <w:right w:type="dxa" w:w="70"/>
-            </w:tcMar>
-          </w:tcPr>
-          <w:p>
-            <w:pPr>
-              <w:jc w:val="right"/>
-            </w:pPr>
-            <w:r>
-              <w:rPr>
-                <w:rFonts w:ascii="Calibri" w:cs="Calibri" w:eastAsia="Calibri" w:hAnsi="Calibri"/>
-                <w:b w:val="false"/>
-                <w:bCs w:val="false"/>
-                <w:sz w:val="14"/>
-                <w:szCs w:val="14"/>
-              </w:rPr>
-              <w:t xml:space="preserve">$1,129,665</w:t>
-            </w:r>
-          </w:p>
-        </w:tc>
-        <w:tc>
-          <w:tcPr>
-            <w:tcW w:type="dxa" w:w="1500"/>
-            <w:tcMar>
-              <w:top w:type="dxa" w:w="50"/>
-              <w:left w:type="dxa" w:w="70"/>
-              <w:bottom w:type="dxa" w:w="50"/>
-              <w:right w:type="dxa" w:w="70"/>
-            </w:tcMar>
-          </w:tcPr>
-          <w:p>
-            <w:pPr>
-              <w:jc w:val="right"/>
-            </w:pPr>
-            <w:r>
-              <w:rPr>
-                <w:rFonts w:ascii="Calibri" w:cs="Calibri" w:eastAsia="Calibri" w:hAnsi="Calibri"/>
-                <w:b w:val="false"/>
-                <w:bCs w:val="false"/>
-                <w:sz w:val="14"/>
-                <w:szCs w:val="14"/>
-              </w:rPr>
-              <w:t xml:space="preserve">$1,090,768</w:t>
+              <w:t xml:space="preserve">$964,423</w:t>
+            </w:r>
+          </w:p>
+        </w:tc>
+        <w:tc>
+          <w:tcPr>
+            <w:tcW w:type="dxa" w:w="1500"/>
+            <w:tcMar>
+              <w:top w:type="dxa" w:w="50"/>
+              <w:left w:type="dxa" w:w="70"/>
+              <w:bottom w:type="dxa" w:w="50"/>
+              <w:right w:type="dxa" w:w="70"/>
+            </w:tcMar>
+          </w:tcPr>
+          <w:p>
+            <w:pPr>
+              <w:jc w:val="right"/>
+            </w:pPr>
+            <w:r>
+              <w:rPr>
+                <w:rFonts w:ascii="Calibri" w:cs="Calibri" w:eastAsia="Calibri" w:hAnsi="Calibri"/>
+                <w:b w:val="false"/>
+                <w:bCs w:val="false"/>
+                <w:sz w:val="14"/>
+                <w:szCs w:val="14"/>
+              </w:rPr>
+              <w:t xml:space="preserve">($173,468)</w:t>
+            </w:r>
+          </w:p>
+        </w:tc>
+        <w:tc>
+          <w:tcPr>
+            <w:tcW w:type="dxa" w:w="1500"/>
+            <w:tcMar>
+              <w:top w:type="dxa" w:w="50"/>
+              <w:left w:type="dxa" w:w="70"/>
+              <w:bottom w:type="dxa" w:w="50"/>
+              <w:right w:type="dxa" w:w="70"/>
+            </w:tcMar>
+          </w:tcPr>
+          <w:p>
+            <w:pPr>
+              <w:jc w:val="right"/>
+            </w:pPr>
+            <w:r>
+              <w:rPr>
+                <w:rFonts w:ascii="Calibri" w:cs="Calibri" w:eastAsia="Calibri" w:hAnsi="Calibri"/>
+                <w:b w:val="false"/>
+                <w:bCs w:val="false"/>
+                <w:sz w:val="14"/>
+                <w:szCs w:val="14"/>
+              </w:rPr>
+              <w:t xml:space="preserve">$819,759</w:t>
+            </w:r>
+          </w:p>
+        </w:tc>
+        <w:tc>
+          <w:tcPr>
+            <w:tcW w:type="dxa" w:w="1500"/>
+            <w:tcMar>
+              <w:top w:type="dxa" w:w="50"/>
+              <w:left w:type="dxa" w:w="70"/>
+              <w:bottom w:type="dxa" w:w="50"/>
+              <w:right w:type="dxa" w:w="70"/>
+            </w:tcMar>
+          </w:tcPr>
+          <w:p>
+            <w:pPr>
+              <w:jc w:val="right"/>
+            </w:pPr>
+            <w:r>
+              <w:rPr>
+                <w:rFonts w:ascii="Calibri" w:cs="Calibri" w:eastAsia="Calibri" w:hAnsi="Calibri"/>
+                <w:b w:val="false"/>
+                <w:bCs w:val="false"/>
+                <w:sz w:val="14"/>
+                <w:szCs w:val="14"/>
+              </w:rPr>
+              <w:t xml:space="preserve">$790,954</w:t>
             </w:r>
           </w:p>
         </w:tc>
@@ -7778,7 +7672,7 @@
                 <w:sz w:val="14"/>
                 <w:szCs w:val="14"/>
               </w:rPr>
-              <w:t xml:space="preserve">$1,090,768</w:t>
+              <w:t xml:space="preserve">$790,954</w:t>
             </w:r>
           </w:p>
         </w:tc>
@@ -7806,7 +7700,7 @@
         <w:rPr>
           <w:rFonts w:ascii="Calibri" w:cs="Calibri" w:eastAsia="Calibri" w:hAnsi="Calibri"/>
         </w:rPr>
-        <w:t xml:space="preserve">Clinical model: five-year net $212,368</w:t>
+        <w:t xml:space="preserve">Clinical model: five-year net $212,208</w:t>
       </w:r>
     </w:p>
     <w:tbl>
@@ -8122,7 +8016,7 @@
                 <w:sz w:val="14"/>
                 <w:szCs w:val="14"/>
               </w:rPr>
-              <w:t xml:space="preserve">($1,924)</w:t>
+              <w:t xml:space="preserve">($1,934)</w:t>
             </w:r>
           </w:p>
         </w:tc>
@@ -8174,7 +8068,7 @@
                 <w:sz w:val="14"/>
                 <w:szCs w:val="14"/>
               </w:rPr>
-              <w:t xml:space="preserve">$5,576</w:t>
+              <w:t xml:space="preserve">$5,565</w:t>
             </w:r>
           </w:p>
         </w:tc>
@@ -8200,7 +8094,7 @@
                 <w:sz w:val="14"/>
                 <w:szCs w:val="14"/>
               </w:rPr>
-              <w:t xml:space="preserve">$5,576</w:t>
+              <w:t xml:space="preserve">$5,565</w:t>
             </w:r>
           </w:p>
         </w:tc>
@@ -8306,7 +8200,7 @@
                 <w:sz w:val="14"/>
                 <w:szCs w:val="14"/>
               </w:rPr>
-              <w:t xml:space="preserve">($4,828)</w:t>
+              <w:t xml:space="preserve">($4,852)</w:t>
             </w:r>
           </w:p>
         </w:tc>
@@ -8358,7 +8252,7 @@
                 <w:sz w:val="14"/>
                 <w:szCs w:val="14"/>
               </w:rPr>
-              <w:t xml:space="preserve">$18,295</w:t>
+              <w:t xml:space="preserve">$18,271</w:t>
             </w:r>
           </w:p>
         </w:tc>
@@ -8384,7 +8278,7 @@
                 <w:sz w:val="14"/>
                 <w:szCs w:val="14"/>
               </w:rPr>
-              <w:t xml:space="preserve">$23,871</w:t>
+              <w:t xml:space="preserve">$23,836</w:t>
             </w:r>
           </w:p>
         </w:tc>
@@ -8490,7 +8384,7 @@
                 <w:sz w:val="14"/>
                 <w:szCs w:val="14"/>
               </w:rPr>
-              <w:t xml:space="preserve">($8,557)</w:t>
+              <w:t xml:space="preserve">($8,593)</w:t>
             </w:r>
           </w:p>
         </w:tc>
@@ -8542,7 +8436,7 @@
                 <w:sz w:val="14"/>
                 <w:szCs w:val="14"/>
               </w:rPr>
-              <w:t xml:space="preserve">$37,064</w:t>
+              <w:t xml:space="preserve">$37,028</w:t>
             </w:r>
           </w:p>
         </w:tc>
@@ -8568,7 +8462,7 @@
                 <w:sz w:val="14"/>
                 <w:szCs w:val="14"/>
               </w:rPr>
-              <w:t xml:space="preserve">$60,935</w:t>
+              <w:t xml:space="preserve">$60,864</w:t>
             </w:r>
           </w:p>
         </w:tc>
@@ -8674,7 +8568,7 @@
                 <w:sz w:val="14"/>
                 <w:szCs w:val="14"/>
               </w:rPr>
-              <w:t xml:space="preserve">($13,475)</w:t>
+              <w:t xml:space="preserve">($13,519)</w:t>
             </w:r>
           </w:p>
         </w:tc>
@@ -8726,7 +8620,7 @@
                 <w:sz w:val="14"/>
                 <w:szCs w:val="14"/>
               </w:rPr>
-              <w:t xml:space="preserve">$62,769</w:t>
+              <w:t xml:space="preserve">$62,725</w:t>
             </w:r>
           </w:p>
         </w:tc>
@@ -8752,7 +8646,7 @@
                 <w:sz w:val="14"/>
                 <w:szCs w:val="14"/>
               </w:rPr>
-              <w:t xml:space="preserve">$123,704</w:t>
+              <w:t xml:space="preserve">$123,589</w:t>
             </w:r>
           </w:p>
         </w:tc>
@@ -8858,7 +8752,7 @@
                 <w:sz w:val="14"/>
                 <w:szCs w:val="14"/>
               </w:rPr>
-              <w:t xml:space="preserve">($18,202)</w:t>
+              <w:t xml:space="preserve">($18,248)</w:t>
             </w:r>
           </w:p>
         </w:tc>
@@ -8910,7 +8804,7 @@
                 <w:sz w:val="14"/>
                 <w:szCs w:val="14"/>
               </w:rPr>
-              <w:t xml:space="preserve">$88,664</w:t>
+              <w:t xml:space="preserve">$88,619</w:t>
             </w:r>
           </w:p>
         </w:tc>
@@ -8936,7 +8830,7 @@
                 <w:sz w:val="14"/>
                 <w:szCs w:val="14"/>
               </w:rPr>
-              <w:t xml:space="preserve">$212,368</w:t>
+              <w:t xml:space="preserve">$212,208</w:t>
             </w:r>
           </w:p>
         </w:tc>
@@ -9042,7 +8936,7 @@
                 <w:sz w:val="14"/>
                 <w:szCs w:val="14"/>
               </w:rPr>
-              <w:t xml:space="preserve">($46,986)</w:t>
+              <w:t xml:space="preserve">($47,146)</w:t>
             </w:r>
           </w:p>
         </w:tc>
@@ -9094,7 +8988,7 @@
                 <w:sz w:val="14"/>
                 <w:szCs w:val="14"/>
               </w:rPr>
-              <w:t xml:space="preserve">$212,368</w:t>
+              <w:t xml:space="preserve">$212,208</w:t>
             </w:r>
           </w:p>
         </w:tc>
@@ -9120,7 +9014,7 @@
                 <w:sz w:val="14"/>
                 <w:szCs w:val="14"/>
               </w:rPr>
-              <w:t xml:space="preserve">$212,368</w:t>
+              <w:t xml:space="preserve">$212,208</w:t>
             </w:r>
           </w:p>
         </w:tc>
@@ -9518,7 +9412,7 @@
                 <w:sz w:val="16"/>
                 <w:szCs w:val="16"/>
               </w:rPr>
-              <w:t xml:space="preserve">5,316</w:t>
+              <w:t xml:space="preserve">3,858</w:t>
             </w:r>
           </w:p>
         </w:tc>
@@ -9570,7 +9464,7 @@
                 <w:sz w:val="16"/>
                 <w:szCs w:val="16"/>
               </w:rPr>
-              <w:t xml:space="preserve">$7,892,977</w:t>
+              <w:t xml:space="preserve">$7,710,741</w:t>
             </w:r>
           </w:p>
         </w:tc>
@@ -9596,7 +9490,7 @@
                 <w:sz w:val="16"/>
                 <w:szCs w:val="16"/>
               </w:rPr>
-              <w:t xml:space="preserve">$5,063,771</w:t>
+              <w:t xml:space="preserve">$4,908,871</w:t>
             </w:r>
           </w:p>
         </w:tc>
@@ -9728,7 +9622,7 @@
                 <w:sz w:val="16"/>
                 <w:szCs w:val="16"/>
               </w:rPr>
-              <w:t xml:space="preserve">10,633</w:t>
+              <w:t xml:space="preserve">7,716</w:t>
             </w:r>
           </w:p>
         </w:tc>
@@ -9780,7 +9674,7 @@
                 <w:sz w:val="16"/>
                 <w:szCs w:val="16"/>
               </w:rPr>
-              <w:t xml:space="preserve">$17,872,305</w:t>
+              <w:t xml:space="preserve">$17,507,708</w:t>
             </w:r>
           </w:p>
         </w:tc>
@@ -9806,7 +9700,7 @@
                 <w:sz w:val="16"/>
                 <w:szCs w:val="16"/>
               </w:rPr>
-              <w:t xml:space="preserve">$12,235,865</w:t>
+              <w:t xml:space="preserve">$11,925,957</w:t>
             </w:r>
           </w:p>
         </w:tc>
@@ -9938,7 +9832,7 @@
                 <w:sz w:val="16"/>
                 <w:szCs w:val="16"/>
               </w:rPr>
-              <w:t xml:space="preserve">21,265</w:t>
+              <w:t xml:space="preserve">15,429</w:t>
             </w:r>
           </w:p>
         </w:tc>
@@ -9990,7 +9884,7 @@
                 <w:sz w:val="16"/>
                 <w:szCs w:val="16"/>
               </w:rPr>
-              <w:t xml:space="preserve">$39,918,266</w:t>
+              <w:t xml:space="preserve">$39,188,824</w:t>
             </w:r>
           </w:p>
         </w:tc>
@@ -10016,7 +9910,7 @@
                 <w:sz w:val="16"/>
                 <w:szCs w:val="16"/>
               </w:rPr>
-              <w:t xml:space="preserve">$28,144,744</w:t>
+              <w:t xml:space="preserve">$27,524,719</w:t>
             </w:r>
           </w:p>
         </w:tc>

</xml_diff>

<commit_message>
Market page: the counted column sits beside the country name, population last and labeled as everyone; the table says it scrolls sideways. Frank read the population column as the market on a phone
Co-Authored-By: Claude Fable 5.1 <noreply@anthropic.com>
Claude-Session: https://claude.ai/code/session_01FdLL4Wp3bi12KNX6zHRo7N
</commit_message>
<xml_diff>
--- a/EZvoxa Market Model and Business Plan.docx
+++ b/EZvoxa Market Model and Business Plan.docx
@@ -150,7 +150,7 @@
     </w:p>
     <w:tbl>
       <w:tblPr>
-        <w:tblW w:type="dxa" w:w="11800"/>
+        <w:tblW w:type="dxa" w:w="12200"/>
         <w:tblBorders>
           <w:top w:val="single" w:color="auto" w:sz="4"/>
           <w:left w:val="single" w:color="auto" w:sz="4"/>
@@ -162,10 +162,10 @@
       </w:tblPr>
       <w:tblGrid>
         <w:gridCol w:w="2600"/>
-        <w:gridCol w:w="2400"/>
+        <w:gridCol w:w="2600"/>
         <w:gridCol w:w="2600"/>
         <w:gridCol w:w="2000"/>
-        <w:gridCol w:w="2200"/>
+        <w:gridCol w:w="2400"/>
       </w:tblGrid>
       <w:tr>
         <w:tc>
@@ -197,7 +197,7 @@
         </w:tc>
         <w:tc>
           <w:tcPr>
-            <w:tcW w:type="dxa" w:w="2400"/>
+            <w:tcW w:type="dxa" w:w="2600"/>
             <w:shd w:fill="E8E3DA" w:color="auto" w:val="clear"/>
             <w:tcMar>
               <w:top w:type="dxa" w:w="50"/>
@@ -218,7 +218,7 @@
                 <w:sz w:val="18"/>
                 <w:szCs w:val="18"/>
               </w:rPr>
-              <w:t xml:space="preserve">Population 13 and over</w:t>
+              <w:t xml:space="preserve">Cannot rely on speech (counted market)</w:t>
             </w:r>
           </w:p>
         </w:tc>
@@ -245,7 +245,7 @@
                 <w:sz w:val="18"/>
                 <w:szCs w:val="18"/>
               </w:rPr>
-              <w:t xml:space="preserve">Autism, minimally verbal</w:t>
+              <w:t xml:space="preserve">Of whom autism, minimally verbal</w:t>
             </w:r>
           </w:p>
         </w:tc>
@@ -272,13 +272,13 @@
                 <w:sz w:val="18"/>
                 <w:szCs w:val="18"/>
               </w:rPr>
-              <w:t xml:space="preserve">Aphasia</w:t>
-            </w:r>
-          </w:p>
-        </w:tc>
-        <w:tc>
-          <w:tcPr>
-            <w:tcW w:type="dxa" w:w="2200"/>
+              <w:t xml:space="preserve">Of whom aphasia</w:t>
+            </w:r>
+          </w:p>
+        </w:tc>
+        <w:tc>
+          <w:tcPr>
+            <w:tcW w:type="dxa" w:w="2400"/>
             <w:shd w:fill="E8E3DA" w:color="auto" w:val="clear"/>
             <w:tcMar>
               <w:top w:type="dxa" w:w="50"/>
@@ -299,7 +299,7 @@
                 <w:sz w:val="18"/>
                 <w:szCs w:val="18"/>
               </w:rPr>
-              <w:t xml:space="preserve">Counted market</w:t>
+              <w:t xml:space="preserve">Everyone 13 and over</w:t>
             </w:r>
           </w:p>
         </w:tc>
@@ -333,7 +333,7 @@
         </w:tc>
         <w:tc>
           <w:tcPr>
-            <w:tcW w:type="dxa" w:w="2400"/>
+            <w:tcW w:type="dxa" w:w="2600"/>
             <w:tcMar>
               <w:top w:type="dxa" w:w="50"/>
               <w:left w:type="dxa" w:w="70"/>
@@ -353,7 +353,7 @@
                 <w:sz w:val="18"/>
                 <w:szCs w:val="18"/>
               </w:rPr>
-              <w:t xml:space="preserve">288,872,301</w:t>
+              <w:t xml:space="preserve">2,842,533</w:t>
             </w:r>
           </w:p>
         </w:tc>
@@ -411,7 +411,7 @@
         </w:tc>
         <w:tc>
           <w:tcPr>
-            <w:tcW w:type="dxa" w:w="2200"/>
+            <w:tcW w:type="dxa" w:w="2400"/>
             <w:tcMar>
               <w:top w:type="dxa" w:w="50"/>
               <w:left w:type="dxa" w:w="70"/>
@@ -431,7 +431,7 @@
                 <w:sz w:val="18"/>
                 <w:szCs w:val="18"/>
               </w:rPr>
-              <w:t xml:space="preserve">2,842,533</w:t>
+              <w:t xml:space="preserve">288,872,301</w:t>
             </w:r>
           </w:p>
         </w:tc>
@@ -465,7 +465,7 @@
         </w:tc>
         <w:tc>
           <w:tcPr>
-            <w:tcW w:type="dxa" w:w="2400"/>
+            <w:tcW w:type="dxa" w:w="2600"/>
             <w:tcMar>
               <w:top w:type="dxa" w:w="50"/>
               <w:left w:type="dxa" w:w="70"/>
@@ -485,7 +485,7 @@
                 <w:sz w:val="18"/>
                 <w:szCs w:val="18"/>
               </w:rPr>
-              <w:t xml:space="preserve">59,222,071</w:t>
+              <w:t xml:space="preserve">549,917</w:t>
             </w:r>
           </w:p>
         </w:tc>
@@ -543,7 +543,7 @@
         </w:tc>
         <w:tc>
           <w:tcPr>
-            <w:tcW w:type="dxa" w:w="2200"/>
+            <w:tcW w:type="dxa" w:w="2400"/>
             <w:tcMar>
               <w:top w:type="dxa" w:w="50"/>
               <w:left w:type="dxa" w:w="70"/>
@@ -563,7 +563,7 @@
                 <w:sz w:val="18"/>
                 <w:szCs w:val="18"/>
               </w:rPr>
-              <w:t xml:space="preserve">549,917</w:t>
+              <w:t xml:space="preserve">59,222,071</w:t>
             </w:r>
           </w:p>
         </w:tc>
@@ -597,7 +597,7 @@
         </w:tc>
         <w:tc>
           <w:tcPr>
-            <w:tcW w:type="dxa" w:w="2400"/>
+            <w:tcW w:type="dxa" w:w="2600"/>
             <w:tcMar>
               <w:top w:type="dxa" w:w="50"/>
               <w:left w:type="dxa" w:w="70"/>
@@ -617,7 +617,7 @@
                 <w:sz w:val="18"/>
                 <w:szCs w:val="18"/>
               </w:rPr>
-              <w:t xml:space="preserve">35,403,905</w:t>
+              <w:t xml:space="preserve">328,749</w:t>
             </w:r>
           </w:p>
         </w:tc>
@@ -675,7 +675,7 @@
         </w:tc>
         <w:tc>
           <w:tcPr>
-            <w:tcW w:type="dxa" w:w="2200"/>
+            <w:tcW w:type="dxa" w:w="2400"/>
             <w:tcMar>
               <w:top w:type="dxa" w:w="50"/>
               <w:left w:type="dxa" w:w="70"/>
@@ -695,7 +695,7 @@
                 <w:sz w:val="18"/>
                 <w:szCs w:val="18"/>
               </w:rPr>
-              <w:t xml:space="preserve">328,749</w:t>
+              <w:t xml:space="preserve">35,403,905</w:t>
             </w:r>
           </w:p>
         </w:tc>
@@ -729,7 +729,7 @@
         </w:tc>
         <w:tc>
           <w:tcPr>
-            <w:tcW w:type="dxa" w:w="2400"/>
+            <w:tcW w:type="dxa" w:w="2600"/>
             <w:tcMar>
               <w:top w:type="dxa" w:w="50"/>
               <w:left w:type="dxa" w:w="70"/>
@@ -749,7 +749,7 @@
                 <w:sz w:val="18"/>
                 <w:szCs w:val="18"/>
               </w:rPr>
-              <w:t xml:space="preserve">23,482,317</w:t>
+              <w:t xml:space="preserve">218,049</w:t>
             </w:r>
           </w:p>
         </w:tc>
@@ -807,7 +807,7 @@
         </w:tc>
         <w:tc>
           <w:tcPr>
-            <w:tcW w:type="dxa" w:w="2200"/>
+            <w:tcW w:type="dxa" w:w="2400"/>
             <w:tcMar>
               <w:top w:type="dxa" w:w="50"/>
               <w:left w:type="dxa" w:w="70"/>
@@ -827,7 +827,7 @@
                 <w:sz w:val="18"/>
                 <w:szCs w:val="18"/>
               </w:rPr>
-              <w:t xml:space="preserve">218,049</w:t>
+              <w:t xml:space="preserve">23,482,317</w:t>
             </w:r>
           </w:p>
         </w:tc>
@@ -861,7 +861,7 @@
         </w:tc>
         <w:tc>
           <w:tcPr>
-            <w:tcW w:type="dxa" w:w="2400"/>
+            <w:tcW w:type="dxa" w:w="2600"/>
             <w:tcMar>
               <w:top w:type="dxa" w:w="50"/>
               <w:left w:type="dxa" w:w="70"/>
@@ -881,7 +881,7 @@
                 <w:sz w:val="18"/>
                 <w:szCs w:val="18"/>
               </w:rPr>
-              <w:t xml:space="preserve">4,525,995</w:t>
+              <w:t xml:space="preserve">42,027</w:t>
             </w:r>
           </w:p>
         </w:tc>
@@ -939,7 +939,7 @@
         </w:tc>
         <w:tc>
           <w:tcPr>
-            <w:tcW w:type="dxa" w:w="2200"/>
+            <w:tcW w:type="dxa" w:w="2400"/>
             <w:tcMar>
               <w:top w:type="dxa" w:w="50"/>
               <w:left w:type="dxa" w:w="70"/>
@@ -959,7 +959,7 @@
                 <w:sz w:val="18"/>
                 <w:szCs w:val="18"/>
               </w:rPr>
-              <w:t xml:space="preserve">42,027</w:t>
+              <w:t xml:space="preserve">4,525,995</w:t>
             </w:r>
           </w:p>
         </w:tc>
@@ -993,7 +993,7 @@
         </w:tc>
         <w:tc>
           <w:tcPr>
-            <w:tcW w:type="dxa" w:w="2400"/>
+            <w:tcW w:type="dxa" w:w="2600"/>
             <w:tcMar>
               <w:top w:type="dxa" w:w="50"/>
               <w:left w:type="dxa" w:w="70"/>
@@ -1013,7 +1013,7 @@
                 <w:sz w:val="18"/>
                 <w:szCs w:val="18"/>
               </w:rPr>
-              <w:t xml:space="preserve">4,684,040</w:t>
+              <w:t xml:space="preserve">43,494</w:t>
             </w:r>
           </w:p>
         </w:tc>
@@ -1071,7 +1071,7 @@
         </w:tc>
         <w:tc>
           <w:tcPr>
-            <w:tcW w:type="dxa" w:w="2200"/>
+            <w:tcW w:type="dxa" w:w="2400"/>
             <w:tcMar>
               <w:top w:type="dxa" w:w="50"/>
               <w:left w:type="dxa" w:w="70"/>
@@ -1091,7 +1091,7 @@
                 <w:sz w:val="18"/>
                 <w:szCs w:val="18"/>
               </w:rPr>
-              <w:t xml:space="preserve">43,494</w:t>
+              <w:t xml:space="preserve">4,684,040</w:t>
             </w:r>
           </w:p>
         </w:tc>
@@ -1125,7 +1125,7 @@
         </w:tc>
         <w:tc>
           <w:tcPr>
-            <w:tcW w:type="dxa" w:w="2400"/>
+            <w:tcW w:type="dxa" w:w="2600"/>
             <w:tcMar>
               <w:top w:type="dxa" w:w="50"/>
               <w:left w:type="dxa" w:w="70"/>
@@ -1145,7 +1145,7 @@
                 <w:sz w:val="18"/>
                 <w:szCs w:val="18"/>
               </w:rPr>
-              <w:t xml:space="preserve">416,190,629</w:t>
+              <w:t xml:space="preserve">4,024,770</w:t>
             </w:r>
           </w:p>
         </w:tc>
@@ -1203,7 +1203,7 @@
         </w:tc>
         <w:tc>
           <w:tcPr>
-            <w:tcW w:type="dxa" w:w="2200"/>
+            <w:tcW w:type="dxa" w:w="2400"/>
             <w:tcMar>
               <w:top w:type="dxa" w:w="50"/>
               <w:left w:type="dxa" w:w="70"/>
@@ -1223,7 +1223,7 @@
                 <w:sz w:val="18"/>
                 <w:szCs w:val="18"/>
               </w:rPr>
-              <w:t xml:space="preserve">4,024,770</w:t>
+              <w:t xml:space="preserve">416,190,629</w:t>
             </w:r>
           </w:p>
         </w:tc>

</xml_diff>

<commit_message>
Widgets and documents say EZvoxa Pro: the seat schools and clinicians buy, its own listing, at the higher rate (Frank, 8 Sep)
Co-Authored-By: Claude Fable 5.1 <noreply@anthropic.com>
Claude-Session: https://claude.ai/code/session_01FdLL4Wp3bi12KNX6zHRo7N
</commit_message>
<xml_diff>
--- a/EZvoxa Market Model and Business Plan.docx
+++ b/EZvoxa Market Model and Business Plan.docx
@@ -2949,7 +2949,7 @@
           <w:sz w:val="22"/>
           <w:szCs w:val="22"/>
         </w:rPr>
-        <w:t xml:space="preserve">Clinical means speech therapy centers, stroke rehab, other rehab, ALS clinics and any loss-of-speech rehab center (Frank, 8 September). Only the US inpatient rehab facilities are counted so far; therapists’ seats are priced at the school rate (Frank, 8 September).</w:t>
+        <w:t xml:space="preserve">Clinical means speech therapy centers, stroke rehab, other rehab, ALS clinics and any loss-of-speech rehab center (Frank, 8 September). Only the US inpatient rehab facilities are counted so far. Schools and clinicians buy EZvoxa Pro, its own App Store listing (Frank, 8 September: "EZVoxaPro is its own listing. period."), at $249.99 list and $124.99 for 20 or more copies through Apple School Manager.</w:t>
       </w:r>
     </w:p>
     <w:p>
@@ -6358,7 +6358,7 @@
         <w:rPr>
           <w:rFonts w:ascii="Calibri" w:cs="Calibri" w:eastAsia="Calibri" w:hAnsi="Calibri"/>
         </w:rPr>
-        <w:t xml:space="preserve">School district model: five-year net $790,954</w:t>
+        <w:t xml:space="preserve">School district model (EZvoxa Pro seats): five-year net $790,954</w:t>
       </w:r>
     </w:p>
     <w:tbl>
@@ -7700,7 +7700,7 @@
         <w:rPr>
           <w:rFonts w:ascii="Calibri" w:cs="Calibri" w:eastAsia="Calibri" w:hAnsi="Calibri"/>
         </w:rPr>
-        <w:t xml:space="preserve">Clinical model: five-year net $212,208</w:t>
+        <w:t xml:space="preserve">Clinical model (EZvoxa Pro seats): five-year net $212,208</w:t>
       </w:r>
     </w:p>
     <w:tbl>

</xml_diff>

<commit_message>
Market model: Claude's best estimate of direct school and clinical sales through the website as the Base level, labeled; districts own the devices, EZ Voice supplies the software (Frank, 9 Sep)
Co-Authored-By: Claude Fable 5.1 <noreply@anthropic.com>
Claude-Session: https://claude.ai/code/session_01FdLL4Wp3bi12KNX6zHRo7N
</commit_message>
<xml_diff>
--- a/EZvoxa Market Model and Business Plan.docx
+++ b/EZvoxa Market Model and Business Plan.docx
@@ -2541,7 +2541,7 @@
                 <w:sz w:val="16"/>
                 <w:szCs w:val="16"/>
               </w:rPr>
-              <w:t xml:space="preserve">Average seats in a district order. Nobody has sold one yet.</w:t>
+              <w:t xml:space="preserve">Average seats in a district order, 40: a district's secondary schools and its 18 to 21 program at two or three seats a class, bought centrally. Claude's estimate, 9 Sep 2026; nobody has sold one yet.</w:t>
             </w:r>
           </w:p>
         </w:tc>
@@ -2920,7 +2920,7 @@
                 <w:sz w:val="16"/>
                 <w:szCs w:val="16"/>
               </w:rPr>
-              <w:t xml:space="preserve">Seats a facility buys. Nobody has sold one yet.</w:t>
+              <w:t xml:space="preserve">Seats a rehab facility buys, 5. Claude's estimate; nobody has sold one yet.</w:t>
             </w:r>
           </w:p>
         </w:tc>
@@ -3058,7 +3058,7 @@
           <w:sz w:val="22"/>
           <w:szCs w:val="22"/>
         </w:rPr>
-        <w:t xml:space="preserve">Frank's to set. Buyer share is new one-time buyers each year as a share of the counted consumer market; subscription attach is the share of all buyers to date who hold the Family Tether at year end; school seat share is new seats each year as a share of the counted school market; clinic facility share is the share of facilities that have bought by that year, times seats per facility. Base is roughly twice the pasted hub's ramp in Year 1 as a share of market; Low is half of Base; High is twice Base.</w:t>
+        <w:t xml:space="preserve">Frank's to set. Buyer share is new one-time buyers each year as a share of the counted consumer market; subscription attach is the share of all buyers to date who hold the Family Tether at year end. The school and clinical shares are Claude's best estimate of direct sales through the website (Frank's ask, 9 Sep 2026), one seller at first, districts owning the devices and EZ Voice supplying the software: Year 1 St. Lucie district-wide (about 100 seats) plus two neighboring districts at 20 seats, 140 seats; Year 2 eight Florida districts at 40 seats, 320; Year 3 twenty-five districts across Florida and the Southeast, 1,000 seats; Year 4 sixty districts, 2,400; Year 5 one hundred twenty districts, 4,800, which is 0.9% of the 13,349 districts and 3.7% of the counted seats. Clinics: 3, 10, 30, 60 and 100 facilities at 5 seats. Base is that estimate; Low is half; High is double. Consumer buyer shares are unchanged placeholders.</w:t>
       </w:r>
     </w:p>
     <w:tbl>
@@ -3318,7 +3318,7 @@
                 <w:sz w:val="16"/>
                 <w:szCs w:val="16"/>
               </w:rPr>
-              <w:t xml:space="preserve">0.05%, 0.20%, 0.50%, 0.90%, 1.30%</w:t>
+              <w:t xml:space="preserve">0.05%, 0.12%, 0.38%, 0.92%, 1.84%</w:t>
             </w:r>
           </w:p>
         </w:tc>
@@ -3344,7 +3344,7 @@
                 <w:sz w:val="16"/>
                 <w:szCs w:val="16"/>
               </w:rPr>
-              <w:t xml:space="preserve">0.5%, 1.5%, 3.0%, 5.0%, 7.0%</w:t>
+              <w:t xml:space="preserve">0.1%, 0.4%, 1.2%, 2.5%, 4.1%</w:t>
             </w:r>
           </w:p>
         </w:tc>
@@ -3450,7 +3450,7 @@
                 <w:sz w:val="16"/>
                 <w:szCs w:val="16"/>
               </w:rPr>
-              <w:t xml:space="preserve">0.10%, 0.40%, 1.00%, 1.80%, 2.60%</w:t>
+              <w:t xml:space="preserve">0.11%, 0.24%, 0.77%, 1.84%, 3.67%</w:t>
             </w:r>
           </w:p>
         </w:tc>
@@ -3476,7 +3476,7 @@
                 <w:sz w:val="16"/>
                 <w:szCs w:val="16"/>
               </w:rPr>
-              <w:t xml:space="preserve">1.0%, 3.0%, 6.0%, 10.0%, 14.0%</w:t>
+              <w:t xml:space="preserve">0.3%, 0.8%, 2.5%, 4.9%, 8.2%</w:t>
             </w:r>
           </w:p>
         </w:tc>
@@ -3582,7 +3582,7 @@
                 <w:sz w:val="16"/>
                 <w:szCs w:val="16"/>
               </w:rPr>
-              <w:t xml:space="preserve">0.20%, 0.80%, 2.00%, 3.60%, 5.20%</w:t>
+              <w:t xml:space="preserve">0.21%, 0.49%, 1.53%, 3.67%, 7.34%</w:t>
             </w:r>
           </w:p>
         </w:tc>
@@ -3608,7 +3608,7 @@
                 <w:sz w:val="16"/>
                 <w:szCs w:val="16"/>
               </w:rPr>
-              <w:t xml:space="preserve">2.0%, 6.0%, 12.0%, 20.0%, 28.0%</w:t>
+              <w:t xml:space="preserve">0.5%, 1.6%, 4.9%, 9.8%, 16.4%</w:t>
             </w:r>
           </w:p>
         </w:tc>
@@ -3674,7 +3674,7 @@
         <w:rPr>
           <w:rFonts w:ascii="Calibri" w:cs="Calibri" w:eastAsia="Calibri" w:hAnsi="Calibri"/>
         </w:rPr>
-        <w:t xml:space="preserve">All three models combined: five-year net $11,987,146</w:t>
+        <w:t xml:space="preserve">All three models combined: five-year net $11,974,209</w:t>
       </w:r>
     </w:p>
     <w:tbl>
@@ -3938,111 +3938,111 @@
                 <w:sz w:val="14"/>
                 <w:szCs w:val="14"/>
               </w:rPr>
-              <w:t xml:space="preserve">4,025 buyers, 1,006 subs, 191 seats</w:t>
-            </w:r>
-          </w:p>
-        </w:tc>
-        <w:tc>
-          <w:tcPr>
-            <w:tcW w:type="dxa" w:w="1500"/>
-            <w:tcMar>
-              <w:top w:type="dxa" w:w="50"/>
-              <w:left w:type="dxa" w:w="70"/>
-              <w:bottom w:type="dxa" w:w="50"/>
-              <w:right w:type="dxa" w:w="70"/>
-            </w:tcMar>
-          </w:tcPr>
-          <w:p>
-            <w:pPr>
-              <w:jc w:val="right"/>
-            </w:pPr>
-            <w:r>
-              <w:rPr>
-                <w:rFonts w:ascii="Calibri" w:cs="Calibri" w:eastAsia="Calibri" w:hAnsi="Calibri"/>
-                <w:b w:val="false"/>
-                <w:bCs w:val="false"/>
-                <w:sz w:val="14"/>
-                <w:szCs w:val="14"/>
-              </w:rPr>
-              <w:t xml:space="preserve">$486,632</w:t>
-            </w:r>
-          </w:p>
-        </w:tc>
-        <w:tc>
-          <w:tcPr>
-            <w:tcW w:type="dxa" w:w="1500"/>
-            <w:tcMar>
-              <w:top w:type="dxa" w:w="50"/>
-              <w:left w:type="dxa" w:w="70"/>
-              <w:bottom w:type="dxa" w:w="50"/>
-              <w:right w:type="dxa" w:w="70"/>
-            </w:tcMar>
-          </w:tcPr>
-          <w:p>
-            <w:pPr>
-              <w:jc w:val="right"/>
-            </w:pPr>
-            <w:r>
-              <w:rPr>
-                <w:rFonts w:ascii="Calibri" w:cs="Calibri" w:eastAsia="Calibri" w:hAnsi="Calibri"/>
-                <w:b w:val="false"/>
-                <w:bCs w:val="false"/>
-                <w:sz w:val="14"/>
-                <w:szCs w:val="14"/>
-              </w:rPr>
-              <w:t xml:space="preserve">($198,989)</w:t>
-            </w:r>
-          </w:p>
-        </w:tc>
-        <w:tc>
-          <w:tcPr>
-            <w:tcW w:type="dxa" w:w="1500"/>
-            <w:tcMar>
-              <w:top w:type="dxa" w:w="50"/>
-              <w:left w:type="dxa" w:w="70"/>
-              <w:bottom w:type="dxa" w:w="50"/>
-              <w:right w:type="dxa" w:w="70"/>
-            </w:tcMar>
-          </w:tcPr>
-          <w:p>
-            <w:pPr>
-              <w:jc w:val="right"/>
-            </w:pPr>
-            <w:r>
-              <w:rPr>
-                <w:rFonts w:ascii="Calibri" w:cs="Calibri" w:eastAsia="Calibri" w:hAnsi="Calibri"/>
-                <w:b w:val="false"/>
-                <w:bCs w:val="false"/>
-                <w:sz w:val="14"/>
-                <w:szCs w:val="14"/>
-              </w:rPr>
-              <w:t xml:space="preserve">$340,140</w:t>
-            </w:r>
-          </w:p>
-        </w:tc>
-        <w:tc>
-          <w:tcPr>
-            <w:tcW w:type="dxa" w:w="1500"/>
-            <w:tcMar>
-              <w:top w:type="dxa" w:w="50"/>
-              <w:left w:type="dxa" w:w="70"/>
-              <w:bottom w:type="dxa" w:w="50"/>
-              <w:right w:type="dxa" w:w="70"/>
-            </w:tcMar>
-          </w:tcPr>
-          <w:p>
-            <w:pPr>
-              <w:jc w:val="right"/>
-            </w:pPr>
-            <w:r>
-              <w:rPr>
-                <w:rFonts w:ascii="Calibri" w:cs="Calibri" w:eastAsia="Calibri" w:hAnsi="Calibri"/>
-                <w:b w:val="false"/>
-                <w:bCs w:val="false"/>
-                <w:sz w:val="14"/>
-                <w:szCs w:val="14"/>
-              </w:rPr>
-              <w:t xml:space="preserve">$287,644</w:t>
+              <w:t xml:space="preserve">4,025 buyers, 1,006 subs, 155 seats</w:t>
+            </w:r>
+          </w:p>
+        </w:tc>
+        <w:tc>
+          <w:tcPr>
+            <w:tcW w:type="dxa" w:w="1500"/>
+            <w:tcMar>
+              <w:top w:type="dxa" w:w="50"/>
+              <w:left w:type="dxa" w:w="70"/>
+              <w:bottom w:type="dxa" w:w="50"/>
+              <w:right w:type="dxa" w:w="70"/>
+            </w:tcMar>
+          </w:tcPr>
+          <w:p>
+            <w:pPr>
+              <w:jc w:val="right"/>
+            </w:pPr>
+            <w:r>
+              <w:rPr>
+                <w:rFonts w:ascii="Calibri" w:cs="Calibri" w:eastAsia="Calibri" w:hAnsi="Calibri"/>
+                <w:b w:val="false"/>
+                <w:bCs w:val="false"/>
+                <w:sz w:val="14"/>
+                <w:szCs w:val="14"/>
+              </w:rPr>
+              <w:t xml:space="preserve">$482,133</w:t>
+            </w:r>
+          </w:p>
+        </w:tc>
+        <w:tc>
+          <w:tcPr>
+            <w:tcW w:type="dxa" w:w="1500"/>
+            <w:tcMar>
+              <w:top w:type="dxa" w:w="50"/>
+              <w:left w:type="dxa" w:w="70"/>
+              <w:bottom w:type="dxa" w:w="50"/>
+              <w:right w:type="dxa" w:w="70"/>
+            </w:tcMar>
+          </w:tcPr>
+          <w:p>
+            <w:pPr>
+              <w:jc w:val="right"/>
+            </w:pPr>
+            <w:r>
+              <w:rPr>
+                <w:rFonts w:ascii="Calibri" w:cs="Calibri" w:eastAsia="Calibri" w:hAnsi="Calibri"/>
+                <w:b w:val="false"/>
+                <w:bCs w:val="false"/>
+                <w:sz w:val="14"/>
+                <w:szCs w:val="14"/>
+              </w:rPr>
+              <w:t xml:space="preserve">($198,539)</w:t>
+            </w:r>
+          </w:p>
+        </w:tc>
+        <w:tc>
+          <w:tcPr>
+            <w:tcW w:type="dxa" w:w="1500"/>
+            <w:tcMar>
+              <w:top w:type="dxa" w:w="50"/>
+              <w:left w:type="dxa" w:w="70"/>
+              <w:bottom w:type="dxa" w:w="50"/>
+              <w:right w:type="dxa" w:w="70"/>
+            </w:tcMar>
+          </w:tcPr>
+          <w:p>
+            <w:pPr>
+              <w:jc w:val="right"/>
+            </w:pPr>
+            <w:r>
+              <w:rPr>
+                <w:rFonts w:ascii="Calibri" w:cs="Calibri" w:eastAsia="Calibri" w:hAnsi="Calibri"/>
+                <w:b w:val="false"/>
+                <w:bCs w:val="false"/>
+                <w:sz w:val="14"/>
+                <w:szCs w:val="14"/>
+              </w:rPr>
+              <w:t xml:space="preserve">$336,091</w:t>
+            </w:r>
+          </w:p>
+        </w:tc>
+        <w:tc>
+          <w:tcPr>
+            <w:tcW w:type="dxa" w:w="1500"/>
+            <w:tcMar>
+              <w:top w:type="dxa" w:w="50"/>
+              <w:left w:type="dxa" w:w="70"/>
+              <w:bottom w:type="dxa" w:w="50"/>
+              <w:right w:type="dxa" w:w="70"/>
+            </w:tcMar>
+          </w:tcPr>
+          <w:p>
+            <w:pPr>
+              <w:jc w:val="right"/>
+            </w:pPr>
+            <w:r>
+              <w:rPr>
+                <w:rFonts w:ascii="Calibri" w:cs="Calibri" w:eastAsia="Calibri" w:hAnsi="Calibri"/>
+                <w:b w:val="false"/>
+                <w:bCs w:val="false"/>
+                <w:sz w:val="14"/>
+                <w:szCs w:val="14"/>
+              </w:rPr>
+              <w:t xml:space="preserve">$283,594</w:t>
             </w:r>
           </w:p>
         </w:tc>
@@ -4068,7 +4068,7 @@
                 <w:sz w:val="14"/>
                 <w:szCs w:val="14"/>
               </w:rPr>
-              <w:t xml:space="preserve">$287,644</w:t>
+              <w:t xml:space="preserve">$283,594</w:t>
             </w:r>
           </w:p>
         </w:tc>
@@ -4122,111 +4122,111 @@
                 <w:sz w:val="14"/>
                 <w:szCs w:val="14"/>
               </w:rPr>
-              <w:t xml:space="preserve">10,062 buyers, 3,522 subs, 708 seats</w:t>
-            </w:r>
-          </w:p>
-        </w:tc>
-        <w:tc>
-          <w:tcPr>
-            <w:tcW w:type="dxa" w:w="1500"/>
-            <w:tcMar>
-              <w:top w:type="dxa" w:w="50"/>
-              <w:left w:type="dxa" w:w="70"/>
-              <w:bottom w:type="dxa" w:w="50"/>
-              <w:right w:type="dxa" w:w="70"/>
-            </w:tcMar>
-          </w:tcPr>
-          <w:p>
-            <w:pPr>
-              <w:jc w:val="right"/>
-            </w:pPr>
-            <w:r>
-              <w:rPr>
-                <w:rFonts w:ascii="Calibri" w:cs="Calibri" w:eastAsia="Calibri" w:hAnsi="Calibri"/>
-                <w:b w:val="false"/>
-                <w:bCs w:val="false"/>
-                <w:sz w:val="14"/>
-                <w:szCs w:val="14"/>
-              </w:rPr>
-              <w:t xml:space="preserve">$1,366,001</w:t>
-            </w:r>
-          </w:p>
-        </w:tc>
-        <w:tc>
-          <w:tcPr>
-            <w:tcW w:type="dxa" w:w="1500"/>
-            <w:tcMar>
-              <w:top w:type="dxa" w:w="50"/>
-              <w:left w:type="dxa" w:w="70"/>
-              <w:bottom w:type="dxa" w:w="50"/>
-              <w:right w:type="dxa" w:w="70"/>
-            </w:tcMar>
-          </w:tcPr>
-          <w:p>
-            <w:pPr>
-              <w:jc w:val="right"/>
-            </w:pPr>
-            <w:r>
-              <w:rPr>
-                <w:rFonts w:ascii="Calibri" w:cs="Calibri" w:eastAsia="Calibri" w:hAnsi="Calibri"/>
-                <w:b w:val="false"/>
-                <w:bCs w:val="false"/>
-                <w:sz w:val="14"/>
-                <w:szCs w:val="14"/>
-              </w:rPr>
-              <w:t xml:space="preserve">($481,060)</w:t>
-            </w:r>
-          </w:p>
-        </w:tc>
-        <w:tc>
-          <w:tcPr>
-            <w:tcW w:type="dxa" w:w="1500"/>
-            <w:tcMar>
-              <w:top w:type="dxa" w:w="50"/>
-              <w:left w:type="dxa" w:w="70"/>
-              <w:bottom w:type="dxa" w:w="50"/>
-              <w:right w:type="dxa" w:w="70"/>
-            </w:tcMar>
-          </w:tcPr>
-          <w:p>
-            <w:pPr>
-              <w:jc w:val="right"/>
-            </w:pPr>
-            <w:r>
-              <w:rPr>
-                <w:rFonts w:ascii="Calibri" w:cs="Calibri" w:eastAsia="Calibri" w:hAnsi="Calibri"/>
-                <w:b w:val="false"/>
-                <w:bCs w:val="false"/>
-                <w:sz w:val="14"/>
-                <w:szCs w:val="14"/>
-              </w:rPr>
-              <w:t xml:space="preserve">$966,694</w:t>
-            </w:r>
-          </w:p>
-        </w:tc>
-        <w:tc>
-          <w:tcPr>
-            <w:tcW w:type="dxa" w:w="1500"/>
-            <w:tcMar>
-              <w:top w:type="dxa" w:w="50"/>
-              <w:left w:type="dxa" w:w="70"/>
-              <w:bottom w:type="dxa" w:w="50"/>
-              <w:right w:type="dxa" w:w="70"/>
-            </w:tcMar>
-          </w:tcPr>
-          <w:p>
-            <w:pPr>
-              <w:jc w:val="right"/>
-            </w:pPr>
-            <w:r>
-              <w:rPr>
-                <w:rFonts w:ascii="Calibri" w:cs="Calibri" w:eastAsia="Calibri" w:hAnsi="Calibri"/>
-                <w:b w:val="false"/>
-                <w:bCs w:val="false"/>
-                <w:sz w:val="14"/>
-                <w:szCs w:val="14"/>
-              </w:rPr>
-              <w:t xml:space="preserve">$884,940</w:t>
+              <w:t xml:space="preserve">10,062 buyers, 3,522 subs, 370 seats</w:t>
+            </w:r>
+          </w:p>
+        </w:tc>
+        <w:tc>
+          <w:tcPr>
+            <w:tcW w:type="dxa" w:w="1500"/>
+            <w:tcMar>
+              <w:top w:type="dxa" w:w="50"/>
+              <w:left w:type="dxa" w:w="70"/>
+              <w:bottom w:type="dxa" w:w="50"/>
+              <w:right w:type="dxa" w:w="70"/>
+            </w:tcMar>
+          </w:tcPr>
+          <w:p>
+            <w:pPr>
+              <w:jc w:val="right"/>
+            </w:pPr>
+            <w:r>
+              <w:rPr>
+                <w:rFonts w:ascii="Calibri" w:cs="Calibri" w:eastAsia="Calibri" w:hAnsi="Calibri"/>
+                <w:b w:val="false"/>
+                <w:bCs w:val="false"/>
+                <w:sz w:val="14"/>
+                <w:szCs w:val="14"/>
+              </w:rPr>
+              <w:t xml:space="preserve">$1,323,754</w:t>
+            </w:r>
+          </w:p>
+        </w:tc>
+        <w:tc>
+          <w:tcPr>
+            <w:tcW w:type="dxa" w:w="1500"/>
+            <w:tcMar>
+              <w:top w:type="dxa" w:w="50"/>
+              <w:left w:type="dxa" w:w="70"/>
+              <w:bottom w:type="dxa" w:w="50"/>
+              <w:right w:type="dxa" w:w="70"/>
+            </w:tcMar>
+          </w:tcPr>
+          <w:p>
+            <w:pPr>
+              <w:jc w:val="right"/>
+            </w:pPr>
+            <w:r>
+              <w:rPr>
+                <w:rFonts w:ascii="Calibri" w:cs="Calibri" w:eastAsia="Calibri" w:hAnsi="Calibri"/>
+                <w:b w:val="false"/>
+                <w:bCs w:val="false"/>
+                <w:sz w:val="14"/>
+                <w:szCs w:val="14"/>
+              </w:rPr>
+              <w:t xml:space="preserve">($476,836)</w:t>
+            </w:r>
+          </w:p>
+        </w:tc>
+        <w:tc>
+          <w:tcPr>
+            <w:tcW w:type="dxa" w:w="1500"/>
+            <w:tcMar>
+              <w:top w:type="dxa" w:w="50"/>
+              <w:left w:type="dxa" w:w="70"/>
+              <w:bottom w:type="dxa" w:w="50"/>
+              <w:right w:type="dxa" w:w="70"/>
+            </w:tcMar>
+          </w:tcPr>
+          <w:p>
+            <w:pPr>
+              <w:jc w:val="right"/>
+            </w:pPr>
+            <w:r>
+              <w:rPr>
+                <w:rFonts w:ascii="Calibri" w:cs="Calibri" w:eastAsia="Calibri" w:hAnsi="Calibri"/>
+                <w:b w:val="false"/>
+                <w:bCs w:val="false"/>
+                <w:sz w:val="14"/>
+                <w:szCs w:val="14"/>
+              </w:rPr>
+              <w:t xml:space="preserve">$928,671</w:t>
+            </w:r>
+          </w:p>
+        </w:tc>
+        <w:tc>
+          <w:tcPr>
+            <w:tcW w:type="dxa" w:w="1500"/>
+            <w:tcMar>
+              <w:top w:type="dxa" w:w="50"/>
+              <w:left w:type="dxa" w:w="70"/>
+              <w:bottom w:type="dxa" w:w="50"/>
+              <w:right w:type="dxa" w:w="70"/>
+            </w:tcMar>
+          </w:tcPr>
+          <w:p>
+            <w:pPr>
+              <w:jc w:val="right"/>
+            </w:pPr>
+            <w:r>
+              <w:rPr>
+                <w:rFonts w:ascii="Calibri" w:cs="Calibri" w:eastAsia="Calibri" w:hAnsi="Calibri"/>
+                <w:b w:val="false"/>
+                <w:bCs w:val="false"/>
+                <w:sz w:val="14"/>
+                <w:szCs w:val="14"/>
+              </w:rPr>
+              <w:t xml:space="preserve">$846,918</w:t>
             </w:r>
           </w:p>
         </w:tc>
@@ -4252,7 +4252,7 @@
                 <w:sz w:val="14"/>
                 <w:szCs w:val="14"/>
               </w:rPr>
-              <w:t xml:space="preserve">$1,172,584</w:t>
+              <w:t xml:space="preserve">$1,130,512</w:t>
             </w:r>
           </w:p>
         </w:tc>
@@ -4306,111 +4306,111 @@
                 <w:sz w:val="14"/>
                 <w:szCs w:val="14"/>
               </w:rPr>
-              <w:t xml:space="preserve">20,124 buyers, 8,553 subs, 1,673 seats</w:t>
-            </w:r>
-          </w:p>
-        </w:tc>
-        <w:tc>
-          <w:tcPr>
-            <w:tcW w:type="dxa" w:w="1500"/>
-            <w:tcMar>
-              <w:top w:type="dxa" w:w="50"/>
-              <w:left w:type="dxa" w:w="70"/>
-              <w:bottom w:type="dxa" w:w="50"/>
-              <w:right w:type="dxa" w:w="70"/>
-            </w:tcMar>
-          </w:tcPr>
-          <w:p>
-            <w:pPr>
-              <w:jc w:val="right"/>
-            </w:pPr>
-            <w:r>
-              <w:rPr>
-                <w:rFonts w:ascii="Calibri" w:cs="Calibri" w:eastAsia="Calibri" w:hAnsi="Calibri"/>
-                <w:b w:val="false"/>
-                <w:bCs w:val="false"/>
-                <w:sz w:val="14"/>
-                <w:szCs w:val="14"/>
-              </w:rPr>
-              <w:t xml:space="preserve">$2,945,083</w:t>
-            </w:r>
-          </w:p>
-        </w:tc>
-        <w:tc>
-          <w:tcPr>
-            <w:tcW w:type="dxa" w:w="1500"/>
-            <w:tcMar>
-              <w:top w:type="dxa" w:w="50"/>
-              <w:left w:type="dxa" w:w="70"/>
-              <w:bottom w:type="dxa" w:w="50"/>
-              <w:right w:type="dxa" w:w="70"/>
-            </w:tcMar>
-          </w:tcPr>
-          <w:p>
-            <w:pPr>
-              <w:jc w:val="right"/>
-            </w:pPr>
-            <w:r>
-              <w:rPr>
-                <w:rFonts w:ascii="Calibri" w:cs="Calibri" w:eastAsia="Calibri" w:hAnsi="Calibri"/>
-                <w:b w:val="false"/>
-                <w:bCs w:val="false"/>
-                <w:sz w:val="14"/>
-                <w:szCs w:val="14"/>
-              </w:rPr>
-              <w:t xml:space="preserve">($960,091)</w:t>
-            </w:r>
-          </w:p>
-        </w:tc>
-        <w:tc>
-          <w:tcPr>
-            <w:tcW w:type="dxa" w:w="1500"/>
-            <w:tcMar>
-              <w:top w:type="dxa" w:w="50"/>
-              <w:left w:type="dxa" w:w="70"/>
-              <w:bottom w:type="dxa" w:w="50"/>
-              <w:right w:type="dxa" w:w="70"/>
-            </w:tcMar>
-          </w:tcPr>
-          <w:p>
-            <w:pPr>
-              <w:jc w:val="right"/>
-            </w:pPr>
-            <w:r>
-              <w:rPr>
-                <w:rFonts w:ascii="Calibri" w:cs="Calibri" w:eastAsia="Calibri" w:hAnsi="Calibri"/>
-                <w:b w:val="false"/>
-                <w:bCs w:val="false"/>
-                <w:sz w:val="14"/>
-                <w:szCs w:val="14"/>
-              </w:rPr>
-              <w:t xml:space="preserve">$2,097,945</w:t>
-            </w:r>
-          </w:p>
-        </w:tc>
-        <w:tc>
-          <w:tcPr>
-            <w:tcW w:type="dxa" w:w="1500"/>
-            <w:tcMar>
-              <w:top w:type="dxa" w:w="50"/>
-              <w:left w:type="dxa" w:w="70"/>
-              <w:bottom w:type="dxa" w:w="50"/>
-              <w:right w:type="dxa" w:w="70"/>
-            </w:tcMar>
-          </w:tcPr>
-          <w:p>
-            <w:pPr>
-              <w:jc w:val="right"/>
-            </w:pPr>
-            <w:r>
-              <w:rPr>
-                <w:rFonts w:ascii="Calibri" w:cs="Calibri" w:eastAsia="Calibri" w:hAnsi="Calibri"/>
-                <w:b w:val="false"/>
-                <w:bCs w:val="false"/>
-                <w:sz w:val="14"/>
-                <w:szCs w:val="14"/>
-              </w:rPr>
-              <w:t xml:space="preserve">$1,984,992</w:t>
+              <w:t xml:space="preserve">20,124 buyers, 8,553 subs, 1,150 seats</w:t>
+            </w:r>
+          </w:p>
+        </w:tc>
+        <w:tc>
+          <w:tcPr>
+            <w:tcW w:type="dxa" w:w="1500"/>
+            <w:tcMar>
+              <w:top w:type="dxa" w:w="50"/>
+              <w:left w:type="dxa" w:w="70"/>
+              <w:bottom w:type="dxa" w:w="50"/>
+              <w:right w:type="dxa" w:w="70"/>
+            </w:tcMar>
+          </w:tcPr>
+          <w:p>
+            <w:pPr>
+              <w:jc w:val="right"/>
+            </w:pPr>
+            <w:r>
+              <w:rPr>
+                <w:rFonts w:ascii="Calibri" w:cs="Calibri" w:eastAsia="Calibri" w:hAnsi="Calibri"/>
+                <w:b w:val="false"/>
+                <w:bCs w:val="false"/>
+                <w:sz w:val="14"/>
+                <w:szCs w:val="14"/>
+              </w:rPr>
+              <w:t xml:space="preserve">$2,879,713</w:t>
+            </w:r>
+          </w:p>
+        </w:tc>
+        <w:tc>
+          <w:tcPr>
+            <w:tcW w:type="dxa" w:w="1500"/>
+            <w:tcMar>
+              <w:top w:type="dxa" w:w="50"/>
+              <w:left w:type="dxa" w:w="70"/>
+              <w:bottom w:type="dxa" w:w="50"/>
+              <w:right w:type="dxa" w:w="70"/>
+            </w:tcMar>
+          </w:tcPr>
+          <w:p>
+            <w:pPr>
+              <w:jc w:val="right"/>
+            </w:pPr>
+            <w:r>
+              <w:rPr>
+                <w:rFonts w:ascii="Calibri" w:cs="Calibri" w:eastAsia="Calibri" w:hAnsi="Calibri"/>
+                <w:b w:val="false"/>
+                <w:bCs w:val="false"/>
+                <w:sz w:val="14"/>
+                <w:szCs w:val="14"/>
+              </w:rPr>
+              <w:t xml:space="preserve">($953,554)</w:t>
+            </w:r>
+          </w:p>
+        </w:tc>
+        <w:tc>
+          <w:tcPr>
+            <w:tcW w:type="dxa" w:w="1500"/>
+            <w:tcMar>
+              <w:top w:type="dxa" w:w="50"/>
+              <w:left w:type="dxa" w:w="70"/>
+              <w:bottom w:type="dxa" w:w="50"/>
+              <w:right w:type="dxa" w:w="70"/>
+            </w:tcMar>
+          </w:tcPr>
+          <w:p>
+            <w:pPr>
+              <w:jc w:val="right"/>
+            </w:pPr>
+            <w:r>
+              <w:rPr>
+                <w:rFonts w:ascii="Calibri" w:cs="Calibri" w:eastAsia="Calibri" w:hAnsi="Calibri"/>
+                <w:b w:val="false"/>
+                <w:bCs w:val="false"/>
+                <w:sz w:val="14"/>
+                <w:szCs w:val="14"/>
+              </w:rPr>
+              <w:t xml:space="preserve">$2,039,112</w:t>
+            </w:r>
+          </w:p>
+        </w:tc>
+        <w:tc>
+          <w:tcPr>
+            <w:tcW w:type="dxa" w:w="1500"/>
+            <w:tcMar>
+              <w:top w:type="dxa" w:w="50"/>
+              <w:left w:type="dxa" w:w="70"/>
+              <w:bottom w:type="dxa" w:w="50"/>
+              <w:right w:type="dxa" w:w="70"/>
+            </w:tcMar>
+          </w:tcPr>
+          <w:p>
+            <w:pPr>
+              <w:jc w:val="right"/>
+            </w:pPr>
+            <w:r>
+              <w:rPr>
+                <w:rFonts w:ascii="Calibri" w:cs="Calibri" w:eastAsia="Calibri" w:hAnsi="Calibri"/>
+                <w:b w:val="false"/>
+                <w:bCs w:val="false"/>
+                <w:sz w:val="14"/>
+                <w:szCs w:val="14"/>
+              </w:rPr>
+              <w:t xml:space="preserve">$1,926,159</w:t>
             </w:r>
           </w:p>
         </w:tc>
@@ -4436,7 +4436,7 @@
                 <w:sz w:val="14"/>
                 <w:szCs w:val="14"/>
               </w:rPr>
-              <w:t xml:space="preserve">$3,157,576</w:t>
+              <w:t xml:space="preserve">$3,056,671</w:t>
             </w:r>
           </w:p>
         </w:tc>
@@ -4490,111 +4490,111 @@
                 <w:sz w:val="14"/>
                 <w:szCs w:val="14"/>
               </w:rPr>
-              <w:t xml:space="preserve">32,198 buyers, 16,602 subs, 2,964 seats</w:t>
-            </w:r>
-          </w:p>
-        </w:tc>
-        <w:tc>
-          <w:tcPr>
-            <w:tcW w:type="dxa" w:w="1500"/>
-            <w:tcMar>
-              <w:top w:type="dxa" w:w="50"/>
-              <w:left w:type="dxa" w:w="70"/>
-              <w:bottom w:type="dxa" w:w="50"/>
-              <w:right w:type="dxa" w:w="70"/>
-            </w:tcMar>
-          </w:tcPr>
-          <w:p>
-            <w:pPr>
-              <w:jc w:val="right"/>
-            </w:pPr>
-            <w:r>
-              <w:rPr>
-                <w:rFonts w:ascii="Calibri" w:cs="Calibri" w:eastAsia="Calibri" w:hAnsi="Calibri"/>
-                <w:b w:val="false"/>
-                <w:bCs w:val="false"/>
-                <w:sz w:val="14"/>
-                <w:szCs w:val="14"/>
-              </w:rPr>
-              <w:t xml:space="preserve">$5,097,739</w:t>
-            </w:r>
-          </w:p>
-        </w:tc>
-        <w:tc>
-          <w:tcPr>
-            <w:tcW w:type="dxa" w:w="1500"/>
-            <w:tcMar>
-              <w:top w:type="dxa" w:w="50"/>
-              <w:left w:type="dxa" w:w="70"/>
-              <w:bottom w:type="dxa" w:w="50"/>
-              <w:right w:type="dxa" w:w="70"/>
-            </w:tcMar>
-          </w:tcPr>
-          <w:p>
-            <w:pPr>
-              <w:jc w:val="right"/>
-            </w:pPr>
-            <w:r>
-              <w:rPr>
-                <w:rFonts w:ascii="Calibri" w:cs="Calibri" w:eastAsia="Calibri" w:hAnsi="Calibri"/>
-                <w:b w:val="false"/>
-                <w:bCs w:val="false"/>
-                <w:sz w:val="14"/>
-                <w:szCs w:val="14"/>
-              </w:rPr>
-              <w:t xml:space="preserve">($1,585,826)</w:t>
-            </w:r>
-          </w:p>
-        </w:tc>
-        <w:tc>
-          <w:tcPr>
-            <w:tcW w:type="dxa" w:w="1500"/>
-            <w:tcMar>
-              <w:top w:type="dxa" w:w="50"/>
-              <w:left w:type="dxa" w:w="70"/>
-              <w:bottom w:type="dxa" w:w="50"/>
-              <w:right w:type="dxa" w:w="70"/>
-            </w:tcMar>
-          </w:tcPr>
-          <w:p>
-            <w:pPr>
-              <w:jc w:val="right"/>
-            </w:pPr>
-            <w:r>
-              <w:rPr>
-                <w:rFonts w:ascii="Calibri" w:cs="Calibri" w:eastAsia="Calibri" w:hAnsi="Calibri"/>
-                <w:b w:val="false"/>
-                <w:bCs w:val="false"/>
-                <w:sz w:val="14"/>
-                <w:szCs w:val="14"/>
-              </w:rPr>
-              <w:t xml:space="preserve">$3,651,166</w:t>
-            </w:r>
-          </w:p>
-        </w:tc>
-        <w:tc>
-          <w:tcPr>
-            <w:tcW w:type="dxa" w:w="1500"/>
-            <w:tcMar>
-              <w:top w:type="dxa" w:w="50"/>
-              <w:left w:type="dxa" w:w="70"/>
-              <w:bottom w:type="dxa" w:w="50"/>
-              <w:right w:type="dxa" w:w="70"/>
-            </w:tcMar>
-          </w:tcPr>
-          <w:p>
-            <w:pPr>
-              <w:jc w:val="right"/>
-            </w:pPr>
-            <w:r>
-              <w:rPr>
-                <w:rFonts w:ascii="Calibri" w:cs="Calibri" w:eastAsia="Calibri" w:hAnsi="Calibri"/>
-                <w:b w:val="false"/>
-                <w:bCs w:val="false"/>
-                <w:sz w:val="14"/>
-                <w:szCs w:val="14"/>
-              </w:rPr>
-              <w:t xml:space="preserve">$3,511,913</w:t>
+              <w:t xml:space="preserve">32,198 buyers, 16,602 subs, 2,701 seats</w:t>
+            </w:r>
+          </w:p>
+        </w:tc>
+        <w:tc>
+          <w:tcPr>
+            <w:tcW w:type="dxa" w:w="1500"/>
+            <w:tcMar>
+              <w:top w:type="dxa" w:w="50"/>
+              <w:left w:type="dxa" w:w="70"/>
+              <w:bottom w:type="dxa" w:w="50"/>
+              <w:right w:type="dxa" w:w="70"/>
+            </w:tcMar>
+          </w:tcPr>
+          <w:p>
+            <w:pPr>
+              <w:jc w:val="right"/>
+            </w:pPr>
+            <w:r>
+              <w:rPr>
+                <w:rFonts w:ascii="Calibri" w:cs="Calibri" w:eastAsia="Calibri" w:hAnsi="Calibri"/>
+                <w:b w:val="false"/>
+                <w:bCs w:val="false"/>
+                <w:sz w:val="14"/>
+                <w:szCs w:val="14"/>
+              </w:rPr>
+              <w:t xml:space="preserve">$5,064,867</w:t>
+            </w:r>
+          </w:p>
+        </w:tc>
+        <w:tc>
+          <w:tcPr>
+            <w:tcW w:type="dxa" w:w="1500"/>
+            <w:tcMar>
+              <w:top w:type="dxa" w:w="50"/>
+              <w:left w:type="dxa" w:w="70"/>
+              <w:bottom w:type="dxa" w:w="50"/>
+              <w:right w:type="dxa" w:w="70"/>
+            </w:tcMar>
+          </w:tcPr>
+          <w:p>
+            <w:pPr>
+              <w:jc w:val="right"/>
+            </w:pPr>
+            <w:r>
+              <w:rPr>
+                <w:rFonts w:ascii="Calibri" w:cs="Calibri" w:eastAsia="Calibri" w:hAnsi="Calibri"/>
+                <w:b w:val="false"/>
+                <w:bCs w:val="false"/>
+                <w:sz w:val="14"/>
+                <w:szCs w:val="14"/>
+              </w:rPr>
+              <w:t xml:space="preserve">($1,582,539)</w:t>
+            </w:r>
+          </w:p>
+        </w:tc>
+        <w:tc>
+          <w:tcPr>
+            <w:tcW w:type="dxa" w:w="1500"/>
+            <w:tcMar>
+              <w:top w:type="dxa" w:w="50"/>
+              <w:left w:type="dxa" w:w="70"/>
+              <w:bottom w:type="dxa" w:w="50"/>
+              <w:right w:type="dxa" w:w="70"/>
+            </w:tcMar>
+          </w:tcPr>
+          <w:p>
+            <w:pPr>
+              <w:jc w:val="right"/>
+            </w:pPr>
+            <w:r>
+              <w:rPr>
+                <w:rFonts w:ascii="Calibri" w:cs="Calibri" w:eastAsia="Calibri" w:hAnsi="Calibri"/>
+                <w:b w:val="false"/>
+                <w:bCs w:val="false"/>
+                <w:sz w:val="14"/>
+                <w:szCs w:val="14"/>
+              </w:rPr>
+              <w:t xml:space="preserve">$3,621,581</w:t>
+            </w:r>
+          </w:p>
+        </w:tc>
+        <w:tc>
+          <w:tcPr>
+            <w:tcW w:type="dxa" w:w="1500"/>
+            <w:tcMar>
+              <w:top w:type="dxa" w:w="50"/>
+              <w:left w:type="dxa" w:w="70"/>
+              <w:bottom w:type="dxa" w:w="50"/>
+              <w:right w:type="dxa" w:w="70"/>
+            </w:tcMar>
+          </w:tcPr>
+          <w:p>
+            <w:pPr>
+              <w:jc w:val="right"/>
+            </w:pPr>
+            <w:r>
+              <w:rPr>
+                <w:rFonts w:ascii="Calibri" w:cs="Calibri" w:eastAsia="Calibri" w:hAnsi="Calibri"/>
+                <w:b w:val="false"/>
+                <w:bCs w:val="false"/>
+                <w:sz w:val="14"/>
+                <w:szCs w:val="14"/>
+              </w:rPr>
+              <w:t xml:space="preserve">$3,482,328</w:t>
             </w:r>
           </w:p>
         </w:tc>
@@ -4620,7 +4620,7 @@
                 <w:sz w:val="14"/>
                 <w:szCs w:val="14"/>
               </w:rPr>
-              <w:t xml:space="preserve">$6,669,489</w:t>
+              <w:t xml:space="preserve">$6,538,999</w:t>
             </w:r>
           </w:p>
         </w:tc>
@@ -4674,111 +4674,111 @@
                 <w:sz w:val="14"/>
                 <w:szCs w:val="14"/>
               </w:rPr>
-              <w:t xml:space="preserve">44,272 buyers, 27,670 subs, 4,255 seats</w:t>
-            </w:r>
-          </w:p>
-        </w:tc>
-        <w:tc>
-          <w:tcPr>
-            <w:tcW w:type="dxa" w:w="1500"/>
-            <w:tcMar>
-              <w:top w:type="dxa" w:w="50"/>
-              <w:left w:type="dxa" w:w="70"/>
-              <w:bottom w:type="dxa" w:w="50"/>
-              <w:right w:type="dxa" w:w="70"/>
-            </w:tcMar>
-          </w:tcPr>
-          <w:p>
-            <w:pPr>
-              <w:jc w:val="right"/>
-            </w:pPr>
-            <w:r>
-              <w:rPr>
-                <w:rFonts w:ascii="Calibri" w:cs="Calibri" w:eastAsia="Calibri" w:hAnsi="Calibri"/>
-                <w:b w:val="false"/>
-                <w:bCs w:val="false"/>
-                <w:sz w:val="14"/>
-                <w:szCs w:val="14"/>
-              </w:rPr>
-              <w:t xml:space="preserve">$7,612,253</w:t>
-            </w:r>
-          </w:p>
-        </w:tc>
-        <w:tc>
-          <w:tcPr>
-            <w:tcW w:type="dxa" w:w="1500"/>
-            <w:tcMar>
-              <w:top w:type="dxa" w:w="50"/>
-              <w:left w:type="dxa" w:w="70"/>
-              <w:bottom w:type="dxa" w:w="50"/>
-              <w:right w:type="dxa" w:w="70"/>
-            </w:tcMar>
-          </w:tcPr>
-          <w:p>
-            <w:pPr>
-              <w:jc w:val="right"/>
-            </w:pPr>
-            <w:r>
-              <w:rPr>
-                <w:rFonts w:ascii="Calibri" w:cs="Calibri" w:eastAsia="Calibri" w:hAnsi="Calibri"/>
-                <w:b w:val="false"/>
-                <w:bCs w:val="false"/>
-                <w:sz w:val="14"/>
-                <w:szCs w:val="14"/>
-              </w:rPr>
-              <w:t xml:space="preserve">($2,294,597)</w:t>
-            </w:r>
-          </w:p>
-        </w:tc>
-        <w:tc>
-          <w:tcPr>
-            <w:tcW w:type="dxa" w:w="1500"/>
-            <w:tcMar>
-              <w:top w:type="dxa" w:w="50"/>
-              <w:left w:type="dxa" w:w="70"/>
-              <w:bottom w:type="dxa" w:w="50"/>
-              <w:right w:type="dxa" w:w="70"/>
-            </w:tcMar>
-          </w:tcPr>
-          <w:p>
-            <w:pPr>
-              <w:jc w:val="right"/>
-            </w:pPr>
-            <w:r>
-              <w:rPr>
-                <w:rFonts w:ascii="Calibri" w:cs="Calibri" w:eastAsia="Calibri" w:hAnsi="Calibri"/>
-                <w:b w:val="false"/>
-                <w:bCs w:val="false"/>
-                <w:sz w:val="14"/>
-                <w:szCs w:val="14"/>
-              </w:rPr>
-              <w:t xml:space="preserve">$5,475,638</w:t>
-            </w:r>
-          </w:p>
-        </w:tc>
-        <w:tc>
-          <w:tcPr>
-            <w:tcW w:type="dxa" w:w="1500"/>
-            <w:tcMar>
-              <w:top w:type="dxa" w:w="50"/>
-              <w:left w:type="dxa" w:w="70"/>
-              <w:bottom w:type="dxa" w:w="50"/>
-              <w:right w:type="dxa" w:w="70"/>
-            </w:tcMar>
-          </w:tcPr>
-          <w:p>
-            <w:pPr>
-              <w:jc w:val="right"/>
-            </w:pPr>
-            <w:r>
-              <w:rPr>
-                <w:rFonts w:ascii="Calibri" w:cs="Calibri" w:eastAsia="Calibri" w:hAnsi="Calibri"/>
-                <w:b w:val="false"/>
-                <w:bCs w:val="false"/>
-                <w:sz w:val="14"/>
-                <w:szCs w:val="14"/>
-              </w:rPr>
-              <w:t xml:space="preserve">$5,317,657</w:t>
+              <w:t xml:space="preserve">44,272 buyers, 27,670 subs, 5,300 seats</w:t>
+            </w:r>
+          </w:p>
+        </w:tc>
+        <w:tc>
+          <w:tcPr>
+            <w:tcW w:type="dxa" w:w="1500"/>
+            <w:tcMar>
+              <w:top w:type="dxa" w:w="50"/>
+              <w:left w:type="dxa" w:w="70"/>
+              <w:bottom w:type="dxa" w:w="50"/>
+              <w:right w:type="dxa" w:w="70"/>
+            </w:tcMar>
+          </w:tcPr>
+          <w:p>
+            <w:pPr>
+              <w:jc w:val="right"/>
+            </w:pPr>
+            <w:r>
+              <w:rPr>
+                <w:rFonts w:ascii="Calibri" w:cs="Calibri" w:eastAsia="Calibri" w:hAnsi="Calibri"/>
+                <w:b w:val="false"/>
+                <w:bCs w:val="false"/>
+                <w:sz w:val="14"/>
+                <w:szCs w:val="14"/>
+              </w:rPr>
+              <w:t xml:space="preserve">$7,742,868</w:t>
+            </w:r>
+          </w:p>
+        </w:tc>
+        <w:tc>
+          <w:tcPr>
+            <w:tcW w:type="dxa" w:w="1500"/>
+            <w:tcMar>
+              <w:top w:type="dxa" w:w="50"/>
+              <w:left w:type="dxa" w:w="70"/>
+              <w:bottom w:type="dxa" w:w="50"/>
+              <w:right w:type="dxa" w:w="70"/>
+            </w:tcMar>
+          </w:tcPr>
+          <w:p>
+            <w:pPr>
+              <w:jc w:val="right"/>
+            </w:pPr>
+            <w:r>
+              <w:rPr>
+                <w:rFonts w:ascii="Calibri" w:cs="Calibri" w:eastAsia="Calibri" w:hAnsi="Calibri"/>
+                <w:b w:val="false"/>
+                <w:bCs w:val="false"/>
+                <w:sz w:val="14"/>
+                <w:szCs w:val="14"/>
+              </w:rPr>
+              <w:t xml:space="preserve">($2,307,658)</w:t>
+            </w:r>
+          </w:p>
+        </w:tc>
+        <w:tc>
+          <w:tcPr>
+            <w:tcW w:type="dxa" w:w="1500"/>
+            <w:tcMar>
+              <w:top w:type="dxa" w:w="50"/>
+              <w:left w:type="dxa" w:w="70"/>
+              <w:bottom w:type="dxa" w:w="50"/>
+              <w:right w:type="dxa" w:w="70"/>
+            </w:tcMar>
+          </w:tcPr>
+          <w:p>
+            <w:pPr>
+              <w:jc w:val="right"/>
+            </w:pPr>
+            <w:r>
+              <w:rPr>
+                <w:rFonts w:ascii="Calibri" w:cs="Calibri" w:eastAsia="Calibri" w:hAnsi="Calibri"/>
+                <w:b w:val="false"/>
+                <w:bCs w:val="false"/>
+                <w:sz w:val="14"/>
+                <w:szCs w:val="14"/>
+              </w:rPr>
+              <w:t xml:space="preserve">$5,593,192</w:t>
+            </w:r>
+          </w:p>
+        </w:tc>
+        <w:tc>
+          <w:tcPr>
+            <w:tcW w:type="dxa" w:w="1500"/>
+            <w:tcMar>
+              <w:top w:type="dxa" w:w="50"/>
+              <w:left w:type="dxa" w:w="70"/>
+              <w:bottom w:type="dxa" w:w="50"/>
+              <w:right w:type="dxa" w:w="70"/>
+            </w:tcMar>
+          </w:tcPr>
+          <w:p>
+            <w:pPr>
+              <w:jc w:val="right"/>
+            </w:pPr>
+            <w:r>
+              <w:rPr>
+                <w:rFonts w:ascii="Calibri" w:cs="Calibri" w:eastAsia="Calibri" w:hAnsi="Calibri"/>
+                <w:b w:val="false"/>
+                <w:bCs w:val="false"/>
+                <w:sz w:val="14"/>
+                <w:szCs w:val="14"/>
+              </w:rPr>
+              <w:t xml:space="preserve">$5,435,210</w:t>
             </w:r>
           </w:p>
         </w:tc>
@@ -4804,7 +4804,7 @@
                 <w:sz w:val="14"/>
                 <w:szCs w:val="14"/>
               </w:rPr>
-              <w:t xml:space="preserve">$11,987,146</w:t>
+              <w:t xml:space="preserve">$11,974,209</w:t>
             </w:r>
           </w:p>
         </w:tc>
@@ -4884,85 +4884,85 @@
                 <w:sz w:val="14"/>
                 <w:szCs w:val="14"/>
               </w:rPr>
-              <w:t xml:space="preserve">$17,507,708</w:t>
-            </w:r>
-          </w:p>
-        </w:tc>
-        <w:tc>
-          <w:tcPr>
-            <w:tcW w:type="dxa" w:w="1500"/>
-            <w:tcMar>
-              <w:top w:type="dxa" w:w="50"/>
-              <w:left w:type="dxa" w:w="70"/>
-              <w:bottom w:type="dxa" w:w="50"/>
-              <w:right w:type="dxa" w:w="70"/>
-            </w:tcMar>
-          </w:tcPr>
-          <w:p>
-            <w:pPr>
-              <w:jc w:val="right"/>
-            </w:pPr>
-            <w:r>
-              <w:rPr>
-                <w:rFonts w:ascii="Calibri" w:cs="Calibri" w:eastAsia="Calibri" w:hAnsi="Calibri"/>
-                <w:b w:val="false"/>
-                <w:bCs w:val="false"/>
-                <w:sz w:val="14"/>
-                <w:szCs w:val="14"/>
-              </w:rPr>
-              <w:t xml:space="preserve">($5,520,563)</w:t>
-            </w:r>
-          </w:p>
-        </w:tc>
-        <w:tc>
-          <w:tcPr>
-            <w:tcW w:type="dxa" w:w="1500"/>
-            <w:tcMar>
-              <w:top w:type="dxa" w:w="50"/>
-              <w:left w:type="dxa" w:w="70"/>
-              <w:bottom w:type="dxa" w:w="50"/>
-              <w:right w:type="dxa" w:w="70"/>
-            </w:tcMar>
-          </w:tcPr>
-          <w:p>
-            <w:pPr>
-              <w:jc w:val="right"/>
-            </w:pPr>
-            <w:r>
-              <w:rPr>
-                <w:rFonts w:ascii="Calibri" w:cs="Calibri" w:eastAsia="Calibri" w:hAnsi="Calibri"/>
-                <w:b w:val="false"/>
-                <w:bCs w:val="false"/>
-                <w:sz w:val="14"/>
-                <w:szCs w:val="14"/>
-              </w:rPr>
-              <w:t xml:space="preserve">$12,531,583</w:t>
-            </w:r>
-          </w:p>
-        </w:tc>
-        <w:tc>
-          <w:tcPr>
-            <w:tcW w:type="dxa" w:w="1500"/>
-            <w:tcMar>
-              <w:top w:type="dxa" w:w="50"/>
-              <w:left w:type="dxa" w:w="70"/>
-              <w:bottom w:type="dxa" w:w="50"/>
-              <w:right w:type="dxa" w:w="70"/>
-            </w:tcMar>
-          </w:tcPr>
-          <w:p>
-            <w:pPr>
-              <w:jc w:val="right"/>
-            </w:pPr>
-            <w:r>
-              <w:rPr>
-                <w:rFonts w:ascii="Calibri" w:cs="Calibri" w:eastAsia="Calibri" w:hAnsi="Calibri"/>
-                <w:b w:val="false"/>
-                <w:bCs w:val="false"/>
-                <w:sz w:val="14"/>
-                <w:szCs w:val="14"/>
-              </w:rPr>
-              <w:t xml:space="preserve">$11,987,146</w:t>
+              <w:t xml:space="preserve">$17,493,335</w:t>
+            </w:r>
+          </w:p>
+        </w:tc>
+        <w:tc>
+          <w:tcPr>
+            <w:tcW w:type="dxa" w:w="1500"/>
+            <w:tcMar>
+              <w:top w:type="dxa" w:w="50"/>
+              <w:left w:type="dxa" w:w="70"/>
+              <w:bottom w:type="dxa" w:w="50"/>
+              <w:right w:type="dxa" w:w="70"/>
+            </w:tcMar>
+          </w:tcPr>
+          <w:p>
+            <w:pPr>
+              <w:jc w:val="right"/>
+            </w:pPr>
+            <w:r>
+              <w:rPr>
+                <w:rFonts w:ascii="Calibri" w:cs="Calibri" w:eastAsia="Calibri" w:hAnsi="Calibri"/>
+                <w:b w:val="false"/>
+                <w:bCs w:val="false"/>
+                <w:sz w:val="14"/>
+                <w:szCs w:val="14"/>
+              </w:rPr>
+              <w:t xml:space="preserve">($5,519,126)</w:t>
+            </w:r>
+          </w:p>
+        </w:tc>
+        <w:tc>
+          <w:tcPr>
+            <w:tcW w:type="dxa" w:w="1500"/>
+            <w:tcMar>
+              <w:top w:type="dxa" w:w="50"/>
+              <w:left w:type="dxa" w:w="70"/>
+              <w:bottom w:type="dxa" w:w="50"/>
+              <w:right w:type="dxa" w:w="70"/>
+            </w:tcMar>
+          </w:tcPr>
+          <w:p>
+            <w:pPr>
+              <w:jc w:val="right"/>
+            </w:pPr>
+            <w:r>
+              <w:rPr>
+                <w:rFonts w:ascii="Calibri" w:cs="Calibri" w:eastAsia="Calibri" w:hAnsi="Calibri"/>
+                <w:b w:val="false"/>
+                <w:bCs w:val="false"/>
+                <w:sz w:val="14"/>
+                <w:szCs w:val="14"/>
+              </w:rPr>
+              <w:t xml:space="preserve">$12,518,647</w:t>
+            </w:r>
+          </w:p>
+        </w:tc>
+        <w:tc>
+          <w:tcPr>
+            <w:tcW w:type="dxa" w:w="1500"/>
+            <w:tcMar>
+              <w:top w:type="dxa" w:w="50"/>
+              <w:left w:type="dxa" w:w="70"/>
+              <w:bottom w:type="dxa" w:w="50"/>
+              <w:right w:type="dxa" w:w="70"/>
+            </w:tcMar>
+          </w:tcPr>
+          <w:p>
+            <w:pPr>
+              <w:jc w:val="right"/>
+            </w:pPr>
+            <w:r>
+              <w:rPr>
+                <w:rFonts w:ascii="Calibri" w:cs="Calibri" w:eastAsia="Calibri" w:hAnsi="Calibri"/>
+                <w:b w:val="false"/>
+                <w:bCs w:val="false"/>
+                <w:sz w:val="14"/>
+                <w:szCs w:val="14"/>
+              </w:rPr>
+              <w:t xml:space="preserve">$11,974,209</w:t>
             </w:r>
           </w:p>
         </w:tc>
@@ -4988,7 +4988,7 @@
                 <w:sz w:val="14"/>
                 <w:szCs w:val="14"/>
               </w:rPr>
-              <w:t xml:space="preserve">$11,987,146</w:t>
+              <w:t xml:space="preserve">$11,974,209</w:t>
             </w:r>
           </w:p>
         </w:tc>
@@ -5016,7 +5016,7 @@
         <w:rPr>
           <w:rFonts w:ascii="Calibri" w:cs="Calibri" w:eastAsia="Calibri" w:hAnsi="Calibri"/>
         </w:rPr>
-        <w:t xml:space="preserve">Consumer model: five-year net $10,922,796, 110,681 buyers, 2.7% of the counted market after five years</w:t>
+        <w:t xml:space="preserve">Consumer model: five-year net $10,919,149, 110,681 buyers, 2.7% of the counted market after five years</w:t>
       </w:r>
     </w:p>
     <w:tbl>
@@ -5332,7 +5332,7 @@
                 <w:sz w:val="14"/>
                 <w:szCs w:val="14"/>
               </w:rPr>
-              <w:t xml:space="preserve">($194,027)</w:t>
+              <w:t xml:space="preserve">($194,492)</w:t>
             </w:r>
           </w:p>
         </w:tc>
@@ -5384,7 +5384,7 @@
                 <w:sz w:val="14"/>
                 <w:szCs w:val="14"/>
               </w:rPr>
-              <w:t xml:space="preserve">$268,733</w:t>
+              <w:t xml:space="preserve">$268,267</w:t>
             </w:r>
           </w:p>
         </w:tc>
@@ -5410,7 +5410,7 @@
                 <w:sz w:val="14"/>
                 <w:szCs w:val="14"/>
               </w:rPr>
-              <w:t xml:space="preserve">$268,733</w:t>
+              <w:t xml:space="preserve">$268,267</w:t>
             </w:r>
           </w:p>
         </w:tc>
@@ -5516,7 +5516,7 @@
                 <w:sz w:val="14"/>
                 <w:szCs w:val="14"/>
               </w:rPr>
-              <w:t xml:space="preserve">($466,915)</w:t>
+              <w:t xml:space="preserve">($469,355)</w:t>
             </w:r>
           </w:p>
         </w:tc>
@@ -5568,7 +5568,7 @@
                 <w:sz w:val="14"/>
                 <w:szCs w:val="14"/>
               </w:rPr>
-              <w:t xml:space="preserve">$810,593</w:t>
+              <w:t xml:space="preserve">$808,153</w:t>
             </w:r>
           </w:p>
         </w:tc>
@@ -5594,7 +5594,7 @@
                 <w:sz w:val="14"/>
                 <w:szCs w:val="14"/>
               </w:rPr>
-              <w:t xml:space="preserve">$1,079,326</w:t>
+              <w:t xml:space="preserve">$1,076,420</w:t>
             </w:r>
           </w:p>
         </w:tc>
@@ -5700,7 +5700,7 @@
                 <w:sz w:val="14"/>
                 <w:szCs w:val="14"/>
               </w:rPr>
-              <w:t xml:space="preserve">($931,160)</w:t>
+              <w:t xml:space="preserve">($933,542)</w:t>
             </w:r>
           </w:p>
         </w:tc>
@@ -5752,7 +5752,7 @@
                 <w:sz w:val="14"/>
                 <w:szCs w:val="14"/>
               </w:rPr>
-              <w:t xml:space="preserve">$1,804,815</w:t>
+              <w:t xml:space="preserve">$1,802,433</w:t>
             </w:r>
           </w:p>
         </w:tc>
@@ -5778,7 +5778,7 @@
                 <w:sz w:val="14"/>
                 <w:szCs w:val="14"/>
               </w:rPr>
-              <w:t xml:space="preserve">$2,884,141</w:t>
+              <w:t xml:space="preserve">$2,878,853</w:t>
             </w:r>
           </w:p>
         </w:tc>
@@ -5884,7 +5884,7 @@
                 <w:sz w:val="14"/>
                 <w:szCs w:val="14"/>
               </w:rPr>
-              <w:t xml:space="preserve">($1,538,659)</w:t>
+              <w:t xml:space="preserve">($1,539,496)</w:t>
             </w:r>
           </w:p>
         </w:tc>
@@ -5936,7 +5936,7 @@
                 <w:sz w:val="14"/>
                 <w:szCs w:val="14"/>
               </w:rPr>
-              <w:t xml:space="preserve">$3,188,610</w:t>
+              <w:t xml:space="preserve">$3,187,772</w:t>
             </w:r>
           </w:p>
         </w:tc>
@@ -5962,7 +5962,7 @@
                 <w:sz w:val="14"/>
                 <w:szCs w:val="14"/>
               </w:rPr>
-              <w:t xml:space="preserve">$6,072,751</w:t>
+              <w:t xml:space="preserve">$6,066,625</w:t>
             </w:r>
           </w:p>
         </w:tc>
@@ -6068,7 +6068,7 @@
                 <w:sz w:val="14"/>
                 <w:szCs w:val="14"/>
               </w:rPr>
-              <w:t xml:space="preserve">($2,230,376)</w:t>
+              <w:t xml:space="preserve">($2,227,897)</w:t>
             </w:r>
           </w:p>
         </w:tc>
@@ -6120,7 +6120,7 @@
                 <w:sz w:val="14"/>
                 <w:szCs w:val="14"/>
               </w:rPr>
-              <w:t xml:space="preserve">$4,850,045</w:t>
+              <w:t xml:space="preserve">$4,852,524</w:t>
             </w:r>
           </w:p>
         </w:tc>
@@ -6146,7 +6146,7 @@
                 <w:sz w:val="14"/>
                 <w:szCs w:val="14"/>
               </w:rPr>
-              <w:t xml:space="preserve">$10,922,796</w:t>
+              <w:t xml:space="preserve">$10,919,149</w:t>
             </w:r>
           </w:p>
         </w:tc>
@@ -6252,7 +6252,7 @@
                 <w:sz w:val="14"/>
                 <w:szCs w:val="14"/>
               </w:rPr>
-              <w:t xml:space="preserve">($5,361,137)</w:t>
+              <w:t xml:space="preserve">($5,364,782)</w:t>
             </w:r>
           </w:p>
         </w:tc>
@@ -6304,7 +6304,7 @@
                 <w:sz w:val="14"/>
                 <w:szCs w:val="14"/>
               </w:rPr>
-              <w:t xml:space="preserve">$10,922,796</w:t>
+              <w:t xml:space="preserve">$10,919,149</w:t>
             </w:r>
           </w:p>
         </w:tc>
@@ -6330,7 +6330,7 @@
                 <w:sz w:val="14"/>
                 <w:szCs w:val="14"/>
               </w:rPr>
-              <w:t xml:space="preserve">$10,922,796</w:t>
+              <w:t xml:space="preserve">$10,919,149</w:t>
             </w:r>
           </w:p>
         </w:tc>
@@ -6358,7 +6358,7 @@
         <w:rPr>
           <w:rFonts w:ascii="Calibri" w:cs="Calibri" w:eastAsia="Calibri" w:hAnsi="Calibri"/>
         </w:rPr>
-        <w:t xml:space="preserve">School district model (EZvoxa Pro seats): five-year net $839,176</w:t>
+        <w:t xml:space="preserve">School district model (EZvoxa Pro seats): five-year net $944,514</w:t>
       </w:r>
     </w:p>
     <w:tbl>
@@ -6622,111 +6622,111 @@
                 <w:sz w:val="14"/>
                 <w:szCs w:val="14"/>
               </w:rPr>
-              <w:t xml:space="preserve">131 seats (0.10% of market), 3 districts</w:t>
-            </w:r>
-          </w:p>
-        </w:tc>
-        <w:tc>
-          <w:tcPr>
-            <w:tcW w:type="dxa" w:w="1500"/>
-            <w:tcMar>
-              <w:top w:type="dxa" w:w="50"/>
-              <w:left w:type="dxa" w:w="70"/>
-              <w:bottom w:type="dxa" w:w="50"/>
-              <w:right w:type="dxa" w:w="70"/>
-            </w:tcMar>
-          </w:tcPr>
-          <w:p>
-            <w:pPr>
-              <w:jc w:val="right"/>
-            </w:pPr>
-            <w:r>
-              <w:rPr>
-                <w:rFonts w:ascii="Calibri" w:cs="Calibri" w:eastAsia="Calibri" w:hAnsi="Calibri"/>
-                <w:b w:val="false"/>
-                <w:bCs w:val="false"/>
-                <w:sz w:val="14"/>
-                <w:szCs w:val="14"/>
-              </w:rPr>
-              <w:t xml:space="preserve">$16,374</w:t>
-            </w:r>
-          </w:p>
-        </w:tc>
-        <w:tc>
-          <w:tcPr>
-            <w:tcW w:type="dxa" w:w="1500"/>
-            <w:tcMar>
-              <w:top w:type="dxa" w:w="50"/>
-              <w:left w:type="dxa" w:w="70"/>
-              <w:bottom w:type="dxa" w:w="50"/>
-              <w:right w:type="dxa" w:w="70"/>
-            </w:tcMar>
-          </w:tcPr>
-          <w:p>
-            <w:pPr>
-              <w:jc w:val="right"/>
-            </w:pPr>
-            <w:r>
-              <w:rPr>
-                <w:rFonts w:ascii="Calibri" w:cs="Calibri" w:eastAsia="Calibri" w:hAnsi="Calibri"/>
-                <w:b w:val="false"/>
-                <w:bCs w:val="false"/>
-                <w:sz w:val="14"/>
-                <w:szCs w:val="14"/>
-              </w:rPr>
-              <w:t xml:space="preserve">($3,404)</w:t>
-            </w:r>
-          </w:p>
-        </w:tc>
-        <w:tc>
-          <w:tcPr>
-            <w:tcW w:type="dxa" w:w="1500"/>
-            <w:tcMar>
-              <w:top w:type="dxa" w:w="50"/>
-              <w:left w:type="dxa" w:w="70"/>
-              <w:bottom w:type="dxa" w:w="50"/>
-              <w:right w:type="dxa" w:w="70"/>
-            </w:tcMar>
-          </w:tcPr>
-          <w:p>
-            <w:pPr>
-              <w:jc w:val="right"/>
-            </w:pPr>
-            <w:r>
-              <w:rPr>
-                <w:rFonts w:ascii="Calibri" w:cs="Calibri" w:eastAsia="Calibri" w:hAnsi="Calibri"/>
-                <w:b w:val="false"/>
-                <w:bCs w:val="false"/>
-                <w:sz w:val="14"/>
-                <w:szCs w:val="14"/>
-              </w:rPr>
-              <w:t xml:space="preserve">$14,736</w:t>
-            </w:r>
-          </w:p>
-        </w:tc>
-        <w:tc>
-          <w:tcPr>
-            <w:tcW w:type="dxa" w:w="1500"/>
-            <w:tcMar>
-              <w:top w:type="dxa" w:w="50"/>
-              <w:left w:type="dxa" w:w="70"/>
-              <w:bottom w:type="dxa" w:w="50"/>
-              <w:right w:type="dxa" w:w="70"/>
-            </w:tcMar>
-          </w:tcPr>
-          <w:p>
-            <w:pPr>
-              <w:jc w:val="right"/>
-            </w:pPr>
-            <w:r>
-              <w:rPr>
-                <w:rFonts w:ascii="Calibri" w:cs="Calibri" w:eastAsia="Calibri" w:hAnsi="Calibri"/>
-                <w:b w:val="false"/>
-                <w:bCs w:val="false"/>
-                <w:sz w:val="14"/>
-                <w:szCs w:val="14"/>
-              </w:rPr>
-              <w:t xml:space="preserve">$12,970</w:t>
+              <w:t xml:space="preserve">140 seats (0.11% of market), 4 districts</w:t>
+            </w:r>
+          </w:p>
+        </w:tc>
+        <w:tc>
+          <w:tcPr>
+            <w:tcW w:type="dxa" w:w="1500"/>
+            <w:tcMar>
+              <w:top w:type="dxa" w:w="50"/>
+              <w:left w:type="dxa" w:w="70"/>
+              <w:bottom w:type="dxa" w:w="50"/>
+              <w:right w:type="dxa" w:w="70"/>
+            </w:tcMar>
+          </w:tcPr>
+          <w:p>
+            <w:pPr>
+              <w:jc w:val="right"/>
+            </w:pPr>
+            <w:r>
+              <w:rPr>
+                <w:rFonts w:ascii="Calibri" w:cs="Calibri" w:eastAsia="Calibri" w:hAnsi="Calibri"/>
+                <w:b w:val="false"/>
+                <w:bCs w:val="false"/>
+                <w:sz w:val="14"/>
+                <w:szCs w:val="14"/>
+              </w:rPr>
+              <w:t xml:space="preserve">$17,499</w:t>
+            </w:r>
+          </w:p>
+        </w:tc>
+        <w:tc>
+          <w:tcPr>
+            <w:tcW w:type="dxa" w:w="1500"/>
+            <w:tcMar>
+              <w:top w:type="dxa" w:w="50"/>
+              <w:left w:type="dxa" w:w="70"/>
+              <w:bottom w:type="dxa" w:w="50"/>
+              <w:right w:type="dxa" w:w="70"/>
+            </w:tcMar>
+          </w:tcPr>
+          <w:p>
+            <w:pPr>
+              <w:jc w:val="right"/>
+            </w:pPr>
+            <w:r>
+              <w:rPr>
+                <w:rFonts w:ascii="Calibri" w:cs="Calibri" w:eastAsia="Calibri" w:hAnsi="Calibri"/>
+                <w:b w:val="false"/>
+                <w:bCs w:val="false"/>
+                <w:sz w:val="14"/>
+                <w:szCs w:val="14"/>
+              </w:rPr>
+              <w:t xml:space="preserve">($3,655)</w:t>
+            </w:r>
+          </w:p>
+        </w:tc>
+        <w:tc>
+          <w:tcPr>
+            <w:tcW w:type="dxa" w:w="1500"/>
+            <w:tcMar>
+              <w:top w:type="dxa" w:w="50"/>
+              <w:left w:type="dxa" w:w="70"/>
+              <w:bottom w:type="dxa" w:w="50"/>
+              <w:right w:type="dxa" w:w="70"/>
+            </w:tcMar>
+          </w:tcPr>
+          <w:p>
+            <w:pPr>
+              <w:jc w:val="right"/>
+            </w:pPr>
+            <w:r>
+              <w:rPr>
+                <w:rFonts w:ascii="Calibri" w:cs="Calibri" w:eastAsia="Calibri" w:hAnsi="Calibri"/>
+                <w:b w:val="false"/>
+                <w:bCs w:val="false"/>
+                <w:sz w:val="14"/>
+                <w:szCs w:val="14"/>
+              </w:rPr>
+              <w:t xml:space="preserve">$15,749</w:t>
+            </w:r>
+          </w:p>
+        </w:tc>
+        <w:tc>
+          <w:tcPr>
+            <w:tcW w:type="dxa" w:w="1500"/>
+            <w:tcMar>
+              <w:top w:type="dxa" w:w="50"/>
+              <w:left w:type="dxa" w:w="70"/>
+              <w:bottom w:type="dxa" w:w="50"/>
+              <w:right w:type="dxa" w:w="70"/>
+            </w:tcMar>
+          </w:tcPr>
+          <w:p>
+            <w:pPr>
+              <w:jc w:val="right"/>
+            </w:pPr>
+            <w:r>
+              <w:rPr>
+                <w:rFonts w:ascii="Calibri" w:cs="Calibri" w:eastAsia="Calibri" w:hAnsi="Calibri"/>
+                <w:b w:val="false"/>
+                <w:bCs w:val="false"/>
+                <w:sz w:val="14"/>
+                <w:szCs w:val="14"/>
+              </w:rPr>
+              <w:t xml:space="preserve">$13,843</w:t>
             </w:r>
           </w:p>
         </w:tc>
@@ -6752,7 +6752,7 @@
                 <w:sz w:val="14"/>
                 <w:szCs w:val="14"/>
               </w:rPr>
-              <w:t xml:space="preserve">$12,970</w:t>
+              <w:t xml:space="preserve">$13,843</w:t>
             </w:r>
           </w:p>
         </w:tc>
@@ -6806,111 +6806,111 @@
                 <w:sz w:val="14"/>
                 <w:szCs w:val="14"/>
               </w:rPr>
-              <w:t xml:space="preserve">523 seats (0.40% of market), 13 districts</w:t>
-            </w:r>
-          </w:p>
-        </w:tc>
-        <w:tc>
-          <w:tcPr>
-            <w:tcW w:type="dxa" w:w="1500"/>
-            <w:tcMar>
-              <w:top w:type="dxa" w:w="50"/>
-              <w:left w:type="dxa" w:w="70"/>
-              <w:bottom w:type="dxa" w:w="50"/>
-              <w:right w:type="dxa" w:w="70"/>
-            </w:tcMar>
-          </w:tcPr>
-          <w:p>
-            <w:pPr>
-              <w:jc w:val="right"/>
-            </w:pPr>
-            <w:r>
-              <w:rPr>
-                <w:rFonts w:ascii="Calibri" w:cs="Calibri" w:eastAsia="Calibri" w:hAnsi="Calibri"/>
-                <w:b w:val="false"/>
-                <w:bCs w:val="false"/>
-                <w:sz w:val="14"/>
-                <w:szCs w:val="14"/>
-              </w:rPr>
-              <w:t xml:space="preserve">$65,370</w:t>
-            </w:r>
-          </w:p>
-        </w:tc>
-        <w:tc>
-          <w:tcPr>
-            <w:tcW w:type="dxa" w:w="1500"/>
-            <w:tcMar>
-              <w:top w:type="dxa" w:w="50"/>
-              <w:left w:type="dxa" w:w="70"/>
-              <w:bottom w:type="dxa" w:w="50"/>
-              <w:right w:type="dxa" w:w="70"/>
-            </w:tcMar>
-          </w:tcPr>
-          <w:p>
-            <w:pPr>
-              <w:jc w:val="right"/>
-            </w:pPr>
-            <w:r>
-              <w:rPr>
-                <w:rFonts w:ascii="Calibri" w:cs="Calibri" w:eastAsia="Calibri" w:hAnsi="Calibri"/>
-                <w:b w:val="false"/>
-                <w:bCs w:val="false"/>
-                <w:sz w:val="14"/>
-                <w:szCs w:val="14"/>
-              </w:rPr>
-              <w:t xml:space="preserve">($10,449)</w:t>
-            </w:r>
-          </w:p>
-        </w:tc>
-        <w:tc>
-          <w:tcPr>
-            <w:tcW w:type="dxa" w:w="1500"/>
-            <w:tcMar>
-              <w:top w:type="dxa" w:w="50"/>
-              <w:left w:type="dxa" w:w="70"/>
-              <w:bottom w:type="dxa" w:w="50"/>
-              <w:right w:type="dxa" w:w="70"/>
-            </w:tcMar>
-          </w:tcPr>
-          <w:p>
-            <w:pPr>
-              <w:jc w:val="right"/>
-            </w:pPr>
-            <w:r>
-              <w:rPr>
-                <w:rFonts w:ascii="Calibri" w:cs="Calibri" w:eastAsia="Calibri" w:hAnsi="Calibri"/>
-                <w:b w:val="false"/>
-                <w:bCs w:val="false"/>
-                <w:sz w:val="14"/>
-                <w:szCs w:val="14"/>
-              </w:rPr>
-              <w:t xml:space="preserve">$58,833</w:t>
-            </w:r>
-          </w:p>
-        </w:tc>
-        <w:tc>
-          <w:tcPr>
-            <w:tcW w:type="dxa" w:w="1500"/>
-            <w:tcMar>
-              <w:top w:type="dxa" w:w="50"/>
-              <w:left w:type="dxa" w:w="70"/>
-              <w:bottom w:type="dxa" w:w="50"/>
-              <w:right w:type="dxa" w:w="70"/>
-            </w:tcMar>
-          </w:tcPr>
-          <w:p>
-            <w:pPr>
-              <w:jc w:val="right"/>
-            </w:pPr>
-            <w:r>
-              <w:rPr>
-                <w:rFonts w:ascii="Calibri" w:cs="Calibri" w:eastAsia="Calibri" w:hAnsi="Calibri"/>
-                <w:b w:val="false"/>
-                <w:bCs w:val="false"/>
-                <w:sz w:val="14"/>
-                <w:szCs w:val="14"/>
-              </w:rPr>
-              <w:t xml:space="preserve">$54,921</w:t>
+              <w:t xml:space="preserve">320 seats (0.24% of market), 8 districts</w:t>
+            </w:r>
+          </w:p>
+        </w:tc>
+        <w:tc>
+          <w:tcPr>
+            <w:tcW w:type="dxa" w:w="1500"/>
+            <w:tcMar>
+              <w:top w:type="dxa" w:w="50"/>
+              <w:left w:type="dxa" w:w="70"/>
+              <w:bottom w:type="dxa" w:w="50"/>
+              <w:right w:type="dxa" w:w="70"/>
+            </w:tcMar>
+          </w:tcPr>
+          <w:p>
+            <w:pPr>
+              <w:jc w:val="right"/>
+            </w:pPr>
+            <w:r>
+              <w:rPr>
+                <w:rFonts w:ascii="Calibri" w:cs="Calibri" w:eastAsia="Calibri" w:hAnsi="Calibri"/>
+                <w:b w:val="false"/>
+                <w:bCs w:val="false"/>
+                <w:sz w:val="14"/>
+                <w:szCs w:val="14"/>
+              </w:rPr>
+              <w:t xml:space="preserve">$39,997</w:t>
+            </w:r>
+          </w:p>
+        </w:tc>
+        <w:tc>
+          <w:tcPr>
+            <w:tcW w:type="dxa" w:w="1500"/>
+            <w:tcMar>
+              <w:top w:type="dxa" w:w="50"/>
+              <w:left w:type="dxa" w:w="70"/>
+              <w:bottom w:type="dxa" w:w="50"/>
+              <w:right w:type="dxa" w:w="70"/>
+            </w:tcMar>
+          </w:tcPr>
+          <w:p>
+            <w:pPr>
+              <w:jc w:val="right"/>
+            </w:pPr>
+            <w:r>
+              <w:rPr>
+                <w:rFonts w:ascii="Calibri" w:cs="Calibri" w:eastAsia="Calibri" w:hAnsi="Calibri"/>
+                <w:b w:val="false"/>
+                <w:bCs w:val="false"/>
+                <w:sz w:val="14"/>
+                <w:szCs w:val="14"/>
+              </w:rPr>
+              <w:t xml:space="preserve">($6,470)</w:t>
+            </w:r>
+          </w:p>
+        </w:tc>
+        <w:tc>
+          <w:tcPr>
+            <w:tcW w:type="dxa" w:w="1500"/>
+            <w:tcMar>
+              <w:top w:type="dxa" w:w="50"/>
+              <w:left w:type="dxa" w:w="70"/>
+              <w:bottom w:type="dxa" w:w="50"/>
+              <w:right w:type="dxa" w:w="70"/>
+            </w:tcMar>
+          </w:tcPr>
+          <w:p>
+            <w:pPr>
+              <w:jc w:val="right"/>
+            </w:pPr>
+            <w:r>
+              <w:rPr>
+                <w:rFonts w:ascii="Calibri" w:cs="Calibri" w:eastAsia="Calibri" w:hAnsi="Calibri"/>
+                <w:b w:val="false"/>
+                <w:bCs w:val="false"/>
+                <w:sz w:val="14"/>
+                <w:szCs w:val="14"/>
+              </w:rPr>
+              <w:t xml:space="preserve">$35,997</w:t>
+            </w:r>
+          </w:p>
+        </w:tc>
+        <w:tc>
+          <w:tcPr>
+            <w:tcW w:type="dxa" w:w="1500"/>
+            <w:tcMar>
+              <w:top w:type="dxa" w:w="50"/>
+              <w:left w:type="dxa" w:w="70"/>
+              <w:bottom w:type="dxa" w:w="50"/>
+              <w:right w:type="dxa" w:w="70"/>
+            </w:tcMar>
+          </w:tcPr>
+          <w:p>
+            <w:pPr>
+              <w:jc w:val="right"/>
+            </w:pPr>
+            <w:r>
+              <w:rPr>
+                <w:rFonts w:ascii="Calibri" w:cs="Calibri" w:eastAsia="Calibri" w:hAnsi="Calibri"/>
+                <w:b w:val="false"/>
+                <w:bCs w:val="false"/>
+                <w:sz w:val="14"/>
+                <w:szCs w:val="14"/>
+              </w:rPr>
+              <w:t xml:space="preserve">$33,527</w:t>
             </w:r>
           </w:p>
         </w:tc>
@@ -6936,7 +6936,7 @@
                 <w:sz w:val="14"/>
                 <w:szCs w:val="14"/>
               </w:rPr>
-              <w:t xml:space="preserve">$67,891</w:t>
+              <w:t xml:space="preserve">$47,370</w:t>
             </w:r>
           </w:p>
         </w:tc>
@@ -6990,111 +6990,111 @@
                 <w:sz w:val="14"/>
                 <w:szCs w:val="14"/>
               </w:rPr>
-              <w:t xml:space="preserve">1,308 seats (1.00% of market), 33 districts</w:t>
-            </w:r>
-          </w:p>
-        </w:tc>
-        <w:tc>
-          <w:tcPr>
-            <w:tcW w:type="dxa" w:w="1500"/>
-            <w:tcMar>
-              <w:top w:type="dxa" w:w="50"/>
-              <w:left w:type="dxa" w:w="70"/>
-              <w:bottom w:type="dxa" w:w="50"/>
-              <w:right w:type="dxa" w:w="70"/>
-            </w:tcMar>
-          </w:tcPr>
-          <w:p>
-            <w:pPr>
-              <w:jc w:val="right"/>
-            </w:pPr>
-            <w:r>
-              <w:rPr>
-                <w:rFonts w:ascii="Calibri" w:cs="Calibri" w:eastAsia="Calibri" w:hAnsi="Calibri"/>
-                <w:b w:val="false"/>
-                <w:bCs w:val="false"/>
-                <w:sz w:val="14"/>
-                <w:szCs w:val="14"/>
-              </w:rPr>
-              <w:t xml:space="preserve">$163,487</w:t>
-            </w:r>
-          </w:p>
-        </w:tc>
-        <w:tc>
-          <w:tcPr>
-            <w:tcW w:type="dxa" w:w="1500"/>
-            <w:tcMar>
-              <w:top w:type="dxa" w:w="50"/>
-              <w:left w:type="dxa" w:w="70"/>
-              <w:bottom w:type="dxa" w:w="50"/>
-              <w:right w:type="dxa" w:w="70"/>
-            </w:tcMar>
-          </w:tcPr>
-          <w:p>
-            <w:pPr>
-              <w:jc w:val="right"/>
-            </w:pPr>
-            <w:r>
-              <w:rPr>
-                <w:rFonts w:ascii="Calibri" w:cs="Calibri" w:eastAsia="Calibri" w:hAnsi="Calibri"/>
-                <w:b w:val="false"/>
-                <w:bCs w:val="false"/>
-                <w:sz w:val="14"/>
-                <w:szCs w:val="14"/>
-              </w:rPr>
-              <w:t xml:space="preserve">($22,619)</w:t>
-            </w:r>
-          </w:p>
-        </w:tc>
-        <w:tc>
-          <w:tcPr>
-            <w:tcW w:type="dxa" w:w="1500"/>
-            <w:tcMar>
-              <w:top w:type="dxa" w:w="50"/>
-              <w:left w:type="dxa" w:w="70"/>
-              <w:bottom w:type="dxa" w:w="50"/>
-              <w:right w:type="dxa" w:w="70"/>
-            </w:tcMar>
-          </w:tcPr>
-          <w:p>
-            <w:pPr>
-              <w:jc w:val="right"/>
-            </w:pPr>
-            <w:r>
-              <w:rPr>
-                <w:rFonts w:ascii="Calibri" w:cs="Calibri" w:eastAsia="Calibri" w:hAnsi="Calibri"/>
-                <w:b w:val="false"/>
-                <w:bCs w:val="false"/>
-                <w:sz w:val="14"/>
-                <w:szCs w:val="14"/>
-              </w:rPr>
-              <w:t xml:space="preserve">$147,138</w:t>
-            </w:r>
-          </w:p>
-        </w:tc>
-        <w:tc>
-          <w:tcPr>
-            <w:tcW w:type="dxa" w:w="1500"/>
-            <w:tcMar>
-              <w:top w:type="dxa" w:w="50"/>
-              <w:left w:type="dxa" w:w="70"/>
-              <w:bottom w:type="dxa" w:w="50"/>
-              <w:right w:type="dxa" w:w="70"/>
-            </w:tcMar>
-          </w:tcPr>
-          <w:p>
-            <w:pPr>
-              <w:jc w:val="right"/>
-            </w:pPr>
-            <w:r>
-              <w:rPr>
-                <w:rFonts w:ascii="Calibri" w:cs="Calibri" w:eastAsia="Calibri" w:hAnsi="Calibri"/>
-                <w:b w:val="false"/>
-                <w:bCs w:val="false"/>
-                <w:sz w:val="14"/>
-                <w:szCs w:val="14"/>
-              </w:rPr>
-              <w:t xml:space="preserve">$140,868</w:t>
+              <w:t xml:space="preserve">1,000 seats (0.77% of market), 25 districts</w:t>
+            </w:r>
+          </w:p>
+        </w:tc>
+        <w:tc>
+          <w:tcPr>
+            <w:tcW w:type="dxa" w:w="1500"/>
+            <w:tcMar>
+              <w:top w:type="dxa" w:w="50"/>
+              <w:left w:type="dxa" w:w="70"/>
+              <w:bottom w:type="dxa" w:w="50"/>
+              <w:right w:type="dxa" w:w="70"/>
+            </w:tcMar>
+          </w:tcPr>
+          <w:p>
+            <w:pPr>
+              <w:jc w:val="right"/>
+            </w:pPr>
+            <w:r>
+              <w:rPr>
+                <w:rFonts w:ascii="Calibri" w:cs="Calibri" w:eastAsia="Calibri" w:hAnsi="Calibri"/>
+                <w:b w:val="false"/>
+                <w:bCs w:val="false"/>
+                <w:sz w:val="14"/>
+                <w:szCs w:val="14"/>
+              </w:rPr>
+              <w:t xml:space="preserve">$124,990</w:t>
+            </w:r>
+          </w:p>
+        </w:tc>
+        <w:tc>
+          <w:tcPr>
+            <w:tcW w:type="dxa" w:w="1500"/>
+            <w:tcMar>
+              <w:top w:type="dxa" w:w="50"/>
+              <w:left w:type="dxa" w:w="70"/>
+              <w:bottom w:type="dxa" w:w="50"/>
+              <w:right w:type="dxa" w:w="70"/>
+            </w:tcMar>
+          </w:tcPr>
+          <w:p>
+            <w:pPr>
+              <w:jc w:val="right"/>
+            </w:pPr>
+            <w:r>
+              <w:rPr>
+                <w:rFonts w:ascii="Calibri" w:cs="Calibri" w:eastAsia="Calibri" w:hAnsi="Calibri"/>
+                <w:b w:val="false"/>
+                <w:bCs w:val="false"/>
+                <w:sz w:val="14"/>
+                <w:szCs w:val="14"/>
+              </w:rPr>
+              <w:t xml:space="preserve">($17,402)</w:t>
+            </w:r>
+          </w:p>
+        </w:tc>
+        <w:tc>
+          <w:tcPr>
+            <w:tcW w:type="dxa" w:w="1500"/>
+            <w:tcMar>
+              <w:top w:type="dxa" w:w="50"/>
+              <w:left w:type="dxa" w:w="70"/>
+              <w:bottom w:type="dxa" w:w="50"/>
+              <w:right w:type="dxa" w:w="70"/>
+            </w:tcMar>
+          </w:tcPr>
+          <w:p>
+            <w:pPr>
+              <w:jc w:val="right"/>
+            </w:pPr>
+            <w:r>
+              <w:rPr>
+                <w:rFonts w:ascii="Calibri" w:cs="Calibri" w:eastAsia="Calibri" w:hAnsi="Calibri"/>
+                <w:b w:val="false"/>
+                <w:bCs w:val="false"/>
+                <w:sz w:val="14"/>
+                <w:szCs w:val="14"/>
+              </w:rPr>
+              <w:t xml:space="preserve">$112,491</w:t>
+            </w:r>
+          </w:p>
+        </w:tc>
+        <w:tc>
+          <w:tcPr>
+            <w:tcW w:type="dxa" w:w="1500"/>
+            <w:tcMar>
+              <w:top w:type="dxa" w:w="50"/>
+              <w:left w:type="dxa" w:w="70"/>
+              <w:bottom w:type="dxa" w:w="50"/>
+              <w:right w:type="dxa" w:w="70"/>
+            </w:tcMar>
+          </w:tcPr>
+          <w:p>
+            <w:pPr>
+              <w:jc w:val="right"/>
+            </w:pPr>
+            <w:r>
+              <w:rPr>
+                <w:rFonts w:ascii="Calibri" w:cs="Calibri" w:eastAsia="Calibri" w:hAnsi="Calibri"/>
+                <w:b w:val="false"/>
+                <w:bCs w:val="false"/>
+                <w:sz w:val="14"/>
+                <w:szCs w:val="14"/>
+              </w:rPr>
+              <w:t xml:space="preserve">$107,588</w:t>
             </w:r>
           </w:p>
         </w:tc>
@@ -7120,7 +7120,7 @@
                 <w:sz w:val="14"/>
                 <w:szCs w:val="14"/>
               </w:rPr>
-              <w:t xml:space="preserve">$208,759</w:t>
+              <w:t xml:space="preserve">$154,958</w:t>
             </w:r>
           </w:p>
         </w:tc>
@@ -7174,111 +7174,111 @@
                 <w:sz w:val="14"/>
                 <w:szCs w:val="14"/>
               </w:rPr>
-              <w:t xml:space="preserve">2,354 seats (1.80% of market), 59 districts</w:t>
-            </w:r>
-          </w:p>
-        </w:tc>
-        <w:tc>
-          <w:tcPr>
-            <w:tcW w:type="dxa" w:w="1500"/>
-            <w:tcMar>
-              <w:top w:type="dxa" w:w="50"/>
-              <w:left w:type="dxa" w:w="70"/>
-              <w:bottom w:type="dxa" w:w="50"/>
-              <w:right w:type="dxa" w:w="70"/>
-            </w:tcMar>
-          </w:tcPr>
-          <w:p>
-            <w:pPr>
-              <w:jc w:val="right"/>
-            </w:pPr>
-            <w:r>
-              <w:rPr>
-                <w:rFonts w:ascii="Calibri" w:cs="Calibri" w:eastAsia="Calibri" w:hAnsi="Calibri"/>
-                <w:b w:val="false"/>
-                <w:bCs w:val="false"/>
-                <w:sz w:val="14"/>
-                <w:szCs w:val="14"/>
-              </w:rPr>
-              <w:t xml:space="preserve">$294,226</w:t>
-            </w:r>
-          </w:p>
-        </w:tc>
-        <w:tc>
-          <w:tcPr>
-            <w:tcW w:type="dxa" w:w="1500"/>
-            <w:tcMar>
-              <w:top w:type="dxa" w:w="50"/>
-              <w:left w:type="dxa" w:w="70"/>
-              <w:bottom w:type="dxa" w:w="50"/>
-              <w:right w:type="dxa" w:w="70"/>
-            </w:tcMar>
-          </w:tcPr>
-          <w:p>
-            <w:pPr>
-              <w:jc w:val="right"/>
-            </w:pPr>
-            <w:r>
-              <w:rPr>
-                <w:rFonts w:ascii="Calibri" w:cs="Calibri" w:eastAsia="Calibri" w:hAnsi="Calibri"/>
-                <w:b w:val="false"/>
-                <w:bCs w:val="false"/>
-                <w:sz w:val="14"/>
-                <w:szCs w:val="14"/>
-              </w:rPr>
-              <w:t xml:space="preserve">($37,460)</w:t>
-            </w:r>
-          </w:p>
-        </w:tc>
-        <w:tc>
-          <w:tcPr>
-            <w:tcW w:type="dxa" w:w="1500"/>
-            <w:tcMar>
-              <w:top w:type="dxa" w:w="50"/>
-              <w:left w:type="dxa" w:w="70"/>
-              <w:bottom w:type="dxa" w:w="50"/>
-              <w:right w:type="dxa" w:w="70"/>
-            </w:tcMar>
-          </w:tcPr>
-          <w:p>
-            <w:pPr>
-              <w:jc w:val="right"/>
-            </w:pPr>
-            <w:r>
-              <w:rPr>
-                <w:rFonts w:ascii="Calibri" w:cs="Calibri" w:eastAsia="Calibri" w:hAnsi="Calibri"/>
-                <w:b w:val="false"/>
-                <w:bCs w:val="false"/>
-                <w:sz w:val="14"/>
-                <w:szCs w:val="14"/>
-              </w:rPr>
-              <w:t xml:space="preserve">$264,804</w:t>
-            </w:r>
-          </w:p>
-        </w:tc>
-        <w:tc>
-          <w:tcPr>
-            <w:tcW w:type="dxa" w:w="1500"/>
-            <w:tcMar>
-              <w:top w:type="dxa" w:w="50"/>
-              <w:left w:type="dxa" w:w="70"/>
-              <w:bottom w:type="dxa" w:w="50"/>
-              <w:right w:type="dxa" w:w="70"/>
-            </w:tcMar>
-          </w:tcPr>
-          <w:p>
-            <w:pPr>
-              <w:jc w:val="right"/>
-            </w:pPr>
-            <w:r>
-              <w:rPr>
-                <w:rFonts w:ascii="Calibri" w:cs="Calibri" w:eastAsia="Calibri" w:hAnsi="Calibri"/>
-                <w:b w:val="false"/>
-                <w:bCs w:val="false"/>
-                <w:sz w:val="14"/>
-                <w:szCs w:val="14"/>
-              </w:rPr>
-              <w:t xml:space="preserve">$256,767</w:t>
+              <w:t xml:space="preserve">2,401 seats (1.84% of market), 60 districts</w:t>
+            </w:r>
+          </w:p>
+        </w:tc>
+        <w:tc>
+          <w:tcPr>
+            <w:tcW w:type="dxa" w:w="1500"/>
+            <w:tcMar>
+              <w:top w:type="dxa" w:w="50"/>
+              <w:left w:type="dxa" w:w="70"/>
+              <w:bottom w:type="dxa" w:w="50"/>
+              <w:right w:type="dxa" w:w="70"/>
+            </w:tcMar>
+          </w:tcPr>
+          <w:p>
+            <w:pPr>
+              <w:jc w:val="right"/>
+            </w:pPr>
+            <w:r>
+              <w:rPr>
+                <w:rFonts w:ascii="Calibri" w:cs="Calibri" w:eastAsia="Calibri" w:hAnsi="Calibri"/>
+                <w:b w:val="false"/>
+                <w:bCs w:val="false"/>
+                <w:sz w:val="14"/>
+                <w:szCs w:val="14"/>
+              </w:rPr>
+              <w:t xml:space="preserve">$300,101</w:t>
+            </w:r>
+          </w:p>
+        </w:tc>
+        <w:tc>
+          <w:tcPr>
+            <w:tcW w:type="dxa" w:w="1500"/>
+            <w:tcMar>
+              <w:top w:type="dxa" w:w="50"/>
+              <w:left w:type="dxa" w:w="70"/>
+              <w:bottom w:type="dxa" w:w="50"/>
+              <w:right w:type="dxa" w:w="70"/>
+            </w:tcMar>
+          </w:tcPr>
+          <w:p>
+            <w:pPr>
+              <w:jc w:val="right"/>
+            </w:pPr>
+            <w:r>
+              <w:rPr>
+                <w:rFonts w:ascii="Calibri" w:cs="Calibri" w:eastAsia="Calibri" w:hAnsi="Calibri"/>
+                <w:b w:val="false"/>
+                <w:bCs w:val="false"/>
+                <w:sz w:val="14"/>
+                <w:szCs w:val="14"/>
+              </w:rPr>
+              <w:t xml:space="preserve">($38,261)</w:t>
+            </w:r>
+          </w:p>
+        </w:tc>
+        <w:tc>
+          <w:tcPr>
+            <w:tcW w:type="dxa" w:w="1500"/>
+            <w:tcMar>
+              <w:top w:type="dxa" w:w="50"/>
+              <w:left w:type="dxa" w:w="70"/>
+              <w:bottom w:type="dxa" w:w="50"/>
+              <w:right w:type="dxa" w:w="70"/>
+            </w:tcMar>
+          </w:tcPr>
+          <w:p>
+            <w:pPr>
+              <w:jc w:val="right"/>
+            </w:pPr>
+            <w:r>
+              <w:rPr>
+                <w:rFonts w:ascii="Calibri" w:cs="Calibri" w:eastAsia="Calibri" w:hAnsi="Calibri"/>
+                <w:b w:val="false"/>
+                <w:bCs w:val="false"/>
+                <w:sz w:val="14"/>
+                <w:szCs w:val="14"/>
+              </w:rPr>
+              <w:t xml:space="preserve">$270,091</w:t>
+            </w:r>
+          </w:p>
+        </w:tc>
+        <w:tc>
+          <w:tcPr>
+            <w:tcW w:type="dxa" w:w="1500"/>
+            <w:tcMar>
+              <w:top w:type="dxa" w:w="50"/>
+              <w:left w:type="dxa" w:w="70"/>
+              <w:bottom w:type="dxa" w:w="50"/>
+              <w:right w:type="dxa" w:w="70"/>
+            </w:tcMar>
+          </w:tcPr>
+          <w:p>
+            <w:pPr>
+              <w:jc w:val="right"/>
+            </w:pPr>
+            <w:r>
+              <w:rPr>
+                <w:rFonts w:ascii="Calibri" w:cs="Calibri" w:eastAsia="Calibri" w:hAnsi="Calibri"/>
+                <w:b w:val="false"/>
+                <w:bCs w:val="false"/>
+                <w:sz w:val="14"/>
+                <w:szCs w:val="14"/>
+              </w:rPr>
+              <w:t xml:space="preserve">$261,840</w:t>
             </w:r>
           </w:p>
         </w:tc>
@@ -7304,7 +7304,7 @@
                 <w:sz w:val="14"/>
                 <w:szCs w:val="14"/>
               </w:rPr>
-              <w:t xml:space="preserve">$465,526</w:t>
+              <w:t xml:space="preserve">$416,798</w:t>
             </w:r>
           </w:p>
         </w:tc>
@@ -7358,111 +7358,111 @@
                 <w:sz w:val="14"/>
                 <w:szCs w:val="14"/>
               </w:rPr>
-              <w:t xml:space="preserve">3,400 seats (2.60% of market), 85 districts</w:t>
-            </w:r>
-          </w:p>
-        </w:tc>
-        <w:tc>
-          <w:tcPr>
-            <w:tcW w:type="dxa" w:w="1500"/>
-            <w:tcMar>
-              <w:top w:type="dxa" w:w="50"/>
-              <w:left w:type="dxa" w:w="70"/>
-              <w:bottom w:type="dxa" w:w="50"/>
-              <w:right w:type="dxa" w:w="70"/>
-            </w:tcMar>
-          </w:tcPr>
-          <w:p>
-            <w:pPr>
-              <w:jc w:val="right"/>
-            </w:pPr>
-            <w:r>
-              <w:rPr>
-                <w:rFonts w:ascii="Calibri" w:cs="Calibri" w:eastAsia="Calibri" w:hAnsi="Calibri"/>
-                <w:b w:val="false"/>
-                <w:bCs w:val="false"/>
-                <w:sz w:val="14"/>
-                <w:szCs w:val="14"/>
-              </w:rPr>
-              <w:t xml:space="preserve">$424,966</w:t>
-            </w:r>
-          </w:p>
-        </w:tc>
-        <w:tc>
-          <w:tcPr>
-            <w:tcW w:type="dxa" w:w="1500"/>
-            <w:tcMar>
-              <w:top w:type="dxa" w:w="50"/>
-              <w:left w:type="dxa" w:w="70"/>
-              <w:bottom w:type="dxa" w:w="50"/>
-              <w:right w:type="dxa" w:w="70"/>
-            </w:tcMar>
-          </w:tcPr>
-          <w:p>
-            <w:pPr>
-              <w:jc w:val="right"/>
-            </w:pPr>
-            <w:r>
-              <w:rPr>
-                <w:rFonts w:ascii="Calibri" w:cs="Calibri" w:eastAsia="Calibri" w:hAnsi="Calibri"/>
-                <w:b w:val="false"/>
-                <w:bCs w:val="false"/>
-                <w:sz w:val="14"/>
-                <w:szCs w:val="14"/>
-              </w:rPr>
-              <w:t xml:space="preserve">($51,316)</w:t>
-            </w:r>
-          </w:p>
-        </w:tc>
-        <w:tc>
-          <w:tcPr>
-            <w:tcW w:type="dxa" w:w="1500"/>
-            <w:tcMar>
-              <w:top w:type="dxa" w:w="50"/>
-              <w:left w:type="dxa" w:w="70"/>
-              <w:bottom w:type="dxa" w:w="50"/>
-              <w:right w:type="dxa" w:w="70"/>
-            </w:tcMar>
-          </w:tcPr>
-          <w:p>
-            <w:pPr>
-              <w:jc w:val="right"/>
-            </w:pPr>
-            <w:r>
-              <w:rPr>
-                <w:rFonts w:ascii="Calibri" w:cs="Calibri" w:eastAsia="Calibri" w:hAnsi="Calibri"/>
-                <w:b w:val="false"/>
-                <w:bCs w:val="false"/>
-                <w:sz w:val="14"/>
-                <w:szCs w:val="14"/>
-              </w:rPr>
-              <w:t xml:space="preserve">$382,469</w:t>
-            </w:r>
-          </w:p>
-        </w:tc>
-        <w:tc>
-          <w:tcPr>
-            <w:tcW w:type="dxa" w:w="1500"/>
-            <w:tcMar>
-              <w:top w:type="dxa" w:w="50"/>
-              <w:left w:type="dxa" w:w="70"/>
-              <w:bottom w:type="dxa" w:w="50"/>
-              <w:right w:type="dxa" w:w="70"/>
-            </w:tcMar>
-          </w:tcPr>
-          <w:p>
-            <w:pPr>
-              <w:jc w:val="right"/>
-            </w:pPr>
-            <w:r>
-              <w:rPr>
-                <w:rFonts w:ascii="Calibri" w:cs="Calibri" w:eastAsia="Calibri" w:hAnsi="Calibri"/>
-                <w:b w:val="false"/>
-                <w:bCs w:val="false"/>
-                <w:sz w:val="14"/>
-                <w:szCs w:val="14"/>
-              </w:rPr>
-              <w:t xml:space="preserve">$373,650</w:t>
+              <w:t xml:space="preserve">4,800 seats (3.67% of market), 120 districts</w:t>
+            </w:r>
+          </w:p>
+        </w:tc>
+        <w:tc>
+          <w:tcPr>
+            <w:tcW w:type="dxa" w:w="1500"/>
+            <w:tcMar>
+              <w:top w:type="dxa" w:w="50"/>
+              <w:left w:type="dxa" w:w="70"/>
+              <w:bottom w:type="dxa" w:w="50"/>
+              <w:right w:type="dxa" w:w="70"/>
+            </w:tcMar>
+          </w:tcPr>
+          <w:p>
+            <w:pPr>
+              <w:jc w:val="right"/>
+            </w:pPr>
+            <w:r>
+              <w:rPr>
+                <w:rFonts w:ascii="Calibri" w:cs="Calibri" w:eastAsia="Calibri" w:hAnsi="Calibri"/>
+                <w:b w:val="false"/>
+                <w:bCs w:val="false"/>
+                <w:sz w:val="14"/>
+                <w:szCs w:val="14"/>
+              </w:rPr>
+              <w:t xml:space="preserve">$599,952</w:t>
+            </w:r>
+          </w:p>
+        </w:tc>
+        <w:tc>
+          <w:tcPr>
+            <w:tcW w:type="dxa" w:w="1500"/>
+            <w:tcMar>
+              <w:top w:type="dxa" w:w="50"/>
+              <w:left w:type="dxa" w:w="70"/>
+              <w:bottom w:type="dxa" w:w="50"/>
+              <w:right w:type="dxa" w:w="70"/>
+            </w:tcMar>
+          </w:tcPr>
+          <w:p>
+            <w:pPr>
+              <w:jc w:val="right"/>
+            </w:pPr>
+            <w:r>
+              <w:rPr>
+                <w:rFonts w:ascii="Calibri" w:cs="Calibri" w:eastAsia="Calibri" w:hAnsi="Calibri"/>
+                <w:b w:val="false"/>
+                <w:bCs w:val="false"/>
+                <w:sz w:val="14"/>
+                <w:szCs w:val="14"/>
+              </w:rPr>
+              <w:t xml:space="preserve">($72,236)</w:t>
+            </w:r>
+          </w:p>
+        </w:tc>
+        <w:tc>
+          <w:tcPr>
+            <w:tcW w:type="dxa" w:w="1500"/>
+            <w:tcMar>
+              <w:top w:type="dxa" w:w="50"/>
+              <w:left w:type="dxa" w:w="70"/>
+              <w:bottom w:type="dxa" w:w="50"/>
+              <w:right w:type="dxa" w:w="70"/>
+            </w:tcMar>
+          </w:tcPr>
+          <w:p>
+            <w:pPr>
+              <w:jc w:val="right"/>
+            </w:pPr>
+            <w:r>
+              <w:rPr>
+                <w:rFonts w:ascii="Calibri" w:cs="Calibri" w:eastAsia="Calibri" w:hAnsi="Calibri"/>
+                <w:b w:val="false"/>
+                <w:bCs w:val="false"/>
+                <w:sz w:val="14"/>
+                <w:szCs w:val="14"/>
+              </w:rPr>
+              <w:t xml:space="preserve">$539,957</w:t>
+            </w:r>
+          </w:p>
+        </w:tc>
+        <w:tc>
+          <w:tcPr>
+            <w:tcW w:type="dxa" w:w="1500"/>
+            <w:tcMar>
+              <w:top w:type="dxa" w:w="50"/>
+              <w:left w:type="dxa" w:w="70"/>
+              <w:bottom w:type="dxa" w:w="50"/>
+              <w:right w:type="dxa" w:w="70"/>
+            </w:tcMar>
+          </w:tcPr>
+          <w:p>
+            <w:pPr>
+              <w:jc w:val="right"/>
+            </w:pPr>
+            <w:r>
+              <w:rPr>
+                <w:rFonts w:ascii="Calibri" w:cs="Calibri" w:eastAsia="Calibri" w:hAnsi="Calibri"/>
+                <w:b w:val="false"/>
+                <w:bCs w:val="false"/>
+                <w:sz w:val="14"/>
+                <w:szCs w:val="14"/>
+              </w:rPr>
+              <w:t xml:space="preserve">$527,716</w:t>
             </w:r>
           </w:p>
         </w:tc>
@@ -7488,7 +7488,7 @@
                 <w:sz w:val="14"/>
                 <w:szCs w:val="14"/>
               </w:rPr>
-              <w:t xml:space="preserve">$839,176</w:t>
+              <w:t xml:space="preserve">$944,514</w:t>
             </w:r>
           </w:p>
         </w:tc>
@@ -7568,85 +7568,85 @@
                 <w:sz w:val="14"/>
                 <w:szCs w:val="14"/>
               </w:rPr>
-              <w:t xml:space="preserve">$964,423</w:t>
-            </w:r>
-          </w:p>
-        </w:tc>
-        <w:tc>
-          <w:tcPr>
-            <w:tcW w:type="dxa" w:w="1500"/>
-            <w:tcMar>
-              <w:top w:type="dxa" w:w="50"/>
-              <w:left w:type="dxa" w:w="70"/>
-              <w:bottom w:type="dxa" w:w="50"/>
-              <w:right w:type="dxa" w:w="70"/>
-            </w:tcMar>
-          </w:tcPr>
-          <w:p>
-            <w:pPr>
-              <w:jc w:val="right"/>
-            </w:pPr>
-            <w:r>
-              <w:rPr>
-                <w:rFonts w:ascii="Calibri" w:cs="Calibri" w:eastAsia="Calibri" w:hAnsi="Calibri"/>
-                <w:b w:val="false"/>
-                <w:bCs w:val="false"/>
-                <w:sz w:val="14"/>
-                <w:szCs w:val="14"/>
-              </w:rPr>
-              <w:t xml:space="preserve">($125,248)</w:t>
-            </w:r>
-          </w:p>
-        </w:tc>
-        <w:tc>
-          <w:tcPr>
-            <w:tcW w:type="dxa" w:w="1500"/>
-            <w:tcMar>
-              <w:top w:type="dxa" w:w="50"/>
-              <w:left w:type="dxa" w:w="70"/>
-              <w:bottom w:type="dxa" w:w="50"/>
-              <w:right w:type="dxa" w:w="70"/>
-            </w:tcMar>
-          </w:tcPr>
-          <w:p>
-            <w:pPr>
-              <w:jc w:val="right"/>
-            </w:pPr>
-            <w:r>
-              <w:rPr>
-                <w:rFonts w:ascii="Calibri" w:cs="Calibri" w:eastAsia="Calibri" w:hAnsi="Calibri"/>
-                <w:b w:val="false"/>
-                <w:bCs w:val="false"/>
-                <w:sz w:val="14"/>
-                <w:szCs w:val="14"/>
-              </w:rPr>
-              <w:t xml:space="preserve">$867,980</w:t>
-            </w:r>
-          </w:p>
-        </w:tc>
-        <w:tc>
-          <w:tcPr>
-            <w:tcW w:type="dxa" w:w="1500"/>
-            <w:tcMar>
-              <w:top w:type="dxa" w:w="50"/>
-              <w:left w:type="dxa" w:w="70"/>
-              <w:bottom w:type="dxa" w:w="50"/>
-              <w:right w:type="dxa" w:w="70"/>
-            </w:tcMar>
-          </w:tcPr>
-          <w:p>
-            <w:pPr>
-              <w:jc w:val="right"/>
-            </w:pPr>
-            <w:r>
-              <w:rPr>
-                <w:rFonts w:ascii="Calibri" w:cs="Calibri" w:eastAsia="Calibri" w:hAnsi="Calibri"/>
-                <w:b w:val="false"/>
-                <w:bCs w:val="false"/>
-                <w:sz w:val="14"/>
-                <w:szCs w:val="14"/>
-              </w:rPr>
-              <w:t xml:space="preserve">$839,176</w:t>
+              <w:t xml:space="preserve">$1,082,539</w:t>
+            </w:r>
+          </w:p>
+        </w:tc>
+        <w:tc>
+          <w:tcPr>
+            <w:tcW w:type="dxa" w:w="1500"/>
+            <w:tcMar>
+              <w:top w:type="dxa" w:w="50"/>
+              <w:left w:type="dxa" w:w="70"/>
+              <w:bottom w:type="dxa" w:w="50"/>
+              <w:right w:type="dxa" w:w="70"/>
+            </w:tcMar>
+          </w:tcPr>
+          <w:p>
+            <w:pPr>
+              <w:jc w:val="right"/>
+            </w:pPr>
+            <w:r>
+              <w:rPr>
+                <w:rFonts w:ascii="Calibri" w:cs="Calibri" w:eastAsia="Calibri" w:hAnsi="Calibri"/>
+                <w:b w:val="false"/>
+                <w:bCs w:val="false"/>
+                <w:sz w:val="14"/>
+                <w:szCs w:val="14"/>
+              </w:rPr>
+              <w:t xml:space="preserve">($138,024)</w:t>
+            </w:r>
+          </w:p>
+        </w:tc>
+        <w:tc>
+          <w:tcPr>
+            <w:tcW w:type="dxa" w:w="1500"/>
+            <w:tcMar>
+              <w:top w:type="dxa" w:w="50"/>
+              <w:left w:type="dxa" w:w="70"/>
+              <w:bottom w:type="dxa" w:w="50"/>
+              <w:right w:type="dxa" w:w="70"/>
+            </w:tcMar>
+          </w:tcPr>
+          <w:p>
+            <w:pPr>
+              <w:jc w:val="right"/>
+            </w:pPr>
+            <w:r>
+              <w:rPr>
+                <w:rFonts w:ascii="Calibri" w:cs="Calibri" w:eastAsia="Calibri" w:hAnsi="Calibri"/>
+                <w:b w:val="false"/>
+                <w:bCs w:val="false"/>
+                <w:sz w:val="14"/>
+                <w:szCs w:val="14"/>
+              </w:rPr>
+              <w:t xml:space="preserve">$974,285</w:t>
+            </w:r>
+          </w:p>
+        </w:tc>
+        <w:tc>
+          <w:tcPr>
+            <w:tcW w:type="dxa" w:w="1500"/>
+            <w:tcMar>
+              <w:top w:type="dxa" w:w="50"/>
+              <w:left w:type="dxa" w:w="70"/>
+              <w:bottom w:type="dxa" w:w="50"/>
+              <w:right w:type="dxa" w:w="70"/>
+            </w:tcMar>
+          </w:tcPr>
+          <w:p>
+            <w:pPr>
+              <w:jc w:val="right"/>
+            </w:pPr>
+            <w:r>
+              <w:rPr>
+                <w:rFonts w:ascii="Calibri" w:cs="Calibri" w:eastAsia="Calibri" w:hAnsi="Calibri"/>
+                <w:b w:val="false"/>
+                <w:bCs w:val="false"/>
+                <w:sz w:val="14"/>
+                <w:szCs w:val="14"/>
+              </w:rPr>
+              <w:t xml:space="preserve">$944,514</w:t>
             </w:r>
           </w:p>
         </w:tc>
@@ -7672,7 +7672,7 @@
                 <w:sz w:val="14"/>
                 <w:szCs w:val="14"/>
               </w:rPr>
-              <w:t xml:space="preserve">$839,176</w:t>
+              <w:t xml:space="preserve">$944,514</w:t>
             </w:r>
           </w:p>
         </w:tc>
@@ -7700,7 +7700,7 @@
         <w:rPr>
           <w:rFonts w:ascii="Calibri" w:cs="Calibri" w:eastAsia="Calibri" w:hAnsi="Calibri"/>
         </w:rPr>
-        <w:t xml:space="preserve">Clinical model (EZvoxa Pro seats): five-year net $225,175</w:t>
+        <w:t xml:space="preserve">Clinical model (EZvoxa Pro seats): five-year net $110,546</w:t>
       </w:r>
     </w:p>
     <w:tbl>
@@ -7964,111 +7964,111 @@
                 <w:sz w:val="14"/>
                 <w:szCs w:val="14"/>
               </w:rPr>
-              <w:t xml:space="preserve">60 seats, 12 facilities (1.0%)</w:t>
-            </w:r>
-          </w:p>
-        </w:tc>
-        <w:tc>
-          <w:tcPr>
-            <w:tcW w:type="dxa" w:w="1500"/>
-            <w:tcMar>
-              <w:top w:type="dxa" w:w="50"/>
-              <w:left w:type="dxa" w:w="70"/>
-              <w:bottom w:type="dxa" w:w="50"/>
-              <w:right w:type="dxa" w:w="70"/>
-            </w:tcMar>
-          </w:tcPr>
-          <w:p>
-            <w:pPr>
-              <w:jc w:val="right"/>
-            </w:pPr>
-            <w:r>
-              <w:rPr>
-                <w:rFonts w:ascii="Calibri" w:cs="Calibri" w:eastAsia="Calibri" w:hAnsi="Calibri"/>
-                <w:b w:val="false"/>
-                <w:bCs w:val="false"/>
-                <w:sz w:val="14"/>
-                <w:szCs w:val="14"/>
-              </w:rPr>
-              <w:t xml:space="preserve">$7,499</w:t>
-            </w:r>
-          </w:p>
-        </w:tc>
-        <w:tc>
-          <w:tcPr>
-            <w:tcW w:type="dxa" w:w="1500"/>
-            <w:tcMar>
-              <w:top w:type="dxa" w:w="50"/>
-              <w:left w:type="dxa" w:w="70"/>
-              <w:bottom w:type="dxa" w:w="50"/>
-              <w:right w:type="dxa" w:w="70"/>
-            </w:tcMar>
-          </w:tcPr>
-          <w:p>
-            <w:pPr>
-              <w:jc w:val="right"/>
-            </w:pPr>
-            <w:r>
-              <w:rPr>
-                <w:rFonts w:ascii="Calibri" w:cs="Calibri" w:eastAsia="Calibri" w:hAnsi="Calibri"/>
-                <w:b w:val="false"/>
-                <w:bCs w:val="false"/>
-                <w:sz w:val="14"/>
-                <w:szCs w:val="14"/>
-              </w:rPr>
-              <w:t xml:space="preserve">($1,559)</w:t>
-            </w:r>
-          </w:p>
-        </w:tc>
-        <w:tc>
-          <w:tcPr>
-            <w:tcW w:type="dxa" w:w="1500"/>
-            <w:tcMar>
-              <w:top w:type="dxa" w:w="50"/>
-              <w:left w:type="dxa" w:w="70"/>
-              <w:bottom w:type="dxa" w:w="50"/>
-              <w:right w:type="dxa" w:w="70"/>
-            </w:tcMar>
-          </w:tcPr>
-          <w:p>
-            <w:pPr>
-              <w:jc w:val="right"/>
-            </w:pPr>
-            <w:r>
-              <w:rPr>
-                <w:rFonts w:ascii="Calibri" w:cs="Calibri" w:eastAsia="Calibri" w:hAnsi="Calibri"/>
-                <w:b w:val="false"/>
-                <w:bCs w:val="false"/>
-                <w:sz w:val="14"/>
-                <w:szCs w:val="14"/>
-              </w:rPr>
-              <w:t xml:space="preserve">$6,749</w:t>
-            </w:r>
-          </w:p>
-        </w:tc>
-        <w:tc>
-          <w:tcPr>
-            <w:tcW w:type="dxa" w:w="1500"/>
-            <w:tcMar>
-              <w:top w:type="dxa" w:w="50"/>
-              <w:left w:type="dxa" w:w="70"/>
-              <w:bottom w:type="dxa" w:w="50"/>
-              <w:right w:type="dxa" w:w="70"/>
-            </w:tcMar>
-          </w:tcPr>
-          <w:p>
-            <w:pPr>
-              <w:jc w:val="right"/>
-            </w:pPr>
-            <w:r>
-              <w:rPr>
-                <w:rFonts w:ascii="Calibri" w:cs="Calibri" w:eastAsia="Calibri" w:hAnsi="Calibri"/>
-                <w:b w:val="false"/>
-                <w:bCs w:val="false"/>
-                <w:sz w:val="14"/>
-                <w:szCs w:val="14"/>
-              </w:rPr>
-              <w:t xml:space="preserve">$5,940</w:t>
+              <w:t xml:space="preserve">15 seats, 3 facilities (0.3%)</w:t>
+            </w:r>
+          </w:p>
+        </w:tc>
+        <w:tc>
+          <w:tcPr>
+            <w:tcW w:type="dxa" w:w="1500"/>
+            <w:tcMar>
+              <w:top w:type="dxa" w:w="50"/>
+              <w:left w:type="dxa" w:w="70"/>
+              <w:bottom w:type="dxa" w:w="50"/>
+              <w:right w:type="dxa" w:w="70"/>
+            </w:tcMar>
+          </w:tcPr>
+          <w:p>
+            <w:pPr>
+              <w:jc w:val="right"/>
+            </w:pPr>
+            <w:r>
+              <w:rPr>
+                <w:rFonts w:ascii="Calibri" w:cs="Calibri" w:eastAsia="Calibri" w:hAnsi="Calibri"/>
+                <w:b w:val="false"/>
+                <w:bCs w:val="false"/>
+                <w:sz w:val="14"/>
+                <w:szCs w:val="14"/>
+              </w:rPr>
+              <w:t xml:space="preserve">$1,875</w:t>
+            </w:r>
+          </w:p>
+        </w:tc>
+        <w:tc>
+          <w:tcPr>
+            <w:tcW w:type="dxa" w:w="1500"/>
+            <w:tcMar>
+              <w:top w:type="dxa" w:w="50"/>
+              <w:left w:type="dxa" w:w="70"/>
+              <w:bottom w:type="dxa" w:w="50"/>
+              <w:right w:type="dxa" w:w="70"/>
+            </w:tcMar>
+          </w:tcPr>
+          <w:p>
+            <w:pPr>
+              <w:jc w:val="right"/>
+            </w:pPr>
+            <w:r>
+              <w:rPr>
+                <w:rFonts w:ascii="Calibri" w:cs="Calibri" w:eastAsia="Calibri" w:hAnsi="Calibri"/>
+                <w:b w:val="false"/>
+                <w:bCs w:val="false"/>
+                <w:sz w:val="14"/>
+                <w:szCs w:val="14"/>
+              </w:rPr>
+              <w:t xml:space="preserve">($392)</w:t>
+            </w:r>
+          </w:p>
+        </w:tc>
+        <w:tc>
+          <w:tcPr>
+            <w:tcW w:type="dxa" w:w="1500"/>
+            <w:tcMar>
+              <w:top w:type="dxa" w:w="50"/>
+              <w:left w:type="dxa" w:w="70"/>
+              <w:bottom w:type="dxa" w:w="50"/>
+              <w:right w:type="dxa" w:w="70"/>
+            </w:tcMar>
+          </w:tcPr>
+          <w:p>
+            <w:pPr>
+              <w:jc w:val="right"/>
+            </w:pPr>
+            <w:r>
+              <w:rPr>
+                <w:rFonts w:ascii="Calibri" w:cs="Calibri" w:eastAsia="Calibri" w:hAnsi="Calibri"/>
+                <w:b w:val="false"/>
+                <w:bCs w:val="false"/>
+                <w:sz w:val="14"/>
+                <w:szCs w:val="14"/>
+              </w:rPr>
+              <w:t xml:space="preserve">$1,687</w:t>
+            </w:r>
+          </w:p>
+        </w:tc>
+        <w:tc>
+          <w:tcPr>
+            <w:tcW w:type="dxa" w:w="1500"/>
+            <w:tcMar>
+              <w:top w:type="dxa" w:w="50"/>
+              <w:left w:type="dxa" w:w="70"/>
+              <w:bottom w:type="dxa" w:w="50"/>
+              <w:right w:type="dxa" w:w="70"/>
+            </w:tcMar>
+          </w:tcPr>
+          <w:p>
+            <w:pPr>
+              <w:jc w:val="right"/>
+            </w:pPr>
+            <w:r>
+              <w:rPr>
+                <w:rFonts w:ascii="Calibri" w:cs="Calibri" w:eastAsia="Calibri" w:hAnsi="Calibri"/>
+                <w:b w:val="false"/>
+                <w:bCs w:val="false"/>
+                <w:sz w:val="14"/>
+                <w:szCs w:val="14"/>
+              </w:rPr>
+              <w:t xml:space="preserve">$1,483</w:t>
             </w:r>
           </w:p>
         </w:tc>
@@ -8094,7 +8094,7 @@
                 <w:sz w:val="14"/>
                 <w:szCs w:val="14"/>
               </w:rPr>
-              <w:t xml:space="preserve">$5,940</w:t>
+              <w:t xml:space="preserve">$1,483</w:t>
             </w:r>
           </w:p>
         </w:tc>
@@ -8148,111 +8148,111 @@
                 <w:sz w:val="14"/>
                 <w:szCs w:val="14"/>
               </w:rPr>
-              <w:t xml:space="preserve">185 seats, 37 facilities (3.0%)</w:t>
-            </w:r>
-          </w:p>
-        </w:tc>
-        <w:tc>
-          <w:tcPr>
-            <w:tcW w:type="dxa" w:w="1500"/>
-            <w:tcMar>
-              <w:top w:type="dxa" w:w="50"/>
-              <w:left w:type="dxa" w:w="70"/>
-              <w:bottom w:type="dxa" w:w="50"/>
-              <w:right w:type="dxa" w:w="70"/>
-            </w:tcMar>
-          </w:tcPr>
-          <w:p>
-            <w:pPr>
-              <w:jc w:val="right"/>
-            </w:pPr>
-            <w:r>
-              <w:rPr>
-                <w:rFonts w:ascii="Calibri" w:cs="Calibri" w:eastAsia="Calibri" w:hAnsi="Calibri"/>
-                <w:b w:val="false"/>
-                <w:bCs w:val="false"/>
-                <w:sz w:val="14"/>
-                <w:szCs w:val="14"/>
-              </w:rPr>
-              <w:t xml:space="preserve">$23,123</w:t>
-            </w:r>
-          </w:p>
-        </w:tc>
-        <w:tc>
-          <w:tcPr>
-            <w:tcW w:type="dxa" w:w="1500"/>
-            <w:tcMar>
-              <w:top w:type="dxa" w:w="50"/>
-              <w:left w:type="dxa" w:w="70"/>
-              <w:bottom w:type="dxa" w:w="50"/>
-              <w:right w:type="dxa" w:w="70"/>
-            </w:tcMar>
-          </w:tcPr>
-          <w:p>
-            <w:pPr>
-              <w:jc w:val="right"/>
-            </w:pPr>
-            <w:r>
-              <w:rPr>
-                <w:rFonts w:ascii="Calibri" w:cs="Calibri" w:eastAsia="Calibri" w:hAnsi="Calibri"/>
-                <w:b w:val="false"/>
-                <w:bCs w:val="false"/>
-                <w:sz w:val="14"/>
-                <w:szCs w:val="14"/>
-              </w:rPr>
-              <w:t xml:space="preserve">($3,696)</w:t>
-            </w:r>
-          </w:p>
-        </w:tc>
-        <w:tc>
-          <w:tcPr>
-            <w:tcW w:type="dxa" w:w="1500"/>
-            <w:tcMar>
-              <w:top w:type="dxa" w:w="50"/>
-              <w:left w:type="dxa" w:w="70"/>
-              <w:bottom w:type="dxa" w:w="50"/>
-              <w:right w:type="dxa" w:w="70"/>
-            </w:tcMar>
-          </w:tcPr>
-          <w:p>
-            <w:pPr>
-              <w:jc w:val="right"/>
-            </w:pPr>
-            <w:r>
-              <w:rPr>
-                <w:rFonts w:ascii="Calibri" w:cs="Calibri" w:eastAsia="Calibri" w:hAnsi="Calibri"/>
-                <w:b w:val="false"/>
-                <w:bCs w:val="false"/>
-                <w:sz w:val="14"/>
-                <w:szCs w:val="14"/>
-              </w:rPr>
-              <w:t xml:space="preserve">$20,811</w:t>
-            </w:r>
-          </w:p>
-        </w:tc>
-        <w:tc>
-          <w:tcPr>
-            <w:tcW w:type="dxa" w:w="1500"/>
-            <w:tcMar>
-              <w:top w:type="dxa" w:w="50"/>
-              <w:left w:type="dxa" w:w="70"/>
-              <w:bottom w:type="dxa" w:w="50"/>
-              <w:right w:type="dxa" w:w="70"/>
-            </w:tcMar>
-          </w:tcPr>
-          <w:p>
-            <w:pPr>
-              <w:jc w:val="right"/>
-            </w:pPr>
-            <w:r>
-              <w:rPr>
-                <w:rFonts w:ascii="Calibri" w:cs="Calibri" w:eastAsia="Calibri" w:hAnsi="Calibri"/>
-                <w:b w:val="false"/>
-                <w:bCs w:val="false"/>
-                <w:sz w:val="14"/>
-                <w:szCs w:val="14"/>
-              </w:rPr>
-              <w:t xml:space="preserve">$19,427</w:t>
+              <w:t xml:space="preserve">50 seats, 10 facilities (0.8%)</w:t>
+            </w:r>
+          </w:p>
+        </w:tc>
+        <w:tc>
+          <w:tcPr>
+            <w:tcW w:type="dxa" w:w="1500"/>
+            <w:tcMar>
+              <w:top w:type="dxa" w:w="50"/>
+              <w:left w:type="dxa" w:w="70"/>
+              <w:bottom w:type="dxa" w:w="50"/>
+              <w:right w:type="dxa" w:w="70"/>
+            </w:tcMar>
+          </w:tcPr>
+          <w:p>
+            <w:pPr>
+              <w:jc w:val="right"/>
+            </w:pPr>
+            <w:r>
+              <w:rPr>
+                <w:rFonts w:ascii="Calibri" w:cs="Calibri" w:eastAsia="Calibri" w:hAnsi="Calibri"/>
+                <w:b w:val="false"/>
+                <w:bCs w:val="false"/>
+                <w:sz w:val="14"/>
+                <w:szCs w:val="14"/>
+              </w:rPr>
+              <w:t xml:space="preserve">$6,250</w:t>
+            </w:r>
+          </w:p>
+        </w:tc>
+        <w:tc>
+          <w:tcPr>
+            <w:tcW w:type="dxa" w:w="1500"/>
+            <w:tcMar>
+              <w:top w:type="dxa" w:w="50"/>
+              <w:left w:type="dxa" w:w="70"/>
+              <w:bottom w:type="dxa" w:w="50"/>
+              <w:right w:type="dxa" w:w="70"/>
+            </w:tcMar>
+          </w:tcPr>
+          <w:p>
+            <w:pPr>
+              <w:jc w:val="right"/>
+            </w:pPr>
+            <w:r>
+              <w:rPr>
+                <w:rFonts w:ascii="Calibri" w:cs="Calibri" w:eastAsia="Calibri" w:hAnsi="Calibri"/>
+                <w:b w:val="false"/>
+                <w:bCs w:val="false"/>
+                <w:sz w:val="14"/>
+                <w:szCs w:val="14"/>
+              </w:rPr>
+              <w:t xml:space="preserve">($1,011)</w:t>
+            </w:r>
+          </w:p>
+        </w:tc>
+        <w:tc>
+          <w:tcPr>
+            <w:tcW w:type="dxa" w:w="1500"/>
+            <w:tcMar>
+              <w:top w:type="dxa" w:w="50"/>
+              <w:left w:type="dxa" w:w="70"/>
+              <w:bottom w:type="dxa" w:w="50"/>
+              <w:right w:type="dxa" w:w="70"/>
+            </w:tcMar>
+          </w:tcPr>
+          <w:p>
+            <w:pPr>
+              <w:jc w:val="right"/>
+            </w:pPr>
+            <w:r>
+              <w:rPr>
+                <w:rFonts w:ascii="Calibri" w:cs="Calibri" w:eastAsia="Calibri" w:hAnsi="Calibri"/>
+                <w:b w:val="false"/>
+                <w:bCs w:val="false"/>
+                <w:sz w:val="14"/>
+                <w:szCs w:val="14"/>
+              </w:rPr>
+              <w:t xml:space="preserve">$5,625</w:t>
+            </w:r>
+          </w:p>
+        </w:tc>
+        <w:tc>
+          <w:tcPr>
+            <w:tcW w:type="dxa" w:w="1500"/>
+            <w:tcMar>
+              <w:top w:type="dxa" w:w="50"/>
+              <w:left w:type="dxa" w:w="70"/>
+              <w:bottom w:type="dxa" w:w="50"/>
+              <w:right w:type="dxa" w:w="70"/>
+            </w:tcMar>
+          </w:tcPr>
+          <w:p>
+            <w:pPr>
+              <w:jc w:val="right"/>
+            </w:pPr>
+            <w:r>
+              <w:rPr>
+                <w:rFonts w:ascii="Calibri" w:cs="Calibri" w:eastAsia="Calibri" w:hAnsi="Calibri"/>
+                <w:b w:val="false"/>
+                <w:bCs w:val="false"/>
+                <w:sz w:val="14"/>
+                <w:szCs w:val="14"/>
+              </w:rPr>
+              <w:t xml:space="preserve">$5,239</w:t>
             </w:r>
           </w:p>
         </w:tc>
@@ -8278,7 +8278,7 @@
                 <w:sz w:val="14"/>
                 <w:szCs w:val="14"/>
               </w:rPr>
-              <w:t xml:space="preserve">$25,367</w:t>
+              <w:t xml:space="preserve">$6,722</w:t>
             </w:r>
           </w:p>
         </w:tc>
@@ -8332,111 +8332,111 @@
                 <w:sz w:val="14"/>
                 <w:szCs w:val="14"/>
               </w:rPr>
-              <w:t xml:space="preserve">365 seats, 73 facilities (6.0%)</w:t>
-            </w:r>
-          </w:p>
-        </w:tc>
-        <w:tc>
-          <w:tcPr>
-            <w:tcW w:type="dxa" w:w="1500"/>
-            <w:tcMar>
-              <w:top w:type="dxa" w:w="50"/>
-              <w:left w:type="dxa" w:w="70"/>
-              <w:bottom w:type="dxa" w:w="50"/>
-              <w:right w:type="dxa" w:w="70"/>
-            </w:tcMar>
-          </w:tcPr>
-          <w:p>
-            <w:pPr>
-              <w:jc w:val="right"/>
-            </w:pPr>
-            <w:r>
-              <w:rPr>
-                <w:rFonts w:ascii="Calibri" w:cs="Calibri" w:eastAsia="Calibri" w:hAnsi="Calibri"/>
-                <w:b w:val="false"/>
-                <w:bCs w:val="false"/>
-                <w:sz w:val="14"/>
-                <w:szCs w:val="14"/>
-              </w:rPr>
-              <w:t xml:space="preserve">$45,621</w:t>
-            </w:r>
-          </w:p>
-        </w:tc>
-        <w:tc>
-          <w:tcPr>
-            <w:tcW w:type="dxa" w:w="1500"/>
-            <w:tcMar>
-              <w:top w:type="dxa" w:w="50"/>
-              <w:left w:type="dxa" w:w="70"/>
-              <w:bottom w:type="dxa" w:w="50"/>
-              <w:right w:type="dxa" w:w="70"/>
-            </w:tcMar>
-          </w:tcPr>
-          <w:p>
-            <w:pPr>
-              <w:jc w:val="right"/>
-            </w:pPr>
-            <w:r>
-              <w:rPr>
-                <w:rFonts w:ascii="Calibri" w:cs="Calibri" w:eastAsia="Calibri" w:hAnsi="Calibri"/>
-                <w:b w:val="false"/>
-                <w:bCs w:val="false"/>
-                <w:sz w:val="14"/>
-                <w:szCs w:val="14"/>
-              </w:rPr>
-              <w:t xml:space="preserve">($6,312)</w:t>
-            </w:r>
-          </w:p>
-        </w:tc>
-        <w:tc>
-          <w:tcPr>
-            <w:tcW w:type="dxa" w:w="1500"/>
-            <w:tcMar>
-              <w:top w:type="dxa" w:w="50"/>
-              <w:left w:type="dxa" w:w="70"/>
-              <w:bottom w:type="dxa" w:w="50"/>
-              <w:right w:type="dxa" w:w="70"/>
-            </w:tcMar>
-          </w:tcPr>
-          <w:p>
-            <w:pPr>
-              <w:jc w:val="right"/>
-            </w:pPr>
-            <w:r>
-              <w:rPr>
-                <w:rFonts w:ascii="Calibri" w:cs="Calibri" w:eastAsia="Calibri" w:hAnsi="Calibri"/>
-                <w:b w:val="false"/>
-                <w:bCs w:val="false"/>
-                <w:sz w:val="14"/>
-                <w:szCs w:val="14"/>
-              </w:rPr>
-              <w:t xml:space="preserve">$41,059</w:t>
-            </w:r>
-          </w:p>
-        </w:tc>
-        <w:tc>
-          <w:tcPr>
-            <w:tcW w:type="dxa" w:w="1500"/>
-            <w:tcMar>
-              <w:top w:type="dxa" w:w="50"/>
-              <w:left w:type="dxa" w:w="70"/>
-              <w:bottom w:type="dxa" w:w="50"/>
-              <w:right w:type="dxa" w:w="70"/>
-            </w:tcMar>
-          </w:tcPr>
-          <w:p>
-            <w:pPr>
-              <w:jc w:val="right"/>
-            </w:pPr>
-            <w:r>
-              <w:rPr>
-                <w:rFonts w:ascii="Calibri" w:cs="Calibri" w:eastAsia="Calibri" w:hAnsi="Calibri"/>
-                <w:b w:val="false"/>
-                <w:bCs w:val="false"/>
-                <w:sz w:val="14"/>
-                <w:szCs w:val="14"/>
-              </w:rPr>
-              <w:t xml:space="preserve">$39,309</w:t>
+              <w:t xml:space="preserve">150 seats, 30 facilities (2.5%)</w:t>
+            </w:r>
+          </w:p>
+        </w:tc>
+        <w:tc>
+          <w:tcPr>
+            <w:tcW w:type="dxa" w:w="1500"/>
+            <w:tcMar>
+              <w:top w:type="dxa" w:w="50"/>
+              <w:left w:type="dxa" w:w="70"/>
+              <w:bottom w:type="dxa" w:w="50"/>
+              <w:right w:type="dxa" w:w="70"/>
+            </w:tcMar>
+          </w:tcPr>
+          <w:p>
+            <w:pPr>
+              <w:jc w:val="right"/>
+            </w:pPr>
+            <w:r>
+              <w:rPr>
+                <w:rFonts w:ascii="Calibri" w:cs="Calibri" w:eastAsia="Calibri" w:hAnsi="Calibri"/>
+                <w:b w:val="false"/>
+                <w:bCs w:val="false"/>
+                <w:sz w:val="14"/>
+                <w:szCs w:val="14"/>
+              </w:rPr>
+              <w:t xml:space="preserve">$18,749</w:t>
+            </w:r>
+          </w:p>
+        </w:tc>
+        <w:tc>
+          <w:tcPr>
+            <w:tcW w:type="dxa" w:w="1500"/>
+            <w:tcMar>
+              <w:top w:type="dxa" w:w="50"/>
+              <w:left w:type="dxa" w:w="70"/>
+              <w:bottom w:type="dxa" w:w="50"/>
+              <w:right w:type="dxa" w:w="70"/>
+            </w:tcMar>
+          </w:tcPr>
+          <w:p>
+            <w:pPr>
+              <w:jc w:val="right"/>
+            </w:pPr>
+            <w:r>
+              <w:rPr>
+                <w:rFonts w:ascii="Calibri" w:cs="Calibri" w:eastAsia="Calibri" w:hAnsi="Calibri"/>
+                <w:b w:val="false"/>
+                <w:bCs w:val="false"/>
+                <w:sz w:val="14"/>
+                <w:szCs w:val="14"/>
+              </w:rPr>
+              <w:t xml:space="preserve">($2,610)</w:t>
+            </w:r>
+          </w:p>
+        </w:tc>
+        <w:tc>
+          <w:tcPr>
+            <w:tcW w:type="dxa" w:w="1500"/>
+            <w:tcMar>
+              <w:top w:type="dxa" w:w="50"/>
+              <w:left w:type="dxa" w:w="70"/>
+              <w:bottom w:type="dxa" w:w="50"/>
+              <w:right w:type="dxa" w:w="70"/>
+            </w:tcMar>
+          </w:tcPr>
+          <w:p>
+            <w:pPr>
+              <w:jc w:val="right"/>
+            </w:pPr>
+            <w:r>
+              <w:rPr>
+                <w:rFonts w:ascii="Calibri" w:cs="Calibri" w:eastAsia="Calibri" w:hAnsi="Calibri"/>
+                <w:b w:val="false"/>
+                <w:bCs w:val="false"/>
+                <w:sz w:val="14"/>
+                <w:szCs w:val="14"/>
+              </w:rPr>
+              <w:t xml:space="preserve">$16,874</w:t>
+            </w:r>
+          </w:p>
+        </w:tc>
+        <w:tc>
+          <w:tcPr>
+            <w:tcW w:type="dxa" w:w="1500"/>
+            <w:tcMar>
+              <w:top w:type="dxa" w:w="50"/>
+              <w:left w:type="dxa" w:w="70"/>
+              <w:bottom w:type="dxa" w:w="50"/>
+              <w:right w:type="dxa" w:w="70"/>
+            </w:tcMar>
+          </w:tcPr>
+          <w:p>
+            <w:pPr>
+              <w:jc w:val="right"/>
+            </w:pPr>
+            <w:r>
+              <w:rPr>
+                <w:rFonts w:ascii="Calibri" w:cs="Calibri" w:eastAsia="Calibri" w:hAnsi="Calibri"/>
+                <w:b w:val="false"/>
+                <w:bCs w:val="false"/>
+                <w:sz w:val="14"/>
+                <w:szCs w:val="14"/>
+              </w:rPr>
+              <w:t xml:space="preserve">$16,138</w:t>
             </w:r>
           </w:p>
         </w:tc>
@@ -8462,7 +8462,7 @@
                 <w:sz w:val="14"/>
                 <w:szCs w:val="14"/>
               </w:rPr>
-              <w:t xml:space="preserve">$64,676</w:t>
+              <w:t xml:space="preserve">$22,860</w:t>
             </w:r>
           </w:p>
         </w:tc>
@@ -8516,111 +8516,111 @@
                 <w:sz w:val="14"/>
                 <w:szCs w:val="14"/>
               </w:rPr>
-              <w:t xml:space="preserve">610 seats, 122 facilities (10.0%)</w:t>
-            </w:r>
-          </w:p>
-        </w:tc>
-        <w:tc>
-          <w:tcPr>
-            <w:tcW w:type="dxa" w:w="1500"/>
-            <w:tcMar>
-              <w:top w:type="dxa" w:w="50"/>
-              <w:left w:type="dxa" w:w="70"/>
-              <w:bottom w:type="dxa" w:w="50"/>
-              <w:right w:type="dxa" w:w="70"/>
-            </w:tcMar>
-          </w:tcPr>
-          <w:p>
-            <w:pPr>
-              <w:jc w:val="right"/>
-            </w:pPr>
-            <w:r>
-              <w:rPr>
-                <w:rFonts w:ascii="Calibri" w:cs="Calibri" w:eastAsia="Calibri" w:hAnsi="Calibri"/>
-                <w:b w:val="false"/>
-                <w:bCs w:val="false"/>
-                <w:sz w:val="14"/>
-                <w:szCs w:val="14"/>
-              </w:rPr>
-              <w:t xml:space="preserve">$76,244</w:t>
-            </w:r>
-          </w:p>
-        </w:tc>
-        <w:tc>
-          <w:tcPr>
-            <w:tcW w:type="dxa" w:w="1500"/>
-            <w:tcMar>
-              <w:top w:type="dxa" w:w="50"/>
-              <w:left w:type="dxa" w:w="70"/>
-              <w:bottom w:type="dxa" w:w="50"/>
-              <w:right w:type="dxa" w:w="70"/>
-            </w:tcMar>
-          </w:tcPr>
-          <w:p>
-            <w:pPr>
-              <w:jc w:val="right"/>
-            </w:pPr>
-            <w:r>
-              <w:rPr>
-                <w:rFonts w:ascii="Calibri" w:cs="Calibri" w:eastAsia="Calibri" w:hAnsi="Calibri"/>
-                <w:b w:val="false"/>
-                <w:bCs w:val="false"/>
-                <w:sz w:val="14"/>
-                <w:szCs w:val="14"/>
-              </w:rPr>
-              <w:t xml:space="preserve">($9,707)</w:t>
-            </w:r>
-          </w:p>
-        </w:tc>
-        <w:tc>
-          <w:tcPr>
-            <w:tcW w:type="dxa" w:w="1500"/>
-            <w:tcMar>
-              <w:top w:type="dxa" w:w="50"/>
-              <w:left w:type="dxa" w:w="70"/>
-              <w:bottom w:type="dxa" w:w="50"/>
-              <w:right w:type="dxa" w:w="70"/>
-            </w:tcMar>
-          </w:tcPr>
-          <w:p>
-            <w:pPr>
-              <w:jc w:val="right"/>
-            </w:pPr>
-            <w:r>
-              <w:rPr>
-                <w:rFonts w:ascii="Calibri" w:cs="Calibri" w:eastAsia="Calibri" w:hAnsi="Calibri"/>
-                <w:b w:val="false"/>
-                <w:bCs w:val="false"/>
-                <w:sz w:val="14"/>
-                <w:szCs w:val="14"/>
-              </w:rPr>
-              <w:t xml:space="preserve">$68,620</w:t>
-            </w:r>
-          </w:p>
-        </w:tc>
-        <w:tc>
-          <w:tcPr>
-            <w:tcW w:type="dxa" w:w="1500"/>
-            <w:tcMar>
-              <w:top w:type="dxa" w:w="50"/>
-              <w:left w:type="dxa" w:w="70"/>
-              <w:bottom w:type="dxa" w:w="50"/>
-              <w:right w:type="dxa" w:w="70"/>
-            </w:tcMar>
-          </w:tcPr>
-          <w:p>
-            <w:pPr>
-              <w:jc w:val="right"/>
-            </w:pPr>
-            <w:r>
-              <w:rPr>
-                <w:rFonts w:ascii="Calibri" w:cs="Calibri" w:eastAsia="Calibri" w:hAnsi="Calibri"/>
-                <w:b w:val="false"/>
-                <w:bCs w:val="false"/>
-                <w:sz w:val="14"/>
-                <w:szCs w:val="14"/>
-              </w:rPr>
-              <w:t xml:space="preserve">$66,537</w:t>
+              <w:t xml:space="preserve">300 seats, 60 facilities (4.9%)</w:t>
+            </w:r>
+          </w:p>
+        </w:tc>
+        <w:tc>
+          <w:tcPr>
+            <w:tcW w:type="dxa" w:w="1500"/>
+            <w:tcMar>
+              <w:top w:type="dxa" w:w="50"/>
+              <w:left w:type="dxa" w:w="70"/>
+              <w:bottom w:type="dxa" w:w="50"/>
+              <w:right w:type="dxa" w:w="70"/>
+            </w:tcMar>
+          </w:tcPr>
+          <w:p>
+            <w:pPr>
+              <w:jc w:val="right"/>
+            </w:pPr>
+            <w:r>
+              <w:rPr>
+                <w:rFonts w:ascii="Calibri" w:cs="Calibri" w:eastAsia="Calibri" w:hAnsi="Calibri"/>
+                <w:b w:val="false"/>
+                <w:bCs w:val="false"/>
+                <w:sz w:val="14"/>
+                <w:szCs w:val="14"/>
+              </w:rPr>
+              <w:t xml:space="preserve">$37,497</w:t>
+            </w:r>
+          </w:p>
+        </w:tc>
+        <w:tc>
+          <w:tcPr>
+            <w:tcW w:type="dxa" w:w="1500"/>
+            <w:tcMar>
+              <w:top w:type="dxa" w:w="50"/>
+              <w:left w:type="dxa" w:w="70"/>
+              <w:bottom w:type="dxa" w:w="50"/>
+              <w:right w:type="dxa" w:w="70"/>
+            </w:tcMar>
+          </w:tcPr>
+          <w:p>
+            <w:pPr>
+              <w:jc w:val="right"/>
+            </w:pPr>
+            <w:r>
+              <w:rPr>
+                <w:rFonts w:ascii="Calibri" w:cs="Calibri" w:eastAsia="Calibri" w:hAnsi="Calibri"/>
+                <w:b w:val="false"/>
+                <w:bCs w:val="false"/>
+                <w:sz w:val="14"/>
+                <w:szCs w:val="14"/>
+              </w:rPr>
+              <w:t xml:space="preserve">($4,781)</w:t>
+            </w:r>
+          </w:p>
+        </w:tc>
+        <w:tc>
+          <w:tcPr>
+            <w:tcW w:type="dxa" w:w="1500"/>
+            <w:tcMar>
+              <w:top w:type="dxa" w:w="50"/>
+              <w:left w:type="dxa" w:w="70"/>
+              <w:bottom w:type="dxa" w:w="50"/>
+              <w:right w:type="dxa" w:w="70"/>
+            </w:tcMar>
+          </w:tcPr>
+          <w:p>
+            <w:pPr>
+              <w:jc w:val="right"/>
+            </w:pPr>
+            <w:r>
+              <w:rPr>
+                <w:rFonts w:ascii="Calibri" w:cs="Calibri" w:eastAsia="Calibri" w:hAnsi="Calibri"/>
+                <w:b w:val="false"/>
+                <w:bCs w:val="false"/>
+                <w:sz w:val="14"/>
+                <w:szCs w:val="14"/>
+              </w:rPr>
+              <w:t xml:space="preserve">$33,747</w:t>
+            </w:r>
+          </w:p>
+        </w:tc>
+        <w:tc>
+          <w:tcPr>
+            <w:tcW w:type="dxa" w:w="1500"/>
+            <w:tcMar>
+              <w:top w:type="dxa" w:w="50"/>
+              <w:left w:type="dxa" w:w="70"/>
+              <w:bottom w:type="dxa" w:w="50"/>
+              <w:right w:type="dxa" w:w="70"/>
+            </w:tcMar>
+          </w:tcPr>
+          <w:p>
+            <w:pPr>
+              <w:jc w:val="right"/>
+            </w:pPr>
+            <w:r>
+              <w:rPr>
+                <w:rFonts w:ascii="Calibri" w:cs="Calibri" w:eastAsia="Calibri" w:hAnsi="Calibri"/>
+                <w:b w:val="false"/>
+                <w:bCs w:val="false"/>
+                <w:sz w:val="14"/>
+                <w:szCs w:val="14"/>
+              </w:rPr>
+              <w:t xml:space="preserve">$32,716</w:t>
             </w:r>
           </w:p>
         </w:tc>
@@ -8646,7 +8646,7 @@
                 <w:sz w:val="14"/>
                 <w:szCs w:val="14"/>
               </w:rPr>
-              <w:t xml:space="preserve">$131,213</w:t>
+              <w:t xml:space="preserve">$55,576</w:t>
             </w:r>
           </w:p>
         </w:tc>
@@ -8700,111 +8700,111 @@
                 <w:sz w:val="14"/>
                 <w:szCs w:val="14"/>
               </w:rPr>
-              <w:t xml:space="preserve">855 seats, 171 facilities (14.0%)</w:t>
-            </w:r>
-          </w:p>
-        </w:tc>
-        <w:tc>
-          <w:tcPr>
-            <w:tcW w:type="dxa" w:w="1500"/>
-            <w:tcMar>
-              <w:top w:type="dxa" w:w="50"/>
-              <w:left w:type="dxa" w:w="70"/>
-              <w:bottom w:type="dxa" w:w="50"/>
-              <w:right w:type="dxa" w:w="70"/>
-            </w:tcMar>
-          </w:tcPr>
-          <w:p>
-            <w:pPr>
-              <w:jc w:val="right"/>
-            </w:pPr>
-            <w:r>
-              <w:rPr>
-                <w:rFonts w:ascii="Calibri" w:cs="Calibri" w:eastAsia="Calibri" w:hAnsi="Calibri"/>
-                <w:b w:val="false"/>
-                <w:bCs w:val="false"/>
-                <w:sz w:val="14"/>
-                <w:szCs w:val="14"/>
-              </w:rPr>
-              <w:t xml:space="preserve">$106,866</w:t>
-            </w:r>
-          </w:p>
-        </w:tc>
-        <w:tc>
-          <w:tcPr>
-            <w:tcW w:type="dxa" w:w="1500"/>
-            <w:tcMar>
-              <w:top w:type="dxa" w:w="50"/>
-              <w:left w:type="dxa" w:w="70"/>
-              <w:bottom w:type="dxa" w:w="50"/>
-              <w:right w:type="dxa" w:w="70"/>
-            </w:tcMar>
-          </w:tcPr>
-          <w:p>
-            <w:pPr>
-              <w:jc w:val="right"/>
-            </w:pPr>
-            <w:r>
-              <w:rPr>
-                <w:rFonts w:ascii="Calibri" w:cs="Calibri" w:eastAsia="Calibri" w:hAnsi="Calibri"/>
-                <w:b w:val="false"/>
-                <w:bCs w:val="false"/>
-                <w:sz w:val="14"/>
-                <w:szCs w:val="14"/>
-              </w:rPr>
-              <w:t xml:space="preserve">($12,905)</w:t>
-            </w:r>
-          </w:p>
-        </w:tc>
-        <w:tc>
-          <w:tcPr>
-            <w:tcW w:type="dxa" w:w="1500"/>
-            <w:tcMar>
-              <w:top w:type="dxa" w:w="50"/>
-              <w:left w:type="dxa" w:w="70"/>
-              <w:bottom w:type="dxa" w:w="50"/>
-              <w:right w:type="dxa" w:w="70"/>
-            </w:tcMar>
-          </w:tcPr>
-          <w:p>
-            <w:pPr>
-              <w:jc w:val="right"/>
-            </w:pPr>
-            <w:r>
-              <w:rPr>
-                <w:rFonts w:ascii="Calibri" w:cs="Calibri" w:eastAsia="Calibri" w:hAnsi="Calibri"/>
-                <w:b w:val="false"/>
-                <w:bCs w:val="false"/>
-                <w:sz w:val="14"/>
-                <w:szCs w:val="14"/>
-              </w:rPr>
-              <w:t xml:space="preserve">$96,180</w:t>
-            </w:r>
-          </w:p>
-        </w:tc>
-        <w:tc>
-          <w:tcPr>
-            <w:tcW w:type="dxa" w:w="1500"/>
-            <w:tcMar>
-              <w:top w:type="dxa" w:w="50"/>
-              <w:left w:type="dxa" w:w="70"/>
-              <w:bottom w:type="dxa" w:w="50"/>
-              <w:right w:type="dxa" w:w="70"/>
-            </w:tcMar>
-          </w:tcPr>
-          <w:p>
-            <w:pPr>
-              <w:jc w:val="right"/>
-            </w:pPr>
-            <w:r>
-              <w:rPr>
-                <w:rFonts w:ascii="Calibri" w:cs="Calibri" w:eastAsia="Calibri" w:hAnsi="Calibri"/>
-                <w:b w:val="false"/>
-                <w:bCs w:val="false"/>
-                <w:sz w:val="14"/>
-                <w:szCs w:val="14"/>
-              </w:rPr>
-              <w:t xml:space="preserve">$93,962</w:t>
+              <w:t xml:space="preserve">500 seats, 100 facilities (8.2%)</w:t>
+            </w:r>
+          </w:p>
+        </w:tc>
+        <w:tc>
+          <w:tcPr>
+            <w:tcW w:type="dxa" w:w="1500"/>
+            <w:tcMar>
+              <w:top w:type="dxa" w:w="50"/>
+              <w:left w:type="dxa" w:w="70"/>
+              <w:bottom w:type="dxa" w:w="50"/>
+              <w:right w:type="dxa" w:w="70"/>
+            </w:tcMar>
+          </w:tcPr>
+          <w:p>
+            <w:pPr>
+              <w:jc w:val="right"/>
+            </w:pPr>
+            <w:r>
+              <w:rPr>
+                <w:rFonts w:ascii="Calibri" w:cs="Calibri" w:eastAsia="Calibri" w:hAnsi="Calibri"/>
+                <w:b w:val="false"/>
+                <w:bCs w:val="false"/>
+                <w:sz w:val="14"/>
+                <w:szCs w:val="14"/>
+              </w:rPr>
+              <w:t xml:space="preserve">$62,495</w:t>
+            </w:r>
+          </w:p>
+        </w:tc>
+        <w:tc>
+          <w:tcPr>
+            <w:tcW w:type="dxa" w:w="1500"/>
+            <w:tcMar>
+              <w:top w:type="dxa" w:w="50"/>
+              <w:left w:type="dxa" w:w="70"/>
+              <w:bottom w:type="dxa" w:w="50"/>
+              <w:right w:type="dxa" w:w="70"/>
+            </w:tcMar>
+          </w:tcPr>
+          <w:p>
+            <w:pPr>
+              <w:jc w:val="right"/>
+            </w:pPr>
+            <w:r>
+              <w:rPr>
+                <w:rFonts w:ascii="Calibri" w:cs="Calibri" w:eastAsia="Calibri" w:hAnsi="Calibri"/>
+                <w:b w:val="false"/>
+                <w:bCs w:val="false"/>
+                <w:sz w:val="14"/>
+                <w:szCs w:val="14"/>
+              </w:rPr>
+              <w:t xml:space="preserve">($7,525)</w:t>
+            </w:r>
+          </w:p>
+        </w:tc>
+        <w:tc>
+          <w:tcPr>
+            <w:tcW w:type="dxa" w:w="1500"/>
+            <w:tcMar>
+              <w:top w:type="dxa" w:w="50"/>
+              <w:left w:type="dxa" w:w="70"/>
+              <w:bottom w:type="dxa" w:w="50"/>
+              <w:right w:type="dxa" w:w="70"/>
+            </w:tcMar>
+          </w:tcPr>
+          <w:p>
+            <w:pPr>
+              <w:jc w:val="right"/>
+            </w:pPr>
+            <w:r>
+              <w:rPr>
+                <w:rFonts w:ascii="Calibri" w:cs="Calibri" w:eastAsia="Calibri" w:hAnsi="Calibri"/>
+                <w:b w:val="false"/>
+                <w:bCs w:val="false"/>
+                <w:sz w:val="14"/>
+                <w:szCs w:val="14"/>
+              </w:rPr>
+              <w:t xml:space="preserve">$56,246</w:t>
+            </w:r>
+          </w:p>
+        </w:tc>
+        <w:tc>
+          <w:tcPr>
+            <w:tcW w:type="dxa" w:w="1500"/>
+            <w:tcMar>
+              <w:top w:type="dxa" w:w="50"/>
+              <w:left w:type="dxa" w:w="70"/>
+              <w:bottom w:type="dxa" w:w="50"/>
+              <w:right w:type="dxa" w:w="70"/>
+            </w:tcMar>
+          </w:tcPr>
+          <w:p>
+            <w:pPr>
+              <w:jc w:val="right"/>
+            </w:pPr>
+            <w:r>
+              <w:rPr>
+                <w:rFonts w:ascii="Calibri" w:cs="Calibri" w:eastAsia="Calibri" w:hAnsi="Calibri"/>
+                <w:b w:val="false"/>
+                <w:bCs w:val="false"/>
+                <w:sz w:val="14"/>
+                <w:szCs w:val="14"/>
+              </w:rPr>
+              <w:t xml:space="preserve">$54,970</w:t>
             </w:r>
           </w:p>
         </w:tc>
@@ -8830,7 +8830,7 @@
                 <w:sz w:val="14"/>
                 <w:szCs w:val="14"/>
               </w:rPr>
-              <w:t xml:space="preserve">$225,175</w:t>
+              <w:t xml:space="preserve">$110,546</w:t>
             </w:r>
           </w:p>
         </w:tc>
@@ -8910,85 +8910,85 @@
                 <w:sz w:val="14"/>
                 <w:szCs w:val="14"/>
               </w:rPr>
-              <w:t xml:space="preserve">$259,353</w:t>
-            </w:r>
-          </w:p>
-        </w:tc>
-        <w:tc>
-          <w:tcPr>
-            <w:tcW w:type="dxa" w:w="1500"/>
-            <w:tcMar>
-              <w:top w:type="dxa" w:w="50"/>
-              <w:left w:type="dxa" w:w="70"/>
-              <w:bottom w:type="dxa" w:w="50"/>
-              <w:right w:type="dxa" w:w="70"/>
-            </w:tcMar>
-          </w:tcPr>
-          <w:p>
-            <w:pPr>
-              <w:jc w:val="right"/>
-            </w:pPr>
-            <w:r>
-              <w:rPr>
-                <w:rFonts w:ascii="Calibri" w:cs="Calibri" w:eastAsia="Calibri" w:hAnsi="Calibri"/>
-                <w:b w:val="false"/>
-                <w:bCs w:val="false"/>
-                <w:sz w:val="14"/>
-                <w:szCs w:val="14"/>
-              </w:rPr>
-              <w:t xml:space="preserve">($34,179)</w:t>
-            </w:r>
-          </w:p>
-        </w:tc>
-        <w:tc>
-          <w:tcPr>
-            <w:tcW w:type="dxa" w:w="1500"/>
-            <w:tcMar>
-              <w:top w:type="dxa" w:w="50"/>
-              <w:left w:type="dxa" w:w="70"/>
-              <w:bottom w:type="dxa" w:w="50"/>
-              <w:right w:type="dxa" w:w="70"/>
-            </w:tcMar>
-          </w:tcPr>
-          <w:p>
-            <w:pPr>
-              <w:jc w:val="right"/>
-            </w:pPr>
-            <w:r>
-              <w:rPr>
-                <w:rFonts w:ascii="Calibri" w:cs="Calibri" w:eastAsia="Calibri" w:hAnsi="Calibri"/>
-                <w:b w:val="false"/>
-                <w:bCs w:val="false"/>
-                <w:sz w:val="14"/>
-                <w:szCs w:val="14"/>
-              </w:rPr>
-              <w:t xml:space="preserve">$233,419</w:t>
-            </w:r>
-          </w:p>
-        </w:tc>
-        <w:tc>
-          <w:tcPr>
-            <w:tcW w:type="dxa" w:w="1500"/>
-            <w:tcMar>
-              <w:top w:type="dxa" w:w="50"/>
-              <w:left w:type="dxa" w:w="70"/>
-              <w:bottom w:type="dxa" w:w="50"/>
-              <w:right w:type="dxa" w:w="70"/>
-            </w:tcMar>
-          </w:tcPr>
-          <w:p>
-            <w:pPr>
-              <w:jc w:val="right"/>
-            </w:pPr>
-            <w:r>
-              <w:rPr>
-                <w:rFonts w:ascii="Calibri" w:cs="Calibri" w:eastAsia="Calibri" w:hAnsi="Calibri"/>
-                <w:b w:val="false"/>
-                <w:bCs w:val="false"/>
-                <w:sz w:val="14"/>
-                <w:szCs w:val="14"/>
-              </w:rPr>
-              <w:t xml:space="preserve">$225,175</w:t>
+              <w:t xml:space="preserve">$126,866</w:t>
+            </w:r>
+          </w:p>
+        </w:tc>
+        <w:tc>
+          <w:tcPr>
+            <w:tcW w:type="dxa" w:w="1500"/>
+            <w:tcMar>
+              <w:top w:type="dxa" w:w="50"/>
+              <w:left w:type="dxa" w:w="70"/>
+              <w:bottom w:type="dxa" w:w="50"/>
+              <w:right w:type="dxa" w:w="70"/>
+            </w:tcMar>
+          </w:tcPr>
+          <w:p>
+            <w:pPr>
+              <w:jc w:val="right"/>
+            </w:pPr>
+            <w:r>
+              <w:rPr>
+                <w:rFonts w:ascii="Calibri" w:cs="Calibri" w:eastAsia="Calibri" w:hAnsi="Calibri"/>
+                <w:b w:val="false"/>
+                <w:bCs w:val="false"/>
+                <w:sz w:val="14"/>
+                <w:szCs w:val="14"/>
+              </w:rPr>
+              <w:t xml:space="preserve">($16,319)</w:t>
+            </w:r>
+          </w:p>
+        </w:tc>
+        <w:tc>
+          <w:tcPr>
+            <w:tcW w:type="dxa" w:w="1500"/>
+            <w:tcMar>
+              <w:top w:type="dxa" w:w="50"/>
+              <w:left w:type="dxa" w:w="70"/>
+              <w:bottom w:type="dxa" w:w="50"/>
+              <w:right w:type="dxa" w:w="70"/>
+            </w:tcMar>
+          </w:tcPr>
+          <w:p>
+            <w:pPr>
+              <w:jc w:val="right"/>
+            </w:pPr>
+            <w:r>
+              <w:rPr>
+                <w:rFonts w:ascii="Calibri" w:cs="Calibri" w:eastAsia="Calibri" w:hAnsi="Calibri"/>
+                <w:b w:val="false"/>
+                <w:bCs w:val="false"/>
+                <w:sz w:val="14"/>
+                <w:szCs w:val="14"/>
+              </w:rPr>
+              <w:t xml:space="preserve">$114,179</w:t>
+            </w:r>
+          </w:p>
+        </w:tc>
+        <w:tc>
+          <w:tcPr>
+            <w:tcW w:type="dxa" w:w="1500"/>
+            <w:tcMar>
+              <w:top w:type="dxa" w:w="50"/>
+              <w:left w:type="dxa" w:w="70"/>
+              <w:bottom w:type="dxa" w:w="50"/>
+              <w:right w:type="dxa" w:w="70"/>
+            </w:tcMar>
+          </w:tcPr>
+          <w:p>
+            <w:pPr>
+              <w:jc w:val="right"/>
+            </w:pPr>
+            <w:r>
+              <w:rPr>
+                <w:rFonts w:ascii="Calibri" w:cs="Calibri" w:eastAsia="Calibri" w:hAnsi="Calibri"/>
+                <w:b w:val="false"/>
+                <w:bCs w:val="false"/>
+                <w:sz w:val="14"/>
+                <w:szCs w:val="14"/>
+              </w:rPr>
+              <w:t xml:space="preserve">$110,546</w:t>
             </w:r>
           </w:p>
         </w:tc>
@@ -9014,7 +9014,7 @@
                 <w:sz w:val="14"/>
                 <w:szCs w:val="14"/>
               </w:rPr>
-              <w:t xml:space="preserve">$225,175</w:t>
+              <w:t xml:space="preserve">$110,546</w:t>
             </w:r>
           </w:p>
         </w:tc>
@@ -9412,7 +9412,7 @@
                 <w:sz w:val="16"/>
                 <w:szCs w:val="16"/>
               </w:rPr>
-              <w:t xml:space="preserve">3,858</w:t>
+              <w:t xml:space="preserve">4,327</w:t>
             </w:r>
           </w:p>
         </w:tc>
@@ -9438,7 +9438,7 @@
                 <w:sz w:val="16"/>
                 <w:szCs w:val="16"/>
               </w:rPr>
-              <w:t xml:space="preserve">1,040</w:t>
+              <w:t xml:space="preserve">510</w:t>
             </w:r>
           </w:p>
         </w:tc>
@@ -9464,7 +9464,7 @@
                 <w:sz w:val="16"/>
                 <w:szCs w:val="16"/>
               </w:rPr>
-              <w:t xml:space="preserve">$7,710,741</w:t>
+              <w:t xml:space="preserve">$7,703,116</w:t>
             </w:r>
           </w:p>
         </w:tc>
@@ -9490,7 +9490,7 @@
                 <w:sz w:val="16"/>
                 <w:szCs w:val="16"/>
               </w:rPr>
-              <w:t xml:space="preserve">$4,939,481</w:t>
+              <w:t xml:space="preserve">$4,932,619</w:t>
             </w:r>
           </w:p>
         </w:tc>
@@ -9622,7 +9622,7 @@
                 <w:sz w:val="16"/>
                 <w:szCs w:val="16"/>
               </w:rPr>
-              <w:t xml:space="preserve">7,716</w:t>
+              <w:t xml:space="preserve">8,661</w:t>
             </w:r>
           </w:p>
         </w:tc>
@@ -9648,7 +9648,7 @@
                 <w:sz w:val="16"/>
                 <w:szCs w:val="16"/>
               </w:rPr>
-              <w:t xml:space="preserve">2,075</w:t>
+              <w:t xml:space="preserve">1,015</w:t>
             </w:r>
           </w:p>
         </w:tc>
@@ -9674,7 +9674,7 @@
                 <w:sz w:val="16"/>
                 <w:szCs w:val="16"/>
               </w:rPr>
-              <w:t xml:space="preserve">$17,507,708</w:t>
+              <w:t xml:space="preserve">$17,493,335</w:t>
             </w:r>
           </w:p>
         </w:tc>
@@ -9700,7 +9700,7 @@
                 <w:sz w:val="16"/>
                 <w:szCs w:val="16"/>
               </w:rPr>
-              <w:t xml:space="preserve">$11,987,146</w:t>
+              <w:t xml:space="preserve">$11,974,209</w:t>
             </w:r>
           </w:p>
         </w:tc>
@@ -9832,7 +9832,7 @@
                 <w:sz w:val="16"/>
                 <w:szCs w:val="16"/>
               </w:rPr>
-              <w:t xml:space="preserve">15,429</w:t>
+              <w:t xml:space="preserve">17,323</w:t>
             </w:r>
           </w:p>
         </w:tc>
@@ -9858,7 +9858,7 @@
                 <w:sz w:val="16"/>
                 <w:szCs w:val="16"/>
               </w:rPr>
-              <w:t xml:space="preserve">4,150</w:t>
+              <w:t xml:space="preserve">2,030</w:t>
             </w:r>
           </w:p>
         </w:tc>
@@ -9884,7 +9884,7 @@
                 <w:sz w:val="16"/>
                 <w:szCs w:val="16"/>
               </w:rPr>
-              <w:t xml:space="preserve">$39,188,824</w:t>
+              <w:t xml:space="preserve">$39,160,576</w:t>
             </w:r>
           </w:p>
         </w:tc>
@@ -9910,7 +9910,7 @@
                 <w:sz w:val="16"/>
                 <w:szCs w:val="16"/>
               </w:rPr>
-              <w:t xml:space="preserve">$27,647,079</w:t>
+              <w:t xml:space="preserve">$27,621,655</w:t>
             </w:r>
           </w:p>
         </w:tc>

</xml_diff>

<commit_message>
Market model: gross counts web sales (bug fix), clinical ramp slowed on Frank's order of growth; documents regenerated
Co-Authored-By: Claude Fable 5.1 <noreply@anthropic.com>
Claude-Session: https://claude.ai/code/session_01FdLL4Wp3bi12KNX6zHRo7N
</commit_message>
<xml_diff>
--- a/EZvoxa Market Model and Business Plan.docx
+++ b/EZvoxa Market Model and Business Plan.docx
@@ -3058,7 +3058,7 @@
           <w:sz w:val="22"/>
           <w:szCs w:val="22"/>
         </w:rPr>
-        <w:t xml:space="preserve">Frank's to set. Buyer share is new one-time buyers each year as a share of the counted consumer market; subscription attach is the share of all buyers to date who hold the Family Tether at year end. The school and clinical shares are Claude's best estimate of direct sales through the website (Frank's ask, 9 Sep 2026), one seller at first, districts owning the devices and EZ Voice supplying the software: Year 1 St. Lucie district-wide (about 100 seats) plus two neighboring districts at 20 seats, 140 seats; Year 2 eight Florida districts at 40 seats, 320; Year 3 twenty-five districts across Florida and the Southeast, 1,000 seats; Year 4 sixty districts, 2,400; Year 5 one hundred twenty districts, 4,800, which is 0.9% of the 13,349 districts and 3.7% of the counted seats. Clinics: 3, 10, 30, 60 and 100 facilities at 5 seats. Base is that estimate; Low is half; High is double. Consumer buyer shares are unchanged placeholders.</w:t>
+        <w:t xml:space="preserve">Frank's to set. Buyer share is new one-time buyers each year as a share of the counted consumer market; subscription attach is the share of all buyers to date who hold the Family Tether at year end. The school and clinical shares are Claude's best estimate of direct sales through the website (Frank's ask, 9 Sep 2026), one seller at first, districts owning the devices and EZ Voice supplying the software: Year 1 St. Lucie district-wide (about 100 seats) plus two neighboring districts at 20 seats, 140 seats; Year 2 eight Florida districts at 40 seats, 320; Year 3 twenty-five districts across Florida and the Southeast, 1,000 seats; Year 4 sixty districts, 2,400; Year 5 one hundred twenty districts, 4,800, which is 0.9% of the 13,349 districts and 3.7% of the counted seats. Clinics grow slowest (Frank, 9 Sep: individual sales, then school districts, then clinical): 2, 5, 12, 25 and 40 facilities at 5 seats. The dedicated-device AAC market is not in this widget, by Frank's instruction. Base is that estimate; Low is half; High is double. Consumer buyer shares are unchanged placeholders.</w:t>
       </w:r>
     </w:p>
     <w:tbl>
@@ -3344,7 +3344,7 @@
                 <w:sz w:val="16"/>
                 <w:szCs w:val="16"/>
               </w:rPr>
-              <w:t xml:space="preserve">0.1%, 0.4%, 1.2%, 2.5%, 4.1%</w:t>
+              <w:t xml:space="preserve">0.1%, 0.2%, 0.5%, 1.0%, 1.6%</w:t>
             </w:r>
           </w:p>
         </w:tc>
@@ -3476,7 +3476,7 @@
                 <w:sz w:val="16"/>
                 <w:szCs w:val="16"/>
               </w:rPr>
-              <w:t xml:space="preserve">0.3%, 0.8%, 2.5%, 4.9%, 8.2%</w:t>
+              <w:t xml:space="preserve">0.2%, 0.4%, 1.0%, 2.1%, 3.3%</w:t>
             </w:r>
           </w:p>
         </w:tc>
@@ -3608,7 +3608,7 @@
                 <w:sz w:val="16"/>
                 <w:szCs w:val="16"/>
               </w:rPr>
-              <w:t xml:space="preserve">0.5%, 1.6%, 4.9%, 9.8%, 16.4%</w:t>
+              <w:t xml:space="preserve">0.3%, 0.8%, 2.0%, 4.1%, 6.5%</w:t>
             </w:r>
           </w:p>
         </w:tc>
@@ -3674,7 +3674,7 @@
         <w:rPr>
           <w:rFonts w:ascii="Calibri" w:cs="Calibri" w:eastAsia="Calibri" w:hAnsi="Calibri"/>
         </w:rPr>
-        <w:t xml:space="preserve">All three models combined: five-year net $11,974,209</w:t>
+        <w:t xml:space="preserve">All three models combined: five-year net $11,907,278</w:t>
       </w:r>
     </w:p>
     <w:tbl>
@@ -3938,111 +3938,111 @@
                 <w:sz w:val="14"/>
                 <w:szCs w:val="14"/>
               </w:rPr>
-              <w:t xml:space="preserve">4,025 buyers, 1,006 subs, 155 seats</w:t>
-            </w:r>
-          </w:p>
-        </w:tc>
-        <w:tc>
-          <w:tcPr>
-            <w:tcW w:type="dxa" w:w="1500"/>
-            <w:tcMar>
-              <w:top w:type="dxa" w:w="50"/>
-              <w:left w:type="dxa" w:w="70"/>
-              <w:bottom w:type="dxa" w:w="50"/>
-              <w:right w:type="dxa" w:w="70"/>
-            </w:tcMar>
-          </w:tcPr>
-          <w:p>
-            <w:pPr>
-              <w:jc w:val="right"/>
-            </w:pPr>
-            <w:r>
-              <w:rPr>
-                <w:rFonts w:ascii="Calibri" w:cs="Calibri" w:eastAsia="Calibri" w:hAnsi="Calibri"/>
-                <w:b w:val="false"/>
-                <w:bCs w:val="false"/>
-                <w:sz w:val="14"/>
-                <w:szCs w:val="14"/>
-              </w:rPr>
-              <w:t xml:space="preserve">$482,133</w:t>
-            </w:r>
-          </w:p>
-        </w:tc>
-        <w:tc>
-          <w:tcPr>
-            <w:tcW w:type="dxa" w:w="1500"/>
-            <w:tcMar>
-              <w:top w:type="dxa" w:w="50"/>
-              <w:left w:type="dxa" w:w="70"/>
-              <w:bottom w:type="dxa" w:w="50"/>
-              <w:right w:type="dxa" w:w="70"/>
-            </w:tcMar>
-          </w:tcPr>
-          <w:p>
-            <w:pPr>
-              <w:jc w:val="right"/>
-            </w:pPr>
-            <w:r>
-              <w:rPr>
-                <w:rFonts w:ascii="Calibri" w:cs="Calibri" w:eastAsia="Calibri" w:hAnsi="Calibri"/>
-                <w:b w:val="false"/>
-                <w:bCs w:val="false"/>
-                <w:sz w:val="14"/>
-                <w:szCs w:val="14"/>
-              </w:rPr>
-              <w:t xml:space="preserve">($198,539)</w:t>
-            </w:r>
-          </w:p>
-        </w:tc>
-        <w:tc>
-          <w:tcPr>
-            <w:tcW w:type="dxa" w:w="1500"/>
-            <w:tcMar>
-              <w:top w:type="dxa" w:w="50"/>
-              <w:left w:type="dxa" w:w="70"/>
-              <w:bottom w:type="dxa" w:w="50"/>
-              <w:right w:type="dxa" w:w="70"/>
-            </w:tcMar>
-          </w:tcPr>
-          <w:p>
-            <w:pPr>
-              <w:jc w:val="right"/>
-            </w:pPr>
-            <w:r>
-              <w:rPr>
-                <w:rFonts w:ascii="Calibri" w:cs="Calibri" w:eastAsia="Calibri" w:hAnsi="Calibri"/>
-                <w:b w:val="false"/>
-                <w:bCs w:val="false"/>
-                <w:sz w:val="14"/>
-                <w:szCs w:val="14"/>
-              </w:rPr>
-              <w:t xml:space="preserve">$336,091</w:t>
-            </w:r>
-          </w:p>
-        </w:tc>
-        <w:tc>
-          <w:tcPr>
-            <w:tcW w:type="dxa" w:w="1500"/>
-            <w:tcMar>
-              <w:top w:type="dxa" w:w="50"/>
-              <w:left w:type="dxa" w:w="70"/>
-              <w:bottom w:type="dxa" w:w="50"/>
-              <w:right w:type="dxa" w:w="70"/>
-            </w:tcMar>
-          </w:tcPr>
-          <w:p>
-            <w:pPr>
-              <w:jc w:val="right"/>
-            </w:pPr>
-            <w:r>
-              <w:rPr>
-                <w:rFonts w:ascii="Calibri" w:cs="Calibri" w:eastAsia="Calibri" w:hAnsi="Calibri"/>
-                <w:b w:val="false"/>
-                <w:bCs w:val="false"/>
-                <w:sz w:val="14"/>
-                <w:szCs w:val="14"/>
-              </w:rPr>
-              <w:t xml:space="preserve">$283,594</w:t>
+              <w:t xml:space="preserve">4,025 buyers, 1,006 subs, 150 seats</w:t>
+            </w:r>
+          </w:p>
+        </w:tc>
+        <w:tc>
+          <w:tcPr>
+            <w:tcW w:type="dxa" w:w="1500"/>
+            <w:tcMar>
+              <w:top w:type="dxa" w:w="50"/>
+              <w:left w:type="dxa" w:w="70"/>
+              <w:bottom w:type="dxa" w:w="50"/>
+              <w:right w:type="dxa" w:w="70"/>
+            </w:tcMar>
+          </w:tcPr>
+          <w:p>
+            <w:pPr>
+              <w:jc w:val="right"/>
+            </w:pPr>
+            <w:r>
+              <w:rPr>
+                <w:rFonts w:ascii="Calibri" w:cs="Calibri" w:eastAsia="Calibri" w:hAnsi="Calibri"/>
+                <w:b w:val="false"/>
+                <w:bCs w:val="false"/>
+                <w:sz w:val="14"/>
+                <w:szCs w:val="14"/>
+              </w:rPr>
+              <w:t xml:space="preserve">$481,508</w:t>
+            </w:r>
+          </w:p>
+        </w:tc>
+        <w:tc>
+          <w:tcPr>
+            <w:tcW w:type="dxa" w:w="1500"/>
+            <w:tcMar>
+              <w:top w:type="dxa" w:w="50"/>
+              <w:left w:type="dxa" w:w="70"/>
+              <w:bottom w:type="dxa" w:w="50"/>
+              <w:right w:type="dxa" w:w="70"/>
+            </w:tcMar>
+          </w:tcPr>
+          <w:p>
+            <w:pPr>
+              <w:jc w:val="right"/>
+            </w:pPr>
+            <w:r>
+              <w:rPr>
+                <w:rFonts w:ascii="Calibri" w:cs="Calibri" w:eastAsia="Calibri" w:hAnsi="Calibri"/>
+                <w:b w:val="false"/>
+                <w:bCs w:val="false"/>
+                <w:sz w:val="14"/>
+                <w:szCs w:val="14"/>
+              </w:rPr>
+              <w:t xml:space="preserve">($198,477)</w:t>
+            </w:r>
+          </w:p>
+        </w:tc>
+        <w:tc>
+          <w:tcPr>
+            <w:tcW w:type="dxa" w:w="1500"/>
+            <w:tcMar>
+              <w:top w:type="dxa" w:w="50"/>
+              <w:left w:type="dxa" w:w="70"/>
+              <w:bottom w:type="dxa" w:w="50"/>
+              <w:right w:type="dxa" w:w="70"/>
+            </w:tcMar>
+          </w:tcPr>
+          <w:p>
+            <w:pPr>
+              <w:jc w:val="right"/>
+            </w:pPr>
+            <w:r>
+              <w:rPr>
+                <w:rFonts w:ascii="Calibri" w:cs="Calibri" w:eastAsia="Calibri" w:hAnsi="Calibri"/>
+                <w:b w:val="false"/>
+                <w:bCs w:val="false"/>
+                <w:sz w:val="14"/>
+                <w:szCs w:val="14"/>
+              </w:rPr>
+              <w:t xml:space="preserve">$335,528</w:t>
+            </w:r>
+          </w:p>
+        </w:tc>
+        <w:tc>
+          <w:tcPr>
+            <w:tcW w:type="dxa" w:w="1500"/>
+            <w:tcMar>
+              <w:top w:type="dxa" w:w="50"/>
+              <w:left w:type="dxa" w:w="70"/>
+              <w:bottom w:type="dxa" w:w="50"/>
+              <w:right w:type="dxa" w:w="70"/>
+            </w:tcMar>
+          </w:tcPr>
+          <w:p>
+            <w:pPr>
+              <w:jc w:val="right"/>
+            </w:pPr>
+            <w:r>
+              <w:rPr>
+                <w:rFonts w:ascii="Calibri" w:cs="Calibri" w:eastAsia="Calibri" w:hAnsi="Calibri"/>
+                <w:b w:val="false"/>
+                <w:bCs w:val="false"/>
+                <w:sz w:val="14"/>
+                <w:szCs w:val="14"/>
+              </w:rPr>
+              <w:t xml:space="preserve">$283,032</w:t>
             </w:r>
           </w:p>
         </w:tc>
@@ -4068,7 +4068,7 @@
                 <w:sz w:val="14"/>
                 <w:szCs w:val="14"/>
               </w:rPr>
-              <w:t xml:space="preserve">$283,594</w:t>
+              <w:t xml:space="preserve">$283,032</w:t>
             </w:r>
           </w:p>
         </w:tc>
@@ -4122,111 +4122,111 @@
                 <w:sz w:val="14"/>
                 <w:szCs w:val="14"/>
               </w:rPr>
-              <w:t xml:space="preserve">10,062 buyers, 3,522 subs, 370 seats</w:t>
-            </w:r>
-          </w:p>
-        </w:tc>
-        <w:tc>
-          <w:tcPr>
-            <w:tcW w:type="dxa" w:w="1500"/>
-            <w:tcMar>
-              <w:top w:type="dxa" w:w="50"/>
-              <w:left w:type="dxa" w:w="70"/>
-              <w:bottom w:type="dxa" w:w="50"/>
-              <w:right w:type="dxa" w:w="70"/>
-            </w:tcMar>
-          </w:tcPr>
-          <w:p>
-            <w:pPr>
-              <w:jc w:val="right"/>
-            </w:pPr>
-            <w:r>
-              <w:rPr>
-                <w:rFonts w:ascii="Calibri" w:cs="Calibri" w:eastAsia="Calibri" w:hAnsi="Calibri"/>
-                <w:b w:val="false"/>
-                <w:bCs w:val="false"/>
-                <w:sz w:val="14"/>
-                <w:szCs w:val="14"/>
-              </w:rPr>
-              <w:t xml:space="preserve">$1,323,754</w:t>
-            </w:r>
-          </w:p>
-        </w:tc>
-        <w:tc>
-          <w:tcPr>
-            <w:tcW w:type="dxa" w:w="1500"/>
-            <w:tcMar>
-              <w:top w:type="dxa" w:w="50"/>
-              <w:left w:type="dxa" w:w="70"/>
-              <w:bottom w:type="dxa" w:w="50"/>
-              <w:right w:type="dxa" w:w="70"/>
-            </w:tcMar>
-          </w:tcPr>
-          <w:p>
-            <w:pPr>
-              <w:jc w:val="right"/>
-            </w:pPr>
-            <w:r>
-              <w:rPr>
-                <w:rFonts w:ascii="Calibri" w:cs="Calibri" w:eastAsia="Calibri" w:hAnsi="Calibri"/>
-                <w:b w:val="false"/>
-                <w:bCs w:val="false"/>
-                <w:sz w:val="14"/>
-                <w:szCs w:val="14"/>
-              </w:rPr>
-              <w:t xml:space="preserve">($476,836)</w:t>
-            </w:r>
-          </w:p>
-        </w:tc>
-        <w:tc>
-          <w:tcPr>
-            <w:tcW w:type="dxa" w:w="1500"/>
-            <w:tcMar>
-              <w:top w:type="dxa" w:w="50"/>
-              <w:left w:type="dxa" w:w="70"/>
-              <w:bottom w:type="dxa" w:w="50"/>
-              <w:right w:type="dxa" w:w="70"/>
-            </w:tcMar>
-          </w:tcPr>
-          <w:p>
-            <w:pPr>
-              <w:jc w:val="right"/>
-            </w:pPr>
-            <w:r>
-              <w:rPr>
-                <w:rFonts w:ascii="Calibri" w:cs="Calibri" w:eastAsia="Calibri" w:hAnsi="Calibri"/>
-                <w:b w:val="false"/>
-                <w:bCs w:val="false"/>
-                <w:sz w:val="14"/>
-                <w:szCs w:val="14"/>
-              </w:rPr>
-              <w:t xml:space="preserve">$928,671</w:t>
-            </w:r>
-          </w:p>
-        </w:tc>
-        <w:tc>
-          <w:tcPr>
-            <w:tcW w:type="dxa" w:w="1500"/>
-            <w:tcMar>
-              <w:top w:type="dxa" w:w="50"/>
-              <w:left w:type="dxa" w:w="70"/>
-              <w:bottom w:type="dxa" w:w="50"/>
-              <w:right w:type="dxa" w:w="70"/>
-            </w:tcMar>
-          </w:tcPr>
-          <w:p>
-            <w:pPr>
-              <w:jc w:val="right"/>
-            </w:pPr>
-            <w:r>
-              <w:rPr>
-                <w:rFonts w:ascii="Calibri" w:cs="Calibri" w:eastAsia="Calibri" w:hAnsi="Calibri"/>
-                <w:b w:val="false"/>
-                <w:bCs w:val="false"/>
-                <w:sz w:val="14"/>
-                <w:szCs w:val="14"/>
-              </w:rPr>
-              <w:t xml:space="preserve">$846,918</w:t>
+              <w:t xml:space="preserve">10,062 buyers, 3,522 subs, 345 seats</w:t>
+            </w:r>
+          </w:p>
+        </w:tc>
+        <w:tc>
+          <w:tcPr>
+            <w:tcW w:type="dxa" w:w="1500"/>
+            <w:tcMar>
+              <w:top w:type="dxa" w:w="50"/>
+              <w:left w:type="dxa" w:w="70"/>
+              <w:bottom w:type="dxa" w:w="50"/>
+              <w:right w:type="dxa" w:w="70"/>
+            </w:tcMar>
+          </w:tcPr>
+          <w:p>
+            <w:pPr>
+              <w:jc w:val="right"/>
+            </w:pPr>
+            <w:r>
+              <w:rPr>
+                <w:rFonts w:ascii="Calibri" w:cs="Calibri" w:eastAsia="Calibri" w:hAnsi="Calibri"/>
+                <w:b w:val="false"/>
+                <w:bCs w:val="false"/>
+                <w:sz w:val="14"/>
+                <w:szCs w:val="14"/>
+              </w:rPr>
+              <w:t xml:space="preserve">$1,320,629</w:t>
+            </w:r>
+          </w:p>
+        </w:tc>
+        <w:tc>
+          <w:tcPr>
+            <w:tcW w:type="dxa" w:w="1500"/>
+            <w:tcMar>
+              <w:top w:type="dxa" w:w="50"/>
+              <w:left w:type="dxa" w:w="70"/>
+              <w:bottom w:type="dxa" w:w="50"/>
+              <w:right w:type="dxa" w:w="70"/>
+            </w:tcMar>
+          </w:tcPr>
+          <w:p>
+            <w:pPr>
+              <w:jc w:val="right"/>
+            </w:pPr>
+            <w:r>
+              <w:rPr>
+                <w:rFonts w:ascii="Calibri" w:cs="Calibri" w:eastAsia="Calibri" w:hAnsi="Calibri"/>
+                <w:b w:val="false"/>
+                <w:bCs w:val="false"/>
+                <w:sz w:val="14"/>
+                <w:szCs w:val="14"/>
+              </w:rPr>
+              <w:t xml:space="preserve">($476,523)</w:t>
+            </w:r>
+          </w:p>
+        </w:tc>
+        <w:tc>
+          <w:tcPr>
+            <w:tcW w:type="dxa" w:w="1500"/>
+            <w:tcMar>
+              <w:top w:type="dxa" w:w="50"/>
+              <w:left w:type="dxa" w:w="70"/>
+              <w:bottom w:type="dxa" w:w="50"/>
+              <w:right w:type="dxa" w:w="70"/>
+            </w:tcMar>
+          </w:tcPr>
+          <w:p>
+            <w:pPr>
+              <w:jc w:val="right"/>
+            </w:pPr>
+            <w:r>
+              <w:rPr>
+                <w:rFonts w:ascii="Calibri" w:cs="Calibri" w:eastAsia="Calibri" w:hAnsi="Calibri"/>
+                <w:b w:val="false"/>
+                <w:bCs w:val="false"/>
+                <w:sz w:val="14"/>
+                <w:szCs w:val="14"/>
+              </w:rPr>
+              <w:t xml:space="preserve">$925,859</w:t>
+            </w:r>
+          </w:p>
+        </w:tc>
+        <w:tc>
+          <w:tcPr>
+            <w:tcW w:type="dxa" w:w="1500"/>
+            <w:tcMar>
+              <w:top w:type="dxa" w:w="50"/>
+              <w:left w:type="dxa" w:w="70"/>
+              <w:bottom w:type="dxa" w:w="50"/>
+              <w:right w:type="dxa" w:w="70"/>
+            </w:tcMar>
+          </w:tcPr>
+          <w:p>
+            <w:pPr>
+              <w:jc w:val="right"/>
+            </w:pPr>
+            <w:r>
+              <w:rPr>
+                <w:rFonts w:ascii="Calibri" w:cs="Calibri" w:eastAsia="Calibri" w:hAnsi="Calibri"/>
+                <w:b w:val="false"/>
+                <w:bCs w:val="false"/>
+                <w:sz w:val="14"/>
+                <w:szCs w:val="14"/>
+              </w:rPr>
+              <w:t xml:space="preserve">$844,106</w:t>
             </w:r>
           </w:p>
         </w:tc>
@@ -4252,7 +4252,7 @@
                 <w:sz w:val="14"/>
                 <w:szCs w:val="14"/>
               </w:rPr>
-              <w:t xml:space="preserve">$1,130,512</w:t>
+              <w:t xml:space="preserve">$1,127,138</w:t>
             </w:r>
           </w:p>
         </w:tc>
@@ -4306,111 +4306,111 @@
                 <w:sz w:val="14"/>
                 <w:szCs w:val="14"/>
               </w:rPr>
-              <w:t xml:space="preserve">20,124 buyers, 8,553 subs, 1,150 seats</w:t>
-            </w:r>
-          </w:p>
-        </w:tc>
-        <w:tc>
-          <w:tcPr>
-            <w:tcW w:type="dxa" w:w="1500"/>
-            <w:tcMar>
-              <w:top w:type="dxa" w:w="50"/>
-              <w:left w:type="dxa" w:w="70"/>
-              <w:bottom w:type="dxa" w:w="50"/>
-              <w:right w:type="dxa" w:w="70"/>
-            </w:tcMar>
-          </w:tcPr>
-          <w:p>
-            <w:pPr>
-              <w:jc w:val="right"/>
-            </w:pPr>
-            <w:r>
-              <w:rPr>
-                <w:rFonts w:ascii="Calibri" w:cs="Calibri" w:eastAsia="Calibri" w:hAnsi="Calibri"/>
-                <w:b w:val="false"/>
-                <w:bCs w:val="false"/>
-                <w:sz w:val="14"/>
-                <w:szCs w:val="14"/>
-              </w:rPr>
-              <w:t xml:space="preserve">$2,879,713</w:t>
-            </w:r>
-          </w:p>
-        </w:tc>
-        <w:tc>
-          <w:tcPr>
-            <w:tcW w:type="dxa" w:w="1500"/>
-            <w:tcMar>
-              <w:top w:type="dxa" w:w="50"/>
-              <w:left w:type="dxa" w:w="70"/>
-              <w:bottom w:type="dxa" w:w="50"/>
-              <w:right w:type="dxa" w:w="70"/>
-            </w:tcMar>
-          </w:tcPr>
-          <w:p>
-            <w:pPr>
-              <w:jc w:val="right"/>
-            </w:pPr>
-            <w:r>
-              <w:rPr>
-                <w:rFonts w:ascii="Calibri" w:cs="Calibri" w:eastAsia="Calibri" w:hAnsi="Calibri"/>
-                <w:b w:val="false"/>
-                <w:bCs w:val="false"/>
-                <w:sz w:val="14"/>
-                <w:szCs w:val="14"/>
-              </w:rPr>
-              <w:t xml:space="preserve">($953,554)</w:t>
-            </w:r>
-          </w:p>
-        </w:tc>
-        <w:tc>
-          <w:tcPr>
-            <w:tcW w:type="dxa" w:w="1500"/>
-            <w:tcMar>
-              <w:top w:type="dxa" w:w="50"/>
-              <w:left w:type="dxa" w:w="70"/>
-              <w:bottom w:type="dxa" w:w="50"/>
-              <w:right w:type="dxa" w:w="70"/>
-            </w:tcMar>
-          </w:tcPr>
-          <w:p>
-            <w:pPr>
-              <w:jc w:val="right"/>
-            </w:pPr>
-            <w:r>
-              <w:rPr>
-                <w:rFonts w:ascii="Calibri" w:cs="Calibri" w:eastAsia="Calibri" w:hAnsi="Calibri"/>
-                <w:b w:val="false"/>
-                <w:bCs w:val="false"/>
-                <w:sz w:val="14"/>
-                <w:szCs w:val="14"/>
-              </w:rPr>
-              <w:t xml:space="preserve">$2,039,112</w:t>
-            </w:r>
-          </w:p>
-        </w:tc>
-        <w:tc>
-          <w:tcPr>
-            <w:tcW w:type="dxa" w:w="1500"/>
-            <w:tcMar>
-              <w:top w:type="dxa" w:w="50"/>
-              <w:left w:type="dxa" w:w="70"/>
-              <w:bottom w:type="dxa" w:w="50"/>
-              <w:right w:type="dxa" w:w="70"/>
-            </w:tcMar>
-          </w:tcPr>
-          <w:p>
-            <w:pPr>
-              <w:jc w:val="right"/>
-            </w:pPr>
-            <w:r>
-              <w:rPr>
-                <w:rFonts w:ascii="Calibri" w:cs="Calibri" w:eastAsia="Calibri" w:hAnsi="Calibri"/>
-                <w:b w:val="false"/>
-                <w:bCs w:val="false"/>
-                <w:sz w:val="14"/>
-                <w:szCs w:val="14"/>
-              </w:rPr>
-              <w:t xml:space="preserve">$1,926,159</w:t>
+              <w:t xml:space="preserve">20,124 buyers, 8,553 subs, 1,060 seats</w:t>
+            </w:r>
+          </w:p>
+        </w:tc>
+        <w:tc>
+          <w:tcPr>
+            <w:tcW w:type="dxa" w:w="1500"/>
+            <w:tcMar>
+              <w:top w:type="dxa" w:w="50"/>
+              <w:left w:type="dxa" w:w="70"/>
+              <w:bottom w:type="dxa" w:w="50"/>
+              <w:right w:type="dxa" w:w="70"/>
+            </w:tcMar>
+          </w:tcPr>
+          <w:p>
+            <w:pPr>
+              <w:jc w:val="right"/>
+            </w:pPr>
+            <w:r>
+              <w:rPr>
+                <w:rFonts w:ascii="Calibri" w:cs="Calibri" w:eastAsia="Calibri" w:hAnsi="Calibri"/>
+                <w:b w:val="false"/>
+                <w:bCs w:val="false"/>
+                <w:sz w:val="14"/>
+                <w:szCs w:val="14"/>
+              </w:rPr>
+              <w:t xml:space="preserve">$2,868,464</w:t>
+            </w:r>
+          </w:p>
+        </w:tc>
+        <w:tc>
+          <w:tcPr>
+            <w:tcW w:type="dxa" w:w="1500"/>
+            <w:tcMar>
+              <w:top w:type="dxa" w:w="50"/>
+              <w:left w:type="dxa" w:w="70"/>
+              <w:bottom w:type="dxa" w:w="50"/>
+              <w:right w:type="dxa" w:w="70"/>
+            </w:tcMar>
+          </w:tcPr>
+          <w:p>
+            <w:pPr>
+              <w:jc w:val="right"/>
+            </w:pPr>
+            <w:r>
+              <w:rPr>
+                <w:rFonts w:ascii="Calibri" w:cs="Calibri" w:eastAsia="Calibri" w:hAnsi="Calibri"/>
+                <w:b w:val="false"/>
+                <w:bCs w:val="false"/>
+                <w:sz w:val="14"/>
+                <w:szCs w:val="14"/>
+              </w:rPr>
+              <w:t xml:space="preserve">($952,429)</w:t>
+            </w:r>
+          </w:p>
+        </w:tc>
+        <w:tc>
+          <w:tcPr>
+            <w:tcW w:type="dxa" w:w="1500"/>
+            <w:tcMar>
+              <w:top w:type="dxa" w:w="50"/>
+              <w:left w:type="dxa" w:w="70"/>
+              <w:bottom w:type="dxa" w:w="50"/>
+              <w:right w:type="dxa" w:w="70"/>
+            </w:tcMar>
+          </w:tcPr>
+          <w:p>
+            <w:pPr>
+              <w:jc w:val="right"/>
+            </w:pPr>
+            <w:r>
+              <w:rPr>
+                <w:rFonts w:ascii="Calibri" w:cs="Calibri" w:eastAsia="Calibri" w:hAnsi="Calibri"/>
+                <w:b w:val="false"/>
+                <w:bCs w:val="false"/>
+                <w:sz w:val="14"/>
+                <w:szCs w:val="14"/>
+              </w:rPr>
+              <w:t xml:space="preserve">$2,028,988</w:t>
+            </w:r>
+          </w:p>
+        </w:tc>
+        <w:tc>
+          <w:tcPr>
+            <w:tcW w:type="dxa" w:w="1500"/>
+            <w:tcMar>
+              <w:top w:type="dxa" w:w="50"/>
+              <w:left w:type="dxa" w:w="70"/>
+              <w:bottom w:type="dxa" w:w="50"/>
+              <w:right w:type="dxa" w:w="70"/>
+            </w:tcMar>
+          </w:tcPr>
+          <w:p>
+            <w:pPr>
+              <w:jc w:val="right"/>
+            </w:pPr>
+            <w:r>
+              <w:rPr>
+                <w:rFonts w:ascii="Calibri" w:cs="Calibri" w:eastAsia="Calibri" w:hAnsi="Calibri"/>
+                <w:b w:val="false"/>
+                <w:bCs w:val="false"/>
+                <w:sz w:val="14"/>
+                <w:szCs w:val="14"/>
+              </w:rPr>
+              <w:t xml:space="preserve">$1,916,035</w:t>
             </w:r>
           </w:p>
         </w:tc>
@@ -4436,7 +4436,7 @@
                 <w:sz w:val="14"/>
                 <w:szCs w:val="14"/>
               </w:rPr>
-              <w:t xml:space="preserve">$3,056,671</w:t>
+              <w:t xml:space="preserve">$3,043,173</w:t>
             </w:r>
           </w:p>
         </w:tc>
@@ -4490,111 +4490,111 @@
                 <w:sz w:val="14"/>
                 <w:szCs w:val="14"/>
               </w:rPr>
-              <w:t xml:space="preserve">32,198 buyers, 16,602 subs, 2,701 seats</w:t>
-            </w:r>
-          </w:p>
-        </w:tc>
-        <w:tc>
-          <w:tcPr>
-            <w:tcW w:type="dxa" w:w="1500"/>
-            <w:tcMar>
-              <w:top w:type="dxa" w:w="50"/>
-              <w:left w:type="dxa" w:w="70"/>
-              <w:bottom w:type="dxa" w:w="50"/>
-              <w:right w:type="dxa" w:w="70"/>
-            </w:tcMar>
-          </w:tcPr>
-          <w:p>
-            <w:pPr>
-              <w:jc w:val="right"/>
-            </w:pPr>
-            <w:r>
-              <w:rPr>
-                <w:rFonts w:ascii="Calibri" w:cs="Calibri" w:eastAsia="Calibri" w:hAnsi="Calibri"/>
-                <w:b w:val="false"/>
-                <w:bCs w:val="false"/>
-                <w:sz w:val="14"/>
-                <w:szCs w:val="14"/>
-              </w:rPr>
-              <w:t xml:space="preserve">$5,064,867</w:t>
-            </w:r>
-          </w:p>
-        </w:tc>
-        <w:tc>
-          <w:tcPr>
-            <w:tcW w:type="dxa" w:w="1500"/>
-            <w:tcMar>
-              <w:top w:type="dxa" w:w="50"/>
-              <w:left w:type="dxa" w:w="70"/>
-              <w:bottom w:type="dxa" w:w="50"/>
-              <w:right w:type="dxa" w:w="70"/>
-            </w:tcMar>
-          </w:tcPr>
-          <w:p>
-            <w:pPr>
-              <w:jc w:val="right"/>
-            </w:pPr>
-            <w:r>
-              <w:rPr>
-                <w:rFonts w:ascii="Calibri" w:cs="Calibri" w:eastAsia="Calibri" w:hAnsi="Calibri"/>
-                <w:b w:val="false"/>
-                <w:bCs w:val="false"/>
-                <w:sz w:val="14"/>
-                <w:szCs w:val="14"/>
-              </w:rPr>
-              <w:t xml:space="preserve">($1,582,539)</w:t>
-            </w:r>
-          </w:p>
-        </w:tc>
-        <w:tc>
-          <w:tcPr>
-            <w:tcW w:type="dxa" w:w="1500"/>
-            <w:tcMar>
-              <w:top w:type="dxa" w:w="50"/>
-              <w:left w:type="dxa" w:w="70"/>
-              <w:bottom w:type="dxa" w:w="50"/>
-              <w:right w:type="dxa" w:w="70"/>
-            </w:tcMar>
-          </w:tcPr>
-          <w:p>
-            <w:pPr>
-              <w:jc w:val="right"/>
-            </w:pPr>
-            <w:r>
-              <w:rPr>
-                <w:rFonts w:ascii="Calibri" w:cs="Calibri" w:eastAsia="Calibri" w:hAnsi="Calibri"/>
-                <w:b w:val="false"/>
-                <w:bCs w:val="false"/>
-                <w:sz w:val="14"/>
-                <w:szCs w:val="14"/>
-              </w:rPr>
-              <w:t xml:space="preserve">$3,621,581</w:t>
-            </w:r>
-          </w:p>
-        </w:tc>
-        <w:tc>
-          <w:tcPr>
-            <w:tcW w:type="dxa" w:w="1500"/>
-            <w:tcMar>
-              <w:top w:type="dxa" w:w="50"/>
-              <w:left w:type="dxa" w:w="70"/>
-              <w:bottom w:type="dxa" w:w="50"/>
-              <w:right w:type="dxa" w:w="70"/>
-            </w:tcMar>
-          </w:tcPr>
-          <w:p>
-            <w:pPr>
-              <w:jc w:val="right"/>
-            </w:pPr>
-            <w:r>
-              <w:rPr>
-                <w:rFonts w:ascii="Calibri" w:cs="Calibri" w:eastAsia="Calibri" w:hAnsi="Calibri"/>
-                <w:b w:val="false"/>
-                <w:bCs w:val="false"/>
-                <w:sz w:val="14"/>
-                <w:szCs w:val="14"/>
-              </w:rPr>
-              <w:t xml:space="preserve">$3,482,328</w:t>
+              <w:t xml:space="preserve">32,198 buyers, 16,602 subs, 2,526 seats</w:t>
+            </w:r>
+          </w:p>
+        </w:tc>
+        <w:tc>
+          <w:tcPr>
+            <w:tcW w:type="dxa" w:w="1500"/>
+            <w:tcMar>
+              <w:top w:type="dxa" w:w="50"/>
+              <w:left w:type="dxa" w:w="70"/>
+              <w:bottom w:type="dxa" w:w="50"/>
+              <w:right w:type="dxa" w:w="70"/>
+            </w:tcMar>
+          </w:tcPr>
+          <w:p>
+            <w:pPr>
+              <w:jc w:val="right"/>
+            </w:pPr>
+            <w:r>
+              <w:rPr>
+                <w:rFonts w:ascii="Calibri" w:cs="Calibri" w:eastAsia="Calibri" w:hAnsi="Calibri"/>
+                <w:b w:val="false"/>
+                <w:bCs w:val="false"/>
+                <w:sz w:val="14"/>
+                <w:szCs w:val="14"/>
+              </w:rPr>
+              <w:t xml:space="preserve">$5,042,993</w:t>
+            </w:r>
+          </w:p>
+        </w:tc>
+        <w:tc>
+          <w:tcPr>
+            <w:tcW w:type="dxa" w:w="1500"/>
+            <w:tcMar>
+              <w:top w:type="dxa" w:w="50"/>
+              <w:left w:type="dxa" w:w="70"/>
+              <w:bottom w:type="dxa" w:w="50"/>
+              <w:right w:type="dxa" w:w="70"/>
+            </w:tcMar>
+          </w:tcPr>
+          <w:p>
+            <w:pPr>
+              <w:jc w:val="right"/>
+            </w:pPr>
+            <w:r>
+              <w:rPr>
+                <w:rFonts w:ascii="Calibri" w:cs="Calibri" w:eastAsia="Calibri" w:hAnsi="Calibri"/>
+                <w:b w:val="false"/>
+                <w:bCs w:val="false"/>
+                <w:sz w:val="14"/>
+                <w:szCs w:val="14"/>
+              </w:rPr>
+              <w:t xml:space="preserve">($1,580,351)</w:t>
+            </w:r>
+          </w:p>
+        </w:tc>
+        <w:tc>
+          <w:tcPr>
+            <w:tcW w:type="dxa" w:w="1500"/>
+            <w:tcMar>
+              <w:top w:type="dxa" w:w="50"/>
+              <w:left w:type="dxa" w:w="70"/>
+              <w:bottom w:type="dxa" w:w="50"/>
+              <w:right w:type="dxa" w:w="70"/>
+            </w:tcMar>
+          </w:tcPr>
+          <w:p>
+            <w:pPr>
+              <w:jc w:val="right"/>
+            </w:pPr>
+            <w:r>
+              <w:rPr>
+                <w:rFonts w:ascii="Calibri" w:cs="Calibri" w:eastAsia="Calibri" w:hAnsi="Calibri"/>
+                <w:b w:val="false"/>
+                <w:bCs w:val="false"/>
+                <w:sz w:val="14"/>
+                <w:szCs w:val="14"/>
+              </w:rPr>
+              <w:t xml:space="preserve">$3,601,895</w:t>
+            </w:r>
+          </w:p>
+        </w:tc>
+        <w:tc>
+          <w:tcPr>
+            <w:tcW w:type="dxa" w:w="1500"/>
+            <w:tcMar>
+              <w:top w:type="dxa" w:w="50"/>
+              <w:left w:type="dxa" w:w="70"/>
+              <w:bottom w:type="dxa" w:w="50"/>
+              <w:right w:type="dxa" w:w="70"/>
+            </w:tcMar>
+          </w:tcPr>
+          <w:p>
+            <w:pPr>
+              <w:jc w:val="right"/>
+            </w:pPr>
+            <w:r>
+              <w:rPr>
+                <w:rFonts w:ascii="Calibri" w:cs="Calibri" w:eastAsia="Calibri" w:hAnsi="Calibri"/>
+                <w:b w:val="false"/>
+                <w:bCs w:val="false"/>
+                <w:sz w:val="14"/>
+                <w:szCs w:val="14"/>
+              </w:rPr>
+              <w:t xml:space="preserve">$3,462,642</w:t>
             </w:r>
           </w:p>
         </w:tc>
@@ -4620,7 +4620,7 @@
                 <w:sz w:val="14"/>
                 <w:szCs w:val="14"/>
               </w:rPr>
-              <w:t xml:space="preserve">$6,538,999</w:t>
+              <w:t xml:space="preserve">$6,505,815</w:t>
             </w:r>
           </w:p>
         </w:tc>
@@ -4674,111 +4674,111 @@
                 <w:sz w:val="14"/>
                 <w:szCs w:val="14"/>
               </w:rPr>
-              <w:t xml:space="preserve">44,272 buyers, 27,670 subs, 5,300 seats</w:t>
-            </w:r>
-          </w:p>
-        </w:tc>
-        <w:tc>
-          <w:tcPr>
-            <w:tcW w:type="dxa" w:w="1500"/>
-            <w:tcMar>
-              <w:top w:type="dxa" w:w="50"/>
-              <w:left w:type="dxa" w:w="70"/>
-              <w:bottom w:type="dxa" w:w="50"/>
-              <w:right w:type="dxa" w:w="70"/>
-            </w:tcMar>
-          </w:tcPr>
-          <w:p>
-            <w:pPr>
-              <w:jc w:val="right"/>
-            </w:pPr>
-            <w:r>
-              <w:rPr>
-                <w:rFonts w:ascii="Calibri" w:cs="Calibri" w:eastAsia="Calibri" w:hAnsi="Calibri"/>
-                <w:b w:val="false"/>
-                <w:bCs w:val="false"/>
-                <w:sz w:val="14"/>
-                <w:szCs w:val="14"/>
-              </w:rPr>
-              <w:t xml:space="preserve">$7,742,868</w:t>
-            </w:r>
-          </w:p>
-        </w:tc>
-        <w:tc>
-          <w:tcPr>
-            <w:tcW w:type="dxa" w:w="1500"/>
-            <w:tcMar>
-              <w:top w:type="dxa" w:w="50"/>
-              <w:left w:type="dxa" w:w="70"/>
-              <w:bottom w:type="dxa" w:w="50"/>
-              <w:right w:type="dxa" w:w="70"/>
-            </w:tcMar>
-          </w:tcPr>
-          <w:p>
-            <w:pPr>
-              <w:jc w:val="right"/>
-            </w:pPr>
-            <w:r>
-              <w:rPr>
-                <w:rFonts w:ascii="Calibri" w:cs="Calibri" w:eastAsia="Calibri" w:hAnsi="Calibri"/>
-                <w:b w:val="false"/>
-                <w:bCs w:val="false"/>
-                <w:sz w:val="14"/>
-                <w:szCs w:val="14"/>
-              </w:rPr>
-              <w:t xml:space="preserve">($2,307,658)</w:t>
-            </w:r>
-          </w:p>
-        </w:tc>
-        <w:tc>
-          <w:tcPr>
-            <w:tcW w:type="dxa" w:w="1500"/>
-            <w:tcMar>
-              <w:top w:type="dxa" w:w="50"/>
-              <w:left w:type="dxa" w:w="70"/>
-              <w:bottom w:type="dxa" w:w="50"/>
-              <w:right w:type="dxa" w:w="70"/>
-            </w:tcMar>
-          </w:tcPr>
-          <w:p>
-            <w:pPr>
-              <w:jc w:val="right"/>
-            </w:pPr>
-            <w:r>
-              <w:rPr>
-                <w:rFonts w:ascii="Calibri" w:cs="Calibri" w:eastAsia="Calibri" w:hAnsi="Calibri"/>
-                <w:b w:val="false"/>
-                <w:bCs w:val="false"/>
-                <w:sz w:val="14"/>
-                <w:szCs w:val="14"/>
-              </w:rPr>
-              <w:t xml:space="preserve">$5,593,192</w:t>
-            </w:r>
-          </w:p>
-        </w:tc>
-        <w:tc>
-          <w:tcPr>
-            <w:tcW w:type="dxa" w:w="1500"/>
-            <w:tcMar>
-              <w:top w:type="dxa" w:w="50"/>
-              <w:left w:type="dxa" w:w="70"/>
-              <w:bottom w:type="dxa" w:w="50"/>
-              <w:right w:type="dxa" w:w="70"/>
-            </w:tcMar>
-          </w:tcPr>
-          <w:p>
-            <w:pPr>
-              <w:jc w:val="right"/>
-            </w:pPr>
-            <w:r>
-              <w:rPr>
-                <w:rFonts w:ascii="Calibri" w:cs="Calibri" w:eastAsia="Calibri" w:hAnsi="Calibri"/>
-                <w:b w:val="false"/>
-                <w:bCs w:val="false"/>
-                <w:sz w:val="14"/>
-                <w:szCs w:val="14"/>
-              </w:rPr>
-              <w:t xml:space="preserve">$5,435,210</w:t>
+              <w:t xml:space="preserve">44,272 buyers, 27,670 subs, 5,000 seats</w:t>
+            </w:r>
+          </w:p>
+        </w:tc>
+        <w:tc>
+          <w:tcPr>
+            <w:tcW w:type="dxa" w:w="1500"/>
+            <w:tcMar>
+              <w:top w:type="dxa" w:w="50"/>
+              <w:left w:type="dxa" w:w="70"/>
+              <w:bottom w:type="dxa" w:w="50"/>
+              <w:right w:type="dxa" w:w="70"/>
+            </w:tcMar>
+          </w:tcPr>
+          <w:p>
+            <w:pPr>
+              <w:jc w:val="right"/>
+            </w:pPr>
+            <w:r>
+              <w:rPr>
+                <w:rFonts w:ascii="Calibri" w:cs="Calibri" w:eastAsia="Calibri" w:hAnsi="Calibri"/>
+                <w:b w:val="false"/>
+                <w:bCs w:val="false"/>
+                <w:sz w:val="14"/>
+                <w:szCs w:val="14"/>
+              </w:rPr>
+              <w:t xml:space="preserve">$7,705,371</w:t>
+            </w:r>
+          </w:p>
+        </w:tc>
+        <w:tc>
+          <w:tcPr>
+            <w:tcW w:type="dxa" w:w="1500"/>
+            <w:tcMar>
+              <w:top w:type="dxa" w:w="50"/>
+              <w:left w:type="dxa" w:w="70"/>
+              <w:bottom w:type="dxa" w:w="50"/>
+              <w:right w:type="dxa" w:w="70"/>
+            </w:tcMar>
+          </w:tcPr>
+          <w:p>
+            <w:pPr>
+              <w:jc w:val="right"/>
+            </w:pPr>
+            <w:r>
+              <w:rPr>
+                <w:rFonts w:ascii="Calibri" w:cs="Calibri" w:eastAsia="Calibri" w:hAnsi="Calibri"/>
+                <w:b w:val="false"/>
+                <w:bCs w:val="false"/>
+                <w:sz w:val="14"/>
+                <w:szCs w:val="14"/>
+              </w:rPr>
+              <w:t xml:space="preserve">($2,303,908)</w:t>
+            </w:r>
+          </w:p>
+        </w:tc>
+        <w:tc>
+          <w:tcPr>
+            <w:tcW w:type="dxa" w:w="1500"/>
+            <w:tcMar>
+              <w:top w:type="dxa" w:w="50"/>
+              <w:left w:type="dxa" w:w="70"/>
+              <w:bottom w:type="dxa" w:w="50"/>
+              <w:right w:type="dxa" w:w="70"/>
+            </w:tcMar>
+          </w:tcPr>
+          <w:p>
+            <w:pPr>
+              <w:jc w:val="right"/>
+            </w:pPr>
+            <w:r>
+              <w:rPr>
+                <w:rFonts w:ascii="Calibri" w:cs="Calibri" w:eastAsia="Calibri" w:hAnsi="Calibri"/>
+                <w:b w:val="false"/>
+                <w:bCs w:val="false"/>
+                <w:sz w:val="14"/>
+                <w:szCs w:val="14"/>
+              </w:rPr>
+              <w:t xml:space="preserve">$5,559,445</w:t>
+            </w:r>
+          </w:p>
+        </w:tc>
+        <w:tc>
+          <w:tcPr>
+            <w:tcW w:type="dxa" w:w="1500"/>
+            <w:tcMar>
+              <w:top w:type="dxa" w:w="50"/>
+              <w:left w:type="dxa" w:w="70"/>
+              <w:bottom w:type="dxa" w:w="50"/>
+              <w:right w:type="dxa" w:w="70"/>
+            </w:tcMar>
+          </w:tcPr>
+          <w:p>
+            <w:pPr>
+              <w:jc w:val="right"/>
+            </w:pPr>
+            <w:r>
+              <w:rPr>
+                <w:rFonts w:ascii="Calibri" w:cs="Calibri" w:eastAsia="Calibri" w:hAnsi="Calibri"/>
+                <w:b w:val="false"/>
+                <w:bCs w:val="false"/>
+                <w:sz w:val="14"/>
+                <w:szCs w:val="14"/>
+              </w:rPr>
+              <w:t xml:space="preserve">$5,401,463</w:t>
             </w:r>
           </w:p>
         </w:tc>
@@ -4804,7 +4804,7 @@
                 <w:sz w:val="14"/>
                 <w:szCs w:val="14"/>
               </w:rPr>
-              <w:t xml:space="preserve">$11,974,209</w:t>
+              <w:t xml:space="preserve">$11,907,278</w:t>
             </w:r>
           </w:p>
         </w:tc>
@@ -4884,85 +4884,85 @@
                 <w:sz w:val="14"/>
                 <w:szCs w:val="14"/>
               </w:rPr>
-              <w:t xml:space="preserve">$17,493,335</w:t>
-            </w:r>
-          </w:p>
-        </w:tc>
-        <w:tc>
-          <w:tcPr>
-            <w:tcW w:type="dxa" w:w="1500"/>
-            <w:tcMar>
-              <w:top w:type="dxa" w:w="50"/>
-              <w:left w:type="dxa" w:w="70"/>
-              <w:bottom w:type="dxa" w:w="50"/>
-              <w:right w:type="dxa" w:w="70"/>
-            </w:tcMar>
-          </w:tcPr>
-          <w:p>
-            <w:pPr>
-              <w:jc w:val="right"/>
-            </w:pPr>
-            <w:r>
-              <w:rPr>
-                <w:rFonts w:ascii="Calibri" w:cs="Calibri" w:eastAsia="Calibri" w:hAnsi="Calibri"/>
-                <w:b w:val="false"/>
-                <w:bCs w:val="false"/>
-                <w:sz w:val="14"/>
-                <w:szCs w:val="14"/>
-              </w:rPr>
-              <w:t xml:space="preserve">($5,519,126)</w:t>
-            </w:r>
-          </w:p>
-        </w:tc>
-        <w:tc>
-          <w:tcPr>
-            <w:tcW w:type="dxa" w:w="1500"/>
-            <w:tcMar>
-              <w:top w:type="dxa" w:w="50"/>
-              <w:left w:type="dxa" w:w="70"/>
-              <w:bottom w:type="dxa" w:w="50"/>
-              <w:right w:type="dxa" w:w="70"/>
-            </w:tcMar>
-          </w:tcPr>
-          <w:p>
-            <w:pPr>
-              <w:jc w:val="right"/>
-            </w:pPr>
-            <w:r>
-              <w:rPr>
-                <w:rFonts w:ascii="Calibri" w:cs="Calibri" w:eastAsia="Calibri" w:hAnsi="Calibri"/>
-                <w:b w:val="false"/>
-                <w:bCs w:val="false"/>
-                <w:sz w:val="14"/>
-                <w:szCs w:val="14"/>
-              </w:rPr>
-              <w:t xml:space="preserve">$12,518,647</w:t>
-            </w:r>
-          </w:p>
-        </w:tc>
-        <w:tc>
-          <w:tcPr>
-            <w:tcW w:type="dxa" w:w="1500"/>
-            <w:tcMar>
-              <w:top w:type="dxa" w:w="50"/>
-              <w:left w:type="dxa" w:w="70"/>
-              <w:bottom w:type="dxa" w:w="50"/>
-              <w:right w:type="dxa" w:w="70"/>
-            </w:tcMar>
-          </w:tcPr>
-          <w:p>
-            <w:pPr>
-              <w:jc w:val="right"/>
-            </w:pPr>
-            <w:r>
-              <w:rPr>
-                <w:rFonts w:ascii="Calibri" w:cs="Calibri" w:eastAsia="Calibri" w:hAnsi="Calibri"/>
-                <w:b w:val="false"/>
-                <w:bCs w:val="false"/>
-                <w:sz w:val="14"/>
-                <w:szCs w:val="14"/>
-              </w:rPr>
-              <w:t xml:space="preserve">$11,974,209</w:t>
+              <w:t xml:space="preserve">$17,418,965</w:t>
+            </w:r>
+          </w:p>
+        </w:tc>
+        <w:tc>
+          <w:tcPr>
+            <w:tcW w:type="dxa" w:w="1500"/>
+            <w:tcMar>
+              <w:top w:type="dxa" w:w="50"/>
+              <w:left w:type="dxa" w:w="70"/>
+              <w:bottom w:type="dxa" w:w="50"/>
+              <w:right w:type="dxa" w:w="70"/>
+            </w:tcMar>
+          </w:tcPr>
+          <w:p>
+            <w:pPr>
+              <w:jc w:val="right"/>
+            </w:pPr>
+            <w:r>
+              <w:rPr>
+                <w:rFonts w:ascii="Calibri" w:cs="Calibri" w:eastAsia="Calibri" w:hAnsi="Calibri"/>
+                <w:b w:val="false"/>
+                <w:bCs w:val="false"/>
+                <w:sz w:val="14"/>
+                <w:szCs w:val="14"/>
+              </w:rPr>
+              <w:t xml:space="preserve">($5,511,688)</w:t>
+            </w:r>
+          </w:p>
+        </w:tc>
+        <w:tc>
+          <w:tcPr>
+            <w:tcW w:type="dxa" w:w="1500"/>
+            <w:tcMar>
+              <w:top w:type="dxa" w:w="50"/>
+              <w:left w:type="dxa" w:w="70"/>
+              <w:bottom w:type="dxa" w:w="50"/>
+              <w:right w:type="dxa" w:w="70"/>
+            </w:tcMar>
+          </w:tcPr>
+          <w:p>
+            <w:pPr>
+              <w:jc w:val="right"/>
+            </w:pPr>
+            <w:r>
+              <w:rPr>
+                <w:rFonts w:ascii="Calibri" w:cs="Calibri" w:eastAsia="Calibri" w:hAnsi="Calibri"/>
+                <w:b w:val="false"/>
+                <w:bCs w:val="false"/>
+                <w:sz w:val="14"/>
+                <w:szCs w:val="14"/>
+              </w:rPr>
+              <w:t xml:space="preserve">$12,451,715</w:t>
+            </w:r>
+          </w:p>
+        </w:tc>
+        <w:tc>
+          <w:tcPr>
+            <w:tcW w:type="dxa" w:w="1500"/>
+            <w:tcMar>
+              <w:top w:type="dxa" w:w="50"/>
+              <w:left w:type="dxa" w:w="70"/>
+              <w:bottom w:type="dxa" w:w="50"/>
+              <w:right w:type="dxa" w:w="70"/>
+            </w:tcMar>
+          </w:tcPr>
+          <w:p>
+            <w:pPr>
+              <w:jc w:val="right"/>
+            </w:pPr>
+            <w:r>
+              <w:rPr>
+                <w:rFonts w:ascii="Calibri" w:cs="Calibri" w:eastAsia="Calibri" w:hAnsi="Calibri"/>
+                <w:b w:val="false"/>
+                <w:bCs w:val="false"/>
+                <w:sz w:val="14"/>
+                <w:szCs w:val="14"/>
+              </w:rPr>
+              <w:t xml:space="preserve">$11,907,278</w:t>
             </w:r>
           </w:p>
         </w:tc>
@@ -4988,7 +4988,7 @@
                 <w:sz w:val="14"/>
                 <w:szCs w:val="14"/>
               </w:rPr>
-              <w:t xml:space="preserve">$11,974,209</w:t>
+              <w:t xml:space="preserve">$11,907,278</w:t>
             </w:r>
           </w:p>
         </w:tc>
@@ -5016,7 +5016,7 @@
         <w:rPr>
           <w:rFonts w:ascii="Calibri" w:cs="Calibri" w:eastAsia="Calibri" w:hAnsi="Calibri"/>
         </w:rPr>
-        <w:t xml:space="preserve">Consumer model: five-year net $10,919,149, 110,681 buyers, 2.7% of the counted market after five years</w:t>
+        <w:t xml:space="preserve">Consumer model: five-year net $10,917,209, 110,681 buyers, 2.7% of the counted market after five years</w:t>
       </w:r>
     </w:p>
     <w:tbl>
@@ -5332,7 +5332,7 @@
                 <w:sz w:val="14"/>
                 <w:szCs w:val="14"/>
               </w:rPr>
-              <w:t xml:space="preserve">($194,492)</w:t>
+              <w:t xml:space="preserve">($194,558)</w:t>
             </w:r>
           </w:p>
         </w:tc>
@@ -5384,7 +5384,7 @@
                 <w:sz w:val="14"/>
                 <w:szCs w:val="14"/>
               </w:rPr>
-              <w:t xml:space="preserve">$268,267</w:t>
+              <w:t xml:space="preserve">$268,202</w:t>
             </w:r>
           </w:p>
         </w:tc>
@@ -5410,7 +5410,7 @@
                 <w:sz w:val="14"/>
                 <w:szCs w:val="14"/>
               </w:rPr>
-              <w:t xml:space="preserve">$268,267</w:t>
+              <w:t xml:space="preserve">$268,202</w:t>
             </w:r>
           </w:p>
         </w:tc>
@@ -5516,7 +5516,7 @@
                 <w:sz w:val="14"/>
                 <w:szCs w:val="14"/>
               </w:rPr>
-              <w:t xml:space="preserve">($469,355)</w:t>
+              <w:t xml:space="preserve">($469,541)</w:t>
             </w:r>
           </w:p>
         </w:tc>
@@ -5568,7 +5568,7 @@
                 <w:sz w:val="14"/>
                 <w:szCs w:val="14"/>
               </w:rPr>
-              <w:t xml:space="preserve">$808,153</w:t>
+              <w:t xml:space="preserve">$807,966</w:t>
             </w:r>
           </w:p>
         </w:tc>
@@ -5594,7 +5594,7 @@
                 <w:sz w:val="14"/>
                 <w:szCs w:val="14"/>
               </w:rPr>
-              <w:t xml:space="preserve">$1,076,420</w:t>
+              <w:t xml:space="preserve">$1,076,168</w:t>
             </w:r>
           </w:p>
         </w:tc>
@@ -5700,7 +5700,7 @@
                 <w:sz w:val="14"/>
                 <w:szCs w:val="14"/>
               </w:rPr>
-              <w:t xml:space="preserve">($933,542)</w:t>
+              <w:t xml:space="preserve">($933,963)</w:t>
             </w:r>
           </w:p>
         </w:tc>
@@ -5752,7 +5752,7 @@
                 <w:sz w:val="14"/>
                 <w:szCs w:val="14"/>
               </w:rPr>
-              <w:t xml:space="preserve">$1,802,433</w:t>
+              <w:t xml:space="preserve">$1,802,011</w:t>
             </w:r>
           </w:p>
         </w:tc>
@@ -5778,7 +5778,7 @@
                 <w:sz w:val="14"/>
                 <w:szCs w:val="14"/>
               </w:rPr>
-              <w:t xml:space="preserve">$2,878,853</w:t>
+              <w:t xml:space="preserve">$2,878,179</w:t>
             </w:r>
           </w:p>
         </w:tc>
@@ -5884,7 +5884,7 @@
                 <w:sz w:val="14"/>
                 <w:szCs w:val="14"/>
               </w:rPr>
-              <w:t xml:space="preserve">($1,539,496)</w:t>
+              <w:t xml:space="preserve">($1,540,060)</w:t>
             </w:r>
           </w:p>
         </w:tc>
@@ -5936,7 +5936,7 @@
                 <w:sz w:val="14"/>
                 <w:szCs w:val="14"/>
               </w:rPr>
-              <w:t xml:space="preserve">$3,187,772</w:t>
+              <w:t xml:space="preserve">$3,187,209</w:t>
             </w:r>
           </w:p>
         </w:tc>
@@ -5962,7 +5962,7 @@
                 <w:sz w:val="14"/>
                 <w:szCs w:val="14"/>
               </w:rPr>
-              <w:t xml:space="preserve">$6,066,625</w:t>
+              <w:t xml:space="preserve">$6,065,388</w:t>
             </w:r>
           </w:p>
         </w:tc>
@@ -6068,7 +6068,7 @@
                 <w:sz w:val="14"/>
                 <w:szCs w:val="14"/>
               </w:rPr>
-              <w:t xml:space="preserve">($2,227,897)</w:t>
+              <w:t xml:space="preserve">($2,228,600)</w:t>
             </w:r>
           </w:p>
         </w:tc>
@@ -6120,7 +6120,7 @@
                 <w:sz w:val="14"/>
                 <w:szCs w:val="14"/>
               </w:rPr>
-              <w:t xml:space="preserve">$4,852,524</w:t>
+              <w:t xml:space="preserve">$4,851,821</w:t>
             </w:r>
           </w:p>
         </w:tc>
@@ -6146,7 +6146,7 @@
                 <w:sz w:val="14"/>
                 <w:szCs w:val="14"/>
               </w:rPr>
-              <w:t xml:space="preserve">$10,919,149</w:t>
+              <w:t xml:space="preserve">$10,917,209</w:t>
             </w:r>
           </w:p>
         </w:tc>
@@ -6252,7 +6252,7 @@
                 <w:sz w:val="14"/>
                 <w:szCs w:val="14"/>
               </w:rPr>
-              <w:t xml:space="preserve">($5,364,782)</w:t>
+              <w:t xml:space="preserve">($5,366,722)</w:t>
             </w:r>
           </w:p>
         </w:tc>
@@ -6304,7 +6304,7 @@
                 <w:sz w:val="14"/>
                 <w:szCs w:val="14"/>
               </w:rPr>
-              <w:t xml:space="preserve">$10,919,149</w:t>
+              <w:t xml:space="preserve">$10,917,209</w:t>
             </w:r>
           </w:p>
         </w:tc>
@@ -6330,7 +6330,7 @@
                 <w:sz w:val="14"/>
                 <w:szCs w:val="14"/>
               </w:rPr>
-              <w:t xml:space="preserve">$10,919,149</w:t>
+              <w:t xml:space="preserve">$10,917,209</w:t>
             </w:r>
           </w:p>
         </w:tc>
@@ -6358,7 +6358,7 @@
         <w:rPr>
           <w:rFonts w:ascii="Calibri" w:cs="Calibri" w:eastAsia="Calibri" w:hAnsi="Calibri"/>
         </w:rPr>
-        <w:t xml:space="preserve">School district model (EZvoxa Pro seats): five-year net $944,514</w:t>
+        <w:t xml:space="preserve">School district model (EZvoxa Pro seats): five-year net $944,391</w:t>
       </w:r>
     </w:p>
     <w:tbl>
@@ -6674,7 +6674,7 @@
                 <w:sz w:val="14"/>
                 <w:szCs w:val="14"/>
               </w:rPr>
-              <w:t xml:space="preserve">($3,655)</w:t>
+              <w:t xml:space="preserve">($3,658)</w:t>
             </w:r>
           </w:p>
         </w:tc>
@@ -6726,7 +6726,7 @@
                 <w:sz w:val="14"/>
                 <w:szCs w:val="14"/>
               </w:rPr>
-              <w:t xml:space="preserve">$13,843</w:t>
+              <w:t xml:space="preserve">$13,841</w:t>
             </w:r>
           </w:p>
         </w:tc>
@@ -6752,7 +6752,7 @@
                 <w:sz w:val="14"/>
                 <w:szCs w:val="14"/>
               </w:rPr>
-              <w:t xml:space="preserve">$13,843</w:t>
+              <w:t xml:space="preserve">$13,841</w:t>
             </w:r>
           </w:p>
         </w:tc>
@@ -6858,7 +6858,7 @@
                 <w:sz w:val="14"/>
                 <w:szCs w:val="14"/>
               </w:rPr>
-              <w:t xml:space="preserve">($6,470)</w:t>
+              <w:t xml:space="preserve">($6,476)</w:t>
             </w:r>
           </w:p>
         </w:tc>
@@ -6910,7 +6910,7 @@
                 <w:sz w:val="14"/>
                 <w:szCs w:val="14"/>
               </w:rPr>
-              <w:t xml:space="preserve">$33,527</w:t>
+              <w:t xml:space="preserve">$33,521</w:t>
             </w:r>
           </w:p>
         </w:tc>
@@ -6936,7 +6936,7 @@
                 <w:sz w:val="14"/>
                 <w:szCs w:val="14"/>
               </w:rPr>
-              <w:t xml:space="preserve">$47,370</w:t>
+              <w:t xml:space="preserve">$47,362</w:t>
             </w:r>
           </w:p>
         </w:tc>
@@ -7042,7 +7042,7 @@
                 <w:sz w:val="14"/>
                 <w:szCs w:val="14"/>
               </w:rPr>
-              <w:t xml:space="preserve">($17,402)</w:t>
+              <w:t xml:space="preserve">($17,421)</w:t>
             </w:r>
           </w:p>
         </w:tc>
@@ -7094,7 +7094,7 @@
                 <w:sz w:val="14"/>
                 <w:szCs w:val="14"/>
               </w:rPr>
-              <w:t xml:space="preserve">$107,588</w:t>
+              <w:t xml:space="preserve">$107,569</w:t>
             </w:r>
           </w:p>
         </w:tc>
@@ -7120,7 +7120,7 @@
                 <w:sz w:val="14"/>
                 <w:szCs w:val="14"/>
               </w:rPr>
-              <w:t xml:space="preserve">$154,958</w:t>
+              <w:t xml:space="preserve">$154,931</w:t>
             </w:r>
           </w:p>
         </w:tc>
@@ -7226,7 +7226,7 @@
                 <w:sz w:val="14"/>
                 <w:szCs w:val="14"/>
               </w:rPr>
-              <w:t xml:space="preserve">($38,261)</w:t>
+              <w:t xml:space="preserve">($38,297)</w:t>
             </w:r>
           </w:p>
         </w:tc>
@@ -7278,7 +7278,7 @@
                 <w:sz w:val="14"/>
                 <w:szCs w:val="14"/>
               </w:rPr>
-              <w:t xml:space="preserve">$261,840</w:t>
+              <w:t xml:space="preserve">$261,804</w:t>
             </w:r>
           </w:p>
         </w:tc>
@@ -7304,7 +7304,7 @@
                 <w:sz w:val="14"/>
                 <w:szCs w:val="14"/>
               </w:rPr>
-              <w:t xml:space="preserve">$416,798</w:t>
+              <w:t xml:space="preserve">$416,735</w:t>
             </w:r>
           </w:p>
         </w:tc>
@@ -7410,7 +7410,7 @@
                 <w:sz w:val="14"/>
                 <w:szCs w:val="14"/>
               </w:rPr>
-              <w:t xml:space="preserve">($72,236)</w:t>
+              <w:t xml:space="preserve">($72,296)</w:t>
             </w:r>
           </w:p>
         </w:tc>
@@ -7462,7 +7462,7 @@
                 <w:sz w:val="14"/>
                 <w:szCs w:val="14"/>
               </w:rPr>
-              <w:t xml:space="preserve">$527,716</w:t>
+              <w:t xml:space="preserve">$527,656</w:t>
             </w:r>
           </w:p>
         </w:tc>
@@ -7488,7 +7488,7 @@
                 <w:sz w:val="14"/>
                 <w:szCs w:val="14"/>
               </w:rPr>
-              <w:t xml:space="preserve">$944,514</w:t>
+              <w:t xml:space="preserve">$944,391</w:t>
             </w:r>
           </w:p>
         </w:tc>
@@ -7594,7 +7594,7 @@
                 <w:sz w:val="14"/>
                 <w:szCs w:val="14"/>
               </w:rPr>
-              <w:t xml:space="preserve">($138,024)</w:t>
+              <w:t xml:space="preserve">($138,148)</w:t>
             </w:r>
           </w:p>
         </w:tc>
@@ -7646,7 +7646,7 @@
                 <w:sz w:val="14"/>
                 <w:szCs w:val="14"/>
               </w:rPr>
-              <w:t xml:space="preserve">$944,514</w:t>
+              <w:t xml:space="preserve">$944,391</w:t>
             </w:r>
           </w:p>
         </w:tc>
@@ -7672,7 +7672,7 @@
                 <w:sz w:val="14"/>
                 <w:szCs w:val="14"/>
               </w:rPr>
-              <w:t xml:space="preserve">$944,514</w:t>
+              <w:t xml:space="preserve">$944,391</w:t>
             </w:r>
           </w:p>
         </w:tc>
@@ -7700,7 +7700,7 @@
         <w:rPr>
           <w:rFonts w:ascii="Calibri" w:cs="Calibri" w:eastAsia="Calibri" w:hAnsi="Calibri"/>
         </w:rPr>
-        <w:t xml:space="preserve">Clinical model (EZvoxa Pro seats): five-year net $110,546</w:t>
+        <w:t xml:space="preserve">Clinical model (EZvoxa Pro seats): five-year net $45,678</w:t>
       </w:r>
     </w:p>
     <w:tbl>
@@ -7964,111 +7964,111 @@
                 <w:sz w:val="14"/>
                 <w:szCs w:val="14"/>
               </w:rPr>
-              <w:t xml:space="preserve">15 seats, 3 facilities (0.3%)</w:t>
-            </w:r>
-          </w:p>
-        </w:tc>
-        <w:tc>
-          <w:tcPr>
-            <w:tcW w:type="dxa" w:w="1500"/>
-            <w:tcMar>
-              <w:top w:type="dxa" w:w="50"/>
-              <w:left w:type="dxa" w:w="70"/>
-              <w:bottom w:type="dxa" w:w="50"/>
-              <w:right w:type="dxa" w:w="70"/>
-            </w:tcMar>
-          </w:tcPr>
-          <w:p>
-            <w:pPr>
-              <w:jc w:val="right"/>
-            </w:pPr>
-            <w:r>
-              <w:rPr>
-                <w:rFonts w:ascii="Calibri" w:cs="Calibri" w:eastAsia="Calibri" w:hAnsi="Calibri"/>
-                <w:b w:val="false"/>
-                <w:bCs w:val="false"/>
-                <w:sz w:val="14"/>
-                <w:szCs w:val="14"/>
-              </w:rPr>
-              <w:t xml:space="preserve">$1,875</w:t>
-            </w:r>
-          </w:p>
-        </w:tc>
-        <w:tc>
-          <w:tcPr>
-            <w:tcW w:type="dxa" w:w="1500"/>
-            <w:tcMar>
-              <w:top w:type="dxa" w:w="50"/>
-              <w:left w:type="dxa" w:w="70"/>
-              <w:bottom w:type="dxa" w:w="50"/>
-              <w:right w:type="dxa" w:w="70"/>
-            </w:tcMar>
-          </w:tcPr>
-          <w:p>
-            <w:pPr>
-              <w:jc w:val="right"/>
-            </w:pPr>
-            <w:r>
-              <w:rPr>
-                <w:rFonts w:ascii="Calibri" w:cs="Calibri" w:eastAsia="Calibri" w:hAnsi="Calibri"/>
-                <w:b w:val="false"/>
-                <w:bCs w:val="false"/>
-                <w:sz w:val="14"/>
-                <w:szCs w:val="14"/>
-              </w:rPr>
-              <w:t xml:space="preserve">($392)</w:t>
-            </w:r>
-          </w:p>
-        </w:tc>
-        <w:tc>
-          <w:tcPr>
-            <w:tcW w:type="dxa" w:w="1500"/>
-            <w:tcMar>
-              <w:top w:type="dxa" w:w="50"/>
-              <w:left w:type="dxa" w:w="70"/>
-              <w:bottom w:type="dxa" w:w="50"/>
-              <w:right w:type="dxa" w:w="70"/>
-            </w:tcMar>
-          </w:tcPr>
-          <w:p>
-            <w:pPr>
-              <w:jc w:val="right"/>
-            </w:pPr>
-            <w:r>
-              <w:rPr>
-                <w:rFonts w:ascii="Calibri" w:cs="Calibri" w:eastAsia="Calibri" w:hAnsi="Calibri"/>
-                <w:b w:val="false"/>
-                <w:bCs w:val="false"/>
-                <w:sz w:val="14"/>
-                <w:szCs w:val="14"/>
-              </w:rPr>
-              <w:t xml:space="preserve">$1,687</w:t>
-            </w:r>
-          </w:p>
-        </w:tc>
-        <w:tc>
-          <w:tcPr>
-            <w:tcW w:type="dxa" w:w="1500"/>
-            <w:tcMar>
-              <w:top w:type="dxa" w:w="50"/>
-              <w:left w:type="dxa" w:w="70"/>
-              <w:bottom w:type="dxa" w:w="50"/>
-              <w:right w:type="dxa" w:w="70"/>
-            </w:tcMar>
-          </w:tcPr>
-          <w:p>
-            <w:pPr>
-              <w:jc w:val="right"/>
-            </w:pPr>
-            <w:r>
-              <w:rPr>
-                <w:rFonts w:ascii="Calibri" w:cs="Calibri" w:eastAsia="Calibri" w:hAnsi="Calibri"/>
-                <w:b w:val="false"/>
-                <w:bCs w:val="false"/>
-                <w:sz w:val="14"/>
-                <w:szCs w:val="14"/>
-              </w:rPr>
-              <w:t xml:space="preserve">$1,483</w:t>
+              <w:t xml:space="preserve">10 seats, 2 facilities (0.2%)</w:t>
+            </w:r>
+          </w:p>
+        </w:tc>
+        <w:tc>
+          <w:tcPr>
+            <w:tcW w:type="dxa" w:w="1500"/>
+            <w:tcMar>
+              <w:top w:type="dxa" w:w="50"/>
+              <w:left w:type="dxa" w:w="70"/>
+              <w:bottom w:type="dxa" w:w="50"/>
+              <w:right w:type="dxa" w:w="70"/>
+            </w:tcMar>
+          </w:tcPr>
+          <w:p>
+            <w:pPr>
+              <w:jc w:val="right"/>
+            </w:pPr>
+            <w:r>
+              <w:rPr>
+                <w:rFonts w:ascii="Calibri" w:cs="Calibri" w:eastAsia="Calibri" w:hAnsi="Calibri"/>
+                <w:b w:val="false"/>
+                <w:bCs w:val="false"/>
+                <w:sz w:val="14"/>
+                <w:szCs w:val="14"/>
+              </w:rPr>
+              <w:t xml:space="preserve">$1,250</w:t>
+            </w:r>
+          </w:p>
+        </w:tc>
+        <w:tc>
+          <w:tcPr>
+            <w:tcW w:type="dxa" w:w="1500"/>
+            <w:tcMar>
+              <w:top w:type="dxa" w:w="50"/>
+              <w:left w:type="dxa" w:w="70"/>
+              <w:bottom w:type="dxa" w:w="50"/>
+              <w:right w:type="dxa" w:w="70"/>
+            </w:tcMar>
+          </w:tcPr>
+          <w:p>
+            <w:pPr>
+              <w:jc w:val="right"/>
+            </w:pPr>
+            <w:r>
+              <w:rPr>
+                <w:rFonts w:ascii="Calibri" w:cs="Calibri" w:eastAsia="Calibri" w:hAnsi="Calibri"/>
+                <w:b w:val="false"/>
+                <w:bCs w:val="false"/>
+                <w:sz w:val="14"/>
+                <w:szCs w:val="14"/>
+              </w:rPr>
+              <w:t xml:space="preserve">($261)</w:t>
+            </w:r>
+          </w:p>
+        </w:tc>
+        <w:tc>
+          <w:tcPr>
+            <w:tcW w:type="dxa" w:w="1500"/>
+            <w:tcMar>
+              <w:top w:type="dxa" w:w="50"/>
+              <w:left w:type="dxa" w:w="70"/>
+              <w:bottom w:type="dxa" w:w="50"/>
+              <w:right w:type="dxa" w:w="70"/>
+            </w:tcMar>
+          </w:tcPr>
+          <w:p>
+            <w:pPr>
+              <w:jc w:val="right"/>
+            </w:pPr>
+            <w:r>
+              <w:rPr>
+                <w:rFonts w:ascii="Calibri" w:cs="Calibri" w:eastAsia="Calibri" w:hAnsi="Calibri"/>
+                <w:b w:val="false"/>
+                <w:bCs w:val="false"/>
+                <w:sz w:val="14"/>
+                <w:szCs w:val="14"/>
+              </w:rPr>
+              <w:t xml:space="preserve">$1,125</w:t>
+            </w:r>
+          </w:p>
+        </w:tc>
+        <w:tc>
+          <w:tcPr>
+            <w:tcW w:type="dxa" w:w="1500"/>
+            <w:tcMar>
+              <w:top w:type="dxa" w:w="50"/>
+              <w:left w:type="dxa" w:w="70"/>
+              <w:bottom w:type="dxa" w:w="50"/>
+              <w:right w:type="dxa" w:w="70"/>
+            </w:tcMar>
+          </w:tcPr>
+          <w:p>
+            <w:pPr>
+              <w:jc w:val="right"/>
+            </w:pPr>
+            <w:r>
+              <w:rPr>
+                <w:rFonts w:ascii="Calibri" w:cs="Calibri" w:eastAsia="Calibri" w:hAnsi="Calibri"/>
+                <w:b w:val="false"/>
+                <w:bCs w:val="false"/>
+                <w:sz w:val="14"/>
+                <w:szCs w:val="14"/>
+              </w:rPr>
+              <w:t xml:space="preserve">$989</w:t>
             </w:r>
           </w:p>
         </w:tc>
@@ -8094,7 +8094,7 @@
                 <w:sz w:val="14"/>
                 <w:szCs w:val="14"/>
               </w:rPr>
-              <w:t xml:space="preserve">$1,483</w:t>
+              <w:t xml:space="preserve">$989</w:t>
             </w:r>
           </w:p>
         </w:tc>
@@ -8148,111 +8148,111 @@
                 <w:sz w:val="14"/>
                 <w:szCs w:val="14"/>
               </w:rPr>
-              <w:t xml:space="preserve">50 seats, 10 facilities (0.8%)</w:t>
-            </w:r>
-          </w:p>
-        </w:tc>
-        <w:tc>
-          <w:tcPr>
-            <w:tcW w:type="dxa" w:w="1500"/>
-            <w:tcMar>
-              <w:top w:type="dxa" w:w="50"/>
-              <w:left w:type="dxa" w:w="70"/>
-              <w:bottom w:type="dxa" w:w="50"/>
-              <w:right w:type="dxa" w:w="70"/>
-            </w:tcMar>
-          </w:tcPr>
-          <w:p>
-            <w:pPr>
-              <w:jc w:val="right"/>
-            </w:pPr>
-            <w:r>
-              <w:rPr>
-                <w:rFonts w:ascii="Calibri" w:cs="Calibri" w:eastAsia="Calibri" w:hAnsi="Calibri"/>
-                <w:b w:val="false"/>
-                <w:bCs w:val="false"/>
-                <w:sz w:val="14"/>
-                <w:szCs w:val="14"/>
-              </w:rPr>
-              <w:t xml:space="preserve">$6,250</w:t>
-            </w:r>
-          </w:p>
-        </w:tc>
-        <w:tc>
-          <w:tcPr>
-            <w:tcW w:type="dxa" w:w="1500"/>
-            <w:tcMar>
-              <w:top w:type="dxa" w:w="50"/>
-              <w:left w:type="dxa" w:w="70"/>
-              <w:bottom w:type="dxa" w:w="50"/>
-              <w:right w:type="dxa" w:w="70"/>
-            </w:tcMar>
-          </w:tcPr>
-          <w:p>
-            <w:pPr>
-              <w:jc w:val="right"/>
-            </w:pPr>
-            <w:r>
-              <w:rPr>
-                <w:rFonts w:ascii="Calibri" w:cs="Calibri" w:eastAsia="Calibri" w:hAnsi="Calibri"/>
-                <w:b w:val="false"/>
-                <w:bCs w:val="false"/>
-                <w:sz w:val="14"/>
-                <w:szCs w:val="14"/>
-              </w:rPr>
-              <w:t xml:space="preserve">($1,011)</w:t>
-            </w:r>
-          </w:p>
-        </w:tc>
-        <w:tc>
-          <w:tcPr>
-            <w:tcW w:type="dxa" w:w="1500"/>
-            <w:tcMar>
-              <w:top w:type="dxa" w:w="50"/>
-              <w:left w:type="dxa" w:w="70"/>
-              <w:bottom w:type="dxa" w:w="50"/>
-              <w:right w:type="dxa" w:w="70"/>
-            </w:tcMar>
-          </w:tcPr>
-          <w:p>
-            <w:pPr>
-              <w:jc w:val="right"/>
-            </w:pPr>
-            <w:r>
-              <w:rPr>
-                <w:rFonts w:ascii="Calibri" w:cs="Calibri" w:eastAsia="Calibri" w:hAnsi="Calibri"/>
-                <w:b w:val="false"/>
-                <w:bCs w:val="false"/>
-                <w:sz w:val="14"/>
-                <w:szCs w:val="14"/>
-              </w:rPr>
-              <w:t xml:space="preserve">$5,625</w:t>
-            </w:r>
-          </w:p>
-        </w:tc>
-        <w:tc>
-          <w:tcPr>
-            <w:tcW w:type="dxa" w:w="1500"/>
-            <w:tcMar>
-              <w:top w:type="dxa" w:w="50"/>
-              <w:left w:type="dxa" w:w="70"/>
-              <w:bottom w:type="dxa" w:w="50"/>
-              <w:right w:type="dxa" w:w="70"/>
-            </w:tcMar>
-          </w:tcPr>
-          <w:p>
-            <w:pPr>
-              <w:jc w:val="right"/>
-            </w:pPr>
-            <w:r>
-              <w:rPr>
-                <w:rFonts w:ascii="Calibri" w:cs="Calibri" w:eastAsia="Calibri" w:hAnsi="Calibri"/>
-                <w:b w:val="false"/>
-                <w:bCs w:val="false"/>
-                <w:sz w:val="14"/>
-                <w:szCs w:val="14"/>
-              </w:rPr>
-              <w:t xml:space="preserve">$5,239</w:t>
+              <w:t xml:space="preserve">25 seats, 5 facilities (0.4%)</w:t>
+            </w:r>
+          </w:p>
+        </w:tc>
+        <w:tc>
+          <w:tcPr>
+            <w:tcW w:type="dxa" w:w="1500"/>
+            <w:tcMar>
+              <w:top w:type="dxa" w:w="50"/>
+              <w:left w:type="dxa" w:w="70"/>
+              <w:bottom w:type="dxa" w:w="50"/>
+              <w:right w:type="dxa" w:w="70"/>
+            </w:tcMar>
+          </w:tcPr>
+          <w:p>
+            <w:pPr>
+              <w:jc w:val="right"/>
+            </w:pPr>
+            <w:r>
+              <w:rPr>
+                <w:rFonts w:ascii="Calibri" w:cs="Calibri" w:eastAsia="Calibri" w:hAnsi="Calibri"/>
+                <w:b w:val="false"/>
+                <w:bCs w:val="false"/>
+                <w:sz w:val="14"/>
+                <w:szCs w:val="14"/>
+              </w:rPr>
+              <w:t xml:space="preserve">$3,125</w:t>
+            </w:r>
+          </w:p>
+        </w:tc>
+        <w:tc>
+          <w:tcPr>
+            <w:tcW w:type="dxa" w:w="1500"/>
+            <w:tcMar>
+              <w:top w:type="dxa" w:w="50"/>
+              <w:left w:type="dxa" w:w="70"/>
+              <w:bottom w:type="dxa" w:w="50"/>
+              <w:right w:type="dxa" w:w="70"/>
+            </w:tcMar>
+          </w:tcPr>
+          <w:p>
+            <w:pPr>
+              <w:jc w:val="right"/>
+            </w:pPr>
+            <w:r>
+              <w:rPr>
+                <w:rFonts w:ascii="Calibri" w:cs="Calibri" w:eastAsia="Calibri" w:hAnsi="Calibri"/>
+                <w:b w:val="false"/>
+                <w:bCs w:val="false"/>
+                <w:sz w:val="14"/>
+                <w:szCs w:val="14"/>
+              </w:rPr>
+              <w:t xml:space="preserve">($506)</w:t>
+            </w:r>
+          </w:p>
+        </w:tc>
+        <w:tc>
+          <w:tcPr>
+            <w:tcW w:type="dxa" w:w="1500"/>
+            <w:tcMar>
+              <w:top w:type="dxa" w:w="50"/>
+              <w:left w:type="dxa" w:w="70"/>
+              <w:bottom w:type="dxa" w:w="50"/>
+              <w:right w:type="dxa" w:w="70"/>
+            </w:tcMar>
+          </w:tcPr>
+          <w:p>
+            <w:pPr>
+              <w:jc w:val="right"/>
+            </w:pPr>
+            <w:r>
+              <w:rPr>
+                <w:rFonts w:ascii="Calibri" w:cs="Calibri" w:eastAsia="Calibri" w:hAnsi="Calibri"/>
+                <w:b w:val="false"/>
+                <w:bCs w:val="false"/>
+                <w:sz w:val="14"/>
+                <w:szCs w:val="14"/>
+              </w:rPr>
+              <w:t xml:space="preserve">$2,812</w:t>
+            </w:r>
+          </w:p>
+        </w:tc>
+        <w:tc>
+          <w:tcPr>
+            <w:tcW w:type="dxa" w:w="1500"/>
+            <w:tcMar>
+              <w:top w:type="dxa" w:w="50"/>
+              <w:left w:type="dxa" w:w="70"/>
+              <w:bottom w:type="dxa" w:w="50"/>
+              <w:right w:type="dxa" w:w="70"/>
+            </w:tcMar>
+          </w:tcPr>
+          <w:p>
+            <w:pPr>
+              <w:jc w:val="right"/>
+            </w:pPr>
+            <w:r>
+              <w:rPr>
+                <w:rFonts w:ascii="Calibri" w:cs="Calibri" w:eastAsia="Calibri" w:hAnsi="Calibri"/>
+                <w:b w:val="false"/>
+                <w:bCs w:val="false"/>
+                <w:sz w:val="14"/>
+                <w:szCs w:val="14"/>
+              </w:rPr>
+              <w:t xml:space="preserve">$2,619</w:t>
             </w:r>
           </w:p>
         </w:tc>
@@ -8278,7 +8278,7 @@
                 <w:sz w:val="14"/>
                 <w:szCs w:val="14"/>
               </w:rPr>
-              <w:t xml:space="preserve">$6,722</w:t>
+              <w:t xml:space="preserve">$3,608</w:t>
             </w:r>
           </w:p>
         </w:tc>
@@ -8332,111 +8332,111 @@
                 <w:sz w:val="14"/>
                 <w:szCs w:val="14"/>
               </w:rPr>
-              <w:t xml:space="preserve">150 seats, 30 facilities (2.5%)</w:t>
-            </w:r>
-          </w:p>
-        </w:tc>
-        <w:tc>
-          <w:tcPr>
-            <w:tcW w:type="dxa" w:w="1500"/>
-            <w:tcMar>
-              <w:top w:type="dxa" w:w="50"/>
-              <w:left w:type="dxa" w:w="70"/>
-              <w:bottom w:type="dxa" w:w="50"/>
-              <w:right w:type="dxa" w:w="70"/>
-            </w:tcMar>
-          </w:tcPr>
-          <w:p>
-            <w:pPr>
-              <w:jc w:val="right"/>
-            </w:pPr>
-            <w:r>
-              <w:rPr>
-                <w:rFonts w:ascii="Calibri" w:cs="Calibri" w:eastAsia="Calibri" w:hAnsi="Calibri"/>
-                <w:b w:val="false"/>
-                <w:bCs w:val="false"/>
-                <w:sz w:val="14"/>
-                <w:szCs w:val="14"/>
-              </w:rPr>
-              <w:t xml:space="preserve">$18,749</w:t>
-            </w:r>
-          </w:p>
-        </w:tc>
-        <w:tc>
-          <w:tcPr>
-            <w:tcW w:type="dxa" w:w="1500"/>
-            <w:tcMar>
-              <w:top w:type="dxa" w:w="50"/>
-              <w:left w:type="dxa" w:w="70"/>
-              <w:bottom w:type="dxa" w:w="50"/>
-              <w:right w:type="dxa" w:w="70"/>
-            </w:tcMar>
-          </w:tcPr>
-          <w:p>
-            <w:pPr>
-              <w:jc w:val="right"/>
-            </w:pPr>
-            <w:r>
-              <w:rPr>
-                <w:rFonts w:ascii="Calibri" w:cs="Calibri" w:eastAsia="Calibri" w:hAnsi="Calibri"/>
-                <w:b w:val="false"/>
-                <w:bCs w:val="false"/>
-                <w:sz w:val="14"/>
-                <w:szCs w:val="14"/>
-              </w:rPr>
-              <w:t xml:space="preserve">($2,610)</w:t>
-            </w:r>
-          </w:p>
-        </w:tc>
-        <w:tc>
-          <w:tcPr>
-            <w:tcW w:type="dxa" w:w="1500"/>
-            <w:tcMar>
-              <w:top w:type="dxa" w:w="50"/>
-              <w:left w:type="dxa" w:w="70"/>
-              <w:bottom w:type="dxa" w:w="50"/>
-              <w:right w:type="dxa" w:w="70"/>
-            </w:tcMar>
-          </w:tcPr>
-          <w:p>
-            <w:pPr>
-              <w:jc w:val="right"/>
-            </w:pPr>
-            <w:r>
-              <w:rPr>
-                <w:rFonts w:ascii="Calibri" w:cs="Calibri" w:eastAsia="Calibri" w:hAnsi="Calibri"/>
-                <w:b w:val="false"/>
-                <w:bCs w:val="false"/>
-                <w:sz w:val="14"/>
-                <w:szCs w:val="14"/>
-              </w:rPr>
-              <w:t xml:space="preserve">$16,874</w:t>
-            </w:r>
-          </w:p>
-        </w:tc>
-        <w:tc>
-          <w:tcPr>
-            <w:tcW w:type="dxa" w:w="1500"/>
-            <w:tcMar>
-              <w:top w:type="dxa" w:w="50"/>
-              <w:left w:type="dxa" w:w="70"/>
-              <w:bottom w:type="dxa" w:w="50"/>
-              <w:right w:type="dxa" w:w="70"/>
-            </w:tcMar>
-          </w:tcPr>
-          <w:p>
-            <w:pPr>
-              <w:jc w:val="right"/>
-            </w:pPr>
-            <w:r>
-              <w:rPr>
-                <w:rFonts w:ascii="Calibri" w:cs="Calibri" w:eastAsia="Calibri" w:hAnsi="Calibri"/>
-                <w:b w:val="false"/>
-                <w:bCs w:val="false"/>
-                <w:sz w:val="14"/>
-                <w:szCs w:val="14"/>
-              </w:rPr>
-              <w:t xml:space="preserve">$16,138</w:t>
+              <w:t xml:space="preserve">60 seats, 12 facilities (1.0%)</w:t>
+            </w:r>
+          </w:p>
+        </w:tc>
+        <w:tc>
+          <w:tcPr>
+            <w:tcW w:type="dxa" w:w="1500"/>
+            <w:tcMar>
+              <w:top w:type="dxa" w:w="50"/>
+              <w:left w:type="dxa" w:w="70"/>
+              <w:bottom w:type="dxa" w:w="50"/>
+              <w:right w:type="dxa" w:w="70"/>
+            </w:tcMar>
+          </w:tcPr>
+          <w:p>
+            <w:pPr>
+              <w:jc w:val="right"/>
+            </w:pPr>
+            <w:r>
+              <w:rPr>
+                <w:rFonts w:ascii="Calibri" w:cs="Calibri" w:eastAsia="Calibri" w:hAnsi="Calibri"/>
+                <w:b w:val="false"/>
+                <w:bCs w:val="false"/>
+                <w:sz w:val="14"/>
+                <w:szCs w:val="14"/>
+              </w:rPr>
+              <w:t xml:space="preserve">$7,499</w:t>
+            </w:r>
+          </w:p>
+        </w:tc>
+        <w:tc>
+          <w:tcPr>
+            <w:tcW w:type="dxa" w:w="1500"/>
+            <w:tcMar>
+              <w:top w:type="dxa" w:w="50"/>
+              <w:left w:type="dxa" w:w="70"/>
+              <w:bottom w:type="dxa" w:w="50"/>
+              <w:right w:type="dxa" w:w="70"/>
+            </w:tcMar>
+          </w:tcPr>
+          <w:p>
+            <w:pPr>
+              <w:jc w:val="right"/>
+            </w:pPr>
+            <w:r>
+              <w:rPr>
+                <w:rFonts w:ascii="Calibri" w:cs="Calibri" w:eastAsia="Calibri" w:hAnsi="Calibri"/>
+                <w:b w:val="false"/>
+                <w:bCs w:val="false"/>
+                <w:sz w:val="14"/>
+                <w:szCs w:val="14"/>
+              </w:rPr>
+              <w:t xml:space="preserve">($1,045)</w:t>
+            </w:r>
+          </w:p>
+        </w:tc>
+        <w:tc>
+          <w:tcPr>
+            <w:tcW w:type="dxa" w:w="1500"/>
+            <w:tcMar>
+              <w:top w:type="dxa" w:w="50"/>
+              <w:left w:type="dxa" w:w="70"/>
+              <w:bottom w:type="dxa" w:w="50"/>
+              <w:right w:type="dxa" w:w="70"/>
+            </w:tcMar>
+          </w:tcPr>
+          <w:p>
+            <w:pPr>
+              <w:jc w:val="right"/>
+            </w:pPr>
+            <w:r>
+              <w:rPr>
+                <w:rFonts w:ascii="Calibri" w:cs="Calibri" w:eastAsia="Calibri" w:hAnsi="Calibri"/>
+                <w:b w:val="false"/>
+                <w:bCs w:val="false"/>
+                <w:sz w:val="14"/>
+                <w:szCs w:val="14"/>
+              </w:rPr>
+              <w:t xml:space="preserve">$6,749</w:t>
+            </w:r>
+          </w:p>
+        </w:tc>
+        <w:tc>
+          <w:tcPr>
+            <w:tcW w:type="dxa" w:w="1500"/>
+            <w:tcMar>
+              <w:top w:type="dxa" w:w="50"/>
+              <w:left w:type="dxa" w:w="70"/>
+              <w:bottom w:type="dxa" w:w="50"/>
+              <w:right w:type="dxa" w:w="70"/>
+            </w:tcMar>
+          </w:tcPr>
+          <w:p>
+            <w:pPr>
+              <w:jc w:val="right"/>
+            </w:pPr>
+            <w:r>
+              <w:rPr>
+                <w:rFonts w:ascii="Calibri" w:cs="Calibri" w:eastAsia="Calibri" w:hAnsi="Calibri"/>
+                <w:b w:val="false"/>
+                <w:bCs w:val="false"/>
+                <w:sz w:val="14"/>
+                <w:szCs w:val="14"/>
+              </w:rPr>
+              <w:t xml:space="preserve">$6,454</w:t>
             </w:r>
           </w:p>
         </w:tc>
@@ -8462,7 +8462,7 @@
                 <w:sz w:val="14"/>
                 <w:szCs w:val="14"/>
               </w:rPr>
-              <w:t xml:space="preserve">$22,860</w:t>
+              <w:t xml:space="preserve">$10,062</w:t>
             </w:r>
           </w:p>
         </w:tc>
@@ -8516,111 +8516,111 @@
                 <w:sz w:val="14"/>
                 <w:szCs w:val="14"/>
               </w:rPr>
-              <w:t xml:space="preserve">300 seats, 60 facilities (4.9%)</w:t>
-            </w:r>
-          </w:p>
-        </w:tc>
-        <w:tc>
-          <w:tcPr>
-            <w:tcW w:type="dxa" w:w="1500"/>
-            <w:tcMar>
-              <w:top w:type="dxa" w:w="50"/>
-              <w:left w:type="dxa" w:w="70"/>
-              <w:bottom w:type="dxa" w:w="50"/>
-              <w:right w:type="dxa" w:w="70"/>
-            </w:tcMar>
-          </w:tcPr>
-          <w:p>
-            <w:pPr>
-              <w:jc w:val="right"/>
-            </w:pPr>
-            <w:r>
-              <w:rPr>
-                <w:rFonts w:ascii="Calibri" w:cs="Calibri" w:eastAsia="Calibri" w:hAnsi="Calibri"/>
-                <w:b w:val="false"/>
-                <w:bCs w:val="false"/>
-                <w:sz w:val="14"/>
-                <w:szCs w:val="14"/>
-              </w:rPr>
-              <w:t xml:space="preserve">$37,497</w:t>
-            </w:r>
-          </w:p>
-        </w:tc>
-        <w:tc>
-          <w:tcPr>
-            <w:tcW w:type="dxa" w:w="1500"/>
-            <w:tcMar>
-              <w:top w:type="dxa" w:w="50"/>
-              <w:left w:type="dxa" w:w="70"/>
-              <w:bottom w:type="dxa" w:w="50"/>
-              <w:right w:type="dxa" w:w="70"/>
-            </w:tcMar>
-          </w:tcPr>
-          <w:p>
-            <w:pPr>
-              <w:jc w:val="right"/>
-            </w:pPr>
-            <w:r>
-              <w:rPr>
-                <w:rFonts w:ascii="Calibri" w:cs="Calibri" w:eastAsia="Calibri" w:hAnsi="Calibri"/>
-                <w:b w:val="false"/>
-                <w:bCs w:val="false"/>
-                <w:sz w:val="14"/>
-                <w:szCs w:val="14"/>
-              </w:rPr>
-              <w:t xml:space="preserve">($4,781)</w:t>
-            </w:r>
-          </w:p>
-        </w:tc>
-        <w:tc>
-          <w:tcPr>
-            <w:tcW w:type="dxa" w:w="1500"/>
-            <w:tcMar>
-              <w:top w:type="dxa" w:w="50"/>
-              <w:left w:type="dxa" w:w="70"/>
-              <w:bottom w:type="dxa" w:w="50"/>
-              <w:right w:type="dxa" w:w="70"/>
-            </w:tcMar>
-          </w:tcPr>
-          <w:p>
-            <w:pPr>
-              <w:jc w:val="right"/>
-            </w:pPr>
-            <w:r>
-              <w:rPr>
-                <w:rFonts w:ascii="Calibri" w:cs="Calibri" w:eastAsia="Calibri" w:hAnsi="Calibri"/>
-                <w:b w:val="false"/>
-                <w:bCs w:val="false"/>
-                <w:sz w:val="14"/>
-                <w:szCs w:val="14"/>
-              </w:rPr>
-              <w:t xml:space="preserve">$33,747</w:t>
-            </w:r>
-          </w:p>
-        </w:tc>
-        <w:tc>
-          <w:tcPr>
-            <w:tcW w:type="dxa" w:w="1500"/>
-            <w:tcMar>
-              <w:top w:type="dxa" w:w="50"/>
-              <w:left w:type="dxa" w:w="70"/>
-              <w:bottom w:type="dxa" w:w="50"/>
-              <w:right w:type="dxa" w:w="70"/>
-            </w:tcMar>
-          </w:tcPr>
-          <w:p>
-            <w:pPr>
-              <w:jc w:val="right"/>
-            </w:pPr>
-            <w:r>
-              <w:rPr>
-                <w:rFonts w:ascii="Calibri" w:cs="Calibri" w:eastAsia="Calibri" w:hAnsi="Calibri"/>
-                <w:b w:val="false"/>
-                <w:bCs w:val="false"/>
-                <w:sz w:val="14"/>
-                <w:szCs w:val="14"/>
-              </w:rPr>
-              <w:t xml:space="preserve">$32,716</w:t>
+              <w:t xml:space="preserve">125 seats, 25 facilities (2.1%)</w:t>
+            </w:r>
+          </w:p>
+        </w:tc>
+        <w:tc>
+          <w:tcPr>
+            <w:tcW w:type="dxa" w:w="1500"/>
+            <w:tcMar>
+              <w:top w:type="dxa" w:w="50"/>
+              <w:left w:type="dxa" w:w="70"/>
+              <w:bottom w:type="dxa" w:w="50"/>
+              <w:right w:type="dxa" w:w="70"/>
+            </w:tcMar>
+          </w:tcPr>
+          <w:p>
+            <w:pPr>
+              <w:jc w:val="right"/>
+            </w:pPr>
+            <w:r>
+              <w:rPr>
+                <w:rFonts w:ascii="Calibri" w:cs="Calibri" w:eastAsia="Calibri" w:hAnsi="Calibri"/>
+                <w:b w:val="false"/>
+                <w:bCs w:val="false"/>
+                <w:sz w:val="14"/>
+                <w:szCs w:val="14"/>
+              </w:rPr>
+              <w:t xml:space="preserve">$15,624</w:t>
+            </w:r>
+          </w:p>
+        </w:tc>
+        <w:tc>
+          <w:tcPr>
+            <w:tcW w:type="dxa" w:w="1500"/>
+            <w:tcMar>
+              <w:top w:type="dxa" w:w="50"/>
+              <w:left w:type="dxa" w:w="70"/>
+              <w:bottom w:type="dxa" w:w="50"/>
+              <w:right w:type="dxa" w:w="70"/>
+            </w:tcMar>
+          </w:tcPr>
+          <w:p>
+            <w:pPr>
+              <w:jc w:val="right"/>
+            </w:pPr>
+            <w:r>
+              <w:rPr>
+                <w:rFonts w:ascii="Calibri" w:cs="Calibri" w:eastAsia="Calibri" w:hAnsi="Calibri"/>
+                <w:b w:val="false"/>
+                <w:bCs w:val="false"/>
+                <w:sz w:val="14"/>
+                <w:szCs w:val="14"/>
+              </w:rPr>
+              <w:t xml:space="preserve">($1,994)</w:t>
+            </w:r>
+          </w:p>
+        </w:tc>
+        <w:tc>
+          <w:tcPr>
+            <w:tcW w:type="dxa" w:w="1500"/>
+            <w:tcMar>
+              <w:top w:type="dxa" w:w="50"/>
+              <w:left w:type="dxa" w:w="70"/>
+              <w:bottom w:type="dxa" w:w="50"/>
+              <w:right w:type="dxa" w:w="70"/>
+            </w:tcMar>
+          </w:tcPr>
+          <w:p>
+            <w:pPr>
+              <w:jc w:val="right"/>
+            </w:pPr>
+            <w:r>
+              <w:rPr>
+                <w:rFonts w:ascii="Calibri" w:cs="Calibri" w:eastAsia="Calibri" w:hAnsi="Calibri"/>
+                <w:b w:val="false"/>
+                <w:bCs w:val="false"/>
+                <w:sz w:val="14"/>
+                <w:szCs w:val="14"/>
+              </w:rPr>
+              <w:t xml:space="preserve">$14,061</w:t>
+            </w:r>
+          </w:p>
+        </w:tc>
+        <w:tc>
+          <w:tcPr>
+            <w:tcW w:type="dxa" w:w="1500"/>
+            <w:tcMar>
+              <w:top w:type="dxa" w:w="50"/>
+              <w:left w:type="dxa" w:w="70"/>
+              <w:bottom w:type="dxa" w:w="50"/>
+              <w:right w:type="dxa" w:w="70"/>
+            </w:tcMar>
+          </w:tcPr>
+          <w:p>
+            <w:pPr>
+              <w:jc w:val="right"/>
+            </w:pPr>
+            <w:r>
+              <w:rPr>
+                <w:rFonts w:ascii="Calibri" w:cs="Calibri" w:eastAsia="Calibri" w:hAnsi="Calibri"/>
+                <w:b w:val="false"/>
+                <w:bCs w:val="false"/>
+                <w:sz w:val="14"/>
+                <w:szCs w:val="14"/>
+              </w:rPr>
+              <w:t xml:space="preserve">$13,630</w:t>
             </w:r>
           </w:p>
         </w:tc>
@@ -8646,7 +8646,7 @@
                 <w:sz w:val="14"/>
                 <w:szCs w:val="14"/>
               </w:rPr>
-              <w:t xml:space="preserve">$55,576</w:t>
+              <w:t xml:space="preserve">$23,692</w:t>
             </w:r>
           </w:p>
         </w:tc>
@@ -8700,111 +8700,111 @@
                 <w:sz w:val="14"/>
                 <w:szCs w:val="14"/>
               </w:rPr>
-              <w:t xml:space="preserve">500 seats, 100 facilities (8.2%)</w:t>
-            </w:r>
-          </w:p>
-        </w:tc>
-        <w:tc>
-          <w:tcPr>
-            <w:tcW w:type="dxa" w:w="1500"/>
-            <w:tcMar>
-              <w:top w:type="dxa" w:w="50"/>
-              <w:left w:type="dxa" w:w="70"/>
-              <w:bottom w:type="dxa" w:w="50"/>
-              <w:right w:type="dxa" w:w="70"/>
-            </w:tcMar>
-          </w:tcPr>
-          <w:p>
-            <w:pPr>
-              <w:jc w:val="right"/>
-            </w:pPr>
-            <w:r>
-              <w:rPr>
-                <w:rFonts w:ascii="Calibri" w:cs="Calibri" w:eastAsia="Calibri" w:hAnsi="Calibri"/>
-                <w:b w:val="false"/>
-                <w:bCs w:val="false"/>
-                <w:sz w:val="14"/>
-                <w:szCs w:val="14"/>
-              </w:rPr>
-              <w:t xml:space="preserve">$62,495</w:t>
-            </w:r>
-          </w:p>
-        </w:tc>
-        <w:tc>
-          <w:tcPr>
-            <w:tcW w:type="dxa" w:w="1500"/>
-            <w:tcMar>
-              <w:top w:type="dxa" w:w="50"/>
-              <w:left w:type="dxa" w:w="70"/>
-              <w:bottom w:type="dxa" w:w="50"/>
-              <w:right w:type="dxa" w:w="70"/>
-            </w:tcMar>
-          </w:tcPr>
-          <w:p>
-            <w:pPr>
-              <w:jc w:val="right"/>
-            </w:pPr>
-            <w:r>
-              <w:rPr>
-                <w:rFonts w:ascii="Calibri" w:cs="Calibri" w:eastAsia="Calibri" w:hAnsi="Calibri"/>
-                <w:b w:val="false"/>
-                <w:bCs w:val="false"/>
-                <w:sz w:val="14"/>
-                <w:szCs w:val="14"/>
-              </w:rPr>
-              <w:t xml:space="preserve">($7,525)</w:t>
-            </w:r>
-          </w:p>
-        </w:tc>
-        <w:tc>
-          <w:tcPr>
-            <w:tcW w:type="dxa" w:w="1500"/>
-            <w:tcMar>
-              <w:top w:type="dxa" w:w="50"/>
-              <w:left w:type="dxa" w:w="70"/>
-              <w:bottom w:type="dxa" w:w="50"/>
-              <w:right w:type="dxa" w:w="70"/>
-            </w:tcMar>
-          </w:tcPr>
-          <w:p>
-            <w:pPr>
-              <w:jc w:val="right"/>
-            </w:pPr>
-            <w:r>
-              <w:rPr>
-                <w:rFonts w:ascii="Calibri" w:cs="Calibri" w:eastAsia="Calibri" w:hAnsi="Calibri"/>
-                <w:b w:val="false"/>
-                <w:bCs w:val="false"/>
-                <w:sz w:val="14"/>
-                <w:szCs w:val="14"/>
-              </w:rPr>
-              <w:t xml:space="preserve">$56,246</w:t>
-            </w:r>
-          </w:p>
-        </w:tc>
-        <w:tc>
-          <w:tcPr>
-            <w:tcW w:type="dxa" w:w="1500"/>
-            <w:tcMar>
-              <w:top w:type="dxa" w:w="50"/>
-              <w:left w:type="dxa" w:w="70"/>
-              <w:bottom w:type="dxa" w:w="50"/>
-              <w:right w:type="dxa" w:w="70"/>
-            </w:tcMar>
-          </w:tcPr>
-          <w:p>
-            <w:pPr>
-              <w:jc w:val="right"/>
-            </w:pPr>
-            <w:r>
-              <w:rPr>
-                <w:rFonts w:ascii="Calibri" w:cs="Calibri" w:eastAsia="Calibri" w:hAnsi="Calibri"/>
-                <w:b w:val="false"/>
-                <w:bCs w:val="false"/>
-                <w:sz w:val="14"/>
-                <w:szCs w:val="14"/>
-              </w:rPr>
-              <w:t xml:space="preserve">$54,970</w:t>
+              <w:t xml:space="preserve">200 seats, 40 facilities (3.3%)</w:t>
+            </w:r>
+          </w:p>
+        </w:tc>
+        <w:tc>
+          <w:tcPr>
+            <w:tcW w:type="dxa" w:w="1500"/>
+            <w:tcMar>
+              <w:top w:type="dxa" w:w="50"/>
+              <w:left w:type="dxa" w:w="70"/>
+              <w:bottom w:type="dxa" w:w="50"/>
+              <w:right w:type="dxa" w:w="70"/>
+            </w:tcMar>
+          </w:tcPr>
+          <w:p>
+            <w:pPr>
+              <w:jc w:val="right"/>
+            </w:pPr>
+            <w:r>
+              <w:rPr>
+                <w:rFonts w:ascii="Calibri" w:cs="Calibri" w:eastAsia="Calibri" w:hAnsi="Calibri"/>
+                <w:b w:val="false"/>
+                <w:bCs w:val="false"/>
+                <w:sz w:val="14"/>
+                <w:szCs w:val="14"/>
+              </w:rPr>
+              <w:t xml:space="preserve">$24,998</w:t>
+            </w:r>
+          </w:p>
+        </w:tc>
+        <w:tc>
+          <w:tcPr>
+            <w:tcW w:type="dxa" w:w="1500"/>
+            <w:tcMar>
+              <w:top w:type="dxa" w:w="50"/>
+              <w:left w:type="dxa" w:w="70"/>
+              <w:bottom w:type="dxa" w:w="50"/>
+              <w:right w:type="dxa" w:w="70"/>
+            </w:tcMar>
+          </w:tcPr>
+          <w:p>
+            <w:pPr>
+              <w:jc w:val="right"/>
+            </w:pPr>
+            <w:r>
+              <w:rPr>
+                <w:rFonts w:ascii="Calibri" w:cs="Calibri" w:eastAsia="Calibri" w:hAnsi="Calibri"/>
+                <w:b w:val="false"/>
+                <w:bCs w:val="false"/>
+                <w:sz w:val="14"/>
+                <w:szCs w:val="14"/>
+              </w:rPr>
+              <w:t xml:space="preserve">($3,012)</w:t>
+            </w:r>
+          </w:p>
+        </w:tc>
+        <w:tc>
+          <w:tcPr>
+            <w:tcW w:type="dxa" w:w="1500"/>
+            <w:tcMar>
+              <w:top w:type="dxa" w:w="50"/>
+              <w:left w:type="dxa" w:w="70"/>
+              <w:bottom w:type="dxa" w:w="50"/>
+              <w:right w:type="dxa" w:w="70"/>
+            </w:tcMar>
+          </w:tcPr>
+          <w:p>
+            <w:pPr>
+              <w:jc w:val="right"/>
+            </w:pPr>
+            <w:r>
+              <w:rPr>
+                <w:rFonts w:ascii="Calibri" w:cs="Calibri" w:eastAsia="Calibri" w:hAnsi="Calibri"/>
+                <w:b w:val="false"/>
+                <w:bCs w:val="false"/>
+                <w:sz w:val="14"/>
+                <w:szCs w:val="14"/>
+              </w:rPr>
+              <w:t xml:space="preserve">$22,498</w:t>
+            </w:r>
+          </w:p>
+        </w:tc>
+        <w:tc>
+          <w:tcPr>
+            <w:tcW w:type="dxa" w:w="1500"/>
+            <w:tcMar>
+              <w:top w:type="dxa" w:w="50"/>
+              <w:left w:type="dxa" w:w="70"/>
+              <w:bottom w:type="dxa" w:w="50"/>
+              <w:right w:type="dxa" w:w="70"/>
+            </w:tcMar>
+          </w:tcPr>
+          <w:p>
+            <w:pPr>
+              <w:jc w:val="right"/>
+            </w:pPr>
+            <w:r>
+              <w:rPr>
+                <w:rFonts w:ascii="Calibri" w:cs="Calibri" w:eastAsia="Calibri" w:hAnsi="Calibri"/>
+                <w:b w:val="false"/>
+                <w:bCs w:val="false"/>
+                <w:sz w:val="14"/>
+                <w:szCs w:val="14"/>
+              </w:rPr>
+              <w:t xml:space="preserve">$21,986</w:t>
             </w:r>
           </w:p>
         </w:tc>
@@ -8830,7 +8830,7 @@
                 <w:sz w:val="14"/>
                 <w:szCs w:val="14"/>
               </w:rPr>
-              <w:t xml:space="preserve">$110,546</w:t>
+              <w:t xml:space="preserve">$45,678</w:t>
             </w:r>
           </w:p>
         </w:tc>
@@ -8910,85 +8910,85 @@
                 <w:sz w:val="14"/>
                 <w:szCs w:val="14"/>
               </w:rPr>
-              <w:t xml:space="preserve">$126,866</w:t>
-            </w:r>
-          </w:p>
-        </w:tc>
-        <w:tc>
-          <w:tcPr>
-            <w:tcW w:type="dxa" w:w="1500"/>
-            <w:tcMar>
-              <w:top w:type="dxa" w:w="50"/>
-              <w:left w:type="dxa" w:w="70"/>
-              <w:bottom w:type="dxa" w:w="50"/>
-              <w:right w:type="dxa" w:w="70"/>
-            </w:tcMar>
-          </w:tcPr>
-          <w:p>
-            <w:pPr>
-              <w:jc w:val="right"/>
-            </w:pPr>
-            <w:r>
-              <w:rPr>
-                <w:rFonts w:ascii="Calibri" w:cs="Calibri" w:eastAsia="Calibri" w:hAnsi="Calibri"/>
-                <w:b w:val="false"/>
-                <w:bCs w:val="false"/>
-                <w:sz w:val="14"/>
-                <w:szCs w:val="14"/>
-              </w:rPr>
-              <w:t xml:space="preserve">($16,319)</w:t>
-            </w:r>
-          </w:p>
-        </w:tc>
-        <w:tc>
-          <w:tcPr>
-            <w:tcW w:type="dxa" w:w="1500"/>
-            <w:tcMar>
-              <w:top w:type="dxa" w:w="50"/>
-              <w:left w:type="dxa" w:w="70"/>
-              <w:bottom w:type="dxa" w:w="50"/>
-              <w:right w:type="dxa" w:w="70"/>
-            </w:tcMar>
-          </w:tcPr>
-          <w:p>
-            <w:pPr>
-              <w:jc w:val="right"/>
-            </w:pPr>
-            <w:r>
-              <w:rPr>
-                <w:rFonts w:ascii="Calibri" w:cs="Calibri" w:eastAsia="Calibri" w:hAnsi="Calibri"/>
-                <w:b w:val="false"/>
-                <w:bCs w:val="false"/>
-                <w:sz w:val="14"/>
-                <w:szCs w:val="14"/>
-              </w:rPr>
-              <w:t xml:space="preserve">$114,179</w:t>
-            </w:r>
-          </w:p>
-        </w:tc>
-        <w:tc>
-          <w:tcPr>
-            <w:tcW w:type="dxa" w:w="1500"/>
-            <w:tcMar>
-              <w:top w:type="dxa" w:w="50"/>
-              <w:left w:type="dxa" w:w="70"/>
-              <w:bottom w:type="dxa" w:w="50"/>
-              <w:right w:type="dxa" w:w="70"/>
-            </w:tcMar>
-          </w:tcPr>
-          <w:p>
-            <w:pPr>
-              <w:jc w:val="right"/>
-            </w:pPr>
-            <w:r>
-              <w:rPr>
-                <w:rFonts w:ascii="Calibri" w:cs="Calibri" w:eastAsia="Calibri" w:hAnsi="Calibri"/>
-                <w:b w:val="false"/>
-                <w:bCs w:val="false"/>
-                <w:sz w:val="14"/>
-                <w:szCs w:val="14"/>
-              </w:rPr>
-              <w:t xml:space="preserve">$110,546</w:t>
+              <w:t xml:space="preserve">$52,496</w:t>
+            </w:r>
+          </w:p>
+        </w:tc>
+        <w:tc>
+          <w:tcPr>
+            <w:tcW w:type="dxa" w:w="1500"/>
+            <w:tcMar>
+              <w:top w:type="dxa" w:w="50"/>
+              <w:left w:type="dxa" w:w="70"/>
+              <w:bottom w:type="dxa" w:w="50"/>
+              <w:right w:type="dxa" w:w="70"/>
+            </w:tcMar>
+          </w:tcPr>
+          <w:p>
+            <w:pPr>
+              <w:jc w:val="right"/>
+            </w:pPr>
+            <w:r>
+              <w:rPr>
+                <w:rFonts w:ascii="Calibri" w:cs="Calibri" w:eastAsia="Calibri" w:hAnsi="Calibri"/>
+                <w:b w:val="false"/>
+                <w:bCs w:val="false"/>
+                <w:sz w:val="14"/>
+                <w:szCs w:val="14"/>
+              </w:rPr>
+              <w:t xml:space="preserve">($6,818)</w:t>
+            </w:r>
+          </w:p>
+        </w:tc>
+        <w:tc>
+          <w:tcPr>
+            <w:tcW w:type="dxa" w:w="1500"/>
+            <w:tcMar>
+              <w:top w:type="dxa" w:w="50"/>
+              <w:left w:type="dxa" w:w="70"/>
+              <w:bottom w:type="dxa" w:w="50"/>
+              <w:right w:type="dxa" w:w="70"/>
+            </w:tcMar>
+          </w:tcPr>
+          <w:p>
+            <w:pPr>
+              <w:jc w:val="right"/>
+            </w:pPr>
+            <w:r>
+              <w:rPr>
+                <w:rFonts w:ascii="Calibri" w:cs="Calibri" w:eastAsia="Calibri" w:hAnsi="Calibri"/>
+                <w:b w:val="false"/>
+                <w:bCs w:val="false"/>
+                <w:sz w:val="14"/>
+                <w:szCs w:val="14"/>
+              </w:rPr>
+              <w:t xml:space="preserve">$47,245</w:t>
+            </w:r>
+          </w:p>
+        </w:tc>
+        <w:tc>
+          <w:tcPr>
+            <w:tcW w:type="dxa" w:w="1500"/>
+            <w:tcMar>
+              <w:top w:type="dxa" w:w="50"/>
+              <w:left w:type="dxa" w:w="70"/>
+              <w:bottom w:type="dxa" w:w="50"/>
+              <w:right w:type="dxa" w:w="70"/>
+            </w:tcMar>
+          </w:tcPr>
+          <w:p>
+            <w:pPr>
+              <w:jc w:val="right"/>
+            </w:pPr>
+            <w:r>
+              <w:rPr>
+                <w:rFonts w:ascii="Calibri" w:cs="Calibri" w:eastAsia="Calibri" w:hAnsi="Calibri"/>
+                <w:b w:val="false"/>
+                <w:bCs w:val="false"/>
+                <w:sz w:val="14"/>
+                <w:szCs w:val="14"/>
+              </w:rPr>
+              <w:t xml:space="preserve">$45,678</w:t>
             </w:r>
           </w:p>
         </w:tc>
@@ -9014,7 +9014,7 @@
                 <w:sz w:val="14"/>
                 <w:szCs w:val="14"/>
               </w:rPr>
-              <w:t xml:space="preserve">$110,546</w:t>
+              <w:t xml:space="preserve">$45,678</w:t>
             </w:r>
           </w:p>
         </w:tc>
@@ -9438,7 +9438,7 @@
                 <w:sz w:val="16"/>
                 <w:szCs w:val="16"/>
               </w:rPr>
-              <w:t xml:space="preserve">510</w:t>
+              <w:t xml:space="preserve">215</w:t>
             </w:r>
           </w:p>
         </w:tc>
@@ -9464,7 +9464,7 @@
                 <w:sz w:val="16"/>
                 <w:szCs w:val="16"/>
               </w:rPr>
-              <w:t xml:space="preserve">$7,703,116</w:t>
+              <w:t xml:space="preserve">$7,666,245</w:t>
             </w:r>
           </w:p>
         </w:tc>
@@ -9490,7 +9490,7 @@
                 <w:sz w:val="16"/>
                 <w:szCs w:val="16"/>
               </w:rPr>
-              <w:t xml:space="preserve">$4,932,619</w:t>
+              <w:t xml:space="preserve">$4,899,434</w:t>
             </w:r>
           </w:p>
         </w:tc>
@@ -9648,7 +9648,7 @@
                 <w:sz w:val="16"/>
                 <w:szCs w:val="16"/>
               </w:rPr>
-              <w:t xml:space="preserve">1,015</w:t>
+              <w:t xml:space="preserve">420</w:t>
             </w:r>
           </w:p>
         </w:tc>
@@ -9674,7 +9674,7 @@
                 <w:sz w:val="16"/>
                 <w:szCs w:val="16"/>
               </w:rPr>
-              <w:t xml:space="preserve">$17,493,335</w:t>
+              <w:t xml:space="preserve">$17,418,965</w:t>
             </w:r>
           </w:p>
         </w:tc>
@@ -9700,7 +9700,7 @@
                 <w:sz w:val="16"/>
                 <w:szCs w:val="16"/>
               </w:rPr>
-              <w:t xml:space="preserve">$11,974,209</w:t>
+              <w:t xml:space="preserve">$11,907,278</w:t>
             </w:r>
           </w:p>
         </w:tc>
@@ -9858,7 +9858,7 @@
                 <w:sz w:val="16"/>
                 <w:szCs w:val="16"/>
               </w:rPr>
-              <w:t xml:space="preserve">2,030</w:t>
+              <w:t xml:space="preserve">840</w:t>
             </w:r>
           </w:p>
         </w:tc>
@@ -9884,7 +9884,7 @@
                 <w:sz w:val="16"/>
                 <w:szCs w:val="16"/>
               </w:rPr>
-              <w:t xml:space="preserve">$39,160,576</w:t>
+              <w:t xml:space="preserve">$39,011,837</w:t>
             </w:r>
           </w:p>
         </w:tc>
@@ -9910,7 +9910,7 @@
                 <w:sz w:val="16"/>
                 <w:szCs w:val="16"/>
               </w:rPr>
-              <w:t xml:space="preserve">$27,621,655</w:t>
+              <w:t xml:space="preserve">$27,487,790</w:t>
             </w:r>
           </w:p>
         </w:tc>

</xml_diff>

<commit_message>
Market model: school district ramp set to Frank's estimate (10 to 225 districts at Base, 150 to 300 at the ends); document regenerated
Co-Authored-By: Claude Fable 5.1 <noreply@anthropic.com>
Claude-Session: https://claude.ai/code/session_01FdLL4Wp3bi12KNX6zHRo7N
</commit_message>
<xml_diff>
--- a/EZvoxa Market Model and Business Plan.docx
+++ b/EZvoxa Market Model and Business Plan.docx
@@ -3058,7 +3058,7 @@
           <w:sz w:val="22"/>
           <w:szCs w:val="22"/>
         </w:rPr>
-        <w:t xml:space="preserve">Frank's to set. Buyer share is new one-time buyers each year as a share of the counted consumer market; subscription attach is the share of all buyers to date who hold the Family Tether at year end. The school and clinical shares are Claude's best estimate of direct sales through the website (Frank's ask, 9 Sep 2026), one seller at first, districts owning the devices and EZ Voice supplying the software: Year 1 St. Lucie district-wide (about 100 seats) plus two neighboring districts at 20 seats, 140 seats; Year 2 eight Florida districts at 40 seats, 320; Year 3 twenty-five districts across Florida and the Southeast, 1,000 seats; Year 4 sixty districts, 2,400; Year 5 one hundred twenty districts, 4,800, which is 0.9% of the 13,349 districts and 3.7% of the counted seats. Clinics grow slowest (Frank, 9 Sep: individual sales, then school districts, then clinical): 2, 5, 12, 25 and 40 facilities at 5 seats. The dedicated-device AAC market is not in this widget, by Frank's instruction. Base is that estimate; Low is half; High is double. Consumer buyer shares are unchanged placeholders.</w:t>
+        <w:t xml:space="preserve">Frank's to set. Buyer share is new one-time buyers each year as a share of the counted consumer market; subscription attach is the share of all buyers to date who hold the Family Tether at year end. School districts are Frank's estimate (9 Sep 2026): "I see is starting 10 districts maybe 50-75 by year 3 to anywhere from 150-300 by year 5. I say that because by year 4 I would want all of Florida and once we get outside Florida? It should take off quickly." Base 10, 25, 60, 120 and 225 districts; Low 10, 20, 50, 90, 150; High 10, 35, 75, 180, 300; at 40 seats a district (Claude's assumption). Florida has 67 regular districts (NCES table 214.30), so Year 4 at Base is all of Florida plus about 50 outside it. Clinics are Claude's estimate and grow slowest (Frank, 9 Sep: individual sales, then school districts, then clinical): 2, 5, 12, 25 and 40 facilities at 5 seats. The dedicated-device AAC market is not in this widget, by Frank's instruction. Base is that estimate; Low is half; High is double. Consumer buyer shares are unchanged placeholders.</w:t>
       </w:r>
     </w:p>
     <w:tbl>
@@ -3318,7 +3318,7 @@
                 <w:sz w:val="16"/>
                 <w:szCs w:val="16"/>
               </w:rPr>
-              <w:t xml:space="preserve">0.05%, 0.12%, 0.38%, 0.92%, 1.84%</w:t>
+              <w:t xml:space="preserve">0.31%, 0.61%, 1.53%, 2.75%, 4.59%</w:t>
             </w:r>
           </w:p>
         </w:tc>
@@ -3450,7 +3450,7 @@
                 <w:sz w:val="16"/>
                 <w:szCs w:val="16"/>
               </w:rPr>
-              <w:t xml:space="preserve">0.11%, 0.24%, 0.77%, 1.84%, 3.67%</w:t>
+              <w:t xml:space="preserve">0.31%, 0.77%, 1.84%, 3.67%, 6.88%</w:t>
             </w:r>
           </w:p>
         </w:tc>
@@ -3582,7 +3582,7 @@
                 <w:sz w:val="16"/>
                 <w:szCs w:val="16"/>
               </w:rPr>
-              <w:t xml:space="preserve">0.21%, 0.49%, 1.53%, 3.67%, 7.34%</w:t>
+              <w:t xml:space="preserve">0.31%, 1.07%, 2.29%, 5.51%, 9.18%</w:t>
             </w:r>
           </w:p>
         </w:tc>
@@ -3674,7 +3674,7 @@
         <w:rPr>
           <w:rFonts w:ascii="Calibri" w:cs="Calibri" w:eastAsia="Calibri" w:hAnsi="Calibri"/>
         </w:rPr>
-        <w:t xml:space="preserve">All three models combined: five-year net $11,907,278</w:t>
+        <w:t xml:space="preserve">All three models combined: five-year net $12,912,947</w:t>
       </w:r>
     </w:p>
     <w:tbl>
@@ -3938,111 +3938,111 @@
                 <w:sz w:val="14"/>
                 <w:szCs w:val="14"/>
               </w:rPr>
-              <w:t xml:space="preserve">4,025 buyers, 1,006 subs, 150 seats</w:t>
-            </w:r>
-          </w:p>
-        </w:tc>
-        <w:tc>
-          <w:tcPr>
-            <w:tcW w:type="dxa" w:w="1500"/>
-            <w:tcMar>
-              <w:top w:type="dxa" w:w="50"/>
-              <w:left w:type="dxa" w:w="70"/>
-              <w:bottom w:type="dxa" w:w="50"/>
-              <w:right w:type="dxa" w:w="70"/>
-            </w:tcMar>
-          </w:tcPr>
-          <w:p>
-            <w:pPr>
-              <w:jc w:val="right"/>
-            </w:pPr>
-            <w:r>
-              <w:rPr>
-                <w:rFonts w:ascii="Calibri" w:cs="Calibri" w:eastAsia="Calibri" w:hAnsi="Calibri"/>
-                <w:b w:val="false"/>
-                <w:bCs w:val="false"/>
-                <w:sz w:val="14"/>
-                <w:szCs w:val="14"/>
-              </w:rPr>
-              <w:t xml:space="preserve">$481,508</w:t>
-            </w:r>
-          </w:p>
-        </w:tc>
-        <w:tc>
-          <w:tcPr>
-            <w:tcW w:type="dxa" w:w="1500"/>
-            <w:tcMar>
-              <w:top w:type="dxa" w:w="50"/>
-              <w:left w:type="dxa" w:w="70"/>
-              <w:bottom w:type="dxa" w:w="50"/>
-              <w:right w:type="dxa" w:w="70"/>
-            </w:tcMar>
-          </w:tcPr>
-          <w:p>
-            <w:pPr>
-              <w:jc w:val="right"/>
-            </w:pPr>
-            <w:r>
-              <w:rPr>
-                <w:rFonts w:ascii="Calibri" w:cs="Calibri" w:eastAsia="Calibri" w:hAnsi="Calibri"/>
-                <w:b w:val="false"/>
-                <w:bCs w:val="false"/>
-                <w:sz w:val="14"/>
-                <w:szCs w:val="14"/>
-              </w:rPr>
-              <w:t xml:space="preserve">($198,477)</w:t>
-            </w:r>
-          </w:p>
-        </w:tc>
-        <w:tc>
-          <w:tcPr>
-            <w:tcW w:type="dxa" w:w="1500"/>
-            <w:tcMar>
-              <w:top w:type="dxa" w:w="50"/>
-              <w:left w:type="dxa" w:w="70"/>
-              <w:bottom w:type="dxa" w:w="50"/>
-              <w:right w:type="dxa" w:w="70"/>
-            </w:tcMar>
-          </w:tcPr>
-          <w:p>
-            <w:pPr>
-              <w:jc w:val="right"/>
-            </w:pPr>
-            <w:r>
-              <w:rPr>
-                <w:rFonts w:ascii="Calibri" w:cs="Calibri" w:eastAsia="Calibri" w:hAnsi="Calibri"/>
-                <w:b w:val="false"/>
-                <w:bCs w:val="false"/>
-                <w:sz w:val="14"/>
-                <w:szCs w:val="14"/>
-              </w:rPr>
-              <w:t xml:space="preserve">$335,528</w:t>
-            </w:r>
-          </w:p>
-        </w:tc>
-        <w:tc>
-          <w:tcPr>
-            <w:tcW w:type="dxa" w:w="1500"/>
-            <w:tcMar>
-              <w:top w:type="dxa" w:w="50"/>
-              <w:left w:type="dxa" w:w="70"/>
-              <w:bottom w:type="dxa" w:w="50"/>
-              <w:right w:type="dxa" w:w="70"/>
-            </w:tcMar>
-          </w:tcPr>
-          <w:p>
-            <w:pPr>
-              <w:jc w:val="right"/>
-            </w:pPr>
-            <w:r>
-              <w:rPr>
-                <w:rFonts w:ascii="Calibri" w:cs="Calibri" w:eastAsia="Calibri" w:hAnsi="Calibri"/>
-                <w:b w:val="false"/>
-                <w:bCs w:val="false"/>
-                <w:sz w:val="14"/>
-                <w:szCs w:val="14"/>
-              </w:rPr>
-              <w:t xml:space="preserve">$283,032</w:t>
+              <w:t xml:space="preserve">4,025 buyers, 1,006 subs, 410 seats</w:t>
+            </w:r>
+          </w:p>
+        </w:tc>
+        <w:tc>
+          <w:tcPr>
+            <w:tcW w:type="dxa" w:w="1500"/>
+            <w:tcMar>
+              <w:top w:type="dxa" w:w="50"/>
+              <w:left w:type="dxa" w:w="70"/>
+              <w:bottom w:type="dxa" w:w="50"/>
+              <w:right w:type="dxa" w:w="70"/>
+            </w:tcMar>
+          </w:tcPr>
+          <w:p>
+            <w:pPr>
+              <w:jc w:val="right"/>
+            </w:pPr>
+            <w:r>
+              <w:rPr>
+                <w:rFonts w:ascii="Calibri" w:cs="Calibri" w:eastAsia="Calibri" w:hAnsi="Calibri"/>
+                <w:b w:val="false"/>
+                <w:bCs w:val="false"/>
+                <w:sz w:val="14"/>
+                <w:szCs w:val="14"/>
+              </w:rPr>
+              <w:t xml:space="preserve">$514,005</w:t>
+            </w:r>
+          </w:p>
+        </w:tc>
+        <w:tc>
+          <w:tcPr>
+            <w:tcW w:type="dxa" w:w="1500"/>
+            <w:tcMar>
+              <w:top w:type="dxa" w:w="50"/>
+              <w:left w:type="dxa" w:w="70"/>
+              <w:bottom w:type="dxa" w:w="50"/>
+              <w:right w:type="dxa" w:w="70"/>
+            </w:tcMar>
+          </w:tcPr>
+          <w:p>
+            <w:pPr>
+              <w:jc w:val="right"/>
+            </w:pPr>
+            <w:r>
+              <w:rPr>
+                <w:rFonts w:ascii="Calibri" w:cs="Calibri" w:eastAsia="Calibri" w:hAnsi="Calibri"/>
+                <w:b w:val="false"/>
+                <w:bCs w:val="false"/>
+                <w:sz w:val="14"/>
+                <w:szCs w:val="14"/>
+              </w:rPr>
+              <w:t xml:space="preserve">($201,726)</w:t>
+            </w:r>
+          </w:p>
+        </w:tc>
+        <w:tc>
+          <w:tcPr>
+            <w:tcW w:type="dxa" w:w="1500"/>
+            <w:tcMar>
+              <w:top w:type="dxa" w:w="50"/>
+              <w:left w:type="dxa" w:w="70"/>
+              <w:bottom w:type="dxa" w:w="50"/>
+              <w:right w:type="dxa" w:w="70"/>
+            </w:tcMar>
+          </w:tcPr>
+          <w:p>
+            <w:pPr>
+              <w:jc w:val="right"/>
+            </w:pPr>
+            <w:r>
+              <w:rPr>
+                <w:rFonts w:ascii="Calibri" w:cs="Calibri" w:eastAsia="Calibri" w:hAnsi="Calibri"/>
+                <w:b w:val="false"/>
+                <w:bCs w:val="false"/>
+                <w:sz w:val="14"/>
+                <w:szCs w:val="14"/>
+              </w:rPr>
+              <w:t xml:space="preserve">$364,776</w:t>
+            </w:r>
+          </w:p>
+        </w:tc>
+        <w:tc>
+          <w:tcPr>
+            <w:tcW w:type="dxa" w:w="1500"/>
+            <w:tcMar>
+              <w:top w:type="dxa" w:w="50"/>
+              <w:left w:type="dxa" w:w="70"/>
+              <w:bottom w:type="dxa" w:w="50"/>
+              <w:right w:type="dxa" w:w="70"/>
+            </w:tcMar>
+          </w:tcPr>
+          <w:p>
+            <w:pPr>
+              <w:jc w:val="right"/>
+            </w:pPr>
+            <w:r>
+              <w:rPr>
+                <w:rFonts w:ascii="Calibri" w:cs="Calibri" w:eastAsia="Calibri" w:hAnsi="Calibri"/>
+                <w:b w:val="false"/>
+                <w:bCs w:val="false"/>
+                <w:sz w:val="14"/>
+                <w:szCs w:val="14"/>
+              </w:rPr>
+              <w:t xml:space="preserve">$312,279</w:t>
             </w:r>
           </w:p>
         </w:tc>
@@ -4068,7 +4068,7 @@
                 <w:sz w:val="14"/>
                 <w:szCs w:val="14"/>
               </w:rPr>
-              <w:t xml:space="preserve">$283,032</w:t>
+              <w:t xml:space="preserve">$312,279</w:t>
             </w:r>
           </w:p>
         </w:tc>
@@ -4122,111 +4122,111 @@
                 <w:sz w:val="14"/>
                 <w:szCs w:val="14"/>
               </w:rPr>
-              <w:t xml:space="preserve">10,062 buyers, 3,522 subs, 345 seats</w:t>
-            </w:r>
-          </w:p>
-        </w:tc>
-        <w:tc>
-          <w:tcPr>
-            <w:tcW w:type="dxa" w:w="1500"/>
-            <w:tcMar>
-              <w:top w:type="dxa" w:w="50"/>
-              <w:left w:type="dxa" w:w="70"/>
-              <w:bottom w:type="dxa" w:w="50"/>
-              <w:right w:type="dxa" w:w="70"/>
-            </w:tcMar>
-          </w:tcPr>
-          <w:p>
-            <w:pPr>
-              <w:jc w:val="right"/>
-            </w:pPr>
-            <w:r>
-              <w:rPr>
-                <w:rFonts w:ascii="Calibri" w:cs="Calibri" w:eastAsia="Calibri" w:hAnsi="Calibri"/>
-                <w:b w:val="false"/>
-                <w:bCs w:val="false"/>
-                <w:sz w:val="14"/>
-                <w:szCs w:val="14"/>
-              </w:rPr>
-              <w:t xml:space="preserve">$1,320,629</w:t>
-            </w:r>
-          </w:p>
-        </w:tc>
-        <w:tc>
-          <w:tcPr>
-            <w:tcW w:type="dxa" w:w="1500"/>
-            <w:tcMar>
-              <w:top w:type="dxa" w:w="50"/>
-              <w:left w:type="dxa" w:w="70"/>
-              <w:bottom w:type="dxa" w:w="50"/>
-              <w:right w:type="dxa" w:w="70"/>
-            </w:tcMar>
-          </w:tcPr>
-          <w:p>
-            <w:pPr>
-              <w:jc w:val="right"/>
-            </w:pPr>
-            <w:r>
-              <w:rPr>
-                <w:rFonts w:ascii="Calibri" w:cs="Calibri" w:eastAsia="Calibri" w:hAnsi="Calibri"/>
-                <w:b w:val="false"/>
-                <w:bCs w:val="false"/>
-                <w:sz w:val="14"/>
-                <w:szCs w:val="14"/>
-              </w:rPr>
-              <w:t xml:space="preserve">($476,523)</w:t>
-            </w:r>
-          </w:p>
-        </w:tc>
-        <w:tc>
-          <w:tcPr>
-            <w:tcW w:type="dxa" w:w="1500"/>
-            <w:tcMar>
-              <w:top w:type="dxa" w:w="50"/>
-              <w:left w:type="dxa" w:w="70"/>
-              <w:bottom w:type="dxa" w:w="50"/>
-              <w:right w:type="dxa" w:w="70"/>
-            </w:tcMar>
-          </w:tcPr>
-          <w:p>
-            <w:pPr>
-              <w:jc w:val="right"/>
-            </w:pPr>
-            <w:r>
-              <w:rPr>
-                <w:rFonts w:ascii="Calibri" w:cs="Calibri" w:eastAsia="Calibri" w:hAnsi="Calibri"/>
-                <w:b w:val="false"/>
-                <w:bCs w:val="false"/>
-                <w:sz w:val="14"/>
-                <w:szCs w:val="14"/>
-              </w:rPr>
-              <w:t xml:space="preserve">$925,859</w:t>
-            </w:r>
-          </w:p>
-        </w:tc>
-        <w:tc>
-          <w:tcPr>
-            <w:tcW w:type="dxa" w:w="1500"/>
-            <w:tcMar>
-              <w:top w:type="dxa" w:w="50"/>
-              <w:left w:type="dxa" w:w="70"/>
-              <w:bottom w:type="dxa" w:w="50"/>
-              <w:right w:type="dxa" w:w="70"/>
-            </w:tcMar>
-          </w:tcPr>
-          <w:p>
-            <w:pPr>
-              <w:jc w:val="right"/>
-            </w:pPr>
-            <w:r>
-              <w:rPr>
-                <w:rFonts w:ascii="Calibri" w:cs="Calibri" w:eastAsia="Calibri" w:hAnsi="Calibri"/>
-                <w:b w:val="false"/>
-                <w:bCs w:val="false"/>
-                <w:sz w:val="14"/>
-                <w:szCs w:val="14"/>
-              </w:rPr>
-              <w:t xml:space="preserve">$844,106</w:t>
+              <w:t xml:space="preserve">10,062 buyers, 3,522 subs, 1,025 seats</w:t>
+            </w:r>
+          </w:p>
+        </w:tc>
+        <w:tc>
+          <w:tcPr>
+            <w:tcW w:type="dxa" w:w="1500"/>
+            <w:tcMar>
+              <w:top w:type="dxa" w:w="50"/>
+              <w:left w:type="dxa" w:w="70"/>
+              <w:bottom w:type="dxa" w:w="50"/>
+              <w:right w:type="dxa" w:w="70"/>
+            </w:tcMar>
+          </w:tcPr>
+          <w:p>
+            <w:pPr>
+              <w:jc w:val="right"/>
+            </w:pPr>
+            <w:r>
+              <w:rPr>
+                <w:rFonts w:ascii="Calibri" w:cs="Calibri" w:eastAsia="Calibri" w:hAnsi="Calibri"/>
+                <w:b w:val="false"/>
+                <w:bCs w:val="false"/>
+                <w:sz w:val="14"/>
+                <w:szCs w:val="14"/>
+              </w:rPr>
+              <w:t xml:space="preserve">$1,405,622</w:t>
+            </w:r>
+          </w:p>
+        </w:tc>
+        <w:tc>
+          <w:tcPr>
+            <w:tcW w:type="dxa" w:w="1500"/>
+            <w:tcMar>
+              <w:top w:type="dxa" w:w="50"/>
+              <w:left w:type="dxa" w:w="70"/>
+              <w:bottom w:type="dxa" w:w="50"/>
+              <w:right w:type="dxa" w:w="70"/>
+            </w:tcMar>
+          </w:tcPr>
+          <w:p>
+            <w:pPr>
+              <w:jc w:val="right"/>
+            </w:pPr>
+            <w:r>
+              <w:rPr>
+                <w:rFonts w:ascii="Calibri" w:cs="Calibri" w:eastAsia="Calibri" w:hAnsi="Calibri"/>
+                <w:b w:val="false"/>
+                <w:bCs w:val="false"/>
+                <w:sz w:val="14"/>
+                <w:szCs w:val="14"/>
+              </w:rPr>
+              <w:t xml:space="preserve">($485,023)</w:t>
+            </w:r>
+          </w:p>
+        </w:tc>
+        <w:tc>
+          <w:tcPr>
+            <w:tcW w:type="dxa" w:w="1500"/>
+            <w:tcMar>
+              <w:top w:type="dxa" w:w="50"/>
+              <w:left w:type="dxa" w:w="70"/>
+              <w:bottom w:type="dxa" w:w="50"/>
+              <w:right w:type="dxa" w:w="70"/>
+            </w:tcMar>
+          </w:tcPr>
+          <w:p>
+            <w:pPr>
+              <w:jc w:val="right"/>
+            </w:pPr>
+            <w:r>
+              <w:rPr>
+                <w:rFonts w:ascii="Calibri" w:cs="Calibri" w:eastAsia="Calibri" w:hAnsi="Calibri"/>
+                <w:b w:val="false"/>
+                <w:bCs w:val="false"/>
+                <w:sz w:val="14"/>
+                <w:szCs w:val="14"/>
+              </w:rPr>
+              <w:t xml:space="preserve">$1,002,352</w:t>
+            </w:r>
+          </w:p>
+        </w:tc>
+        <w:tc>
+          <w:tcPr>
+            <w:tcW w:type="dxa" w:w="1500"/>
+            <w:tcMar>
+              <w:top w:type="dxa" w:w="50"/>
+              <w:left w:type="dxa" w:w="70"/>
+              <w:bottom w:type="dxa" w:w="50"/>
+              <w:right w:type="dxa" w:w="70"/>
+            </w:tcMar>
+          </w:tcPr>
+          <w:p>
+            <w:pPr>
+              <w:jc w:val="right"/>
+            </w:pPr>
+            <w:r>
+              <w:rPr>
+                <w:rFonts w:ascii="Calibri" w:cs="Calibri" w:eastAsia="Calibri" w:hAnsi="Calibri"/>
+                <w:b w:val="false"/>
+                <w:bCs w:val="false"/>
+                <w:sz w:val="14"/>
+                <w:szCs w:val="14"/>
+              </w:rPr>
+              <w:t xml:space="preserve">$920,600</w:t>
             </w:r>
           </w:p>
         </w:tc>
@@ -4252,7 +4252,7 @@
                 <w:sz w:val="14"/>
                 <w:szCs w:val="14"/>
               </w:rPr>
-              <w:t xml:space="preserve">$1,127,138</w:t>
+              <w:t xml:space="preserve">$1,232,879</w:t>
             </w:r>
           </w:p>
         </w:tc>
@@ -4306,111 +4306,111 @@
                 <w:sz w:val="14"/>
                 <w:szCs w:val="14"/>
               </w:rPr>
-              <w:t xml:space="preserve">20,124 buyers, 8,553 subs, 1,060 seats</w:t>
-            </w:r>
-          </w:p>
-        </w:tc>
-        <w:tc>
-          <w:tcPr>
-            <w:tcW w:type="dxa" w:w="1500"/>
-            <w:tcMar>
-              <w:top w:type="dxa" w:w="50"/>
-              <w:left w:type="dxa" w:w="70"/>
-              <w:bottom w:type="dxa" w:w="50"/>
-              <w:right w:type="dxa" w:w="70"/>
-            </w:tcMar>
-          </w:tcPr>
-          <w:p>
-            <w:pPr>
-              <w:jc w:val="right"/>
-            </w:pPr>
-            <w:r>
-              <w:rPr>
-                <w:rFonts w:ascii="Calibri" w:cs="Calibri" w:eastAsia="Calibri" w:hAnsi="Calibri"/>
-                <w:b w:val="false"/>
-                <w:bCs w:val="false"/>
-                <w:sz w:val="14"/>
-                <w:szCs w:val="14"/>
-              </w:rPr>
-              <w:t xml:space="preserve">$2,868,464</w:t>
-            </w:r>
-          </w:p>
-        </w:tc>
-        <w:tc>
-          <w:tcPr>
-            <w:tcW w:type="dxa" w:w="1500"/>
-            <w:tcMar>
-              <w:top w:type="dxa" w:w="50"/>
-              <w:left w:type="dxa" w:w="70"/>
-              <w:bottom w:type="dxa" w:w="50"/>
-              <w:right w:type="dxa" w:w="70"/>
-            </w:tcMar>
-          </w:tcPr>
-          <w:p>
-            <w:pPr>
-              <w:jc w:val="right"/>
-            </w:pPr>
-            <w:r>
-              <w:rPr>
-                <w:rFonts w:ascii="Calibri" w:cs="Calibri" w:eastAsia="Calibri" w:hAnsi="Calibri"/>
-                <w:b w:val="false"/>
-                <w:bCs w:val="false"/>
-                <w:sz w:val="14"/>
-                <w:szCs w:val="14"/>
-              </w:rPr>
-              <w:t xml:space="preserve">($952,429)</w:t>
-            </w:r>
-          </w:p>
-        </w:tc>
-        <w:tc>
-          <w:tcPr>
-            <w:tcW w:type="dxa" w:w="1500"/>
-            <w:tcMar>
-              <w:top w:type="dxa" w:w="50"/>
-              <w:left w:type="dxa" w:w="70"/>
-              <w:bottom w:type="dxa" w:w="50"/>
-              <w:right w:type="dxa" w:w="70"/>
-            </w:tcMar>
-          </w:tcPr>
-          <w:p>
-            <w:pPr>
-              <w:jc w:val="right"/>
-            </w:pPr>
-            <w:r>
-              <w:rPr>
-                <w:rFonts w:ascii="Calibri" w:cs="Calibri" w:eastAsia="Calibri" w:hAnsi="Calibri"/>
-                <w:b w:val="false"/>
-                <w:bCs w:val="false"/>
-                <w:sz w:val="14"/>
-                <w:szCs w:val="14"/>
-              </w:rPr>
-              <w:t xml:space="preserve">$2,028,988</w:t>
-            </w:r>
-          </w:p>
-        </w:tc>
-        <w:tc>
-          <w:tcPr>
-            <w:tcW w:type="dxa" w:w="1500"/>
-            <w:tcMar>
-              <w:top w:type="dxa" w:w="50"/>
-              <w:left w:type="dxa" w:w="70"/>
-              <w:bottom w:type="dxa" w:w="50"/>
-              <w:right w:type="dxa" w:w="70"/>
-            </w:tcMar>
-          </w:tcPr>
-          <w:p>
-            <w:pPr>
-              <w:jc w:val="right"/>
-            </w:pPr>
-            <w:r>
-              <w:rPr>
-                <w:rFonts w:ascii="Calibri" w:cs="Calibri" w:eastAsia="Calibri" w:hAnsi="Calibri"/>
-                <w:b w:val="false"/>
-                <w:bCs w:val="false"/>
-                <w:sz w:val="14"/>
-                <w:szCs w:val="14"/>
-              </w:rPr>
-              <w:t xml:space="preserve">$1,916,035</w:t>
+              <w:t xml:space="preserve">20,124 buyers, 8,553 subs, 2,461 seats</w:t>
+            </w:r>
+          </w:p>
+        </w:tc>
+        <w:tc>
+          <w:tcPr>
+            <w:tcW w:type="dxa" w:w="1500"/>
+            <w:tcMar>
+              <w:top w:type="dxa" w:w="50"/>
+              <w:left w:type="dxa" w:w="70"/>
+              <w:bottom w:type="dxa" w:w="50"/>
+              <w:right w:type="dxa" w:w="70"/>
+            </w:tcMar>
+          </w:tcPr>
+          <w:p>
+            <w:pPr>
+              <w:jc w:val="right"/>
+            </w:pPr>
+            <w:r>
+              <w:rPr>
+                <w:rFonts w:ascii="Calibri" w:cs="Calibri" w:eastAsia="Calibri" w:hAnsi="Calibri"/>
+                <w:b w:val="false"/>
+                <w:bCs w:val="false"/>
+                <w:sz w:val="14"/>
+                <w:szCs w:val="14"/>
+              </w:rPr>
+              <w:t xml:space="preserve">$3,043,575</w:t>
+            </w:r>
+          </w:p>
+        </w:tc>
+        <w:tc>
+          <w:tcPr>
+            <w:tcW w:type="dxa" w:w="1500"/>
+            <w:tcMar>
+              <w:top w:type="dxa" w:w="50"/>
+              <w:left w:type="dxa" w:w="70"/>
+              <w:bottom w:type="dxa" w:w="50"/>
+              <w:right w:type="dxa" w:w="70"/>
+            </w:tcMar>
+          </w:tcPr>
+          <w:p>
+            <w:pPr>
+              <w:jc w:val="right"/>
+            </w:pPr>
+            <w:r>
+              <w:rPr>
+                <w:rFonts w:ascii="Calibri" w:cs="Calibri" w:eastAsia="Calibri" w:hAnsi="Calibri"/>
+                <w:b w:val="false"/>
+                <w:bCs w:val="false"/>
+                <w:sz w:val="14"/>
+                <w:szCs w:val="14"/>
+              </w:rPr>
+              <w:t xml:space="preserve">($969,940)</w:t>
+            </w:r>
+          </w:p>
+        </w:tc>
+        <w:tc>
+          <w:tcPr>
+            <w:tcW w:type="dxa" w:w="1500"/>
+            <w:tcMar>
+              <w:top w:type="dxa" w:w="50"/>
+              <w:left w:type="dxa" w:w="70"/>
+              <w:bottom w:type="dxa" w:w="50"/>
+              <w:right w:type="dxa" w:w="70"/>
+            </w:tcMar>
+          </w:tcPr>
+          <w:p>
+            <w:pPr>
+              <w:jc w:val="right"/>
+            </w:pPr>
+            <w:r>
+              <w:rPr>
+                <w:rFonts w:ascii="Calibri" w:cs="Calibri" w:eastAsia="Calibri" w:hAnsi="Calibri"/>
+                <w:b w:val="false"/>
+                <w:bCs w:val="false"/>
+                <w:sz w:val="14"/>
+                <w:szCs w:val="14"/>
+              </w:rPr>
+              <w:t xml:space="preserve">$2,186,588</w:t>
+            </w:r>
+          </w:p>
+        </w:tc>
+        <w:tc>
+          <w:tcPr>
+            <w:tcW w:type="dxa" w:w="1500"/>
+            <w:tcMar>
+              <w:top w:type="dxa" w:w="50"/>
+              <w:left w:type="dxa" w:w="70"/>
+              <w:bottom w:type="dxa" w:w="50"/>
+              <w:right w:type="dxa" w:w="70"/>
+            </w:tcMar>
+          </w:tcPr>
+          <w:p>
+            <w:pPr>
+              <w:jc w:val="right"/>
+            </w:pPr>
+            <w:r>
+              <w:rPr>
+                <w:rFonts w:ascii="Calibri" w:cs="Calibri" w:eastAsia="Calibri" w:hAnsi="Calibri"/>
+                <w:b w:val="false"/>
+                <w:bCs w:val="false"/>
+                <w:sz w:val="14"/>
+                <w:szCs w:val="14"/>
+              </w:rPr>
+              <w:t xml:space="preserve">$2,073,635</w:t>
             </w:r>
           </w:p>
         </w:tc>
@@ -4436,7 +4436,7 @@
                 <w:sz w:val="14"/>
                 <w:szCs w:val="14"/>
               </w:rPr>
-              <w:t xml:space="preserve">$3,043,173</w:t>
+              <w:t xml:space="preserve">$3,306,514</w:t>
             </w:r>
           </w:p>
         </w:tc>
@@ -4490,111 +4490,111 @@
                 <w:sz w:val="14"/>
                 <w:szCs w:val="14"/>
               </w:rPr>
-              <w:t xml:space="preserve">32,198 buyers, 16,602 subs, 2,526 seats</w:t>
-            </w:r>
-          </w:p>
-        </w:tc>
-        <w:tc>
-          <w:tcPr>
-            <w:tcW w:type="dxa" w:w="1500"/>
-            <w:tcMar>
-              <w:top w:type="dxa" w:w="50"/>
-              <w:left w:type="dxa" w:w="70"/>
-              <w:bottom w:type="dxa" w:w="50"/>
-              <w:right w:type="dxa" w:w="70"/>
-            </w:tcMar>
-          </w:tcPr>
-          <w:p>
-            <w:pPr>
-              <w:jc w:val="right"/>
-            </w:pPr>
-            <w:r>
-              <w:rPr>
-                <w:rFonts w:ascii="Calibri" w:cs="Calibri" w:eastAsia="Calibri" w:hAnsi="Calibri"/>
-                <w:b w:val="false"/>
-                <w:bCs w:val="false"/>
-                <w:sz w:val="14"/>
-                <w:szCs w:val="14"/>
-              </w:rPr>
-              <w:t xml:space="preserve">$5,042,993</w:t>
-            </w:r>
-          </w:p>
-        </w:tc>
-        <w:tc>
-          <w:tcPr>
-            <w:tcW w:type="dxa" w:w="1500"/>
-            <w:tcMar>
-              <w:top w:type="dxa" w:w="50"/>
-              <w:left w:type="dxa" w:w="70"/>
-              <w:bottom w:type="dxa" w:w="50"/>
-              <w:right w:type="dxa" w:w="70"/>
-            </w:tcMar>
-          </w:tcPr>
-          <w:p>
-            <w:pPr>
-              <w:jc w:val="right"/>
-            </w:pPr>
-            <w:r>
-              <w:rPr>
-                <w:rFonts w:ascii="Calibri" w:cs="Calibri" w:eastAsia="Calibri" w:hAnsi="Calibri"/>
-                <w:b w:val="false"/>
-                <w:bCs w:val="false"/>
-                <w:sz w:val="14"/>
-                <w:szCs w:val="14"/>
-              </w:rPr>
-              <w:t xml:space="preserve">($1,580,351)</w:t>
-            </w:r>
-          </w:p>
-        </w:tc>
-        <w:tc>
-          <w:tcPr>
-            <w:tcW w:type="dxa" w:w="1500"/>
-            <w:tcMar>
-              <w:top w:type="dxa" w:w="50"/>
-              <w:left w:type="dxa" w:w="70"/>
-              <w:bottom w:type="dxa" w:w="50"/>
-              <w:right w:type="dxa" w:w="70"/>
-            </w:tcMar>
-          </w:tcPr>
-          <w:p>
-            <w:pPr>
-              <w:jc w:val="right"/>
-            </w:pPr>
-            <w:r>
-              <w:rPr>
-                <w:rFonts w:ascii="Calibri" w:cs="Calibri" w:eastAsia="Calibri" w:hAnsi="Calibri"/>
-                <w:b w:val="false"/>
-                <w:bCs w:val="false"/>
-                <w:sz w:val="14"/>
-                <w:szCs w:val="14"/>
-              </w:rPr>
-              <w:t xml:space="preserve">$3,601,895</w:t>
-            </w:r>
-          </w:p>
-        </w:tc>
-        <w:tc>
-          <w:tcPr>
-            <w:tcW w:type="dxa" w:w="1500"/>
-            <w:tcMar>
-              <w:top w:type="dxa" w:w="50"/>
-              <w:left w:type="dxa" w:w="70"/>
-              <w:bottom w:type="dxa" w:w="50"/>
-              <w:right w:type="dxa" w:w="70"/>
-            </w:tcMar>
-          </w:tcPr>
-          <w:p>
-            <w:pPr>
-              <w:jc w:val="right"/>
-            </w:pPr>
-            <w:r>
-              <w:rPr>
-                <w:rFonts w:ascii="Calibri" w:cs="Calibri" w:eastAsia="Calibri" w:hAnsi="Calibri"/>
-                <w:b w:val="false"/>
-                <w:bCs w:val="false"/>
-                <w:sz w:val="14"/>
-                <w:szCs w:val="14"/>
-              </w:rPr>
-              <w:t xml:space="preserve">$3,462,642</w:t>
+              <w:t xml:space="preserve">32,198 buyers, 16,602 subs, 4,925 seats</w:t>
+            </w:r>
+          </w:p>
+        </w:tc>
+        <w:tc>
+          <w:tcPr>
+            <w:tcW w:type="dxa" w:w="1500"/>
+            <w:tcMar>
+              <w:top w:type="dxa" w:w="50"/>
+              <w:left w:type="dxa" w:w="70"/>
+              <w:bottom w:type="dxa" w:w="50"/>
+              <w:right w:type="dxa" w:w="70"/>
+            </w:tcMar>
+          </w:tcPr>
+          <w:p>
+            <w:pPr>
+              <w:jc w:val="right"/>
+            </w:pPr>
+            <w:r>
+              <w:rPr>
+                <w:rFonts w:ascii="Calibri" w:cs="Calibri" w:eastAsia="Calibri" w:hAnsi="Calibri"/>
+                <w:b w:val="false"/>
+                <w:bCs w:val="false"/>
+                <w:sz w:val="14"/>
+                <w:szCs w:val="14"/>
+              </w:rPr>
+              <w:t xml:space="preserve">$5,342,844</w:t>
+            </w:r>
+          </w:p>
+        </w:tc>
+        <w:tc>
+          <w:tcPr>
+            <w:tcW w:type="dxa" w:w="1500"/>
+            <w:tcMar>
+              <w:top w:type="dxa" w:w="50"/>
+              <w:left w:type="dxa" w:w="70"/>
+              <w:bottom w:type="dxa" w:w="50"/>
+              <w:right w:type="dxa" w:w="70"/>
+            </w:tcMar>
+          </w:tcPr>
+          <w:p>
+            <w:pPr>
+              <w:jc w:val="right"/>
+            </w:pPr>
+            <w:r>
+              <w:rPr>
+                <w:rFonts w:ascii="Calibri" w:cs="Calibri" w:eastAsia="Calibri" w:hAnsi="Calibri"/>
+                <w:b w:val="false"/>
+                <w:bCs w:val="false"/>
+                <w:sz w:val="14"/>
+                <w:szCs w:val="14"/>
+              </w:rPr>
+              <w:t xml:space="preserve">($1,610,336)</w:t>
+            </w:r>
+          </w:p>
+        </w:tc>
+        <w:tc>
+          <w:tcPr>
+            <w:tcW w:type="dxa" w:w="1500"/>
+            <w:tcMar>
+              <w:top w:type="dxa" w:w="50"/>
+              <w:left w:type="dxa" w:w="70"/>
+              <w:bottom w:type="dxa" w:w="50"/>
+              <w:right w:type="dxa" w:w="70"/>
+            </w:tcMar>
+          </w:tcPr>
+          <w:p>
+            <w:pPr>
+              <w:jc w:val="right"/>
+            </w:pPr>
+            <w:r>
+              <w:rPr>
+                <w:rFonts w:ascii="Calibri" w:cs="Calibri" w:eastAsia="Calibri" w:hAnsi="Calibri"/>
+                <w:b w:val="false"/>
+                <w:bCs w:val="false"/>
+                <w:sz w:val="14"/>
+                <w:szCs w:val="14"/>
+              </w:rPr>
+              <w:t xml:space="preserve">$3,871,761</w:t>
+            </w:r>
+          </w:p>
+        </w:tc>
+        <w:tc>
+          <w:tcPr>
+            <w:tcW w:type="dxa" w:w="1500"/>
+            <w:tcMar>
+              <w:top w:type="dxa" w:w="50"/>
+              <w:left w:type="dxa" w:w="70"/>
+              <w:bottom w:type="dxa" w:w="50"/>
+              <w:right w:type="dxa" w:w="70"/>
+            </w:tcMar>
+          </w:tcPr>
+          <w:p>
+            <w:pPr>
+              <w:jc w:val="right"/>
+            </w:pPr>
+            <w:r>
+              <w:rPr>
+                <w:rFonts w:ascii="Calibri" w:cs="Calibri" w:eastAsia="Calibri" w:hAnsi="Calibri"/>
+                <w:b w:val="false"/>
+                <w:bCs w:val="false"/>
+                <w:sz w:val="14"/>
+                <w:szCs w:val="14"/>
+              </w:rPr>
+              <w:t xml:space="preserve">$3,732,508</w:t>
             </w:r>
           </w:p>
         </w:tc>
@@ -4620,7 +4620,7 @@
                 <w:sz w:val="14"/>
                 <w:szCs w:val="14"/>
               </w:rPr>
-              <w:t xml:space="preserve">$6,505,815</w:t>
+              <w:t xml:space="preserve">$7,039,022</w:t>
             </w:r>
           </w:p>
         </w:tc>
@@ -4674,111 +4674,111 @@
                 <w:sz w:val="14"/>
                 <w:szCs w:val="14"/>
               </w:rPr>
-              <w:t xml:space="preserve">44,272 buyers, 27,670 subs, 5,000 seats</w:t>
-            </w:r>
-          </w:p>
-        </w:tc>
-        <w:tc>
-          <w:tcPr>
-            <w:tcW w:type="dxa" w:w="1500"/>
-            <w:tcMar>
-              <w:top w:type="dxa" w:w="50"/>
-              <w:left w:type="dxa" w:w="70"/>
-              <w:bottom w:type="dxa" w:w="50"/>
-              <w:right w:type="dxa" w:w="70"/>
-            </w:tcMar>
-          </w:tcPr>
-          <w:p>
-            <w:pPr>
-              <w:jc w:val="right"/>
-            </w:pPr>
-            <w:r>
-              <w:rPr>
-                <w:rFonts w:ascii="Calibri" w:cs="Calibri" w:eastAsia="Calibri" w:hAnsi="Calibri"/>
-                <w:b w:val="false"/>
-                <w:bCs w:val="false"/>
-                <w:sz w:val="14"/>
-                <w:szCs w:val="14"/>
-              </w:rPr>
-              <w:t xml:space="preserve">$7,705,371</w:t>
-            </w:r>
-          </w:p>
-        </w:tc>
-        <w:tc>
-          <w:tcPr>
-            <w:tcW w:type="dxa" w:w="1500"/>
-            <w:tcMar>
-              <w:top w:type="dxa" w:w="50"/>
-              <w:left w:type="dxa" w:w="70"/>
-              <w:bottom w:type="dxa" w:w="50"/>
-              <w:right w:type="dxa" w:w="70"/>
-            </w:tcMar>
-          </w:tcPr>
-          <w:p>
-            <w:pPr>
-              <w:jc w:val="right"/>
-            </w:pPr>
-            <w:r>
-              <w:rPr>
-                <w:rFonts w:ascii="Calibri" w:cs="Calibri" w:eastAsia="Calibri" w:hAnsi="Calibri"/>
-                <w:b w:val="false"/>
-                <w:bCs w:val="false"/>
-                <w:sz w:val="14"/>
-                <w:szCs w:val="14"/>
-              </w:rPr>
-              <w:t xml:space="preserve">($2,303,908)</w:t>
-            </w:r>
-          </w:p>
-        </w:tc>
-        <w:tc>
-          <w:tcPr>
-            <w:tcW w:type="dxa" w:w="1500"/>
-            <w:tcMar>
-              <w:top w:type="dxa" w:w="50"/>
-              <w:left w:type="dxa" w:w="70"/>
-              <w:bottom w:type="dxa" w:w="50"/>
-              <w:right w:type="dxa" w:w="70"/>
-            </w:tcMar>
-          </w:tcPr>
-          <w:p>
-            <w:pPr>
-              <w:jc w:val="right"/>
-            </w:pPr>
-            <w:r>
-              <w:rPr>
-                <w:rFonts w:ascii="Calibri" w:cs="Calibri" w:eastAsia="Calibri" w:hAnsi="Calibri"/>
-                <w:b w:val="false"/>
-                <w:bCs w:val="false"/>
-                <w:sz w:val="14"/>
-                <w:szCs w:val="14"/>
-              </w:rPr>
-              <w:t xml:space="preserve">$5,559,445</w:t>
-            </w:r>
-          </w:p>
-        </w:tc>
-        <w:tc>
-          <w:tcPr>
-            <w:tcW w:type="dxa" w:w="1500"/>
-            <w:tcMar>
-              <w:top w:type="dxa" w:w="50"/>
-              <w:left w:type="dxa" w:w="70"/>
-              <w:bottom w:type="dxa" w:w="50"/>
-              <w:right w:type="dxa" w:w="70"/>
-            </w:tcMar>
-          </w:tcPr>
-          <w:p>
-            <w:pPr>
-              <w:jc w:val="right"/>
-            </w:pPr>
-            <w:r>
-              <w:rPr>
-                <w:rFonts w:ascii="Calibri" w:cs="Calibri" w:eastAsia="Calibri" w:hAnsi="Calibri"/>
-                <w:b w:val="false"/>
-                <w:bCs w:val="false"/>
-                <w:sz w:val="14"/>
-                <w:szCs w:val="14"/>
-              </w:rPr>
-              <w:t xml:space="preserve">$5,401,463</w:t>
+              <w:t xml:space="preserve">44,272 buyers, 27,670 subs, 9,200 seats</w:t>
+            </w:r>
+          </w:p>
+        </w:tc>
+        <w:tc>
+          <w:tcPr>
+            <w:tcW w:type="dxa" w:w="1500"/>
+            <w:tcMar>
+              <w:top w:type="dxa" w:w="50"/>
+              <w:left w:type="dxa" w:w="70"/>
+              <w:bottom w:type="dxa" w:w="50"/>
+              <w:right w:type="dxa" w:w="70"/>
+            </w:tcMar>
+          </w:tcPr>
+          <w:p>
+            <w:pPr>
+              <w:jc w:val="right"/>
+            </w:pPr>
+            <w:r>
+              <w:rPr>
+                <w:rFonts w:ascii="Calibri" w:cs="Calibri" w:eastAsia="Calibri" w:hAnsi="Calibri"/>
+                <w:b w:val="false"/>
+                <w:bCs w:val="false"/>
+                <w:sz w:val="14"/>
+                <w:szCs w:val="14"/>
+              </w:rPr>
+              <w:t xml:space="preserve">$8,230,329</w:t>
+            </w:r>
+          </w:p>
+        </w:tc>
+        <w:tc>
+          <w:tcPr>
+            <w:tcW w:type="dxa" w:w="1500"/>
+            <w:tcMar>
+              <w:top w:type="dxa" w:w="50"/>
+              <w:left w:type="dxa" w:w="70"/>
+              <w:bottom w:type="dxa" w:w="50"/>
+              <w:right w:type="dxa" w:w="70"/>
+            </w:tcMar>
+          </w:tcPr>
+          <w:p>
+            <w:pPr>
+              <w:jc w:val="right"/>
+            </w:pPr>
+            <w:r>
+              <w:rPr>
+                <w:rFonts w:ascii="Calibri" w:cs="Calibri" w:eastAsia="Calibri" w:hAnsi="Calibri"/>
+                <w:b w:val="false"/>
+                <w:bCs w:val="false"/>
+                <w:sz w:val="14"/>
+                <w:szCs w:val="14"/>
+              </w:rPr>
+              <w:t xml:space="preserve">($2,356,404)</w:t>
+            </w:r>
+          </w:p>
+        </w:tc>
+        <w:tc>
+          <w:tcPr>
+            <w:tcW w:type="dxa" w:w="1500"/>
+            <w:tcMar>
+              <w:top w:type="dxa" w:w="50"/>
+              <w:left w:type="dxa" w:w="70"/>
+              <w:bottom w:type="dxa" w:w="50"/>
+              <w:right w:type="dxa" w:w="70"/>
+            </w:tcMar>
+          </w:tcPr>
+          <w:p>
+            <w:pPr>
+              <w:jc w:val="right"/>
+            </w:pPr>
+            <w:r>
+              <w:rPr>
+                <w:rFonts w:ascii="Calibri" w:cs="Calibri" w:eastAsia="Calibri" w:hAnsi="Calibri"/>
+                <w:b w:val="false"/>
+                <w:bCs w:val="false"/>
+                <w:sz w:val="14"/>
+                <w:szCs w:val="14"/>
+              </w:rPr>
+              <w:t xml:space="preserve">$6,031,907</w:t>
+            </w:r>
+          </w:p>
+        </w:tc>
+        <w:tc>
+          <w:tcPr>
+            <w:tcW w:type="dxa" w:w="1500"/>
+            <w:tcMar>
+              <w:top w:type="dxa" w:w="50"/>
+              <w:left w:type="dxa" w:w="70"/>
+              <w:bottom w:type="dxa" w:w="50"/>
+              <w:right w:type="dxa" w:w="70"/>
+            </w:tcMar>
+          </w:tcPr>
+          <w:p>
+            <w:pPr>
+              <w:jc w:val="right"/>
+            </w:pPr>
+            <w:r>
+              <w:rPr>
+                <w:rFonts w:ascii="Calibri" w:cs="Calibri" w:eastAsia="Calibri" w:hAnsi="Calibri"/>
+                <w:b w:val="false"/>
+                <w:bCs w:val="false"/>
+                <w:sz w:val="14"/>
+                <w:szCs w:val="14"/>
+              </w:rPr>
+              <w:t xml:space="preserve">$5,873,925</w:t>
             </w:r>
           </w:p>
         </w:tc>
@@ -4804,7 +4804,7 @@
                 <w:sz w:val="14"/>
                 <w:szCs w:val="14"/>
               </w:rPr>
-              <w:t xml:space="preserve">$11,907,278</w:t>
+              <w:t xml:space="preserve">$12,912,947</w:t>
             </w:r>
           </w:p>
         </w:tc>
@@ -4884,85 +4884,85 @@
                 <w:sz w:val="14"/>
                 <w:szCs w:val="14"/>
               </w:rPr>
-              <w:t xml:space="preserve">$17,418,965</w:t>
-            </w:r>
-          </w:p>
-        </w:tc>
-        <w:tc>
-          <w:tcPr>
-            <w:tcW w:type="dxa" w:w="1500"/>
-            <w:tcMar>
-              <w:top w:type="dxa" w:w="50"/>
-              <w:left w:type="dxa" w:w="70"/>
-              <w:bottom w:type="dxa" w:w="50"/>
-              <w:right w:type="dxa" w:w="70"/>
-            </w:tcMar>
-          </w:tcPr>
-          <w:p>
-            <w:pPr>
-              <w:jc w:val="right"/>
-            </w:pPr>
-            <w:r>
-              <w:rPr>
-                <w:rFonts w:ascii="Calibri" w:cs="Calibri" w:eastAsia="Calibri" w:hAnsi="Calibri"/>
-                <w:b w:val="false"/>
-                <w:bCs w:val="false"/>
-                <w:sz w:val="14"/>
-                <w:szCs w:val="14"/>
-              </w:rPr>
-              <w:t xml:space="preserve">($5,511,688)</w:t>
-            </w:r>
-          </w:p>
-        </w:tc>
-        <w:tc>
-          <w:tcPr>
-            <w:tcW w:type="dxa" w:w="1500"/>
-            <w:tcMar>
-              <w:top w:type="dxa" w:w="50"/>
-              <w:left w:type="dxa" w:w="70"/>
-              <w:bottom w:type="dxa" w:w="50"/>
-              <w:right w:type="dxa" w:w="70"/>
-            </w:tcMar>
-          </w:tcPr>
-          <w:p>
-            <w:pPr>
-              <w:jc w:val="right"/>
-            </w:pPr>
-            <w:r>
-              <w:rPr>
-                <w:rFonts w:ascii="Calibri" w:cs="Calibri" w:eastAsia="Calibri" w:hAnsi="Calibri"/>
-                <w:b w:val="false"/>
-                <w:bCs w:val="false"/>
-                <w:sz w:val="14"/>
-                <w:szCs w:val="14"/>
-              </w:rPr>
-              <w:t xml:space="preserve">$12,451,715</w:t>
-            </w:r>
-          </w:p>
-        </w:tc>
-        <w:tc>
-          <w:tcPr>
-            <w:tcW w:type="dxa" w:w="1500"/>
-            <w:tcMar>
-              <w:top w:type="dxa" w:w="50"/>
-              <w:left w:type="dxa" w:w="70"/>
-              <w:bottom w:type="dxa" w:w="50"/>
-              <w:right w:type="dxa" w:w="70"/>
-            </w:tcMar>
-          </w:tcPr>
-          <w:p>
-            <w:pPr>
-              <w:jc w:val="right"/>
-            </w:pPr>
-            <w:r>
-              <w:rPr>
-                <w:rFonts w:ascii="Calibri" w:cs="Calibri" w:eastAsia="Calibri" w:hAnsi="Calibri"/>
-                <w:b w:val="false"/>
-                <w:bCs w:val="false"/>
-                <w:sz w:val="14"/>
-                <w:szCs w:val="14"/>
-              </w:rPr>
-              <w:t xml:space="preserve">$11,907,278</w:t>
+              <w:t xml:space="preserve">$18,536,375</w:t>
+            </w:r>
+          </w:p>
+        </w:tc>
+        <w:tc>
+          <w:tcPr>
+            <w:tcW w:type="dxa" w:w="1500"/>
+            <w:tcMar>
+              <w:top w:type="dxa" w:w="50"/>
+              <w:left w:type="dxa" w:w="70"/>
+              <w:bottom w:type="dxa" w:w="50"/>
+              <w:right w:type="dxa" w:w="70"/>
+            </w:tcMar>
+          </w:tcPr>
+          <w:p>
+            <w:pPr>
+              <w:jc w:val="right"/>
+            </w:pPr>
+            <w:r>
+              <w:rPr>
+                <w:rFonts w:ascii="Calibri" w:cs="Calibri" w:eastAsia="Calibri" w:hAnsi="Calibri"/>
+                <w:b w:val="false"/>
+                <w:bCs w:val="false"/>
+                <w:sz w:val="14"/>
+                <w:szCs w:val="14"/>
+              </w:rPr>
+              <w:t xml:space="preserve">($5,623,429)</w:t>
+            </w:r>
+          </w:p>
+        </w:tc>
+        <w:tc>
+          <w:tcPr>
+            <w:tcW w:type="dxa" w:w="1500"/>
+            <w:tcMar>
+              <w:top w:type="dxa" w:w="50"/>
+              <w:left w:type="dxa" w:w="70"/>
+              <w:bottom w:type="dxa" w:w="50"/>
+              <w:right w:type="dxa" w:w="70"/>
+            </w:tcMar>
+          </w:tcPr>
+          <w:p>
+            <w:pPr>
+              <w:jc w:val="right"/>
+            </w:pPr>
+            <w:r>
+              <w:rPr>
+                <w:rFonts w:ascii="Calibri" w:cs="Calibri" w:eastAsia="Calibri" w:hAnsi="Calibri"/>
+                <w:b w:val="false"/>
+                <w:bCs w:val="false"/>
+                <w:sz w:val="14"/>
+                <w:szCs w:val="14"/>
+              </w:rPr>
+              <w:t xml:space="preserve">$13,457,384</w:t>
+            </w:r>
+          </w:p>
+        </w:tc>
+        <w:tc>
+          <w:tcPr>
+            <w:tcW w:type="dxa" w:w="1500"/>
+            <w:tcMar>
+              <w:top w:type="dxa" w:w="50"/>
+              <w:left w:type="dxa" w:w="70"/>
+              <w:bottom w:type="dxa" w:w="50"/>
+              <w:right w:type="dxa" w:w="70"/>
+            </w:tcMar>
+          </w:tcPr>
+          <w:p>
+            <w:pPr>
+              <w:jc w:val="right"/>
+            </w:pPr>
+            <w:r>
+              <w:rPr>
+                <w:rFonts w:ascii="Calibri" w:cs="Calibri" w:eastAsia="Calibri" w:hAnsi="Calibri"/>
+                <w:b w:val="false"/>
+                <w:bCs w:val="false"/>
+                <w:sz w:val="14"/>
+                <w:szCs w:val="14"/>
+              </w:rPr>
+              <w:t xml:space="preserve">$12,912,947</w:t>
             </w:r>
           </w:p>
         </w:tc>
@@ -4988,7 +4988,7 @@
                 <w:sz w:val="14"/>
                 <w:szCs w:val="14"/>
               </w:rPr>
-              <w:t xml:space="preserve">$11,907,278</w:t>
+              <w:t xml:space="preserve">$12,912,947</w:t>
             </w:r>
           </w:p>
         </w:tc>
@@ -5016,7 +5016,7 @@
         <w:rPr>
           <w:rFonts w:ascii="Calibri" w:cs="Calibri" w:eastAsia="Calibri" w:hAnsi="Calibri"/>
         </w:rPr>
-        <w:t xml:space="preserve">Consumer model: five-year net $10,917,209, 110,681 buyers, 2.7% of the counted market after five years</w:t>
+        <w:t xml:space="preserve">Consumer model: five-year net $10,947,964, 110,681 buyers, 2.7% of the counted market after five years</w:t>
       </w:r>
     </w:p>
     <w:tbl>
@@ -5332,7 +5332,7 @@
                 <w:sz w:val="14"/>
                 <w:szCs w:val="14"/>
               </w:rPr>
-              <w:t xml:space="preserve">($194,558)</w:t>
+              <w:t xml:space="preserve">($191,367)</w:t>
             </w:r>
           </w:p>
         </w:tc>
@@ -5384,7 +5384,7 @@
                 <w:sz w:val="14"/>
                 <w:szCs w:val="14"/>
               </w:rPr>
-              <w:t xml:space="preserve">$268,202</w:t>
+              <w:t xml:space="preserve">$271,391</w:t>
             </w:r>
           </w:p>
         </w:tc>
@@ -5410,7 +5410,7 @@
                 <w:sz w:val="14"/>
                 <w:szCs w:val="14"/>
               </w:rPr>
-              <w:t xml:space="preserve">$268,202</w:t>
+              <w:t xml:space="preserve">$271,391</w:t>
             </w:r>
           </w:p>
         </w:tc>
@@ -5516,7 +5516,7 @@
                 <w:sz w:val="14"/>
                 <w:szCs w:val="14"/>
               </w:rPr>
-              <w:t xml:space="preserve">($469,541)</w:t>
+              <w:t xml:space="preserve">($464,759)</w:t>
             </w:r>
           </w:p>
         </w:tc>
@@ -5568,7 +5568,7 @@
                 <w:sz w:val="14"/>
                 <w:szCs w:val="14"/>
               </w:rPr>
-              <w:t xml:space="preserve">$807,966</w:t>
+              <w:t xml:space="preserve">$812,748</w:t>
             </w:r>
           </w:p>
         </w:tc>
@@ -5594,7 +5594,7 @@
                 <w:sz w:val="14"/>
                 <w:szCs w:val="14"/>
               </w:rPr>
-              <w:t xml:space="preserve">$1,076,168</w:t>
+              <w:t xml:space="preserve">$1,084,139</w:t>
             </w:r>
           </w:p>
         </w:tc>
@@ -5700,7 +5700,7 @@
                 <w:sz w:val="14"/>
                 <w:szCs w:val="14"/>
               </w:rPr>
-              <w:t xml:space="preserve">($933,963)</w:t>
+              <w:t xml:space="preserve">($927,765)</w:t>
             </w:r>
           </w:p>
         </w:tc>
@@ -5752,7 +5752,7 @@
                 <w:sz w:val="14"/>
                 <w:szCs w:val="14"/>
               </w:rPr>
-              <w:t xml:space="preserve">$1,802,011</w:t>
+              <w:t xml:space="preserve">$1,808,210</w:t>
             </w:r>
           </w:p>
         </w:tc>
@@ -5778,7 +5778,7 @@
                 <w:sz w:val="14"/>
                 <w:szCs w:val="14"/>
               </w:rPr>
-              <w:t xml:space="preserve">$2,878,179</w:t>
+              <w:t xml:space="preserve">$2,892,349</w:t>
             </w:r>
           </w:p>
         </w:tc>
@@ -5884,7 +5884,7 @@
                 <w:sz w:val="14"/>
                 <w:szCs w:val="14"/>
               </w:rPr>
-              <w:t xml:space="preserve">($1,540,060)</w:t>
+              <w:t xml:space="preserve">($1,532,735)</w:t>
             </w:r>
           </w:p>
         </w:tc>
@@ -5936,7 +5936,7 @@
                 <w:sz w:val="14"/>
                 <w:szCs w:val="14"/>
               </w:rPr>
-              <w:t xml:space="preserve">$3,187,209</w:t>
+              <w:t xml:space="preserve">$3,194,534</w:t>
             </w:r>
           </w:p>
         </w:tc>
@@ -5962,7 +5962,7 @@
                 <w:sz w:val="14"/>
                 <w:szCs w:val="14"/>
               </w:rPr>
-              <w:t xml:space="preserve">$6,065,388</w:t>
+              <w:t xml:space="preserve">$6,086,883</w:t>
             </w:r>
           </w:p>
         </w:tc>
@@ -6068,7 +6068,7 @@
                 <w:sz w:val="14"/>
                 <w:szCs w:val="14"/>
               </w:rPr>
-              <w:t xml:space="preserve">($2,228,600)</w:t>
+              <w:t xml:space="preserve">($2,219,341)</w:t>
             </w:r>
           </w:p>
         </w:tc>
@@ -6120,7 +6120,7 @@
                 <w:sz w:val="14"/>
                 <w:szCs w:val="14"/>
               </w:rPr>
-              <w:t xml:space="preserve">$4,851,821</w:t>
+              <w:t xml:space="preserve">$4,861,081</w:t>
             </w:r>
           </w:p>
         </w:tc>
@@ -6146,7 +6146,7 @@
                 <w:sz w:val="14"/>
                 <w:szCs w:val="14"/>
               </w:rPr>
-              <w:t xml:space="preserve">$10,917,209</w:t>
+              <w:t xml:space="preserve">$10,947,964</w:t>
             </w:r>
           </w:p>
         </w:tc>
@@ -6252,7 +6252,7 @@
                 <w:sz w:val="14"/>
                 <w:szCs w:val="14"/>
               </w:rPr>
-              <w:t xml:space="preserve">($5,366,722)</w:t>
+              <w:t xml:space="preserve">($5,335,967)</w:t>
             </w:r>
           </w:p>
         </w:tc>
@@ -6304,7 +6304,7 @@
                 <w:sz w:val="14"/>
                 <w:szCs w:val="14"/>
               </w:rPr>
-              <w:t xml:space="preserve">$10,917,209</w:t>
+              <w:t xml:space="preserve">$10,947,964</w:t>
             </w:r>
           </w:p>
         </w:tc>
@@ -6330,7 +6330,7 @@
                 <w:sz w:val="14"/>
                 <w:szCs w:val="14"/>
               </w:rPr>
-              <w:t xml:space="preserve">$10,917,209</w:t>
+              <w:t xml:space="preserve">$10,947,964</w:t>
             </w:r>
           </w:p>
         </w:tc>
@@ -6358,7 +6358,7 @@
         <w:rPr>
           <w:rFonts w:ascii="Calibri" w:cs="Calibri" w:eastAsia="Calibri" w:hAnsi="Calibri"/>
         </w:rPr>
-        <w:t xml:space="preserve">School district model (EZvoxa Pro seats): five-year net $944,391</w:t>
+        <w:t xml:space="preserve">School district model (EZvoxa Pro seats): five-year net $1,919,211</w:t>
       </w:r>
     </w:p>
     <w:tbl>
@@ -6622,111 +6622,111 @@
                 <w:sz w:val="14"/>
                 <w:szCs w:val="14"/>
               </w:rPr>
-              <w:t xml:space="preserve">140 seats (0.11% of market), 4 districts</w:t>
-            </w:r>
-          </w:p>
-        </w:tc>
-        <w:tc>
-          <w:tcPr>
-            <w:tcW w:type="dxa" w:w="1500"/>
-            <w:tcMar>
-              <w:top w:type="dxa" w:w="50"/>
-              <w:left w:type="dxa" w:w="70"/>
-              <w:bottom w:type="dxa" w:w="50"/>
-              <w:right w:type="dxa" w:w="70"/>
-            </w:tcMar>
-          </w:tcPr>
-          <w:p>
-            <w:pPr>
-              <w:jc w:val="right"/>
-            </w:pPr>
-            <w:r>
-              <w:rPr>
-                <w:rFonts w:ascii="Calibri" w:cs="Calibri" w:eastAsia="Calibri" w:hAnsi="Calibri"/>
-                <w:b w:val="false"/>
-                <w:bCs w:val="false"/>
-                <w:sz w:val="14"/>
-                <w:szCs w:val="14"/>
-              </w:rPr>
-              <w:t xml:space="preserve">$17,499</w:t>
-            </w:r>
-          </w:p>
-        </w:tc>
-        <w:tc>
-          <w:tcPr>
-            <w:tcW w:type="dxa" w:w="1500"/>
-            <w:tcMar>
-              <w:top w:type="dxa" w:w="50"/>
-              <w:left w:type="dxa" w:w="70"/>
-              <w:bottom w:type="dxa" w:w="50"/>
-              <w:right w:type="dxa" w:w="70"/>
-            </w:tcMar>
-          </w:tcPr>
-          <w:p>
-            <w:pPr>
-              <w:jc w:val="right"/>
-            </w:pPr>
-            <w:r>
-              <w:rPr>
-                <w:rFonts w:ascii="Calibri" w:cs="Calibri" w:eastAsia="Calibri" w:hAnsi="Calibri"/>
-                <w:b w:val="false"/>
-                <w:bCs w:val="false"/>
-                <w:sz w:val="14"/>
-                <w:szCs w:val="14"/>
-              </w:rPr>
-              <w:t xml:space="preserve">($3,658)</w:t>
-            </w:r>
-          </w:p>
-        </w:tc>
-        <w:tc>
-          <w:tcPr>
-            <w:tcW w:type="dxa" w:w="1500"/>
-            <w:tcMar>
-              <w:top w:type="dxa" w:w="50"/>
-              <w:left w:type="dxa" w:w="70"/>
-              <w:bottom w:type="dxa" w:w="50"/>
-              <w:right w:type="dxa" w:w="70"/>
-            </w:tcMar>
-          </w:tcPr>
-          <w:p>
-            <w:pPr>
-              <w:jc w:val="right"/>
-            </w:pPr>
-            <w:r>
-              <w:rPr>
-                <w:rFonts w:ascii="Calibri" w:cs="Calibri" w:eastAsia="Calibri" w:hAnsi="Calibri"/>
-                <w:b w:val="false"/>
-                <w:bCs w:val="false"/>
-                <w:sz w:val="14"/>
-                <w:szCs w:val="14"/>
-              </w:rPr>
-              <w:t xml:space="preserve">$15,749</w:t>
-            </w:r>
-          </w:p>
-        </w:tc>
-        <w:tc>
-          <w:tcPr>
-            <w:tcW w:type="dxa" w:w="1500"/>
-            <w:tcMar>
-              <w:top w:type="dxa" w:w="50"/>
-              <w:left w:type="dxa" w:w="70"/>
-              <w:bottom w:type="dxa" w:w="50"/>
-              <w:right w:type="dxa" w:w="70"/>
-            </w:tcMar>
-          </w:tcPr>
-          <w:p>
-            <w:pPr>
-              <w:jc w:val="right"/>
-            </w:pPr>
-            <w:r>
-              <w:rPr>
-                <w:rFonts w:ascii="Calibri" w:cs="Calibri" w:eastAsia="Calibri" w:hAnsi="Calibri"/>
-                <w:b w:val="false"/>
-                <w:bCs w:val="false"/>
-                <w:sz w:val="14"/>
-                <w:szCs w:val="14"/>
-              </w:rPr>
-              <w:t xml:space="preserve">$13,841</w:t>
+              <w:t xml:space="preserve">400 seats (0.31% of market), 10 districts</w:t>
+            </w:r>
+          </w:p>
+        </w:tc>
+        <w:tc>
+          <w:tcPr>
+            <w:tcW w:type="dxa" w:w="1500"/>
+            <w:tcMar>
+              <w:top w:type="dxa" w:w="50"/>
+              <w:left w:type="dxa" w:w="70"/>
+              <w:bottom w:type="dxa" w:w="50"/>
+              <w:right w:type="dxa" w:w="70"/>
+            </w:tcMar>
+          </w:tcPr>
+          <w:p>
+            <w:pPr>
+              <w:jc w:val="right"/>
+            </w:pPr>
+            <w:r>
+              <w:rPr>
+                <w:rFonts w:ascii="Calibri" w:cs="Calibri" w:eastAsia="Calibri" w:hAnsi="Calibri"/>
+                <w:b w:val="false"/>
+                <w:bCs w:val="false"/>
+                <w:sz w:val="14"/>
+                <w:szCs w:val="14"/>
+              </w:rPr>
+              <w:t xml:space="preserve">$49,996</w:t>
+            </w:r>
+          </w:p>
+        </w:tc>
+        <w:tc>
+          <w:tcPr>
+            <w:tcW w:type="dxa" w:w="1500"/>
+            <w:tcMar>
+              <w:top w:type="dxa" w:w="50"/>
+              <w:left w:type="dxa" w:w="70"/>
+              <w:bottom w:type="dxa" w:w="50"/>
+              <w:right w:type="dxa" w:w="70"/>
+            </w:tcMar>
+          </w:tcPr>
+          <w:p>
+            <w:pPr>
+              <w:jc w:val="right"/>
+            </w:pPr>
+            <w:r>
+              <w:rPr>
+                <w:rFonts w:ascii="Calibri" w:cs="Calibri" w:eastAsia="Calibri" w:hAnsi="Calibri"/>
+                <w:b w:val="false"/>
+                <w:bCs w:val="false"/>
+                <w:sz w:val="14"/>
+                <w:szCs w:val="14"/>
+              </w:rPr>
+              <w:t xml:space="preserve">($10,106)</w:t>
+            </w:r>
+          </w:p>
+        </w:tc>
+        <w:tc>
+          <w:tcPr>
+            <w:tcW w:type="dxa" w:w="1500"/>
+            <w:tcMar>
+              <w:top w:type="dxa" w:w="50"/>
+              <w:left w:type="dxa" w:w="70"/>
+              <w:bottom w:type="dxa" w:w="50"/>
+              <w:right w:type="dxa" w:w="70"/>
+            </w:tcMar>
+          </w:tcPr>
+          <w:p>
+            <w:pPr>
+              <w:jc w:val="right"/>
+            </w:pPr>
+            <w:r>
+              <w:rPr>
+                <w:rFonts w:ascii="Calibri" w:cs="Calibri" w:eastAsia="Calibri" w:hAnsi="Calibri"/>
+                <w:b w:val="false"/>
+                <w:bCs w:val="false"/>
+                <w:sz w:val="14"/>
+                <w:szCs w:val="14"/>
+              </w:rPr>
+              <w:t xml:space="preserve">$44,996</w:t>
+            </w:r>
+          </w:p>
+        </w:tc>
+        <w:tc>
+          <w:tcPr>
+            <w:tcW w:type="dxa" w:w="1500"/>
+            <w:tcMar>
+              <w:top w:type="dxa" w:w="50"/>
+              <w:left w:type="dxa" w:w="70"/>
+              <w:bottom w:type="dxa" w:w="50"/>
+              <w:right w:type="dxa" w:w="70"/>
+            </w:tcMar>
+          </w:tcPr>
+          <w:p>
+            <w:pPr>
+              <w:jc w:val="right"/>
+            </w:pPr>
+            <w:r>
+              <w:rPr>
+                <w:rFonts w:ascii="Calibri" w:cs="Calibri" w:eastAsia="Calibri" w:hAnsi="Calibri"/>
+                <w:b w:val="false"/>
+                <w:bCs w:val="false"/>
+                <w:sz w:val="14"/>
+                <w:szCs w:val="14"/>
+              </w:rPr>
+              <w:t xml:space="preserve">$39,890</w:t>
             </w:r>
           </w:p>
         </w:tc>
@@ -6752,7 +6752,7 @@
                 <w:sz w:val="14"/>
                 <w:szCs w:val="14"/>
               </w:rPr>
-              <w:t xml:space="preserve">$13,841</w:t>
+              <w:t xml:space="preserve">$39,890</w:t>
             </w:r>
           </w:p>
         </w:tc>
@@ -6806,111 +6806,111 @@
                 <w:sz w:val="14"/>
                 <w:szCs w:val="14"/>
               </w:rPr>
-              <w:t xml:space="preserve">320 seats (0.24% of market), 8 districts</w:t>
-            </w:r>
-          </w:p>
-        </w:tc>
-        <w:tc>
-          <w:tcPr>
-            <w:tcW w:type="dxa" w:w="1500"/>
-            <w:tcMar>
-              <w:top w:type="dxa" w:w="50"/>
-              <w:left w:type="dxa" w:w="70"/>
-              <w:bottom w:type="dxa" w:w="50"/>
-              <w:right w:type="dxa" w:w="70"/>
-            </w:tcMar>
-          </w:tcPr>
-          <w:p>
-            <w:pPr>
-              <w:jc w:val="right"/>
-            </w:pPr>
-            <w:r>
-              <w:rPr>
-                <w:rFonts w:ascii="Calibri" w:cs="Calibri" w:eastAsia="Calibri" w:hAnsi="Calibri"/>
-                <w:b w:val="false"/>
-                <w:bCs w:val="false"/>
-                <w:sz w:val="14"/>
-                <w:szCs w:val="14"/>
-              </w:rPr>
-              <w:t xml:space="preserve">$39,997</w:t>
-            </w:r>
-          </w:p>
-        </w:tc>
-        <w:tc>
-          <w:tcPr>
-            <w:tcW w:type="dxa" w:w="1500"/>
-            <w:tcMar>
-              <w:top w:type="dxa" w:w="50"/>
-              <w:left w:type="dxa" w:w="70"/>
-              <w:bottom w:type="dxa" w:w="50"/>
-              <w:right w:type="dxa" w:w="70"/>
-            </w:tcMar>
-          </w:tcPr>
-          <w:p>
-            <w:pPr>
-              <w:jc w:val="right"/>
-            </w:pPr>
-            <w:r>
-              <w:rPr>
-                <w:rFonts w:ascii="Calibri" w:cs="Calibri" w:eastAsia="Calibri" w:hAnsi="Calibri"/>
-                <w:b w:val="false"/>
-                <w:bCs w:val="false"/>
-                <w:sz w:val="14"/>
-                <w:szCs w:val="14"/>
-              </w:rPr>
-              <w:t xml:space="preserve">($6,476)</w:t>
-            </w:r>
-          </w:p>
-        </w:tc>
-        <w:tc>
-          <w:tcPr>
-            <w:tcW w:type="dxa" w:w="1500"/>
-            <w:tcMar>
-              <w:top w:type="dxa" w:w="50"/>
-              <w:left w:type="dxa" w:w="70"/>
-              <w:bottom w:type="dxa" w:w="50"/>
-              <w:right w:type="dxa" w:w="70"/>
-            </w:tcMar>
-          </w:tcPr>
-          <w:p>
-            <w:pPr>
-              <w:jc w:val="right"/>
-            </w:pPr>
-            <w:r>
-              <w:rPr>
-                <w:rFonts w:ascii="Calibri" w:cs="Calibri" w:eastAsia="Calibri" w:hAnsi="Calibri"/>
-                <w:b w:val="false"/>
-                <w:bCs w:val="false"/>
-                <w:sz w:val="14"/>
-                <w:szCs w:val="14"/>
-              </w:rPr>
-              <w:t xml:space="preserve">$35,997</w:t>
-            </w:r>
-          </w:p>
-        </w:tc>
-        <w:tc>
-          <w:tcPr>
-            <w:tcW w:type="dxa" w:w="1500"/>
-            <w:tcMar>
-              <w:top w:type="dxa" w:w="50"/>
-              <w:left w:type="dxa" w:w="70"/>
-              <w:bottom w:type="dxa" w:w="50"/>
-              <w:right w:type="dxa" w:w="70"/>
-            </w:tcMar>
-          </w:tcPr>
-          <w:p>
-            <w:pPr>
-              <w:jc w:val="right"/>
-            </w:pPr>
-            <w:r>
-              <w:rPr>
-                <w:rFonts w:ascii="Calibri" w:cs="Calibri" w:eastAsia="Calibri" w:hAnsi="Calibri"/>
-                <w:b w:val="false"/>
-                <w:bCs w:val="false"/>
-                <w:sz w:val="14"/>
-                <w:szCs w:val="14"/>
-              </w:rPr>
-              <w:t xml:space="preserve">$33,521</w:t>
+              <w:t xml:space="preserve">1,000 seats (0.77% of market), 25 districts</w:t>
+            </w:r>
+          </w:p>
+        </w:tc>
+        <w:tc>
+          <w:tcPr>
+            <w:tcW w:type="dxa" w:w="1500"/>
+            <w:tcMar>
+              <w:top w:type="dxa" w:w="50"/>
+              <w:left w:type="dxa" w:w="70"/>
+              <w:bottom w:type="dxa" w:w="50"/>
+              <w:right w:type="dxa" w:w="70"/>
+            </w:tcMar>
+          </w:tcPr>
+          <w:p>
+            <w:pPr>
+              <w:jc w:val="right"/>
+            </w:pPr>
+            <w:r>
+              <w:rPr>
+                <w:rFonts w:ascii="Calibri" w:cs="Calibri" w:eastAsia="Calibri" w:hAnsi="Calibri"/>
+                <w:b w:val="false"/>
+                <w:bCs w:val="false"/>
+                <w:sz w:val="14"/>
+                <w:szCs w:val="14"/>
+              </w:rPr>
+              <w:t xml:space="preserve">$124,990</w:t>
+            </w:r>
+          </w:p>
+        </w:tc>
+        <w:tc>
+          <w:tcPr>
+            <w:tcW w:type="dxa" w:w="1500"/>
+            <w:tcMar>
+              <w:top w:type="dxa" w:w="50"/>
+              <w:left w:type="dxa" w:w="70"/>
+              <w:bottom w:type="dxa" w:w="50"/>
+              <w:right w:type="dxa" w:w="70"/>
+            </w:tcMar>
+          </w:tcPr>
+          <w:p>
+            <w:pPr>
+              <w:jc w:val="right"/>
+            </w:pPr>
+            <w:r>
+              <w:rPr>
+                <w:rFonts w:ascii="Calibri" w:cs="Calibri" w:eastAsia="Calibri" w:hAnsi="Calibri"/>
+                <w:b w:val="false"/>
+                <w:bCs w:val="false"/>
+                <w:sz w:val="14"/>
+                <w:szCs w:val="14"/>
+              </w:rPr>
+              <w:t xml:space="preserve">($19,769)</w:t>
+            </w:r>
+          </w:p>
+        </w:tc>
+        <w:tc>
+          <w:tcPr>
+            <w:tcW w:type="dxa" w:w="1500"/>
+            <w:tcMar>
+              <w:top w:type="dxa" w:w="50"/>
+              <w:left w:type="dxa" w:w="70"/>
+              <w:bottom w:type="dxa" w:w="50"/>
+              <w:right w:type="dxa" w:w="70"/>
+            </w:tcMar>
+          </w:tcPr>
+          <w:p>
+            <w:pPr>
+              <w:jc w:val="right"/>
+            </w:pPr>
+            <w:r>
+              <w:rPr>
+                <w:rFonts w:ascii="Calibri" w:cs="Calibri" w:eastAsia="Calibri" w:hAnsi="Calibri"/>
+                <w:b w:val="false"/>
+                <w:bCs w:val="false"/>
+                <w:sz w:val="14"/>
+                <w:szCs w:val="14"/>
+              </w:rPr>
+              <w:t xml:space="preserve">$112,491</w:t>
+            </w:r>
+          </w:p>
+        </w:tc>
+        <w:tc>
+          <w:tcPr>
+            <w:tcW w:type="dxa" w:w="1500"/>
+            <w:tcMar>
+              <w:top w:type="dxa" w:w="50"/>
+              <w:left w:type="dxa" w:w="70"/>
+              <w:bottom w:type="dxa" w:w="50"/>
+              <w:right w:type="dxa" w:w="70"/>
+            </w:tcMar>
+          </w:tcPr>
+          <w:p>
+            <w:pPr>
+              <w:jc w:val="right"/>
+            </w:pPr>
+            <w:r>
+              <w:rPr>
+                <w:rFonts w:ascii="Calibri" w:cs="Calibri" w:eastAsia="Calibri" w:hAnsi="Calibri"/>
+                <w:b w:val="false"/>
+                <w:bCs w:val="false"/>
+                <w:sz w:val="14"/>
+                <w:szCs w:val="14"/>
+              </w:rPr>
+              <w:t xml:space="preserve">$105,221</w:t>
             </w:r>
           </w:p>
         </w:tc>
@@ -6936,7 +6936,7 @@
                 <w:sz w:val="14"/>
                 <w:szCs w:val="14"/>
               </w:rPr>
-              <w:t xml:space="preserve">$47,362</w:t>
+              <w:t xml:space="preserve">$145,111</w:t>
             </w:r>
           </w:p>
         </w:tc>
@@ -6990,111 +6990,111 @@
                 <w:sz w:val="14"/>
                 <w:szCs w:val="14"/>
               </w:rPr>
-              <w:t xml:space="preserve">1,000 seats (0.77% of market), 25 districts</w:t>
-            </w:r>
-          </w:p>
-        </w:tc>
-        <w:tc>
-          <w:tcPr>
-            <w:tcW w:type="dxa" w:w="1500"/>
-            <w:tcMar>
-              <w:top w:type="dxa" w:w="50"/>
-              <w:left w:type="dxa" w:w="70"/>
-              <w:bottom w:type="dxa" w:w="50"/>
-              <w:right w:type="dxa" w:w="70"/>
-            </w:tcMar>
-          </w:tcPr>
-          <w:p>
-            <w:pPr>
-              <w:jc w:val="right"/>
-            </w:pPr>
-            <w:r>
-              <w:rPr>
-                <w:rFonts w:ascii="Calibri" w:cs="Calibri" w:eastAsia="Calibri" w:hAnsi="Calibri"/>
-                <w:b w:val="false"/>
-                <w:bCs w:val="false"/>
-                <w:sz w:val="14"/>
-                <w:szCs w:val="14"/>
-              </w:rPr>
-              <w:t xml:space="preserve">$124,990</w:t>
-            </w:r>
-          </w:p>
-        </w:tc>
-        <w:tc>
-          <w:tcPr>
-            <w:tcW w:type="dxa" w:w="1500"/>
-            <w:tcMar>
-              <w:top w:type="dxa" w:w="50"/>
-              <w:left w:type="dxa" w:w="70"/>
-              <w:bottom w:type="dxa" w:w="50"/>
-              <w:right w:type="dxa" w:w="70"/>
-            </w:tcMar>
-          </w:tcPr>
-          <w:p>
-            <w:pPr>
-              <w:jc w:val="right"/>
-            </w:pPr>
-            <w:r>
-              <w:rPr>
-                <w:rFonts w:ascii="Calibri" w:cs="Calibri" w:eastAsia="Calibri" w:hAnsi="Calibri"/>
-                <w:b w:val="false"/>
-                <w:bCs w:val="false"/>
-                <w:sz w:val="14"/>
-                <w:szCs w:val="14"/>
-              </w:rPr>
-              <w:t xml:space="preserve">($17,421)</w:t>
-            </w:r>
-          </w:p>
-        </w:tc>
-        <w:tc>
-          <w:tcPr>
-            <w:tcW w:type="dxa" w:w="1500"/>
-            <w:tcMar>
-              <w:top w:type="dxa" w:w="50"/>
-              <w:left w:type="dxa" w:w="70"/>
-              <w:bottom w:type="dxa" w:w="50"/>
-              <w:right w:type="dxa" w:w="70"/>
-            </w:tcMar>
-          </w:tcPr>
-          <w:p>
-            <w:pPr>
-              <w:jc w:val="right"/>
-            </w:pPr>
-            <w:r>
-              <w:rPr>
-                <w:rFonts w:ascii="Calibri" w:cs="Calibri" w:eastAsia="Calibri" w:hAnsi="Calibri"/>
-                <w:b w:val="false"/>
-                <w:bCs w:val="false"/>
-                <w:sz w:val="14"/>
-                <w:szCs w:val="14"/>
-              </w:rPr>
-              <w:t xml:space="preserve">$112,491</w:t>
-            </w:r>
-          </w:p>
-        </w:tc>
-        <w:tc>
-          <w:tcPr>
-            <w:tcW w:type="dxa" w:w="1500"/>
-            <w:tcMar>
-              <w:top w:type="dxa" w:w="50"/>
-              <w:left w:type="dxa" w:w="70"/>
-              <w:bottom w:type="dxa" w:w="50"/>
-              <w:right w:type="dxa" w:w="70"/>
-            </w:tcMar>
-          </w:tcPr>
-          <w:p>
-            <w:pPr>
-              <w:jc w:val="right"/>
-            </w:pPr>
-            <w:r>
-              <w:rPr>
-                <w:rFonts w:ascii="Calibri" w:cs="Calibri" w:eastAsia="Calibri" w:hAnsi="Calibri"/>
-                <w:b w:val="false"/>
-                <w:bCs w:val="false"/>
-                <w:sz w:val="14"/>
-                <w:szCs w:val="14"/>
-              </w:rPr>
-              <w:t xml:space="preserve">$107,569</w:t>
+              <w:t xml:space="preserve">2,401 seats (1.84% of market), 60 districts</w:t>
+            </w:r>
+          </w:p>
+        </w:tc>
+        <w:tc>
+          <w:tcPr>
+            <w:tcW w:type="dxa" w:w="1500"/>
+            <w:tcMar>
+              <w:top w:type="dxa" w:w="50"/>
+              <w:left w:type="dxa" w:w="70"/>
+              <w:bottom w:type="dxa" w:w="50"/>
+              <w:right w:type="dxa" w:w="70"/>
+            </w:tcMar>
+          </w:tcPr>
+          <w:p>
+            <w:pPr>
+              <w:jc w:val="right"/>
+            </w:pPr>
+            <w:r>
+              <w:rPr>
+                <w:rFonts w:ascii="Calibri" w:cs="Calibri" w:eastAsia="Calibri" w:hAnsi="Calibri"/>
+                <w:b w:val="false"/>
+                <w:bCs w:val="false"/>
+                <w:sz w:val="14"/>
+                <w:szCs w:val="14"/>
+              </w:rPr>
+              <w:t xml:space="preserve">$300,101</w:t>
+            </w:r>
+          </w:p>
+        </w:tc>
+        <w:tc>
+          <w:tcPr>
+            <w:tcW w:type="dxa" w:w="1500"/>
+            <w:tcMar>
+              <w:top w:type="dxa" w:w="50"/>
+              <w:left w:type="dxa" w:w="70"/>
+              <w:bottom w:type="dxa" w:w="50"/>
+              <w:right w:type="dxa" w:w="70"/>
+            </w:tcMar>
+          </w:tcPr>
+          <w:p>
+            <w:pPr>
+              <w:jc w:val="right"/>
+            </w:pPr>
+            <w:r>
+              <w:rPr>
+                <w:rFonts w:ascii="Calibri" w:cs="Calibri" w:eastAsia="Calibri" w:hAnsi="Calibri"/>
+                <w:b w:val="false"/>
+                <w:bCs w:val="false"/>
+                <w:sz w:val="14"/>
+                <w:szCs w:val="14"/>
+              </w:rPr>
+              <w:t xml:space="preserve">($41,147)</w:t>
+            </w:r>
+          </w:p>
+        </w:tc>
+        <w:tc>
+          <w:tcPr>
+            <w:tcW w:type="dxa" w:w="1500"/>
+            <w:tcMar>
+              <w:top w:type="dxa" w:w="50"/>
+              <w:left w:type="dxa" w:w="70"/>
+              <w:bottom w:type="dxa" w:w="50"/>
+              <w:right w:type="dxa" w:w="70"/>
+            </w:tcMar>
+          </w:tcPr>
+          <w:p>
+            <w:pPr>
+              <w:jc w:val="right"/>
+            </w:pPr>
+            <w:r>
+              <w:rPr>
+                <w:rFonts w:ascii="Calibri" w:cs="Calibri" w:eastAsia="Calibri" w:hAnsi="Calibri"/>
+                <w:b w:val="false"/>
+                <w:bCs w:val="false"/>
+                <w:sz w:val="14"/>
+                <w:szCs w:val="14"/>
+              </w:rPr>
+              <w:t xml:space="preserve">$270,091</w:t>
+            </w:r>
+          </w:p>
+        </w:tc>
+        <w:tc>
+          <w:tcPr>
+            <w:tcW w:type="dxa" w:w="1500"/>
+            <w:tcMar>
+              <w:top w:type="dxa" w:w="50"/>
+              <w:left w:type="dxa" w:w="70"/>
+              <w:bottom w:type="dxa" w:w="50"/>
+              <w:right w:type="dxa" w:w="70"/>
+            </w:tcMar>
+          </w:tcPr>
+          <w:p>
+            <w:pPr>
+              <w:jc w:val="right"/>
+            </w:pPr>
+            <w:r>
+              <w:rPr>
+                <w:rFonts w:ascii="Calibri" w:cs="Calibri" w:eastAsia="Calibri" w:hAnsi="Calibri"/>
+                <w:b w:val="false"/>
+                <w:bCs w:val="false"/>
+                <w:sz w:val="14"/>
+                <w:szCs w:val="14"/>
+              </w:rPr>
+              <w:t xml:space="preserve">$258,954</w:t>
             </w:r>
           </w:p>
         </w:tc>
@@ -7120,7 +7120,7 @@
                 <w:sz w:val="14"/>
                 <w:szCs w:val="14"/>
               </w:rPr>
-              <w:t xml:space="preserve">$154,931</w:t>
+              <w:t xml:space="preserve">$404,065</w:t>
             </w:r>
           </w:p>
         </w:tc>
@@ -7174,111 +7174,111 @@
                 <w:sz w:val="14"/>
                 <w:szCs w:val="14"/>
               </w:rPr>
-              <w:t xml:space="preserve">2,401 seats (1.84% of market), 60 districts</w:t>
-            </w:r>
-          </w:p>
-        </w:tc>
-        <w:tc>
-          <w:tcPr>
-            <w:tcW w:type="dxa" w:w="1500"/>
-            <w:tcMar>
-              <w:top w:type="dxa" w:w="50"/>
-              <w:left w:type="dxa" w:w="70"/>
-              <w:bottom w:type="dxa" w:w="50"/>
-              <w:right w:type="dxa" w:w="70"/>
-            </w:tcMar>
-          </w:tcPr>
-          <w:p>
-            <w:pPr>
-              <w:jc w:val="right"/>
-            </w:pPr>
-            <w:r>
-              <w:rPr>
-                <w:rFonts w:ascii="Calibri" w:cs="Calibri" w:eastAsia="Calibri" w:hAnsi="Calibri"/>
-                <w:b w:val="false"/>
-                <w:bCs w:val="false"/>
-                <w:sz w:val="14"/>
-                <w:szCs w:val="14"/>
-              </w:rPr>
-              <w:t xml:space="preserve">$300,101</w:t>
-            </w:r>
-          </w:p>
-        </w:tc>
-        <w:tc>
-          <w:tcPr>
-            <w:tcW w:type="dxa" w:w="1500"/>
-            <w:tcMar>
-              <w:top w:type="dxa" w:w="50"/>
-              <w:left w:type="dxa" w:w="70"/>
-              <w:bottom w:type="dxa" w:w="50"/>
-              <w:right w:type="dxa" w:w="70"/>
-            </w:tcMar>
-          </w:tcPr>
-          <w:p>
-            <w:pPr>
-              <w:jc w:val="right"/>
-            </w:pPr>
-            <w:r>
-              <w:rPr>
-                <w:rFonts w:ascii="Calibri" w:cs="Calibri" w:eastAsia="Calibri" w:hAnsi="Calibri"/>
-                <w:b w:val="false"/>
-                <w:bCs w:val="false"/>
-                <w:sz w:val="14"/>
-                <w:szCs w:val="14"/>
-              </w:rPr>
-              <w:t xml:space="preserve">($38,297)</w:t>
-            </w:r>
-          </w:p>
-        </w:tc>
-        <w:tc>
-          <w:tcPr>
-            <w:tcW w:type="dxa" w:w="1500"/>
-            <w:tcMar>
-              <w:top w:type="dxa" w:w="50"/>
-              <w:left w:type="dxa" w:w="70"/>
-              <w:bottom w:type="dxa" w:w="50"/>
-              <w:right w:type="dxa" w:w="70"/>
-            </w:tcMar>
-          </w:tcPr>
-          <w:p>
-            <w:pPr>
-              <w:jc w:val="right"/>
-            </w:pPr>
-            <w:r>
-              <w:rPr>
-                <w:rFonts w:ascii="Calibri" w:cs="Calibri" w:eastAsia="Calibri" w:hAnsi="Calibri"/>
-                <w:b w:val="false"/>
-                <w:bCs w:val="false"/>
-                <w:sz w:val="14"/>
-                <w:szCs w:val="14"/>
-              </w:rPr>
-              <w:t xml:space="preserve">$270,091</w:t>
-            </w:r>
-          </w:p>
-        </w:tc>
-        <w:tc>
-          <w:tcPr>
-            <w:tcW w:type="dxa" w:w="1500"/>
-            <w:tcMar>
-              <w:top w:type="dxa" w:w="50"/>
-              <w:left w:type="dxa" w:w="70"/>
-              <w:bottom w:type="dxa" w:w="50"/>
-              <w:right w:type="dxa" w:w="70"/>
-            </w:tcMar>
-          </w:tcPr>
-          <w:p>
-            <w:pPr>
-              <w:jc w:val="right"/>
-            </w:pPr>
-            <w:r>
-              <w:rPr>
-                <w:rFonts w:ascii="Calibri" w:cs="Calibri" w:eastAsia="Calibri" w:hAnsi="Calibri"/>
-                <w:b w:val="false"/>
-                <w:bCs w:val="false"/>
-                <w:sz w:val="14"/>
-                <w:szCs w:val="14"/>
-              </w:rPr>
-              <w:t xml:space="preserve">$261,804</w:t>
+              <w:t xml:space="preserve">4,800 seats (3.67% of market), 120 districts</w:t>
+            </w:r>
+          </w:p>
+        </w:tc>
+        <w:tc>
+          <w:tcPr>
+            <w:tcW w:type="dxa" w:w="1500"/>
+            <w:tcMar>
+              <w:top w:type="dxa" w:w="50"/>
+              <w:left w:type="dxa" w:w="70"/>
+              <w:bottom w:type="dxa" w:w="50"/>
+              <w:right w:type="dxa" w:w="70"/>
+            </w:tcMar>
+          </w:tcPr>
+          <w:p>
+            <w:pPr>
+              <w:jc w:val="right"/>
+            </w:pPr>
+            <w:r>
+              <w:rPr>
+                <w:rFonts w:ascii="Calibri" w:cs="Calibri" w:eastAsia="Calibri" w:hAnsi="Calibri"/>
+                <w:b w:val="false"/>
+                <w:bCs w:val="false"/>
+                <w:sz w:val="14"/>
+                <w:szCs w:val="14"/>
+              </w:rPr>
+              <w:t xml:space="preserve">$599,952</w:t>
+            </w:r>
+          </w:p>
+        </w:tc>
+        <w:tc>
+          <w:tcPr>
+            <w:tcW w:type="dxa" w:w="1500"/>
+            <w:tcMar>
+              <w:top w:type="dxa" w:w="50"/>
+              <w:left w:type="dxa" w:w="70"/>
+              <w:bottom w:type="dxa" w:w="50"/>
+              <w:right w:type="dxa" w:w="70"/>
+            </w:tcMar>
+          </w:tcPr>
+          <w:p>
+            <w:pPr>
+              <w:jc w:val="right"/>
+            </w:pPr>
+            <w:r>
+              <w:rPr>
+                <w:rFonts w:ascii="Calibri" w:cs="Calibri" w:eastAsia="Calibri" w:hAnsi="Calibri"/>
+                <w:b w:val="false"/>
+                <w:bCs w:val="false"/>
+                <w:sz w:val="14"/>
+                <w:szCs w:val="14"/>
+              </w:rPr>
+              <w:t xml:space="preserve">($75,632)</w:t>
+            </w:r>
+          </w:p>
+        </w:tc>
+        <w:tc>
+          <w:tcPr>
+            <w:tcW w:type="dxa" w:w="1500"/>
+            <w:tcMar>
+              <w:top w:type="dxa" w:w="50"/>
+              <w:left w:type="dxa" w:w="70"/>
+              <w:bottom w:type="dxa" w:w="50"/>
+              <w:right w:type="dxa" w:w="70"/>
+            </w:tcMar>
+          </w:tcPr>
+          <w:p>
+            <w:pPr>
+              <w:jc w:val="right"/>
+            </w:pPr>
+            <w:r>
+              <w:rPr>
+                <w:rFonts w:ascii="Calibri" w:cs="Calibri" w:eastAsia="Calibri" w:hAnsi="Calibri"/>
+                <w:b w:val="false"/>
+                <w:bCs w:val="false"/>
+                <w:sz w:val="14"/>
+                <w:szCs w:val="14"/>
+              </w:rPr>
+              <w:t xml:space="preserve">$539,957</w:t>
+            </w:r>
+          </w:p>
+        </w:tc>
+        <w:tc>
+          <w:tcPr>
+            <w:tcW w:type="dxa" w:w="1500"/>
+            <w:tcMar>
+              <w:top w:type="dxa" w:w="50"/>
+              <w:left w:type="dxa" w:w="70"/>
+              <w:bottom w:type="dxa" w:w="50"/>
+              <w:right w:type="dxa" w:w="70"/>
+            </w:tcMar>
+          </w:tcPr>
+          <w:p>
+            <w:pPr>
+              <w:jc w:val="right"/>
+            </w:pPr>
+            <w:r>
+              <w:rPr>
+                <w:rFonts w:ascii="Calibri" w:cs="Calibri" w:eastAsia="Calibri" w:hAnsi="Calibri"/>
+                <w:b w:val="false"/>
+                <w:bCs w:val="false"/>
+                <w:sz w:val="14"/>
+                <w:szCs w:val="14"/>
+              </w:rPr>
+              <w:t xml:space="preserve">$524,320</w:t>
             </w:r>
           </w:p>
         </w:tc>
@@ -7304,7 +7304,7 @@
                 <w:sz w:val="14"/>
                 <w:szCs w:val="14"/>
               </w:rPr>
-              <w:t xml:space="preserve">$416,735</w:t>
+              <w:t xml:space="preserve">$928,385</w:t>
             </w:r>
           </w:p>
         </w:tc>
@@ -7358,111 +7358,111 @@
                 <w:sz w:val="14"/>
                 <w:szCs w:val="14"/>
               </w:rPr>
-              <w:t xml:space="preserve">4,800 seats (3.67% of market), 120 districts</w:t>
-            </w:r>
-          </w:p>
-        </w:tc>
-        <w:tc>
-          <w:tcPr>
-            <w:tcW w:type="dxa" w:w="1500"/>
-            <w:tcMar>
-              <w:top w:type="dxa" w:w="50"/>
-              <w:left w:type="dxa" w:w="70"/>
-              <w:bottom w:type="dxa" w:w="50"/>
-              <w:right w:type="dxa" w:w="70"/>
-            </w:tcMar>
-          </w:tcPr>
-          <w:p>
-            <w:pPr>
-              <w:jc w:val="right"/>
-            </w:pPr>
-            <w:r>
-              <w:rPr>
-                <w:rFonts w:ascii="Calibri" w:cs="Calibri" w:eastAsia="Calibri" w:hAnsi="Calibri"/>
-                <w:b w:val="false"/>
-                <w:bCs w:val="false"/>
-                <w:sz w:val="14"/>
-                <w:szCs w:val="14"/>
-              </w:rPr>
-              <w:t xml:space="preserve">$599,952</w:t>
-            </w:r>
-          </w:p>
-        </w:tc>
-        <w:tc>
-          <w:tcPr>
-            <w:tcW w:type="dxa" w:w="1500"/>
-            <w:tcMar>
-              <w:top w:type="dxa" w:w="50"/>
-              <w:left w:type="dxa" w:w="70"/>
-              <w:bottom w:type="dxa" w:w="50"/>
-              <w:right w:type="dxa" w:w="70"/>
-            </w:tcMar>
-          </w:tcPr>
-          <w:p>
-            <w:pPr>
-              <w:jc w:val="right"/>
-            </w:pPr>
-            <w:r>
-              <w:rPr>
-                <w:rFonts w:ascii="Calibri" w:cs="Calibri" w:eastAsia="Calibri" w:hAnsi="Calibri"/>
-                <w:b w:val="false"/>
-                <w:bCs w:val="false"/>
-                <w:sz w:val="14"/>
-                <w:szCs w:val="14"/>
-              </w:rPr>
-              <w:t xml:space="preserve">($72,296)</w:t>
-            </w:r>
-          </w:p>
-        </w:tc>
-        <w:tc>
-          <w:tcPr>
-            <w:tcW w:type="dxa" w:w="1500"/>
-            <w:tcMar>
-              <w:top w:type="dxa" w:w="50"/>
-              <w:left w:type="dxa" w:w="70"/>
-              <w:bottom w:type="dxa" w:w="50"/>
-              <w:right w:type="dxa" w:w="70"/>
-            </w:tcMar>
-          </w:tcPr>
-          <w:p>
-            <w:pPr>
-              <w:jc w:val="right"/>
-            </w:pPr>
-            <w:r>
-              <w:rPr>
-                <w:rFonts w:ascii="Calibri" w:cs="Calibri" w:eastAsia="Calibri" w:hAnsi="Calibri"/>
-                <w:b w:val="false"/>
-                <w:bCs w:val="false"/>
-                <w:sz w:val="14"/>
-                <w:szCs w:val="14"/>
-              </w:rPr>
-              <w:t xml:space="preserve">$539,957</w:t>
-            </w:r>
-          </w:p>
-        </w:tc>
-        <w:tc>
-          <w:tcPr>
-            <w:tcW w:type="dxa" w:w="1500"/>
-            <w:tcMar>
-              <w:top w:type="dxa" w:w="50"/>
-              <w:left w:type="dxa" w:w="70"/>
-              <w:bottom w:type="dxa" w:w="50"/>
-              <w:right w:type="dxa" w:w="70"/>
-            </w:tcMar>
-          </w:tcPr>
-          <w:p>
-            <w:pPr>
-              <w:jc w:val="right"/>
-            </w:pPr>
-            <w:r>
-              <w:rPr>
-                <w:rFonts w:ascii="Calibri" w:cs="Calibri" w:eastAsia="Calibri" w:hAnsi="Calibri"/>
-                <w:b w:val="false"/>
-                <w:bCs w:val="false"/>
-                <w:sz w:val="14"/>
-                <w:szCs w:val="14"/>
-              </w:rPr>
-              <w:t xml:space="preserve">$527,656</w:t>
+              <w:t xml:space="preserve">9,000 seats (6.88% of market), 225 districts</w:t>
+            </w:r>
+          </w:p>
+        </w:tc>
+        <w:tc>
+          <w:tcPr>
+            <w:tcW w:type="dxa" w:w="1500"/>
+            <w:tcMar>
+              <w:top w:type="dxa" w:w="50"/>
+              <w:left w:type="dxa" w:w="70"/>
+              <w:bottom w:type="dxa" w:w="50"/>
+              <w:right w:type="dxa" w:w="70"/>
+            </w:tcMar>
+          </w:tcPr>
+          <w:p>
+            <w:pPr>
+              <w:jc w:val="right"/>
+            </w:pPr>
+            <w:r>
+              <w:rPr>
+                <w:rFonts w:ascii="Calibri" w:cs="Calibri" w:eastAsia="Calibri" w:hAnsi="Calibri"/>
+                <w:b w:val="false"/>
+                <w:bCs w:val="false"/>
+                <w:sz w:val="14"/>
+                <w:szCs w:val="14"/>
+              </w:rPr>
+              <w:t xml:space="preserve">$1,124,910</w:t>
+            </w:r>
+          </w:p>
+        </w:tc>
+        <w:tc>
+          <w:tcPr>
+            <w:tcW w:type="dxa" w:w="1500"/>
+            <w:tcMar>
+              <w:top w:type="dxa" w:w="50"/>
+              <w:left w:type="dxa" w:w="70"/>
+              <w:bottom w:type="dxa" w:w="50"/>
+              <w:right w:type="dxa" w:w="70"/>
+            </w:tcMar>
+          </w:tcPr>
+          <w:p>
+            <w:pPr>
+              <w:jc w:val="right"/>
+            </w:pPr>
+            <w:r>
+              <w:rPr>
+                <w:rFonts w:ascii="Calibri" w:cs="Calibri" w:eastAsia="Calibri" w:hAnsi="Calibri"/>
+                <w:b w:val="false"/>
+                <w:bCs w:val="false"/>
+                <w:sz w:val="14"/>
+                <w:szCs w:val="14"/>
+              </w:rPr>
+              <w:t xml:space="preserve">($134,084)</w:t>
+            </w:r>
+          </w:p>
+        </w:tc>
+        <w:tc>
+          <w:tcPr>
+            <w:tcW w:type="dxa" w:w="1500"/>
+            <w:tcMar>
+              <w:top w:type="dxa" w:w="50"/>
+              <w:left w:type="dxa" w:w="70"/>
+              <w:bottom w:type="dxa" w:w="50"/>
+              <w:right w:type="dxa" w:w="70"/>
+            </w:tcMar>
+          </w:tcPr>
+          <w:p>
+            <w:pPr>
+              <w:jc w:val="right"/>
+            </w:pPr>
+            <w:r>
+              <w:rPr>
+                <w:rFonts w:ascii="Calibri" w:cs="Calibri" w:eastAsia="Calibri" w:hAnsi="Calibri"/>
+                <w:b w:val="false"/>
+                <w:bCs w:val="false"/>
+                <w:sz w:val="14"/>
+                <w:szCs w:val="14"/>
+              </w:rPr>
+              <w:t xml:space="preserve">$1,012,419</w:t>
+            </w:r>
+          </w:p>
+        </w:tc>
+        <w:tc>
+          <w:tcPr>
+            <w:tcW w:type="dxa" w:w="1500"/>
+            <w:tcMar>
+              <w:top w:type="dxa" w:w="50"/>
+              <w:left w:type="dxa" w:w="70"/>
+              <w:bottom w:type="dxa" w:w="50"/>
+              <w:right w:type="dxa" w:w="70"/>
+            </w:tcMar>
+          </w:tcPr>
+          <w:p>
+            <w:pPr>
+              <w:jc w:val="right"/>
+            </w:pPr>
+            <w:r>
+              <w:rPr>
+                <w:rFonts w:ascii="Calibri" w:cs="Calibri" w:eastAsia="Calibri" w:hAnsi="Calibri"/>
+                <w:b w:val="false"/>
+                <w:bCs w:val="false"/>
+                <w:sz w:val="14"/>
+                <w:szCs w:val="14"/>
+              </w:rPr>
+              <w:t xml:space="preserve">$990,826</w:t>
             </w:r>
           </w:p>
         </w:tc>
@@ -7488,7 +7488,7 @@
                 <w:sz w:val="14"/>
                 <w:szCs w:val="14"/>
               </w:rPr>
-              <w:t xml:space="preserve">$944,391</w:t>
+              <w:t xml:space="preserve">$1,919,211</w:t>
             </w:r>
           </w:p>
         </w:tc>
@@ -7568,85 +7568,85 @@
                 <w:sz w:val="14"/>
                 <w:szCs w:val="14"/>
               </w:rPr>
-              <w:t xml:space="preserve">$1,082,539</w:t>
-            </w:r>
-          </w:p>
-        </w:tc>
-        <w:tc>
-          <w:tcPr>
-            <w:tcW w:type="dxa" w:w="1500"/>
-            <w:tcMar>
-              <w:top w:type="dxa" w:w="50"/>
-              <w:left w:type="dxa" w:w="70"/>
-              <w:bottom w:type="dxa" w:w="50"/>
-              <w:right w:type="dxa" w:w="70"/>
-            </w:tcMar>
-          </w:tcPr>
-          <w:p>
-            <w:pPr>
-              <w:jc w:val="right"/>
-            </w:pPr>
-            <w:r>
-              <w:rPr>
-                <w:rFonts w:ascii="Calibri" w:cs="Calibri" w:eastAsia="Calibri" w:hAnsi="Calibri"/>
-                <w:b w:val="false"/>
-                <w:bCs w:val="false"/>
-                <w:sz w:val="14"/>
-                <w:szCs w:val="14"/>
-              </w:rPr>
-              <w:t xml:space="preserve">($138,148)</w:t>
-            </w:r>
-          </w:p>
-        </w:tc>
-        <w:tc>
-          <w:tcPr>
-            <w:tcW w:type="dxa" w:w="1500"/>
-            <w:tcMar>
-              <w:top w:type="dxa" w:w="50"/>
-              <w:left w:type="dxa" w:w="70"/>
-              <w:bottom w:type="dxa" w:w="50"/>
-              <w:right w:type="dxa" w:w="70"/>
-            </w:tcMar>
-          </w:tcPr>
-          <w:p>
-            <w:pPr>
-              <w:jc w:val="right"/>
-            </w:pPr>
-            <w:r>
-              <w:rPr>
-                <w:rFonts w:ascii="Calibri" w:cs="Calibri" w:eastAsia="Calibri" w:hAnsi="Calibri"/>
-                <w:b w:val="false"/>
-                <w:bCs w:val="false"/>
-                <w:sz w:val="14"/>
-                <w:szCs w:val="14"/>
-              </w:rPr>
-              <w:t xml:space="preserve">$974,285</w:t>
-            </w:r>
-          </w:p>
-        </w:tc>
-        <w:tc>
-          <w:tcPr>
-            <w:tcW w:type="dxa" w:w="1500"/>
-            <w:tcMar>
-              <w:top w:type="dxa" w:w="50"/>
-              <w:left w:type="dxa" w:w="70"/>
-              <w:bottom w:type="dxa" w:w="50"/>
-              <w:right w:type="dxa" w:w="70"/>
-            </w:tcMar>
-          </w:tcPr>
-          <w:p>
-            <w:pPr>
-              <w:jc w:val="right"/>
-            </w:pPr>
-            <w:r>
-              <w:rPr>
-                <w:rFonts w:ascii="Calibri" w:cs="Calibri" w:eastAsia="Calibri" w:hAnsi="Calibri"/>
-                <w:b w:val="false"/>
-                <w:bCs w:val="false"/>
-                <w:sz w:val="14"/>
-                <w:szCs w:val="14"/>
-              </w:rPr>
-              <w:t xml:space="preserve">$944,391</w:t>
+              <w:t xml:space="preserve">$2,199,949</w:t>
+            </w:r>
+          </w:p>
+        </w:tc>
+        <w:tc>
+          <w:tcPr>
+            <w:tcW w:type="dxa" w:w="1500"/>
+            <w:tcMar>
+              <w:top w:type="dxa" w:w="50"/>
+              <w:left w:type="dxa" w:w="70"/>
+              <w:bottom w:type="dxa" w:w="50"/>
+              <w:right w:type="dxa" w:w="70"/>
+            </w:tcMar>
+          </w:tcPr>
+          <w:p>
+            <w:pPr>
+              <w:jc w:val="right"/>
+            </w:pPr>
+            <w:r>
+              <w:rPr>
+                <w:rFonts w:ascii="Calibri" w:cs="Calibri" w:eastAsia="Calibri" w:hAnsi="Calibri"/>
+                <w:b w:val="false"/>
+                <w:bCs w:val="false"/>
+                <w:sz w:val="14"/>
+                <w:szCs w:val="14"/>
+              </w:rPr>
+              <w:t xml:space="preserve">($280,738)</w:t>
+            </w:r>
+          </w:p>
+        </w:tc>
+        <w:tc>
+          <w:tcPr>
+            <w:tcW w:type="dxa" w:w="1500"/>
+            <w:tcMar>
+              <w:top w:type="dxa" w:w="50"/>
+              <w:left w:type="dxa" w:w="70"/>
+              <w:bottom w:type="dxa" w:w="50"/>
+              <w:right w:type="dxa" w:w="70"/>
+            </w:tcMar>
+          </w:tcPr>
+          <w:p>
+            <w:pPr>
+              <w:jc w:val="right"/>
+            </w:pPr>
+            <w:r>
+              <w:rPr>
+                <w:rFonts w:ascii="Calibri" w:cs="Calibri" w:eastAsia="Calibri" w:hAnsi="Calibri"/>
+                <w:b w:val="false"/>
+                <w:bCs w:val="false"/>
+                <w:sz w:val="14"/>
+                <w:szCs w:val="14"/>
+              </w:rPr>
+              <w:t xml:space="preserve">$1,979,954</w:t>
+            </w:r>
+          </w:p>
+        </w:tc>
+        <w:tc>
+          <w:tcPr>
+            <w:tcW w:type="dxa" w:w="1500"/>
+            <w:tcMar>
+              <w:top w:type="dxa" w:w="50"/>
+              <w:left w:type="dxa" w:w="70"/>
+              <w:bottom w:type="dxa" w:w="50"/>
+              <w:right w:type="dxa" w:w="70"/>
+            </w:tcMar>
+          </w:tcPr>
+          <w:p>
+            <w:pPr>
+              <w:jc w:val="right"/>
+            </w:pPr>
+            <w:r>
+              <w:rPr>
+                <w:rFonts w:ascii="Calibri" w:cs="Calibri" w:eastAsia="Calibri" w:hAnsi="Calibri"/>
+                <w:b w:val="false"/>
+                <w:bCs w:val="false"/>
+                <w:sz w:val="14"/>
+                <w:szCs w:val="14"/>
+              </w:rPr>
+              <w:t xml:space="preserve">$1,919,211</w:t>
             </w:r>
           </w:p>
         </w:tc>
@@ -7672,7 +7672,7 @@
                 <w:sz w:val="14"/>
                 <w:szCs w:val="14"/>
               </w:rPr>
-              <w:t xml:space="preserve">$944,391</w:t>
+              <w:t xml:space="preserve">$1,919,211</w:t>
             </w:r>
           </w:p>
         </w:tc>
@@ -7700,7 +7700,7 @@
         <w:rPr>
           <w:rFonts w:ascii="Calibri" w:cs="Calibri" w:eastAsia="Calibri" w:hAnsi="Calibri"/>
         </w:rPr>
-        <w:t xml:space="preserve">Clinical model (EZvoxa Pro seats): five-year net $45,678</w:t>
+        <w:t xml:space="preserve">Clinical model (EZvoxa Pro seats): five-year net $45,771</w:t>
       </w:r>
     </w:p>
     <w:tbl>
@@ -8016,7 +8016,7 @@
                 <w:sz w:val="14"/>
                 <w:szCs w:val="14"/>
               </w:rPr>
-              <w:t xml:space="preserve">($261)</w:t>
+              <w:t xml:space="preserve">($253)</w:t>
             </w:r>
           </w:p>
         </w:tc>
@@ -8068,7 +8068,7 @@
                 <w:sz w:val="14"/>
                 <w:szCs w:val="14"/>
               </w:rPr>
-              <w:t xml:space="preserve">$989</w:t>
+              <w:t xml:space="preserve">$997</w:t>
             </w:r>
           </w:p>
         </w:tc>
@@ -8094,7 +8094,7 @@
                 <w:sz w:val="14"/>
                 <w:szCs w:val="14"/>
               </w:rPr>
-              <w:t xml:space="preserve">$989</w:t>
+              <w:t xml:space="preserve">$997</w:t>
             </w:r>
           </w:p>
         </w:tc>
@@ -8200,7 +8200,7 @@
                 <w:sz w:val="14"/>
                 <w:szCs w:val="14"/>
               </w:rPr>
-              <w:t xml:space="preserve">($506)</w:t>
+              <w:t xml:space="preserve">($494)</w:t>
             </w:r>
           </w:p>
         </w:tc>
@@ -8252,7 +8252,7 @@
                 <w:sz w:val="14"/>
                 <w:szCs w:val="14"/>
               </w:rPr>
-              <w:t xml:space="preserve">$2,619</w:t>
+              <w:t xml:space="preserve">$2,631</w:t>
             </w:r>
           </w:p>
         </w:tc>
@@ -8278,7 +8278,7 @@
                 <w:sz w:val="14"/>
                 <w:szCs w:val="14"/>
               </w:rPr>
-              <w:t xml:space="preserve">$3,608</w:t>
+              <w:t xml:space="preserve">$3,628</w:t>
             </w:r>
           </w:p>
         </w:tc>
@@ -8384,7 +8384,7 @@
                 <w:sz w:val="14"/>
                 <w:szCs w:val="14"/>
               </w:rPr>
-              <w:t xml:space="preserve">($1,045)</w:t>
+              <w:t xml:space="preserve">($1,028)</w:t>
             </w:r>
           </w:p>
         </w:tc>
@@ -8436,7 +8436,7 @@
                 <w:sz w:val="14"/>
                 <w:szCs w:val="14"/>
               </w:rPr>
-              <w:t xml:space="preserve">$6,454</w:t>
+              <w:t xml:space="preserve">$6,471</w:t>
             </w:r>
           </w:p>
         </w:tc>
@@ -8462,7 +8462,7 @@
                 <w:sz w:val="14"/>
                 <w:szCs w:val="14"/>
               </w:rPr>
-              <w:t xml:space="preserve">$10,062</w:t>
+              <w:t xml:space="preserve">$10,099</w:t>
             </w:r>
           </w:p>
         </w:tc>
@@ -8568,7 +8568,7 @@
                 <w:sz w:val="14"/>
                 <w:szCs w:val="14"/>
               </w:rPr>
-              <w:t xml:space="preserve">($1,994)</w:t>
+              <w:t xml:space="preserve">($1,970)</w:t>
             </w:r>
           </w:p>
         </w:tc>
@@ -8620,7 +8620,7 @@
                 <w:sz w:val="14"/>
                 <w:szCs w:val="14"/>
               </w:rPr>
-              <w:t xml:space="preserve">$13,630</w:t>
+              <w:t xml:space="preserve">$13,654</w:t>
             </w:r>
           </w:p>
         </w:tc>
@@ -8646,7 +8646,7 @@
                 <w:sz w:val="14"/>
                 <w:szCs w:val="14"/>
               </w:rPr>
-              <w:t xml:space="preserve">$23,692</w:t>
+              <w:t xml:space="preserve">$23,753</w:t>
             </w:r>
           </w:p>
         </w:tc>
@@ -8752,7 +8752,7 @@
                 <w:sz w:val="14"/>
                 <w:szCs w:val="14"/>
               </w:rPr>
-              <w:t xml:space="preserve">($3,012)</w:t>
+              <w:t xml:space="preserve">($2,980)</w:t>
             </w:r>
           </w:p>
         </w:tc>
@@ -8804,7 +8804,7 @@
                 <w:sz w:val="14"/>
                 <w:szCs w:val="14"/>
               </w:rPr>
-              <w:t xml:space="preserve">$21,986</w:t>
+              <w:t xml:space="preserve">$22,018</w:t>
             </w:r>
           </w:p>
         </w:tc>
@@ -8830,7 +8830,7 @@
                 <w:sz w:val="14"/>
                 <w:szCs w:val="14"/>
               </w:rPr>
-              <w:t xml:space="preserve">$45,678</w:t>
+              <w:t xml:space="preserve">$45,771</w:t>
             </w:r>
           </w:p>
         </w:tc>
@@ -8936,7 +8936,7 @@
                 <w:sz w:val="14"/>
                 <w:szCs w:val="14"/>
               </w:rPr>
-              <w:t xml:space="preserve">($6,818)</w:t>
+              <w:t xml:space="preserve">($6,725)</w:t>
             </w:r>
           </w:p>
         </w:tc>
@@ -8988,7 +8988,7 @@
                 <w:sz w:val="14"/>
                 <w:szCs w:val="14"/>
               </w:rPr>
-              <w:t xml:space="preserve">$45,678</w:t>
+              <w:t xml:space="preserve">$45,771</w:t>
             </w:r>
           </w:p>
         </w:tc>
@@ -9014,7 +9014,7 @@
                 <w:sz w:val="14"/>
                 <w:szCs w:val="14"/>
               </w:rPr>
-              <w:t xml:space="preserve">$45,678</w:t>
+              <w:t xml:space="preserve">$45,771</w:t>
             </w:r>
           </w:p>
         </w:tc>
@@ -9412,7 +9412,7 @@
                 <w:sz w:val="16"/>
                 <w:szCs w:val="16"/>
               </w:rPr>
-              <w:t xml:space="preserve">4,327</w:t>
+              <w:t xml:space="preserve">12,801</w:t>
             </w:r>
           </w:p>
         </w:tc>
@@ -9464,7 +9464,7 @@
                 <w:sz w:val="16"/>
                 <w:szCs w:val="16"/>
               </w:rPr>
-              <w:t xml:space="preserve">$7,666,245</w:t>
+              <w:t xml:space="preserve">$8,725,411</w:t>
             </w:r>
           </w:p>
         </w:tc>
@@ -9490,7 +9490,7 @@
                 <w:sz w:val="16"/>
                 <w:szCs w:val="16"/>
               </w:rPr>
-              <w:t xml:space="preserve">$4,899,434</w:t>
+              <w:t xml:space="preserve">$5,852,682</w:t>
             </w:r>
           </w:p>
         </w:tc>
@@ -9622,7 +9622,7 @@
                 <w:sz w:val="16"/>
                 <w:szCs w:val="16"/>
               </w:rPr>
-              <w:t xml:space="preserve">8,661</w:t>
+              <w:t xml:space="preserve">17,601</w:t>
             </w:r>
           </w:p>
         </w:tc>
@@ -9674,7 +9674,7 @@
                 <w:sz w:val="16"/>
                 <w:szCs w:val="16"/>
               </w:rPr>
-              <w:t xml:space="preserve">$17,418,965</w:t>
+              <w:t xml:space="preserve">$18,536,375</w:t>
             </w:r>
           </w:p>
         </w:tc>
@@ -9700,7 +9700,7 @@
                 <w:sz w:val="16"/>
                 <w:szCs w:val="16"/>
               </w:rPr>
-              <w:t xml:space="preserve">$11,907,278</w:t>
+              <w:t xml:space="preserve">$12,912,947</w:t>
             </w:r>
           </w:p>
         </w:tc>
@@ -9832,7 +9832,7 @@
                 <w:sz w:val="16"/>
                 <w:szCs w:val="16"/>
               </w:rPr>
-              <w:t xml:space="preserve">17,323</w:t>
+              <w:t xml:space="preserve">24,001</w:t>
             </w:r>
           </w:p>
         </w:tc>
@@ -9884,7 +9884,7 @@
                 <w:sz w:val="16"/>
                 <w:szCs w:val="16"/>
               </w:rPr>
-              <w:t xml:space="preserve">$39,011,837</w:t>
+              <w:t xml:space="preserve">$39,846,521</w:t>
             </w:r>
           </w:p>
         </w:tc>
@@ -9910,7 +9910,7 @@
                 <w:sz w:val="16"/>
                 <w:szCs w:val="16"/>
               </w:rPr>
-              <w:t xml:space="preserve">$27,487,790</w:t>
+              <w:t xml:space="preserve">$28,239,005</w:t>
             </w:r>
           </w:p>
         </w:tc>

</xml_diff>